<commit_message>
Add new test cases for array reversal and statistics
Added a test for even-length arrays in ArrayReversalExerciseTest and a comprehensive test for mean, median, min, and max in ArrayStatisticsExerciseTest. Updated .gitignore to exclude a new temporary file. Protocol.docx was also updated.
</commit_message>
<xml_diff>
--- a/Modules/Semester_1/Modern Code/Aufgaben/04_Arrays_and_Algorithms/Protocol.docx
+++ b/Modules/Semester_1/Modern Code/Aufgaben/04_Arrays_and_Algorithms/Protocol.docx
@@ -277,13 +277,8 @@
                                 <w:r>
                                   <w:tab/>
                                 </w:r>
-                                <w:proofErr w:type="gramStart"/>
                                 <w:r>
-                                  <w:t>XX:XX</w:t>
-                                </w:r>
-                                <w:proofErr w:type="gramEnd"/>
-                                <w:r>
-                                  <w:t>:XX</w:t>
+                                  <w:t>XX:XX:XX</w:t>
                                 </w:r>
                               </w:p>
                             </w:txbxContent>
@@ -385,13 +380,8 @@
                           <w:r>
                             <w:tab/>
                           </w:r>
-                          <w:proofErr w:type="gramStart"/>
                           <w:r>
-                            <w:t>XX:XX</w:t>
-                          </w:r>
-                          <w:proofErr w:type="gramEnd"/>
-                          <w:r>
-                            <w:t>:XX</w:t>
+                            <w:t>XX:XX:XX</w:t>
                           </w:r>
                         </w:p>
                       </w:txbxContent>
@@ -656,13 +646,1621 @@
     </w:p>
     <w:p>
       <w:pPr>
-        <w:jc w:val="left"/>
-      </w:pPr>
-    </w:p>
+        <w:pStyle w:val="Heading1"/>
+      </w:pPr>
+      <w:r>
+        <w:lastRenderedPageBreak/>
+        <w:t>Exercise 1</w:t>
+      </w:r>
+      <w:r>
+        <w:t xml:space="preserve"> – Array Statistics</w:t>
+      </w:r>
+    </w:p>
+    <w:p>
+      <w:pPr>
+        <w:pStyle w:val="Heading2"/>
+      </w:pPr>
+      <w:r>
+        <w:t>Solution Idea</w:t>
+      </w:r>
+    </w:p>
+    <w:p>
+      <w:r>
+        <w:t>This exercise requires the calculation of mean, median, minimum and maximum of an integer array.</w:t>
+      </w:r>
+    </w:p>
+    <w:p>
+      <w:pPr>
+        <w:pStyle w:val="Heading3"/>
+      </w:pPr>
+      <w:r>
+        <w:t>Mean</w:t>
+      </w:r>
+    </w:p>
+    <w:p>
+      <w:r>
+        <w:t xml:space="preserve">Calculating the mean only requires calculating the sum and then dividing by the length of the array. Before dividing, either the sum or the length should be </w:t>
+      </w:r>
+      <w:r>
+        <w:t>cast</w:t>
+      </w:r>
+      <w:r>
+        <w:t xml:space="preserve"> to a double to avoid integer division. </w:t>
+      </w:r>
+    </w:p>
+    <w:p>
+      <w:pPr>
+        <w:pStyle w:val="Heading3"/>
+      </w:pPr>
+      <w:r>
+        <w:t>Median</w:t>
+      </w:r>
+    </w:p>
+    <w:p>
+      <w:r>
+        <w:t xml:space="preserve">Calculating the median is a bit more complicated, since it requires first sorting the array and depending on </w:t>
+      </w:r>
+      <w:r>
+        <w:t>whether</w:t>
+      </w:r>
+      <w:r>
+        <w:t xml:space="preserve"> it’s even or odd in length, it requires a different calculation.</w:t>
+      </w:r>
+    </w:p>
+    <w:p>
+      <w:r>
+        <w:t xml:space="preserve">If it’s even, there are two mid-points, to get the second divide the array length by two and to get the first, subtract one from the second mid-point (since arrays are 0 indexed). </w:t>
+      </w:r>
+    </w:p>
+    <w:p>
+      <w:r>
+        <w:t>If it’s odd, just divide the length by two and that’s the index of the median. Since integer division rounds down, one can safely assume that you’ll get the middle.</w:t>
+      </w:r>
+    </w:p>
+    <w:p>
+      <w:pPr>
+        <w:pStyle w:val="Heading3"/>
+      </w:pPr>
+      <w:r>
+        <w:t>Minimum</w:t>
+      </w:r>
+      <w:r>
+        <w:t xml:space="preserve"> and </w:t>
+      </w:r>
+      <w:r>
+        <w:t>Maximum</w:t>
+      </w:r>
+    </w:p>
+    <w:p>
+      <w:r>
+        <w:t>To get the minimum and maximum values, one should just loop through the array once, save the current minimum and maximum values and compare and swap until the loop finishes.</w:t>
+      </w:r>
+    </w:p>
+    <w:p>
+      <w:pPr>
+        <w:pStyle w:val="Heading2"/>
+      </w:pPr>
+      <w:r>
+        <w:t>Code</w:t>
+      </w:r>
+    </w:p>
+    <w:p>
+      <w:pPr>
+        <w:pStyle w:val="Heading3"/>
+      </w:pPr>
+      <w:r>
+        <w:t>Mean</w:t>
+      </w:r>
+    </w:p>
+    <w:p>
+      <w:pPr>
+        <w:pStyle w:val="Pseoudocode"/>
+      </w:pPr>
+      <w:r>
+        <w:t>public void calculateMean()</w:t>
+      </w:r>
+      <w:r>
+        <w:br/>
+        <w:t>{</w:t>
+      </w:r>
+      <w:r>
+        <w:br/>
+        <w:t xml:space="preserve">    int sum = 0;</w:t>
+      </w:r>
+      <w:r>
+        <w:br/>
+      </w:r>
+      <w:r>
+        <w:br/>
+        <w:t xml:space="preserve">    for (int num : getInputArray())</w:t>
+      </w:r>
+      <w:r>
+        <w:br/>
+        <w:t xml:space="preserve">    {</w:t>
+      </w:r>
+      <w:r>
+        <w:br/>
+        <w:t xml:space="preserve">        sum += num;</w:t>
+      </w:r>
+      <w:r>
+        <w:br/>
+      </w:r>
+      <w:r>
+        <w:lastRenderedPageBreak/>
+        <w:t xml:space="preserve">    }</w:t>
+      </w:r>
+      <w:r>
+        <w:br/>
+      </w:r>
+      <w:r>
+        <w:br/>
+        <w:t xml:space="preserve">    setMean((double) sum / getInputArray().length);</w:t>
+      </w:r>
+      <w:r>
+        <w:br/>
+        <w:t>}</w:t>
+      </w:r>
+    </w:p>
+    <w:p>
+      <w:pPr>
+        <w:pStyle w:val="Caption"/>
+        <w:rPr>
+          <w:lang w:val="en-AT"/>
+        </w:rPr>
+      </w:pPr>
+      <w:bookmarkStart w:id="2" w:name="_Ref215077198"/>
+      <w:r>
+        <w:t xml:space="preserve">Figure </w:t>
+      </w:r>
+      <w:r>
+        <w:fldChar w:fldCharType="begin"/>
+      </w:r>
+      <w:r>
+        <w:instrText xml:space="preserve"> SEQ Figure \* ARABIC </w:instrText>
+      </w:r>
+      <w:r>
+        <w:fldChar w:fldCharType="separate"/>
+      </w:r>
+      <w:r>
+        <w:rPr>
+          <w:noProof/>
+        </w:rPr>
+        <w:t>1</w:t>
+      </w:r>
+      <w:r>
+        <w:fldChar w:fldCharType="end"/>
+      </w:r>
+      <w:bookmarkEnd w:id="2"/>
+      <w:r>
+        <w:t>: calculateMean</w:t>
+      </w:r>
+    </w:p>
+    <w:p>
+      <w:pPr>
+        <w:pStyle w:val="Heading3"/>
+      </w:pPr>
+      <w:r>
+        <w:t>Median</w:t>
+      </w:r>
+    </w:p>
+    <w:p>
+      <w:pPr>
+        <w:pStyle w:val="Pseoudocode"/>
+      </w:pPr>
+      <w:r>
+        <w:t>public void calculateMedian()</w:t>
+      </w:r>
+      <w:r>
+        <w:br/>
+        <w:t>{</w:t>
+      </w:r>
+      <w:r>
+        <w:br/>
+        <w:t xml:space="preserve">    int[] sortedArray = Arrays.</w:t>
+      </w:r>
+      <w:r>
+        <w:rPr>
+          <w:i/>
+          <w:iCs/>
+        </w:rPr>
+        <w:t>copyOf</w:t>
+      </w:r>
+      <w:r>
+        <w:t>(getInputArray(), getInputArray().length);</w:t>
+      </w:r>
+      <w:r>
+        <w:br/>
+        <w:t xml:space="preserve">    Arrays.</w:t>
+      </w:r>
+      <w:r>
+        <w:rPr>
+          <w:i/>
+          <w:iCs/>
+        </w:rPr>
+        <w:t>sort</w:t>
+      </w:r>
+      <w:r>
+        <w:t>(sortedArray);</w:t>
+      </w:r>
+      <w:r>
+        <w:br/>
+      </w:r>
+      <w:r>
+        <w:br/>
+        <w:t xml:space="preserve">    if (sortedArray.length % 2 == 0)</w:t>
+      </w:r>
+      <w:r>
+        <w:br/>
+        <w:t xml:space="preserve">    {</w:t>
+      </w:r>
+      <w:r>
+        <w:br/>
+        <w:t xml:space="preserve">        int mid1 = sortedArray.length / 2;</w:t>
+      </w:r>
+      <w:r>
+        <w:br/>
+        <w:t xml:space="preserve">        int mid2 = mid1 - 1;</w:t>
+      </w:r>
+      <w:r>
+        <w:br/>
+        <w:t xml:space="preserve">        setMedian((sortedArray[mid1] + sortedArray[mid2]) / 2.0);</w:t>
+      </w:r>
+      <w:r>
+        <w:br/>
+        <w:t xml:space="preserve">    }</w:t>
+      </w:r>
+      <w:r>
+        <w:br/>
+        <w:t xml:space="preserve">    else</w:t>
+      </w:r>
+      <w:r>
+        <w:br/>
+        <w:t xml:space="preserve">    {</w:t>
+      </w:r>
+      <w:r>
+        <w:br/>
+        <w:t xml:space="preserve">        int mid = sortedArray.length / 2;</w:t>
+      </w:r>
+      <w:r>
+        <w:br/>
+        <w:t xml:space="preserve">        setMedian(sortedArray[mid]);</w:t>
+      </w:r>
+      <w:r>
+        <w:br/>
+        <w:t xml:space="preserve">    }</w:t>
+      </w:r>
+      <w:r>
+        <w:br/>
+        <w:t>}</w:t>
+      </w:r>
+    </w:p>
+    <w:p>
+      <w:pPr>
+        <w:pStyle w:val="Caption"/>
+        <w:rPr>
+          <w:lang w:val="en-AT"/>
+        </w:rPr>
+      </w:pPr>
+      <w:r>
+        <w:t xml:space="preserve">Figure </w:t>
+      </w:r>
+      <w:r>
+        <w:fldChar w:fldCharType="begin"/>
+      </w:r>
+      <w:r>
+        <w:instrText xml:space="preserve"> SEQ Figure \* ARABIC </w:instrText>
+      </w:r>
+      <w:r>
+        <w:fldChar w:fldCharType="separate"/>
+      </w:r>
+      <w:r>
+        <w:rPr>
+          <w:noProof/>
+        </w:rPr>
+        <w:t>2</w:t>
+      </w:r>
+      <w:r>
+        <w:fldChar w:fldCharType="end"/>
+      </w:r>
+      <w:r>
+        <w:t>: calculateMedian</w:t>
+      </w:r>
+    </w:p>
+    <w:p>
+      <w:pPr>
+        <w:pStyle w:val="Heading3"/>
+      </w:pPr>
+      <w:r>
+        <w:t>Minimum and Maximum</w:t>
+      </w:r>
+    </w:p>
+    <w:p>
+      <w:pPr>
+        <w:pStyle w:val="Pseoudocode"/>
+      </w:pPr>
+      <w:r>
+        <w:t>public void calculateMinAndMax()</w:t>
+      </w:r>
+      <w:r>
+        <w:br/>
+        <w:t>{</w:t>
+      </w:r>
+      <w:r>
+        <w:br/>
+        <w:t xml:space="preserve">    int min = getInputArray()[0];</w:t>
+      </w:r>
+      <w:r>
+        <w:br/>
+        <w:t xml:space="preserve">    int max = getInputArray()[0];</w:t>
+      </w:r>
+      <w:r>
+        <w:br/>
+      </w:r>
+      <w:r>
+        <w:br/>
+        <w:t xml:space="preserve">    for (int num : getInputArray())</w:t>
+      </w:r>
+      <w:r>
+        <w:br/>
+        <w:t xml:space="preserve">    {</w:t>
+      </w:r>
+      <w:r>
+        <w:br/>
+        <w:t xml:space="preserve">        if (num &lt; min)</w:t>
+      </w:r>
+      <w:r>
+        <w:br/>
+        <w:t xml:space="preserve">        {</w:t>
+      </w:r>
+      <w:r>
+        <w:br/>
+      </w:r>
+      <w:r>
+        <w:lastRenderedPageBreak/>
+        <w:t xml:space="preserve">            min = num;</w:t>
+      </w:r>
+      <w:r>
+        <w:br/>
+        <w:t xml:space="preserve">        }</w:t>
+      </w:r>
+      <w:r>
+        <w:br/>
+        <w:t xml:space="preserve">        if (num &gt; max)</w:t>
+      </w:r>
+      <w:r>
+        <w:br/>
+        <w:t xml:space="preserve">        {</w:t>
+      </w:r>
+      <w:r>
+        <w:br/>
+        <w:t xml:space="preserve">            max = num;</w:t>
+      </w:r>
+      <w:r>
+        <w:br/>
+        <w:t xml:space="preserve">        }</w:t>
+      </w:r>
+      <w:r>
+        <w:br/>
+        <w:t xml:space="preserve">    }</w:t>
+      </w:r>
+      <w:r>
+        <w:br/>
+      </w:r>
+      <w:r>
+        <w:br/>
+        <w:t xml:space="preserve">    minimum = min;</w:t>
+      </w:r>
+      <w:r>
+        <w:br/>
+        <w:t xml:space="preserve">    maximum = max;</w:t>
+      </w:r>
+      <w:r>
+        <w:br/>
+        <w:t>}</w:t>
+      </w:r>
+    </w:p>
+    <w:p>
+      <w:pPr>
+        <w:pStyle w:val="Caption"/>
+      </w:pPr>
+      <w:r>
+        <w:t xml:space="preserve">Figure </w:t>
+      </w:r>
+      <w:r>
+        <w:fldChar w:fldCharType="begin"/>
+      </w:r>
+      <w:r>
+        <w:instrText xml:space="preserve"> SEQ Figure \* ARABIC </w:instrText>
+      </w:r>
+      <w:r>
+        <w:fldChar w:fldCharType="separate"/>
+      </w:r>
+      <w:r>
+        <w:rPr>
+          <w:noProof/>
+        </w:rPr>
+        <w:t>3</w:t>
+      </w:r>
+      <w:r>
+        <w:fldChar w:fldCharType="end"/>
+      </w:r>
+      <w:r>
+        <w:t>: calculateMinAndMax</w:t>
+      </w:r>
+    </w:p>
+    <w:p>
+      <w:pPr>
+        <w:rPr>
+          <w:lang w:val="en-AT"/>
+        </w:rPr>
+      </w:pPr>
+    </w:p>
+    <w:p>
+      <w:pPr>
+        <w:pStyle w:val="Heading2"/>
+      </w:pPr>
+      <w:r>
+        <w:t>Test</w:t>
+      </w:r>
+    </w:p>
+    <w:p>
+      <w:pPr>
+        <w:pStyle w:val="Pseoudocode"/>
+        <w:rPr>
+          <w:lang w:val="en-AT"/>
+        </w:rPr>
+      </w:pPr>
+      <w:r>
+        <w:rPr>
+          <w:lang w:val="en-AT"/>
+        </w:rPr>
+        <w:t>@Test</w:t>
+      </w:r>
+      <w:r>
+        <w:rPr>
+          <w:lang w:val="en-AT"/>
+        </w:rPr>
+        <w:br/>
+        <w:t>void testArrayFromExercise()</w:t>
+      </w:r>
+      <w:r>
+        <w:rPr>
+          <w:lang w:val="en-AT"/>
+        </w:rPr>
+        <w:br/>
+        <w:t>{</w:t>
+      </w:r>
+      <w:r>
+        <w:rPr>
+          <w:lang w:val="en-AT"/>
+        </w:rPr>
+        <w:br/>
+        <w:t xml:space="preserve">    excercise = new ArrayStatisticsExercise(new int[]{15, 8, 23, 4, 42, 11, 19});</w:t>
+      </w:r>
+      <w:r>
+        <w:rPr>
+          <w:lang w:val="en-AT"/>
+        </w:rPr>
+        <w:br/>
+      </w:r>
+      <w:r>
+        <w:rPr>
+          <w:lang w:val="en-AT"/>
+        </w:rPr>
+        <w:br/>
+        <w:t xml:space="preserve">    excercise.runExcercise();</w:t>
+      </w:r>
+      <w:r>
+        <w:rPr>
+          <w:lang w:val="en-AT"/>
+        </w:rPr>
+        <w:br/>
+        <w:t xml:space="preserve">    excercise.displayOutput();</w:t>
+      </w:r>
+      <w:r>
+        <w:rPr>
+          <w:lang w:val="en-AT"/>
+        </w:rPr>
+        <w:br/>
+      </w:r>
+      <w:r>
+        <w:rPr>
+          <w:lang w:val="en-AT"/>
+        </w:rPr>
+        <w:br/>
+        <w:t xml:space="preserve">    double expectedMean = 17.43;</w:t>
+      </w:r>
+      <w:r>
+        <w:rPr>
+          <w:lang w:val="en-AT"/>
+        </w:rPr>
+        <w:br/>
+        <w:t xml:space="preserve">    double expectedMedian = 15.0;</w:t>
+      </w:r>
+      <w:r>
+        <w:rPr>
+          <w:lang w:val="en-AT"/>
+        </w:rPr>
+        <w:br/>
+        <w:t xml:space="preserve">    int expectedMin = 4;</w:t>
+      </w:r>
+      <w:r>
+        <w:rPr>
+          <w:lang w:val="en-AT"/>
+        </w:rPr>
+        <w:br/>
+        <w:t xml:space="preserve">    int expectedMax = 42;</w:t>
+      </w:r>
+      <w:r>
+        <w:rPr>
+          <w:lang w:val="en-AT"/>
+        </w:rPr>
+        <w:br/>
+      </w:r>
+      <w:r>
+        <w:rPr>
+          <w:lang w:val="en-AT"/>
+        </w:rPr>
+        <w:br/>
+        <w:t xml:space="preserve">    </w:t>
+      </w:r>
+      <w:r>
+        <w:rPr>
+          <w:i/>
+          <w:iCs/>
+          <w:lang w:val="en-AT"/>
+        </w:rPr>
+        <w:t>assertEquals</w:t>
+      </w:r>
+      <w:r>
+        <w:rPr>
+          <w:lang w:val="en-AT"/>
+        </w:rPr>
+        <w:t>(expectedMean, excercise.getMean(), 0.01);</w:t>
+      </w:r>
+      <w:r>
+        <w:rPr>
+          <w:lang w:val="en-AT"/>
+        </w:rPr>
+        <w:br/>
+        <w:t xml:space="preserve">    </w:t>
+      </w:r>
+      <w:r>
+        <w:rPr>
+          <w:i/>
+          <w:iCs/>
+          <w:lang w:val="en-AT"/>
+        </w:rPr>
+        <w:t>assertEquals</w:t>
+      </w:r>
+      <w:r>
+        <w:rPr>
+          <w:lang w:val="en-AT"/>
+        </w:rPr>
+        <w:t>(expectedMedian, excercise.getMedian(), 0.001);</w:t>
+      </w:r>
+      <w:r>
+        <w:rPr>
+          <w:lang w:val="en-AT"/>
+        </w:rPr>
+        <w:br/>
+        <w:t xml:space="preserve">    </w:t>
+      </w:r>
+      <w:r>
+        <w:rPr>
+          <w:i/>
+          <w:iCs/>
+          <w:lang w:val="en-AT"/>
+        </w:rPr>
+        <w:t>assertEquals</w:t>
+      </w:r>
+      <w:r>
+        <w:rPr>
+          <w:lang w:val="en-AT"/>
+        </w:rPr>
+        <w:t>(expectedMin, excercise.getMinimum());</w:t>
+      </w:r>
+      <w:r>
+        <w:rPr>
+          <w:lang w:val="en-AT"/>
+        </w:rPr>
+        <w:br/>
+        <w:t xml:space="preserve">    </w:t>
+      </w:r>
+      <w:r>
+        <w:rPr>
+          <w:i/>
+          <w:iCs/>
+          <w:lang w:val="en-AT"/>
+        </w:rPr>
+        <w:t>assertEquals</w:t>
+      </w:r>
+      <w:r>
+        <w:rPr>
+          <w:lang w:val="en-AT"/>
+        </w:rPr>
+        <w:t>(expectedMax, excercise.getMaximum());</w:t>
+      </w:r>
+      <w:r>
+        <w:rPr>
+          <w:lang w:val="en-AT"/>
+        </w:rPr>
+        <w:br/>
+        <w:t>}</w:t>
+      </w:r>
+    </w:p>
+    <w:p>
+      <w:pPr>
+        <w:pStyle w:val="Caption"/>
+      </w:pPr>
+      <w:r>
+        <w:t xml:space="preserve">Figure </w:t>
+      </w:r>
+      <w:r>
+        <w:fldChar w:fldCharType="begin"/>
+      </w:r>
+      <w:r>
+        <w:instrText xml:space="preserve"> SEQ Figure \* ARABIC </w:instrText>
+      </w:r>
+      <w:r>
+        <w:fldChar w:fldCharType="separate"/>
+      </w:r>
+      <w:r>
+        <w:rPr>
+          <w:noProof/>
+        </w:rPr>
+        <w:t>4</w:t>
+      </w:r>
+      <w:r>
+        <w:fldChar w:fldCharType="end"/>
+      </w:r>
+      <w:r>
+        <w:t>: Statistics Test</w:t>
+      </w:r>
+    </w:p>
+    <w:p>
+      <w:pPr>
+        <w:pStyle w:val="Pseoudocode"/>
+      </w:pPr>
+      <w:r>
+        <w:t>=== Array Statistics ===</w:t>
+      </w:r>
+    </w:p>
+    <w:p>
+      <w:pPr>
+        <w:pStyle w:val="Pseoudocode"/>
+      </w:pPr>
+      <w:r>
+        <w:t>Arrays: [15, 8, 23, 4, 42, 11, 19]</w:t>
+      </w:r>
+    </w:p>
+    <w:p>
+      <w:pPr>
+        <w:pStyle w:val="Pseoudocode"/>
+      </w:pPr>
+      <w:r>
+        <w:t>Mean: 17.43</w:t>
+      </w:r>
+    </w:p>
+    <w:p>
+      <w:pPr>
+        <w:pStyle w:val="Pseoudocode"/>
+      </w:pPr>
+      <w:r>
+        <w:lastRenderedPageBreak/>
+        <w:t>Median: 15.00</w:t>
+      </w:r>
+    </w:p>
+    <w:p>
+      <w:pPr>
+        <w:pStyle w:val="Pseoudocode"/>
+      </w:pPr>
+      <w:r>
+        <w:t>Minimum: 4</w:t>
+      </w:r>
+    </w:p>
+    <w:p>
+      <w:pPr>
+        <w:pStyle w:val="Pseoudocode"/>
+      </w:pPr>
+      <w:r>
+        <w:t>Maximum: 42</w:t>
+      </w:r>
+    </w:p>
+    <w:p>
+      <w:pPr>
+        <w:pStyle w:val="Caption"/>
+      </w:pPr>
+      <w:r>
+        <w:t xml:space="preserve">Figure </w:t>
+      </w:r>
+      <w:r>
+        <w:fldChar w:fldCharType="begin"/>
+      </w:r>
+      <w:r>
+        <w:instrText xml:space="preserve"> SEQ Figure \* ARABIC </w:instrText>
+      </w:r>
+      <w:r>
+        <w:fldChar w:fldCharType="separate"/>
+      </w:r>
+      <w:r>
+        <w:rPr>
+          <w:noProof/>
+        </w:rPr>
+        <w:t>5</w:t>
+      </w:r>
+      <w:r>
+        <w:fldChar w:fldCharType="end"/>
+      </w:r>
+      <w:r>
+        <w:t>: Statistics Test Output</w:t>
+      </w:r>
+    </w:p>
+    <w:p>
+      <w:r>
+        <w:rPr>
+          <w:noProof/>
+        </w:rPr>
+        <mc:AlternateContent>
+          <mc:Choice Requires="wps">
+            <w:drawing>
+              <wp:anchor distT="0" distB="0" distL="114300" distR="114300" simplePos="0" relativeHeight="251664384" behindDoc="0" locked="0" layoutInCell="1" allowOverlap="1" wp14:anchorId="4CE442FD" wp14:editId="4C647903">
+                <wp:simplePos x="0" y="0"/>
+                <wp:positionH relativeFrom="column">
+                  <wp:posOffset>1038860</wp:posOffset>
+                </wp:positionH>
+                <wp:positionV relativeFrom="paragraph">
+                  <wp:posOffset>1125855</wp:posOffset>
+                </wp:positionV>
+                <wp:extent cx="3105150" cy="635"/>
+                <wp:effectExtent l="0" t="0" r="0" b="0"/>
+                <wp:wrapTopAndBottom/>
+                <wp:docPr id="1569173465" name="Text Box 1"/>
+                <wp:cNvGraphicFramePr/>
+                <a:graphic xmlns:a="http://schemas.openxmlformats.org/drawingml/2006/main">
+                  <a:graphicData uri="http://schemas.microsoft.com/office/word/2010/wordprocessingShape">
+                    <wps:wsp>
+                      <wps:cNvSpPr txBox="1"/>
+                      <wps:spPr>
+                        <a:xfrm>
+                          <a:off x="0" y="0"/>
+                          <a:ext cx="3105150" cy="635"/>
+                        </a:xfrm>
+                        <a:prstGeom prst="rect">
+                          <a:avLst/>
+                        </a:prstGeom>
+                        <a:solidFill>
+                          <a:prstClr val="white"/>
+                        </a:solidFill>
+                        <a:ln>
+                          <a:noFill/>
+                        </a:ln>
+                      </wps:spPr>
+                      <wps:txbx>
+                        <w:txbxContent>
+                          <w:p>
+                            <w:pPr>
+                              <w:pStyle w:val="Caption"/>
+                            </w:pPr>
+                            <w:r>
+                              <w:t xml:space="preserve">Figure </w:t>
+                            </w:r>
+                            <w:r>
+                              <w:fldChar w:fldCharType="begin"/>
+                            </w:r>
+                            <w:r>
+                              <w:instrText xml:space="preserve"> SEQ Figure \* ARABIC </w:instrText>
+                            </w:r>
+                            <w:r>
+                              <w:fldChar w:fldCharType="separate"/>
+                            </w:r>
+                            <w:r>
+                              <w:rPr>
+                                <w:noProof/>
+                              </w:rPr>
+                              <w:t>6</w:t>
+                            </w:r>
+                            <w:r>
+                              <w:fldChar w:fldCharType="end"/>
+                            </w:r>
+                            <w:r>
+                              <w:t>: Successful Unit Test</w:t>
+                            </w:r>
+                          </w:p>
+                        </w:txbxContent>
+                      </wps:txbx>
+                      <wps:bodyPr rot="0" spcFirstLastPara="0" vertOverflow="overflow" horzOverflow="overflow" vert="horz" wrap="square" lIns="0" tIns="0" rIns="0" bIns="0" numCol="1" spcCol="0" rtlCol="0" fromWordArt="0" anchor="t" anchorCtr="0" forceAA="0" compatLnSpc="1">
+                        <a:prstTxWarp prst="textNoShape">
+                          <a:avLst/>
+                        </a:prstTxWarp>
+                        <a:spAutoFit/>
+                      </wps:bodyPr>
+                    </wps:wsp>
+                  </a:graphicData>
+                </a:graphic>
+              </wp:anchor>
+            </w:drawing>
+          </mc:Choice>
+          <mc:Fallback>
+            <w:pict>
+              <v:shape w14:anchorId="4CE442FD" id="Text Box 1" o:spid="_x0000_s1028" type="#_x0000_t202" style="position:absolute;left:0;text-align:left;margin-left:81.8pt;margin-top:88.65pt;width:244.5pt;height:.05pt;z-index:251664384;visibility:visible;mso-wrap-style:square;mso-wrap-distance-left:9pt;mso-wrap-distance-top:0;mso-wrap-distance-right:9pt;mso-wrap-distance-bottom:0;mso-position-horizontal:absolute;mso-position-horizontal-relative:text;mso-position-vertical:absolute;mso-position-vertical-relative:text;v-text-anchor:top" o:gfxdata="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" stroked="f">
+                <v:textbox style="mso-fit-shape-to-text:t" inset="0,0,0,0">
+                  <w:txbxContent>
+                    <w:p>
+                      <w:pPr>
+                        <w:pStyle w:val="Caption"/>
+                      </w:pPr>
+                      <w:r>
+                        <w:t xml:space="preserve">Figure </w:t>
+                      </w:r>
+                      <w:r>
+                        <w:fldChar w:fldCharType="begin"/>
+                      </w:r>
+                      <w:r>
+                        <w:instrText xml:space="preserve"> SEQ Figure \* ARABIC </w:instrText>
+                      </w:r>
+                      <w:r>
+                        <w:fldChar w:fldCharType="separate"/>
+                      </w:r>
+                      <w:r>
+                        <w:rPr>
+                          <w:noProof/>
+                        </w:rPr>
+                        <w:t>6</w:t>
+                      </w:r>
+                      <w:r>
+                        <w:fldChar w:fldCharType="end"/>
+                      </w:r>
+                      <w:r>
+                        <w:t>: Successful Unit Test</w:t>
+                      </w:r>
+                    </w:p>
+                  </w:txbxContent>
+                </v:textbox>
+                <w10:wrap type="topAndBottom"/>
+              </v:shape>
+            </w:pict>
+          </mc:Fallback>
+        </mc:AlternateContent>
+      </w:r>
+      <w:r>
+        <w:drawing>
+          <wp:anchor distT="0" distB="0" distL="114300" distR="114300" simplePos="0" relativeHeight="251662336" behindDoc="0" locked="0" layoutInCell="1" allowOverlap="1" wp14:anchorId="797499EE" wp14:editId="313DA407">
+            <wp:simplePos x="0" y="0"/>
+            <wp:positionH relativeFrom="margin">
+              <wp:align>center</wp:align>
+            </wp:positionH>
+            <wp:positionV relativeFrom="paragraph">
+              <wp:posOffset>383456</wp:posOffset>
+            </wp:positionV>
+            <wp:extent cx="3105583" cy="685896"/>
+            <wp:effectExtent l="0" t="0" r="0" b="0"/>
+            <wp:wrapTopAndBottom/>
+            <wp:docPr id="726999198" name="Picture 1" descr="A screenshot of a computer&#10;&#10;AI-generated content may be incorrect."/>
+            <wp:cNvGraphicFramePr>
+              <a:graphicFrameLocks xmlns:a="http://schemas.openxmlformats.org/drawingml/2006/main" noChangeAspect="1"/>
+            </wp:cNvGraphicFramePr>
+            <a:graphic xmlns:a="http://schemas.openxmlformats.org/drawingml/2006/main">
+              <a:graphicData uri="http://schemas.openxmlformats.org/drawingml/2006/picture">
+                <pic:pic xmlns:pic="http://schemas.openxmlformats.org/drawingml/2006/picture">
+                  <pic:nvPicPr>
+                    <pic:cNvPr id="726999198" name="Picture 1" descr="A screenshot of a computer&#10;&#10;AI-generated content may be incorrect."/>
+                    <pic:cNvPicPr/>
+                  </pic:nvPicPr>
+                  <pic:blipFill>
+                    <a:blip r:embed="rId8">
+                      <a:extLst>
+                        <a:ext uri="{28A0092B-C50C-407E-A947-70E740481C1C}">
+                          <a14:useLocalDpi xmlns:a14="http://schemas.microsoft.com/office/drawing/2010/main" val="0"/>
+                        </a:ext>
+                      </a:extLst>
+                    </a:blip>
+                    <a:stretch>
+                      <a:fillRect/>
+                    </a:stretch>
+                  </pic:blipFill>
+                  <pic:spPr>
+                    <a:xfrm>
+                      <a:off x="0" y="0"/>
+                      <a:ext cx="3105583" cy="685896"/>
+                    </a:xfrm>
+                    <a:prstGeom prst="rect">
+                      <a:avLst/>
+                    </a:prstGeom>
+                  </pic:spPr>
+                </pic:pic>
+              </a:graphicData>
+            </a:graphic>
+          </wp:anchor>
+        </w:drawing>
+      </w:r>
+    </w:p>
+    <w:p>
+      <w:pPr>
+        <w:pStyle w:val="Heading1"/>
+      </w:pPr>
+      <w:r>
+        <w:t>Exercise 2 – Array Reversal</w:t>
+      </w:r>
+    </w:p>
+    <w:p>
+      <w:pPr>
+        <w:pStyle w:val="Heading2"/>
+      </w:pPr>
+      <w:r>
+        <w:t>Solution Idea</w:t>
+      </w:r>
+    </w:p>
+    <w:p>
+      <w:r>
+        <w:t>Reversing an array in place requires following algorithm:</w:t>
+      </w:r>
+    </w:p>
+    <w:p>
+      <w:pPr>
+        <w:pStyle w:val="ListParagraph"/>
+        <w:numPr>
+          <w:ilvl w:val="0"/>
+          <w:numId w:val="7"/>
+        </w:numPr>
+      </w:pPr>
+      <w:r>
+        <w:t>Save first array element in a temp variable</w:t>
+      </w:r>
+    </w:p>
+    <w:p>
+      <w:pPr>
+        <w:pStyle w:val="ListParagraph"/>
+        <w:numPr>
+          <w:ilvl w:val="0"/>
+          <w:numId w:val="7"/>
+        </w:numPr>
+      </w:pPr>
+      <w:r>
+        <w:t>Set first array element to last</w:t>
+      </w:r>
+    </w:p>
+    <w:p>
+      <w:pPr>
+        <w:pStyle w:val="ListParagraph"/>
+        <w:numPr>
+          <w:ilvl w:val="0"/>
+          <w:numId w:val="7"/>
+        </w:numPr>
+      </w:pPr>
+      <w:r>
+        <w:t>Set last array element to temp</w:t>
+      </w:r>
+    </w:p>
+    <w:p>
+      <w:pPr>
+        <w:pStyle w:val="ListParagraph"/>
+        <w:numPr>
+          <w:ilvl w:val="0"/>
+          <w:numId w:val="7"/>
+        </w:numPr>
+      </w:pPr>
+      <w:r>
+        <w:t>Continue like this with second and second last</w:t>
+      </w:r>
+      <w:r>
+        <w:t xml:space="preserve"> and so on</w:t>
+      </w:r>
+    </w:p>
+    <w:p>
+      <w:r>
+        <w:t xml:space="preserve">This algorithm is shown in </w:t>
+      </w:r>
+      <w:r>
+        <w:fldChar w:fldCharType="begin"/>
+      </w:r>
+      <w:r>
+        <w:instrText xml:space="preserve"> REF _Ref215077198 \h </w:instrText>
+      </w:r>
+      <w:r>
+        <w:fldChar w:fldCharType="separate"/>
+      </w:r>
+      <w:r>
+        <w:fldChar w:fldCharType="end"/>
+      </w:r>
+      <w:r>
+        <w:fldChar w:fldCharType="begin"/>
+      </w:r>
+      <w:r>
+        <w:instrText xml:space="preserve"> REF _Ref215077202 \h </w:instrText>
+      </w:r>
+      <w:r>
+        <w:fldChar w:fldCharType="separate"/>
+      </w:r>
+      <w:r>
+        <w:t xml:space="preserve">Figure </w:t>
+      </w:r>
+      <w:r>
+        <w:rPr>
+          <w:noProof/>
+        </w:rPr>
+        <w:t>7</w:t>
+      </w:r>
+      <w:r>
+        <w:fldChar w:fldCharType="end"/>
+      </w:r>
+      <w:r>
+        <w:t xml:space="preserve">. </w:t>
+      </w:r>
+    </w:p>
+    <w:p>
+      <w:pPr>
+        <w:pStyle w:val="Heading2"/>
+      </w:pPr>
+      <w:r>
+        <w:t>Code</w:t>
+      </w:r>
+    </w:p>
+    <w:p>
+      <w:pPr>
+        <w:pStyle w:val="Pseoudocode"/>
+        <w:rPr>
+          <w:lang w:val="en-AT"/>
+        </w:rPr>
+      </w:pPr>
+      <w:r>
+        <w:rPr>
+          <w:lang w:val="en-AT"/>
+        </w:rPr>
+        <w:t>private int[] reverseArray(int[] array)</w:t>
+      </w:r>
+      <w:r>
+        <w:rPr>
+          <w:lang w:val="en-AT"/>
+        </w:rPr>
+        <w:br/>
+        <w:t>{</w:t>
+      </w:r>
+      <w:r>
+        <w:rPr>
+          <w:lang w:val="en-AT"/>
+        </w:rPr>
+        <w:br/>
+        <w:t xml:space="preserve">    int[] arrayCopy = Arrays.</w:t>
+      </w:r>
+      <w:r>
+        <w:rPr>
+          <w:i/>
+          <w:iCs/>
+          <w:lang w:val="en-AT"/>
+        </w:rPr>
+        <w:t>copyOf</w:t>
+      </w:r>
+      <w:r>
+        <w:rPr>
+          <w:lang w:val="en-AT"/>
+        </w:rPr>
+        <w:t>(array, array.length);</w:t>
+      </w:r>
+      <w:r>
+        <w:rPr>
+          <w:lang w:val="en-AT"/>
+        </w:rPr>
+        <w:br/>
+      </w:r>
+      <w:r>
+        <w:rPr>
+          <w:lang w:val="en-AT"/>
+        </w:rPr>
+        <w:br/>
+        <w:t xml:space="preserve">    int temp;</w:t>
+      </w:r>
+      <w:r>
+        <w:rPr>
+          <w:lang w:val="en-AT"/>
+        </w:rPr>
+        <w:br/>
+      </w:r>
+      <w:r>
+        <w:rPr>
+          <w:lang w:val="en-AT"/>
+        </w:rPr>
+        <w:br/>
+        <w:t xml:space="preserve">    for (int i = 0; i &lt; arrayCopy.length / 2; i++)</w:t>
+      </w:r>
+      <w:r>
+        <w:rPr>
+          <w:lang w:val="en-AT"/>
+        </w:rPr>
+        <w:br/>
+        <w:t xml:space="preserve">    {</w:t>
+      </w:r>
+      <w:r>
+        <w:rPr>
+          <w:lang w:val="en-AT"/>
+        </w:rPr>
+        <w:br/>
+        <w:t xml:space="preserve">        temp = arrayCopy[i];</w:t>
+      </w:r>
+      <w:r>
+        <w:rPr>
+          <w:lang w:val="en-AT"/>
+        </w:rPr>
+        <w:br/>
+        <w:t xml:space="preserve">        arrayCopy[i] = arrayCopy[arrayCopy.length - 1 - i];</w:t>
+      </w:r>
+      <w:r>
+        <w:rPr>
+          <w:lang w:val="en-AT"/>
+        </w:rPr>
+        <w:br/>
+        <w:t xml:space="preserve">        arrayCopy[arrayCopy.length - 1 - i] = temp;</w:t>
+      </w:r>
+      <w:r>
+        <w:rPr>
+          <w:lang w:val="en-AT"/>
+        </w:rPr>
+        <w:br/>
+        <w:t xml:space="preserve">    }</w:t>
+      </w:r>
+      <w:r>
+        <w:rPr>
+          <w:lang w:val="en-AT"/>
+        </w:rPr>
+        <w:br/>
+      </w:r>
+      <w:r>
+        <w:rPr>
+          <w:lang w:val="en-AT"/>
+        </w:rPr>
+        <w:br/>
+      </w:r>
+      <w:r>
+        <w:rPr>
+          <w:lang w:val="en-AT"/>
+        </w:rPr>
+        <w:lastRenderedPageBreak/>
+        <w:t xml:space="preserve">    return arrayCopy;</w:t>
+      </w:r>
+      <w:r>
+        <w:rPr>
+          <w:lang w:val="en-AT"/>
+        </w:rPr>
+        <w:br/>
+        <w:t>}</w:t>
+      </w:r>
+    </w:p>
+    <w:p>
+      <w:pPr>
+        <w:pStyle w:val="Caption"/>
+        <w:rPr>
+          <w:lang w:val="en-AT"/>
+        </w:rPr>
+      </w:pPr>
+      <w:bookmarkStart w:id="3" w:name="_Ref215077202"/>
+      <w:r>
+        <w:t xml:space="preserve">Figure </w:t>
+      </w:r>
+      <w:r>
+        <w:fldChar w:fldCharType="begin"/>
+      </w:r>
+      <w:r>
+        <w:instrText xml:space="preserve"> SEQ Figure \* ARABIC </w:instrText>
+      </w:r>
+      <w:r>
+        <w:fldChar w:fldCharType="separate"/>
+      </w:r>
+      <w:r>
+        <w:rPr>
+          <w:noProof/>
+        </w:rPr>
+        <w:t>7</w:t>
+      </w:r>
+      <w:r>
+        <w:fldChar w:fldCharType="end"/>
+      </w:r>
+      <w:bookmarkEnd w:id="3"/>
+      <w:r>
+        <w:t>: reverseArray</w:t>
+      </w:r>
+    </w:p>
+    <w:p>
+      <w:pPr>
+        <w:pStyle w:val="Heading2"/>
+      </w:pPr>
+      <w:r>
+        <w:t>Test</w:t>
+      </w:r>
+    </w:p>
+    <w:p>
+      <w:pPr>
+        <w:pStyle w:val="Pseoudocode"/>
+        <w:rPr>
+          <w:lang w:val="en-AT"/>
+        </w:rPr>
+      </w:pPr>
+      <w:r>
+        <w:rPr>
+          <w:lang w:val="en-AT"/>
+        </w:rPr>
+        <w:t>@Test</w:t>
+      </w:r>
+      <w:r>
+        <w:rPr>
+          <w:lang w:val="en-AT"/>
+        </w:rPr>
+        <w:br/>
+        <w:t>void testArrayReversalOdd()</w:t>
+      </w:r>
+      <w:r>
+        <w:rPr>
+          <w:lang w:val="en-AT"/>
+        </w:rPr>
+        <w:br/>
+        <w:t>{</w:t>
+      </w:r>
+      <w:r>
+        <w:rPr>
+          <w:lang w:val="en-AT"/>
+        </w:rPr>
+        <w:br/>
+        <w:t xml:space="preserve">    int[] inputArray = {10, 20, 30, 40, 50};</w:t>
+      </w:r>
+      <w:r>
+        <w:rPr>
+          <w:lang w:val="en-AT"/>
+        </w:rPr>
+        <w:br/>
+      </w:r>
+      <w:r>
+        <w:rPr>
+          <w:lang w:val="en-AT"/>
+        </w:rPr>
+        <w:br/>
+        <w:t xml:space="preserve">    ArrayReversalExercise excercise = new ArrayReversalExercise(inputArray);</w:t>
+      </w:r>
+      <w:r>
+        <w:rPr>
+          <w:lang w:val="en-AT"/>
+        </w:rPr>
+        <w:br/>
+      </w:r>
+      <w:r>
+        <w:rPr>
+          <w:lang w:val="en-AT"/>
+        </w:rPr>
+        <w:br/>
+        <w:t xml:space="preserve">    excercise.runExcercise();</w:t>
+      </w:r>
+      <w:r>
+        <w:rPr>
+          <w:lang w:val="en-AT"/>
+        </w:rPr>
+        <w:br/>
+      </w:r>
+      <w:r>
+        <w:rPr>
+          <w:lang w:val="en-AT"/>
+        </w:rPr>
+        <w:br/>
+        <w:t xml:space="preserve">    int[] reversedArray = excercise.getReversedArray();</w:t>
+      </w:r>
+      <w:r>
+        <w:rPr>
+          <w:lang w:val="en-AT"/>
+        </w:rPr>
+        <w:br/>
+      </w:r>
+      <w:r>
+        <w:rPr>
+          <w:lang w:val="en-AT"/>
+        </w:rPr>
+        <w:br/>
+        <w:t xml:space="preserve">    int[] expectedArray = {50, 40, 30, 20, 10};</w:t>
+      </w:r>
+      <w:r>
+        <w:rPr>
+          <w:lang w:val="en-AT"/>
+        </w:rPr>
+        <w:br/>
+      </w:r>
+      <w:r>
+        <w:rPr>
+          <w:lang w:val="en-AT"/>
+        </w:rPr>
+        <w:br/>
+        <w:t xml:space="preserve">    for (int i = 0; i &lt; expectedArray.length; i++)</w:t>
+      </w:r>
+      <w:r>
+        <w:rPr>
+          <w:lang w:val="en-AT"/>
+        </w:rPr>
+        <w:br/>
+        <w:t xml:space="preserve">    {</w:t>
+      </w:r>
+      <w:r>
+        <w:rPr>
+          <w:lang w:val="en-AT"/>
+        </w:rPr>
+        <w:br/>
+        <w:t xml:space="preserve">        assert(reversedArray[i] == expectedArray[i]);</w:t>
+      </w:r>
+      <w:r>
+        <w:rPr>
+          <w:lang w:val="en-AT"/>
+        </w:rPr>
+        <w:br/>
+        <w:t xml:space="preserve">    }</w:t>
+      </w:r>
+      <w:r>
+        <w:rPr>
+          <w:lang w:val="en-AT"/>
+        </w:rPr>
+        <w:br/>
+        <w:t>}</w:t>
+      </w:r>
+    </w:p>
+    <w:p>
+      <w:pPr>
+        <w:pStyle w:val="Caption"/>
+      </w:pPr>
+      <w:r>
+        <w:t xml:space="preserve">Figure </w:t>
+      </w:r>
+      <w:r>
+        <w:fldChar w:fldCharType="begin"/>
+      </w:r>
+      <w:r>
+        <w:instrText xml:space="preserve"> SEQ Figure \* ARABIC </w:instrText>
+      </w:r>
+      <w:r>
+        <w:fldChar w:fldCharType="separate"/>
+      </w:r>
+      <w:r>
+        <w:rPr>
+          <w:noProof/>
+        </w:rPr>
+        <w:t>8</w:t>
+      </w:r>
+      <w:r>
+        <w:fldChar w:fldCharType="end"/>
+      </w:r>
+      <w:r>
+        <w:t>: array reversal test</w:t>
+      </w:r>
+    </w:p>
+    <w:p>
+      <w:pPr>
+        <w:pStyle w:val="Pseoudocode"/>
+      </w:pPr>
+      <w:r>
+        <w:t>=== Array Reversal ===</w:t>
+      </w:r>
+    </w:p>
+    <w:p>
+      <w:pPr>
+        <w:pStyle w:val="Pseoudocode"/>
+      </w:pPr>
+      <w:r>
+        <w:t>Original Array: [10, 20, 30, 40, 50]</w:t>
+      </w:r>
+    </w:p>
+    <w:p>
+      <w:pPr>
+        <w:pStyle w:val="Pseoudocode"/>
+      </w:pPr>
+      <w:r>
+        <w:t>Reversed Array: [50, 40, 30, 20, 10]</w:t>
+      </w:r>
+    </w:p>
+    <w:p>
+      <w:pPr>
+        <w:pStyle w:val="Caption"/>
+      </w:pPr>
+      <w:r>
+        <w:t xml:space="preserve">Figure </w:t>
+      </w:r>
+      <w:r>
+        <w:fldChar w:fldCharType="begin"/>
+      </w:r>
+      <w:r>
+        <w:instrText xml:space="preserve"> SEQ Figure \* ARABIC </w:instrText>
+      </w:r>
+      <w:r>
+        <w:fldChar w:fldCharType="separate"/>
+      </w:r>
+      <w:r>
+        <w:rPr>
+          <w:noProof/>
+        </w:rPr>
+        <w:t>9</w:t>
+      </w:r>
+      <w:r>
+        <w:fldChar w:fldCharType="end"/>
+      </w:r>
+      <w:r>
+        <w:t>: array reversal test output</w:t>
+      </w:r>
+    </w:p>
+    <w:p>
+      <w:r>
+        <w:rPr>
+          <w:noProof/>
+        </w:rPr>
+        <mc:AlternateContent>
+          <mc:Choice Requires="wps">
+            <w:drawing>
+              <wp:anchor distT="0" distB="0" distL="114300" distR="114300" simplePos="0" relativeHeight="251667456" behindDoc="0" locked="0" layoutInCell="1" allowOverlap="1" wp14:anchorId="4EA9A3CA" wp14:editId="14E53FA3">
+                <wp:simplePos x="0" y="0"/>
+                <wp:positionH relativeFrom="column">
+                  <wp:posOffset>1115060</wp:posOffset>
+                </wp:positionH>
+                <wp:positionV relativeFrom="paragraph">
+                  <wp:posOffset>1100455</wp:posOffset>
+                </wp:positionV>
+                <wp:extent cx="2952750" cy="635"/>
+                <wp:effectExtent l="0" t="0" r="0" b="0"/>
+                <wp:wrapTopAndBottom/>
+                <wp:docPr id="1221396085" name="Text Box 1"/>
+                <wp:cNvGraphicFramePr/>
+                <a:graphic xmlns:a="http://schemas.openxmlformats.org/drawingml/2006/main">
+                  <a:graphicData uri="http://schemas.microsoft.com/office/word/2010/wordprocessingShape">
+                    <wps:wsp>
+                      <wps:cNvSpPr txBox="1"/>
+                      <wps:spPr>
+                        <a:xfrm>
+                          <a:off x="0" y="0"/>
+                          <a:ext cx="2952750" cy="635"/>
+                        </a:xfrm>
+                        <a:prstGeom prst="rect">
+                          <a:avLst/>
+                        </a:prstGeom>
+                        <a:solidFill>
+                          <a:prstClr val="white"/>
+                        </a:solidFill>
+                        <a:ln>
+                          <a:noFill/>
+                        </a:ln>
+                      </wps:spPr>
+                      <wps:txbx>
+                        <w:txbxContent>
+                          <w:p>
+                            <w:pPr>
+                              <w:pStyle w:val="Caption"/>
+                            </w:pPr>
+                            <w:r>
+                              <w:t xml:space="preserve">Figure </w:t>
+                            </w:r>
+                            <w:r>
+                              <w:fldChar w:fldCharType="begin"/>
+                            </w:r>
+                            <w:r>
+                              <w:instrText xml:space="preserve"> SEQ Figure \* ARABIC </w:instrText>
+                            </w:r>
+                            <w:r>
+                              <w:fldChar w:fldCharType="separate"/>
+                            </w:r>
+                            <w:r>
+                              <w:rPr>
+                                <w:noProof/>
+                              </w:rPr>
+                              <w:t>10</w:t>
+                            </w:r>
+                            <w:r>
+                              <w:fldChar w:fldCharType="end"/>
+                            </w:r>
+                            <w:r>
+                              <w:t>: array reversal unit tests</w:t>
+                            </w:r>
+                          </w:p>
+                        </w:txbxContent>
+                      </wps:txbx>
+                      <wps:bodyPr rot="0" spcFirstLastPara="0" vertOverflow="overflow" horzOverflow="overflow" vert="horz" wrap="square" lIns="0" tIns="0" rIns="0" bIns="0" numCol="1" spcCol="0" rtlCol="0" fromWordArt="0" anchor="t" anchorCtr="0" forceAA="0" compatLnSpc="1">
+                        <a:prstTxWarp prst="textNoShape">
+                          <a:avLst/>
+                        </a:prstTxWarp>
+                        <a:spAutoFit/>
+                      </wps:bodyPr>
+                    </wps:wsp>
+                  </a:graphicData>
+                </a:graphic>
+              </wp:anchor>
+            </w:drawing>
+          </mc:Choice>
+          <mc:Fallback>
+            <w:pict>
+              <v:shape w14:anchorId="4EA9A3CA" id="_x0000_s1029" type="#_x0000_t202" style="position:absolute;left:0;text-align:left;margin-left:87.8pt;margin-top:86.65pt;width:232.5pt;height:.05pt;z-index:251667456;visibility:visible;mso-wrap-style:square;mso-wrap-distance-left:9pt;mso-wrap-distance-top:0;mso-wrap-distance-right:9pt;mso-wrap-distance-bottom:0;mso-position-horizontal:absolute;mso-position-horizontal-relative:text;mso-position-vertical:absolute;mso-position-vertical-relative:text;v-text-anchor:top" o:gfxdata="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" stroked="f">
+                <v:textbox style="mso-fit-shape-to-text:t" inset="0,0,0,0">
+                  <w:txbxContent>
+                    <w:p>
+                      <w:pPr>
+                        <w:pStyle w:val="Caption"/>
+                      </w:pPr>
+                      <w:r>
+                        <w:t xml:space="preserve">Figure </w:t>
+                      </w:r>
+                      <w:r>
+                        <w:fldChar w:fldCharType="begin"/>
+                      </w:r>
+                      <w:r>
+                        <w:instrText xml:space="preserve"> SEQ Figure \* ARABIC </w:instrText>
+                      </w:r>
+                      <w:r>
+                        <w:fldChar w:fldCharType="separate"/>
+                      </w:r>
+                      <w:r>
+                        <w:rPr>
+                          <w:noProof/>
+                        </w:rPr>
+                        <w:t>10</w:t>
+                      </w:r>
+                      <w:r>
+                        <w:fldChar w:fldCharType="end"/>
+                      </w:r>
+                      <w:r>
+                        <w:t>: array reversal unit tests</w:t>
+                      </w:r>
+                    </w:p>
+                  </w:txbxContent>
+                </v:textbox>
+                <w10:wrap type="topAndBottom"/>
+              </v:shape>
+            </w:pict>
+          </mc:Fallback>
+        </mc:AlternateContent>
+      </w:r>
+      <w:r>
+        <w:drawing>
+          <wp:anchor distT="0" distB="0" distL="114300" distR="114300" simplePos="0" relativeHeight="251665408" behindDoc="0" locked="0" layoutInCell="1" allowOverlap="1" wp14:anchorId="32442BD6" wp14:editId="5F238951">
+            <wp:simplePos x="0" y="0"/>
+            <wp:positionH relativeFrom="margin">
+              <wp:align>center</wp:align>
+            </wp:positionH>
+            <wp:positionV relativeFrom="paragraph">
+              <wp:posOffset>186547</wp:posOffset>
+            </wp:positionV>
+            <wp:extent cx="2953162" cy="857370"/>
+            <wp:effectExtent l="0" t="0" r="0" b="0"/>
+            <wp:wrapTopAndBottom/>
+            <wp:docPr id="1676468341" name="Picture 1" descr="A screenshot of a computer&#10;&#10;AI-generated content may be incorrect."/>
+            <wp:cNvGraphicFramePr>
+              <a:graphicFrameLocks xmlns:a="http://schemas.openxmlformats.org/drawingml/2006/main" noChangeAspect="1"/>
+            </wp:cNvGraphicFramePr>
+            <a:graphic xmlns:a="http://schemas.openxmlformats.org/drawingml/2006/main">
+              <a:graphicData uri="http://schemas.openxmlformats.org/drawingml/2006/picture">
+                <pic:pic xmlns:pic="http://schemas.openxmlformats.org/drawingml/2006/picture">
+                  <pic:nvPicPr>
+                    <pic:cNvPr id="1676468341" name="Picture 1" descr="A screenshot of a computer&#10;&#10;AI-generated content may be incorrect."/>
+                    <pic:cNvPicPr/>
+                  </pic:nvPicPr>
+                  <pic:blipFill>
+                    <a:blip r:embed="rId9">
+                      <a:extLst>
+                        <a:ext uri="{28A0092B-C50C-407E-A947-70E740481C1C}">
+                          <a14:useLocalDpi xmlns:a14="http://schemas.microsoft.com/office/drawing/2010/main" val="0"/>
+                        </a:ext>
+                      </a:extLst>
+                    </a:blip>
+                    <a:stretch>
+                      <a:fillRect/>
+                    </a:stretch>
+                  </pic:blipFill>
+                  <pic:spPr>
+                    <a:xfrm>
+                      <a:off x="0" y="0"/>
+                      <a:ext cx="2953162" cy="857370"/>
+                    </a:xfrm>
+                    <a:prstGeom prst="rect">
+                      <a:avLst/>
+                    </a:prstGeom>
+                  </pic:spPr>
+                </pic:pic>
+              </a:graphicData>
+            </a:graphic>
+          </wp:anchor>
+        </w:drawing>
+      </w:r>
+    </w:p>
+    <w:p/>
     <w:sectPr>
-      <w:headerReference w:type="default" r:id="rId8"/>
-      <w:footerReference w:type="default" r:id="rId9"/>
-      <w:headerReference w:type="first" r:id="rId10"/>
+      <w:headerReference w:type="default" r:id="rId10"/>
+      <w:footerReference w:type="default" r:id="rId11"/>
+      <w:headerReference w:type="first" r:id="rId12"/>
       <w:pgSz w:w="11906" w:h="16838"/>
       <w:pgMar w:top="1872" w:right="1872" w:bottom="1872" w:left="1872" w:header="706" w:footer="706" w:gutter="0"/>
       <w:pgNumType w:start="0"/>
@@ -888,6 +2486,92 @@
     </w:lvl>
   </w:abstractNum>
   <w:abstractNum w:abstractNumId="1" w15:restartNumberingAfterBreak="0">
+    <w:nsid w:val="33C25D2F"/>
+    <w:multiLevelType w:val="hybridMultilevel"/>
+    <w:tmpl w:val="3F2CFF94"/>
+    <w:lvl w:ilvl="0" w:tplc="2000000F">
+      <w:start w:val="1"/>
+      <w:numFmt w:val="decimal"/>
+      <w:lvlText w:val="%1."/>
+      <w:lvlJc w:val="left"/>
+      <w:pPr>
+        <w:ind w:left="720" w:hanging="360"/>
+      </w:pPr>
+    </w:lvl>
+    <w:lvl w:ilvl="1" w:tplc="20000019" w:tentative="1">
+      <w:start w:val="1"/>
+      <w:numFmt w:val="lowerLetter"/>
+      <w:lvlText w:val="%2."/>
+      <w:lvlJc w:val="left"/>
+      <w:pPr>
+        <w:ind w:left="1440" w:hanging="360"/>
+      </w:pPr>
+    </w:lvl>
+    <w:lvl w:ilvl="2" w:tplc="2000001B" w:tentative="1">
+      <w:start w:val="1"/>
+      <w:numFmt w:val="lowerRoman"/>
+      <w:lvlText w:val="%3."/>
+      <w:lvlJc w:val="right"/>
+      <w:pPr>
+        <w:ind w:left="2160" w:hanging="180"/>
+      </w:pPr>
+    </w:lvl>
+    <w:lvl w:ilvl="3" w:tplc="2000000F" w:tentative="1">
+      <w:start w:val="1"/>
+      <w:numFmt w:val="decimal"/>
+      <w:lvlText w:val="%4."/>
+      <w:lvlJc w:val="left"/>
+      <w:pPr>
+        <w:ind w:left="2880" w:hanging="360"/>
+      </w:pPr>
+    </w:lvl>
+    <w:lvl w:ilvl="4" w:tplc="20000019" w:tentative="1">
+      <w:start w:val="1"/>
+      <w:numFmt w:val="lowerLetter"/>
+      <w:lvlText w:val="%5."/>
+      <w:lvlJc w:val="left"/>
+      <w:pPr>
+        <w:ind w:left="3600" w:hanging="360"/>
+      </w:pPr>
+    </w:lvl>
+    <w:lvl w:ilvl="5" w:tplc="2000001B" w:tentative="1">
+      <w:start w:val="1"/>
+      <w:numFmt w:val="lowerRoman"/>
+      <w:lvlText w:val="%6."/>
+      <w:lvlJc w:val="right"/>
+      <w:pPr>
+        <w:ind w:left="4320" w:hanging="180"/>
+      </w:pPr>
+    </w:lvl>
+    <w:lvl w:ilvl="6" w:tplc="2000000F" w:tentative="1">
+      <w:start w:val="1"/>
+      <w:numFmt w:val="decimal"/>
+      <w:lvlText w:val="%7."/>
+      <w:lvlJc w:val="left"/>
+      <w:pPr>
+        <w:ind w:left="5040" w:hanging="360"/>
+      </w:pPr>
+    </w:lvl>
+    <w:lvl w:ilvl="7" w:tplc="20000019" w:tentative="1">
+      <w:start w:val="1"/>
+      <w:numFmt w:val="lowerLetter"/>
+      <w:lvlText w:val="%8."/>
+      <w:lvlJc w:val="left"/>
+      <w:pPr>
+        <w:ind w:left="5760" w:hanging="360"/>
+      </w:pPr>
+    </w:lvl>
+    <w:lvl w:ilvl="8" w:tplc="2000001B" w:tentative="1">
+      <w:start w:val="1"/>
+      <w:numFmt w:val="lowerRoman"/>
+      <w:lvlText w:val="%9."/>
+      <w:lvlJc w:val="right"/>
+      <w:pPr>
+        <w:ind w:left="6480" w:hanging="180"/>
+      </w:pPr>
+    </w:lvl>
+  </w:abstractNum>
+  <w:abstractNum w:abstractNumId="2" w15:restartNumberingAfterBreak="0">
     <w:nsid w:val="398311D0"/>
     <w:multiLevelType w:val="hybridMultilevel"/>
     <w:tmpl w:val="38C2D666"/>
@@ -1000,7 +2684,7 @@
       </w:rPr>
     </w:lvl>
   </w:abstractNum>
-  <w:abstractNum w:abstractNumId="2" w15:restartNumberingAfterBreak="0">
+  <w:abstractNum w:abstractNumId="3" w15:restartNumberingAfterBreak="0">
     <w:nsid w:val="3DEE1232"/>
     <w:multiLevelType w:val="hybridMultilevel"/>
     <w:tmpl w:val="57F83F06"/>
@@ -1089,7 +2773,7 @@
       </w:pPr>
     </w:lvl>
   </w:abstractNum>
-  <w:abstractNum w:abstractNumId="3" w15:restartNumberingAfterBreak="0">
+  <w:abstractNum w:abstractNumId="4" w15:restartNumberingAfterBreak="0">
     <w:nsid w:val="40996A2C"/>
     <w:multiLevelType w:val="hybridMultilevel"/>
     <w:tmpl w:val="AB8CAF66"/>
@@ -1202,7 +2886,7 @@
       </w:rPr>
     </w:lvl>
   </w:abstractNum>
-  <w:abstractNum w:abstractNumId="4" w15:restartNumberingAfterBreak="0">
+  <w:abstractNum w:abstractNumId="5" w15:restartNumberingAfterBreak="0">
     <w:nsid w:val="515A3E0F"/>
     <w:multiLevelType w:val="hybridMultilevel"/>
     <w:tmpl w:val="2CEE2032"/>
@@ -1291,7 +2975,7 @@
       </w:pPr>
     </w:lvl>
   </w:abstractNum>
-  <w:abstractNum w:abstractNumId="5" w15:restartNumberingAfterBreak="0">
+  <w:abstractNum w:abstractNumId="6" w15:restartNumberingAfterBreak="0">
     <w:nsid w:val="5FB1649B"/>
     <w:multiLevelType w:val="hybridMultilevel"/>
     <w:tmpl w:val="FAA8C06C"/>
@@ -1405,22 +3089,25 @@
     </w:lvl>
   </w:abstractNum>
   <w:num w:numId="1" w16cid:durableId="94404181">
-    <w:abstractNumId w:val="4"/>
+    <w:abstractNumId w:val="5"/>
   </w:num>
   <w:num w:numId="2" w16cid:durableId="316106527">
-    <w:abstractNumId w:val="2"/>
+    <w:abstractNumId w:val="3"/>
   </w:num>
   <w:num w:numId="3" w16cid:durableId="1032145165">
     <w:abstractNumId w:val="0"/>
   </w:num>
   <w:num w:numId="4" w16cid:durableId="1454789265">
-    <w:abstractNumId w:val="1"/>
+    <w:abstractNumId w:val="2"/>
   </w:num>
   <w:num w:numId="5" w16cid:durableId="1128742110">
-    <w:abstractNumId w:val="5"/>
+    <w:abstractNumId w:val="6"/>
   </w:num>
   <w:num w:numId="6" w16cid:durableId="1120487733">
-    <w:abstractNumId w:val="3"/>
+    <w:abstractNumId w:val="4"/>
+  </w:num>
+  <w:num w:numId="7" w16cid:durableId="412552527">
+    <w:abstractNumId w:val="1"/>
   </w:num>
 </w:numbering>
 </file>
@@ -2040,7 +3727,6 @@
   <w:style w:type="character" w:default="1" w:styleId="DefaultParagraphFont">
     <w:name w:val="Default Paragraph Font"/>
     <w:uiPriority w:val="1"/>
-    <w:semiHidden/>
     <w:unhideWhenUsed/>
   </w:style>
   <w:style w:type="table" w:default="1" w:styleId="TableNormal">

</xml_diff>

<commit_message>
Add fuzzy search exercise with result record and tests
Implemented FuzzySearchExercise to find exact or closest value in an array, including a FuzzySearchResult record for encapsulating results. Updated Main to demonstrate the new exercise and added unit tests for both exact and closest match scenarios.
</commit_message>
<xml_diff>
--- a/Modules/Semester_1/Modern Code/Aufgaben/04_Arrays_and_Algorithms/Protocol.docx
+++ b/Modules/Semester_1/Modern Code/Aufgaben/04_Arrays_and_Algorithms/Protocol.docx
@@ -277,8 +277,13 @@
                                 <w:r>
                                   <w:tab/>
                                 </w:r>
+                                <w:proofErr w:type="gramStart"/>
                                 <w:r>
-                                  <w:t>XX:XX:XX</w:t>
+                                  <w:t>XX:XX</w:t>
+                                </w:r>
+                                <w:proofErr w:type="gramEnd"/>
+                                <w:r>
+                                  <w:t>:XX</w:t>
                                 </w:r>
                               </w:p>
                             </w:txbxContent>
@@ -380,8 +385,13 @@
                           <w:r>
                             <w:tab/>
                           </w:r>
+                          <w:proofErr w:type="gramStart"/>
                           <w:r>
-                            <w:t>XX:XX:XX</w:t>
+                            <w:t>XX:XX</w:t>
+                          </w:r>
+                          <w:proofErr w:type="gramEnd"/>
+                          <w:r>
+                            <w:t>:XX</w:t>
                           </w:r>
                         </w:p>
                       </w:txbxContent>
@@ -679,7 +689,15 @@
     </w:p>
     <w:p>
       <w:r>
-        <w:t xml:space="preserve">Calculating the mean only requires calculating the sum and then dividing by the length of the array. Before dividing, either the sum or the length should be </w:t>
+        <w:t xml:space="preserve">Calculating the </w:t>
+      </w:r>
+      <w:proofErr w:type="gramStart"/>
+      <w:r>
+        <w:t>mean</w:t>
+      </w:r>
+      <w:proofErr w:type="gramEnd"/>
+      <w:r>
+        <w:t xml:space="preserve"> only requires calculating the sum and then dividing by the length of the array. Before dividing, either the sum or the length should be </w:t>
       </w:r>
       <w:r>
         <w:t>cast</w:t>
@@ -725,10 +743,7 @@
         <w:t>Minimum</w:t>
       </w:r>
       <w:r>
-        <w:t xml:space="preserve"> and </w:t>
-      </w:r>
-      <w:r>
-        <w:t>Maximum</w:t>
+        <w:t xml:space="preserve"> and Maximum</w:t>
       </w:r>
     </w:p>
     <w:p>
@@ -756,8 +771,34 @@
       <w:pPr>
         <w:pStyle w:val="Pseoudocode"/>
       </w:pPr>
-      <w:r>
-        <w:t>public void calculateMean()</w:t>
+      <w:proofErr w:type="gramStart"/>
+      <w:r>
+        <w:t>public</w:t>
+      </w:r>
+      <w:proofErr w:type="gramEnd"/>
+      <w:r>
+        <w:t xml:space="preserve"> </w:t>
+      </w:r>
+      <w:proofErr w:type="spellStart"/>
+      <w:r>
+        <w:t>void</w:t>
+      </w:r>
+      <w:proofErr w:type="spellEnd"/>
+      <w:r>
+        <w:t xml:space="preserve"> </w:t>
+      </w:r>
+      <w:proofErr w:type="spellStart"/>
+      <w:proofErr w:type="gramStart"/>
+      <w:r>
+        <w:t>calculateMean</w:t>
+      </w:r>
+      <w:proofErr w:type="spellEnd"/>
+      <w:r>
+        <w:t>(</w:t>
+      </w:r>
+      <w:proofErr w:type="gramEnd"/>
+      <w:r>
+        <w:t>)</w:t>
       </w:r>
       <w:r>
         <w:br/>
@@ -765,37 +806,152 @@
       </w:r>
       <w:r>
         <w:br/>
-        <w:t xml:space="preserve">    int sum = 0;</w:t>
-      </w:r>
-      <w:r>
-        <w:br/>
-      </w:r>
-      <w:r>
-        <w:br/>
-        <w:t xml:space="preserve">    for (int num : getInputArray())</w:t>
-      </w:r>
-      <w:r>
-        <w:br/>
-        <w:t xml:space="preserve">    {</w:t>
-      </w:r>
-      <w:r>
-        <w:br/>
-        <w:t xml:space="preserve">        sum += num;</w:t>
-      </w:r>
+        <w:t xml:space="preserve">    </w:t>
+      </w:r>
+      <w:proofErr w:type="spellStart"/>
+      <w:r>
+        <w:t>int</w:t>
+      </w:r>
+      <w:proofErr w:type="spellEnd"/>
+      <w:r>
+        <w:t xml:space="preserve"> </w:t>
+      </w:r>
+      <w:proofErr w:type="spellStart"/>
+      <w:r>
+        <w:t>sum</w:t>
+      </w:r>
+      <w:proofErr w:type="spellEnd"/>
+      <w:r>
+        <w:t xml:space="preserve"> = </w:t>
+      </w:r>
+      <w:proofErr w:type="gramStart"/>
+      <w:r>
+        <w:t>0;</w:t>
+      </w:r>
+      <w:proofErr w:type="gramEnd"/>
+      <w:r>
+        <w:br/>
+      </w:r>
+      <w:r>
+        <w:br/>
+        <w:t xml:space="preserve">    for (</w:t>
+      </w:r>
+      <w:proofErr w:type="spellStart"/>
+      <w:r>
+        <w:t>int</w:t>
+      </w:r>
+      <w:proofErr w:type="spellEnd"/>
+      <w:r>
+        <w:t xml:space="preserve"> </w:t>
+      </w:r>
+      <w:proofErr w:type="spellStart"/>
+      <w:r>
+        <w:t>num</w:t>
+      </w:r>
+      <w:proofErr w:type="spellEnd"/>
+      <w:r>
+        <w:t xml:space="preserve"> : </w:t>
+      </w:r>
+      <w:proofErr w:type="spellStart"/>
+      <w:proofErr w:type="gramStart"/>
+      <w:r>
+        <w:t>getInputArray</w:t>
+      </w:r>
+      <w:proofErr w:type="spellEnd"/>
+      <w:r>
+        <w:t>(</w:t>
+      </w:r>
+      <w:proofErr w:type="gramEnd"/>
+      <w:r>
+        <w:t>))</w:t>
+      </w:r>
+      <w:r>
+        <w:br/>
+        <w:t xml:space="preserve"> </w:t>
+      </w:r>
+      <w:proofErr w:type="gramStart"/>
+      <w:r>
+        <w:t xml:space="preserve">   {</w:t>
+      </w:r>
+      <w:proofErr w:type="gramEnd"/>
+      <w:r>
+        <w:br/>
+        <w:t xml:space="preserve">        </w:t>
+      </w:r>
+      <w:proofErr w:type="spellStart"/>
+      <w:r>
+        <w:t>sum</w:t>
+      </w:r>
+      <w:proofErr w:type="spellEnd"/>
+      <w:r>
+        <w:t xml:space="preserve"> += </w:t>
+      </w:r>
+      <w:proofErr w:type="spellStart"/>
+      <w:proofErr w:type="gramStart"/>
+      <w:r>
+        <w:t>num</w:t>
+      </w:r>
+      <w:proofErr w:type="spellEnd"/>
+      <w:r>
+        <w:t>;</w:t>
+      </w:r>
+      <w:proofErr w:type="gramEnd"/>
       <w:r>
         <w:br/>
       </w:r>
       <w:r>
         <w:lastRenderedPageBreak/>
-        <w:t xml:space="preserve">    }</w:t>
-      </w:r>
-      <w:r>
-        <w:br/>
-      </w:r>
-      <w:r>
-        <w:br/>
-        <w:t xml:space="preserve">    setMean((double) sum / getInputArray().length);</w:t>
-      </w:r>
+        <w:t xml:space="preserve">  </w:t>
+      </w:r>
+      <w:proofErr w:type="gramStart"/>
+      <w:r>
+        <w:t xml:space="preserve">  }</w:t>
+      </w:r>
+      <w:proofErr w:type="gramEnd"/>
+      <w:r>
+        <w:br/>
+      </w:r>
+      <w:r>
+        <w:br/>
+        <w:t xml:space="preserve">    </w:t>
+      </w:r>
+      <w:proofErr w:type="spellStart"/>
+      <w:r>
+        <w:t>setMean</w:t>
+      </w:r>
+      <w:proofErr w:type="spellEnd"/>
+      <w:r>
+        <w:t xml:space="preserve">((double) </w:t>
+      </w:r>
+      <w:proofErr w:type="spellStart"/>
+      <w:r>
+        <w:t>sum</w:t>
+      </w:r>
+      <w:proofErr w:type="spellEnd"/>
+      <w:r>
+        <w:t xml:space="preserve"> / </w:t>
+      </w:r>
+      <w:proofErr w:type="spellStart"/>
+      <w:r>
+        <w:t>getInputArray</w:t>
+      </w:r>
+      <w:proofErr w:type="spellEnd"/>
+      <w:r>
+        <w:t>(</w:t>
+      </w:r>
+      <w:proofErr w:type="gramStart"/>
+      <w:r>
+        <w:t>).</w:t>
+      </w:r>
+      <w:proofErr w:type="spellStart"/>
+      <w:r>
+        <w:t>length</w:t>
+      </w:r>
+      <w:proofErr w:type="spellEnd"/>
+      <w:r>
+        <w:t>);</w:t>
+      </w:r>
+      <w:proofErr w:type="gramEnd"/>
       <w:r>
         <w:br/>
         <w:t>}</w:t>
@@ -832,8 +988,13 @@
       </w:r>
       <w:bookmarkEnd w:id="2"/>
       <w:r>
-        <w:t>: calculateMean</w:t>
-      </w:r>
+        <w:t xml:space="preserve">: </w:t>
+      </w:r>
+      <w:proofErr w:type="spellStart"/>
+      <w:r>
+        <w:t>calculateMean</w:t>
+      </w:r>
+      <w:proofErr w:type="spellEnd"/>
     </w:p>
     <w:p>
       <w:pPr>
@@ -847,8 +1008,34 @@
       <w:pPr>
         <w:pStyle w:val="Pseoudocode"/>
       </w:pPr>
-      <w:r>
-        <w:t>public void calculateMedian()</w:t>
+      <w:proofErr w:type="gramStart"/>
+      <w:r>
+        <w:t>public</w:t>
+      </w:r>
+      <w:proofErr w:type="gramEnd"/>
+      <w:r>
+        <w:t xml:space="preserve"> </w:t>
+      </w:r>
+      <w:proofErr w:type="spellStart"/>
+      <w:r>
+        <w:t>void</w:t>
+      </w:r>
+      <w:proofErr w:type="spellEnd"/>
+      <w:r>
+        <w:t xml:space="preserve"> </w:t>
+      </w:r>
+      <w:proofErr w:type="spellStart"/>
+      <w:proofErr w:type="gramStart"/>
+      <w:r>
+        <w:t>calculateMedian</w:t>
+      </w:r>
+      <w:proofErr w:type="spellEnd"/>
+      <w:r>
+        <w:t>(</w:t>
+      </w:r>
+      <w:proofErr w:type="gramEnd"/>
+      <w:r>
+        <w:t>)</w:t>
       </w:r>
       <w:r>
         <w:br/>
@@ -856,7 +1043,32 @@
       </w:r>
       <w:r>
         <w:br/>
-        <w:t xml:space="preserve">    int[] sortedArray = Arrays.</w:t>
+        <w:t xml:space="preserve">    </w:t>
+      </w:r>
+      <w:proofErr w:type="spellStart"/>
+      <w:proofErr w:type="gramStart"/>
+      <w:r>
+        <w:t>int</w:t>
+      </w:r>
+      <w:proofErr w:type="spellEnd"/>
+      <w:r>
+        <w:t>[</w:t>
+      </w:r>
+      <w:proofErr w:type="gramEnd"/>
+      <w:r>
+        <w:t xml:space="preserve">] </w:t>
+      </w:r>
+      <w:proofErr w:type="spellStart"/>
+      <w:r>
+        <w:t>sortedArray</w:t>
+      </w:r>
+      <w:proofErr w:type="spellEnd"/>
+      <w:r>
+        <w:t xml:space="preserve"> = </w:t>
+      </w:r>
+      <w:proofErr w:type="spellStart"/>
+      <w:r>
+        <w:t>Arrays.</w:t>
       </w:r>
       <w:r>
         <w:rPr>
@@ -865,12 +1077,51 @@
         </w:rPr>
         <w:t>copyOf</w:t>
       </w:r>
-      <w:r>
-        <w:t>(getInputArray(), getInputArray().length);</w:t>
-      </w:r>
-      <w:r>
-        <w:br/>
-        <w:t xml:space="preserve">    Arrays.</w:t>
+      <w:proofErr w:type="spellEnd"/>
+      <w:r>
+        <w:t>(</w:t>
+      </w:r>
+      <w:proofErr w:type="spellStart"/>
+      <w:proofErr w:type="gramStart"/>
+      <w:r>
+        <w:t>getInputArray</w:t>
+      </w:r>
+      <w:proofErr w:type="spellEnd"/>
+      <w:r>
+        <w:t>(</w:t>
+      </w:r>
+      <w:proofErr w:type="gramEnd"/>
+      <w:r>
+        <w:t xml:space="preserve">), </w:t>
+      </w:r>
+      <w:proofErr w:type="spellStart"/>
+      <w:r>
+        <w:t>getInputArray</w:t>
+      </w:r>
+      <w:proofErr w:type="spellEnd"/>
+      <w:r>
+        <w:t>(</w:t>
+      </w:r>
+      <w:proofErr w:type="gramStart"/>
+      <w:r>
+        <w:t>).</w:t>
+      </w:r>
+      <w:proofErr w:type="spellStart"/>
+      <w:r>
+        <w:t>length</w:t>
+      </w:r>
+      <w:proofErr w:type="spellEnd"/>
+      <w:r>
+        <w:t>);</w:t>
+      </w:r>
+      <w:proofErr w:type="gramEnd"/>
+      <w:r>
+        <w:br/>
+        <w:t xml:space="preserve">    </w:t>
+      </w:r>
+      <w:proofErr w:type="spellStart"/>
+      <w:r>
+        <w:t>Arrays.</w:t>
       </w:r>
       <w:r>
         <w:rPr>
@@ -879,56 +1130,221 @@
         </w:rPr>
         <w:t>sort</w:t>
       </w:r>
-      <w:r>
-        <w:t>(sortedArray);</w:t>
-      </w:r>
-      <w:r>
-        <w:br/>
-      </w:r>
-      <w:r>
-        <w:br/>
-        <w:t xml:space="preserve">    if (sortedArray.length % 2 == 0)</w:t>
-      </w:r>
-      <w:r>
-        <w:br/>
-        <w:t xml:space="preserve">    {</w:t>
-      </w:r>
-      <w:r>
-        <w:br/>
-        <w:t xml:space="preserve">        int mid1 = sortedArray.length / 2;</w:t>
-      </w:r>
-      <w:r>
-        <w:br/>
-        <w:t xml:space="preserve">        int mid2 = mid1 - 1;</w:t>
-      </w:r>
-      <w:r>
-        <w:br/>
-        <w:t xml:space="preserve">        setMedian((sortedArray[mid1] + sortedArray[mid2]) / 2.0);</w:t>
-      </w:r>
-      <w:r>
-        <w:br/>
-        <w:t xml:space="preserve">    }</w:t>
-      </w:r>
-      <w:r>
-        <w:br/>
-        <w:t xml:space="preserve">    else</w:t>
-      </w:r>
-      <w:r>
-        <w:br/>
-        <w:t xml:space="preserve">    {</w:t>
-      </w:r>
-      <w:r>
-        <w:br/>
-        <w:t xml:space="preserve">        int mid = sortedArray.length / 2;</w:t>
-      </w:r>
-      <w:r>
-        <w:br/>
-        <w:t xml:space="preserve">        setMedian(sortedArray[mid]);</w:t>
-      </w:r>
-      <w:r>
-        <w:br/>
-        <w:t xml:space="preserve">    }</w:t>
-      </w:r>
+      <w:proofErr w:type="spellEnd"/>
+      <w:r>
+        <w:t>(</w:t>
+      </w:r>
+      <w:proofErr w:type="spellStart"/>
+      <w:r>
+        <w:t>sortedArray</w:t>
+      </w:r>
+      <w:proofErr w:type="spellEnd"/>
+      <w:proofErr w:type="gramStart"/>
+      <w:r>
+        <w:t>);</w:t>
+      </w:r>
+      <w:proofErr w:type="gramEnd"/>
+      <w:r>
+        <w:br/>
+      </w:r>
+      <w:r>
+        <w:br/>
+        <w:t xml:space="preserve">    if (</w:t>
+      </w:r>
+      <w:proofErr w:type="spellStart"/>
+      <w:r>
+        <w:t>sortedArray.length</w:t>
+      </w:r>
+      <w:proofErr w:type="spellEnd"/>
+      <w:r>
+        <w:t xml:space="preserve"> % 2 == 0)</w:t>
+      </w:r>
+      <w:r>
+        <w:br/>
+        <w:t xml:space="preserve"> </w:t>
+      </w:r>
+      <w:proofErr w:type="gramStart"/>
+      <w:r>
+        <w:t xml:space="preserve">   {</w:t>
+      </w:r>
+      <w:proofErr w:type="gramEnd"/>
+      <w:r>
+        <w:br/>
+        <w:t xml:space="preserve">        </w:t>
+      </w:r>
+      <w:proofErr w:type="spellStart"/>
+      <w:r>
+        <w:t>int</w:t>
+      </w:r>
+      <w:proofErr w:type="spellEnd"/>
+      <w:r>
+        <w:t xml:space="preserve"> mid1 = </w:t>
+      </w:r>
+      <w:proofErr w:type="spellStart"/>
+      <w:r>
+        <w:t>sortedArray.length</w:t>
+      </w:r>
+      <w:proofErr w:type="spellEnd"/>
+      <w:r>
+        <w:t xml:space="preserve"> / </w:t>
+      </w:r>
+      <w:proofErr w:type="gramStart"/>
+      <w:r>
+        <w:t>2;</w:t>
+      </w:r>
+      <w:proofErr w:type="gramEnd"/>
+      <w:r>
+        <w:br/>
+        <w:t xml:space="preserve">        </w:t>
+      </w:r>
+      <w:proofErr w:type="spellStart"/>
+      <w:r>
+        <w:t>int</w:t>
+      </w:r>
+      <w:proofErr w:type="spellEnd"/>
+      <w:r>
+        <w:t xml:space="preserve"> mid2 = mid1 - </w:t>
+      </w:r>
+      <w:proofErr w:type="gramStart"/>
+      <w:r>
+        <w:t>1;</w:t>
+      </w:r>
+      <w:proofErr w:type="gramEnd"/>
+      <w:r>
+        <w:br/>
+        <w:t xml:space="preserve">        </w:t>
+      </w:r>
+      <w:proofErr w:type="spellStart"/>
+      <w:r>
+        <w:t>setMedian</w:t>
+      </w:r>
+      <w:proofErr w:type="spellEnd"/>
+      <w:r>
+        <w:t>((</w:t>
+      </w:r>
+      <w:proofErr w:type="spellStart"/>
+      <w:r>
+        <w:t>sortedArray</w:t>
+      </w:r>
+      <w:proofErr w:type="spellEnd"/>
+      <w:r>
+        <w:t xml:space="preserve">[mid1] + </w:t>
+      </w:r>
+      <w:proofErr w:type="spellStart"/>
+      <w:r>
+        <w:t>sortedArray</w:t>
+      </w:r>
+      <w:proofErr w:type="spellEnd"/>
+      <w:r>
+        <w:t>[mid2]) / 2.0</w:t>
+      </w:r>
+      <w:proofErr w:type="gramStart"/>
+      <w:r>
+        <w:t>);</w:t>
+      </w:r>
+      <w:proofErr w:type="gramEnd"/>
+      <w:r>
+        <w:br/>
+        <w:t xml:space="preserve">  </w:t>
+      </w:r>
+      <w:proofErr w:type="gramStart"/>
+      <w:r>
+        <w:t xml:space="preserve">  }</w:t>
+      </w:r>
+      <w:proofErr w:type="gramEnd"/>
+      <w:r>
+        <w:br/>
+        <w:t xml:space="preserve">    </w:t>
+      </w:r>
+      <w:proofErr w:type="spellStart"/>
+      <w:r>
+        <w:t>else</w:t>
+      </w:r>
+      <w:proofErr w:type="spellEnd"/>
+      <w:r>
+        <w:br/>
+        <w:t xml:space="preserve"> </w:t>
+      </w:r>
+      <w:proofErr w:type="gramStart"/>
+      <w:r>
+        <w:t xml:space="preserve">   {</w:t>
+      </w:r>
+      <w:proofErr w:type="gramEnd"/>
+      <w:r>
+        <w:br/>
+        <w:t xml:space="preserve">        </w:t>
+      </w:r>
+      <w:proofErr w:type="spellStart"/>
+      <w:r>
+        <w:t>int</w:t>
+      </w:r>
+      <w:proofErr w:type="spellEnd"/>
+      <w:r>
+        <w:t xml:space="preserve"> </w:t>
+      </w:r>
+      <w:proofErr w:type="spellStart"/>
+      <w:r>
+        <w:t>mid</w:t>
+      </w:r>
+      <w:proofErr w:type="spellEnd"/>
+      <w:r>
+        <w:t xml:space="preserve"> = </w:t>
+      </w:r>
+      <w:proofErr w:type="spellStart"/>
+      <w:r>
+        <w:t>sortedArray.length</w:t>
+      </w:r>
+      <w:proofErr w:type="spellEnd"/>
+      <w:r>
+        <w:t xml:space="preserve"> / </w:t>
+      </w:r>
+      <w:proofErr w:type="gramStart"/>
+      <w:r>
+        <w:t>2;</w:t>
+      </w:r>
+      <w:proofErr w:type="gramEnd"/>
+      <w:r>
+        <w:br/>
+        <w:t xml:space="preserve">        </w:t>
+      </w:r>
+      <w:proofErr w:type="spellStart"/>
+      <w:r>
+        <w:t>setMedian</w:t>
+      </w:r>
+      <w:proofErr w:type="spellEnd"/>
+      <w:r>
+        <w:t>(</w:t>
+      </w:r>
+      <w:proofErr w:type="spellStart"/>
+      <w:r>
+        <w:t>sortedArray</w:t>
+      </w:r>
+      <w:proofErr w:type="spellEnd"/>
+      <w:r>
+        <w:t>[</w:t>
+      </w:r>
+      <w:proofErr w:type="spellStart"/>
+      <w:r>
+        <w:t>mid</w:t>
+      </w:r>
+      <w:proofErr w:type="spellEnd"/>
+      <w:r>
+        <w:t>]</w:t>
+      </w:r>
+      <w:proofErr w:type="gramStart"/>
+      <w:r>
+        <w:t>);</w:t>
+      </w:r>
+      <w:proofErr w:type="gramEnd"/>
+      <w:r>
+        <w:br/>
+        <w:t xml:space="preserve">  </w:t>
+      </w:r>
+      <w:proofErr w:type="gramStart"/>
+      <w:r>
+        <w:t xml:space="preserve">  }</w:t>
+      </w:r>
+      <w:proofErr w:type="gramEnd"/>
       <w:r>
         <w:br/>
         <w:t>}</w:t>
@@ -963,8 +1379,13 @@
         <w:fldChar w:fldCharType="end"/>
       </w:r>
       <w:r>
-        <w:t>: calculateMedian</w:t>
-      </w:r>
+        <w:t xml:space="preserve">: </w:t>
+      </w:r>
+      <w:proofErr w:type="spellStart"/>
+      <w:r>
+        <w:t>calculateMedian</w:t>
+      </w:r>
+      <w:proofErr w:type="spellEnd"/>
     </w:p>
     <w:p>
       <w:pPr>
@@ -978,8 +1399,34 @@
       <w:pPr>
         <w:pStyle w:val="Pseoudocode"/>
       </w:pPr>
-      <w:r>
-        <w:t>public void calculateMinAndMax()</w:t>
+      <w:proofErr w:type="gramStart"/>
+      <w:r>
+        <w:t>public</w:t>
+      </w:r>
+      <w:proofErr w:type="gramEnd"/>
+      <w:r>
+        <w:t xml:space="preserve"> </w:t>
+      </w:r>
+      <w:proofErr w:type="spellStart"/>
+      <w:r>
+        <w:t>void</w:t>
+      </w:r>
+      <w:proofErr w:type="spellEnd"/>
+      <w:r>
+        <w:t xml:space="preserve"> </w:t>
+      </w:r>
+      <w:proofErr w:type="spellStart"/>
+      <w:proofErr w:type="gramStart"/>
+      <w:r>
+        <w:t>calculateMinAndMax</w:t>
+      </w:r>
+      <w:proofErr w:type="spellEnd"/>
+      <w:r>
+        <w:t>(</w:t>
+      </w:r>
+      <w:proofErr w:type="gramEnd"/>
+      <w:r>
+        <w:t>)</w:t>
       </w:r>
       <w:r>
         <w:br/>
@@ -987,73 +1434,230 @@
       </w:r>
       <w:r>
         <w:br/>
-        <w:t xml:space="preserve">    int min = getInputArray()[0];</w:t>
-      </w:r>
-      <w:r>
-        <w:br/>
-        <w:t xml:space="preserve">    int max = getInputArray()[0];</w:t>
-      </w:r>
-      <w:r>
-        <w:br/>
-      </w:r>
-      <w:r>
-        <w:br/>
-        <w:t xml:space="preserve">    for (int num : getInputArray())</w:t>
-      </w:r>
-      <w:r>
-        <w:br/>
-        <w:t xml:space="preserve">    {</w:t>
-      </w:r>
-      <w:r>
-        <w:br/>
-        <w:t xml:space="preserve">        if (num &lt; min)</w:t>
-      </w:r>
-      <w:r>
-        <w:br/>
-        <w:t xml:space="preserve">        {</w:t>
-      </w:r>
+        <w:t xml:space="preserve">    </w:t>
+      </w:r>
+      <w:proofErr w:type="spellStart"/>
+      <w:r>
+        <w:t>int</w:t>
+      </w:r>
+      <w:proofErr w:type="spellEnd"/>
+      <w:r>
+        <w:t xml:space="preserve"> min = </w:t>
+      </w:r>
+      <w:proofErr w:type="spellStart"/>
+      <w:proofErr w:type="gramStart"/>
+      <w:r>
+        <w:t>getInputArray</w:t>
+      </w:r>
+      <w:proofErr w:type="spellEnd"/>
+      <w:r>
+        <w:t>()[</w:t>
+      </w:r>
+      <w:proofErr w:type="gramEnd"/>
+      <w:r>
+        <w:t>0</w:t>
+      </w:r>
+      <w:proofErr w:type="gramStart"/>
+      <w:r>
+        <w:t>];</w:t>
+      </w:r>
+      <w:proofErr w:type="gramEnd"/>
+      <w:r>
+        <w:br/>
+        <w:t xml:space="preserve">    </w:t>
+      </w:r>
+      <w:proofErr w:type="spellStart"/>
+      <w:r>
+        <w:t>int</w:t>
+      </w:r>
+      <w:proofErr w:type="spellEnd"/>
+      <w:r>
+        <w:t xml:space="preserve"> max = </w:t>
+      </w:r>
+      <w:proofErr w:type="spellStart"/>
+      <w:proofErr w:type="gramStart"/>
+      <w:r>
+        <w:t>getInputArray</w:t>
+      </w:r>
+      <w:proofErr w:type="spellEnd"/>
+      <w:r>
+        <w:t>()[</w:t>
+      </w:r>
+      <w:proofErr w:type="gramEnd"/>
+      <w:r>
+        <w:t>0</w:t>
+      </w:r>
+      <w:proofErr w:type="gramStart"/>
+      <w:r>
+        <w:t>];</w:t>
+      </w:r>
+      <w:proofErr w:type="gramEnd"/>
+      <w:r>
+        <w:br/>
+      </w:r>
+      <w:r>
+        <w:br/>
+        <w:t xml:space="preserve">    for (</w:t>
+      </w:r>
+      <w:proofErr w:type="spellStart"/>
+      <w:r>
+        <w:t>int</w:t>
+      </w:r>
+      <w:proofErr w:type="spellEnd"/>
+      <w:r>
+        <w:t xml:space="preserve"> </w:t>
+      </w:r>
+      <w:proofErr w:type="spellStart"/>
+      <w:r>
+        <w:t>num</w:t>
+      </w:r>
+      <w:proofErr w:type="spellEnd"/>
+      <w:r>
+        <w:t xml:space="preserve"> : </w:t>
+      </w:r>
+      <w:proofErr w:type="spellStart"/>
+      <w:proofErr w:type="gramStart"/>
+      <w:r>
+        <w:t>getInputArray</w:t>
+      </w:r>
+      <w:proofErr w:type="spellEnd"/>
+      <w:r>
+        <w:t>(</w:t>
+      </w:r>
+      <w:proofErr w:type="gramEnd"/>
+      <w:r>
+        <w:t>))</w:t>
+      </w:r>
+      <w:r>
+        <w:br/>
+        <w:t xml:space="preserve"> </w:t>
+      </w:r>
+      <w:proofErr w:type="gramStart"/>
+      <w:r>
+        <w:t xml:space="preserve">   {</w:t>
+      </w:r>
+      <w:proofErr w:type="gramEnd"/>
+      <w:r>
+        <w:br/>
+        <w:t xml:space="preserve">        if (</w:t>
+      </w:r>
+      <w:proofErr w:type="spellStart"/>
+      <w:r>
+        <w:t>num</w:t>
+      </w:r>
+      <w:proofErr w:type="spellEnd"/>
+      <w:r>
+        <w:t xml:space="preserve"> &lt; min)</w:t>
+      </w:r>
+      <w:r>
+        <w:br/>
+        <w:t xml:space="preserve">     </w:t>
+      </w:r>
+      <w:proofErr w:type="gramStart"/>
+      <w:r>
+        <w:t xml:space="preserve">   {</w:t>
+      </w:r>
+      <w:proofErr w:type="gramEnd"/>
       <w:r>
         <w:br/>
       </w:r>
       <w:r>
         <w:lastRenderedPageBreak/>
-        <w:t xml:space="preserve">            min = num;</w:t>
-      </w:r>
-      <w:r>
-        <w:br/>
-        <w:t xml:space="preserve">        }</w:t>
-      </w:r>
-      <w:r>
-        <w:br/>
-        <w:t xml:space="preserve">        if (num &gt; max)</w:t>
-      </w:r>
-      <w:r>
-        <w:br/>
-        <w:t xml:space="preserve">        {</w:t>
-      </w:r>
-      <w:r>
-        <w:br/>
-        <w:t xml:space="preserve">            max = num;</w:t>
-      </w:r>
-      <w:r>
-        <w:br/>
-        <w:t xml:space="preserve">        }</w:t>
-      </w:r>
-      <w:r>
-        <w:br/>
-        <w:t xml:space="preserve">    }</w:t>
-      </w:r>
-      <w:r>
-        <w:br/>
-      </w:r>
-      <w:r>
-        <w:br/>
-        <w:t xml:space="preserve">    minimum = min;</w:t>
-      </w:r>
-      <w:r>
-        <w:br/>
-        <w:t xml:space="preserve">    maximum = max;</w:t>
-      </w:r>
+        <w:t xml:space="preserve">            min = </w:t>
+      </w:r>
+      <w:proofErr w:type="spellStart"/>
+      <w:proofErr w:type="gramStart"/>
+      <w:r>
+        <w:t>num</w:t>
+      </w:r>
+      <w:proofErr w:type="spellEnd"/>
+      <w:r>
+        <w:t>;</w:t>
+      </w:r>
+      <w:proofErr w:type="gramEnd"/>
+      <w:r>
+        <w:br/>
+        <w:t xml:space="preserve">      </w:t>
+      </w:r>
+      <w:proofErr w:type="gramStart"/>
+      <w:r>
+        <w:t xml:space="preserve">  }</w:t>
+      </w:r>
+      <w:proofErr w:type="gramEnd"/>
+      <w:r>
+        <w:br/>
+        <w:t xml:space="preserve">        if (</w:t>
+      </w:r>
+      <w:proofErr w:type="spellStart"/>
+      <w:r>
+        <w:t>num</w:t>
+      </w:r>
+      <w:proofErr w:type="spellEnd"/>
+      <w:r>
+        <w:t xml:space="preserve"> &gt; max)</w:t>
+      </w:r>
+      <w:r>
+        <w:br/>
+        <w:t xml:space="preserve">     </w:t>
+      </w:r>
+      <w:proofErr w:type="gramStart"/>
+      <w:r>
+        <w:t xml:space="preserve">   {</w:t>
+      </w:r>
+      <w:proofErr w:type="gramEnd"/>
+      <w:r>
+        <w:br/>
+        <w:t xml:space="preserve">            max = </w:t>
+      </w:r>
+      <w:proofErr w:type="spellStart"/>
+      <w:proofErr w:type="gramStart"/>
+      <w:r>
+        <w:t>num</w:t>
+      </w:r>
+      <w:proofErr w:type="spellEnd"/>
+      <w:r>
+        <w:t>;</w:t>
+      </w:r>
+      <w:proofErr w:type="gramEnd"/>
+      <w:r>
+        <w:br/>
+        <w:t xml:space="preserve">      </w:t>
+      </w:r>
+      <w:proofErr w:type="gramStart"/>
+      <w:r>
+        <w:t xml:space="preserve">  }</w:t>
+      </w:r>
+      <w:proofErr w:type="gramEnd"/>
+      <w:r>
+        <w:br/>
+        <w:t xml:space="preserve">  </w:t>
+      </w:r>
+      <w:proofErr w:type="gramStart"/>
+      <w:r>
+        <w:t xml:space="preserve">  }</w:t>
+      </w:r>
+      <w:proofErr w:type="gramEnd"/>
+      <w:r>
+        <w:br/>
+      </w:r>
+      <w:r>
+        <w:br/>
+        <w:t xml:space="preserve">    minimum = </w:t>
+      </w:r>
+      <w:proofErr w:type="gramStart"/>
+      <w:r>
+        <w:t>min;</w:t>
+      </w:r>
+      <w:proofErr w:type="gramEnd"/>
+      <w:r>
+        <w:br/>
+        <w:t xml:space="preserve">    maximum = </w:t>
+      </w:r>
+      <w:proofErr w:type="gramStart"/>
+      <w:r>
+        <w:t>max;</w:t>
+      </w:r>
+      <w:proofErr w:type="gramEnd"/>
       <w:r>
         <w:br/>
         <w:t>}</w:t>
@@ -1085,8 +1689,13 @@
         <w:fldChar w:fldCharType="end"/>
       </w:r>
       <w:r>
-        <w:t>: calculateMinAndMax</w:t>
-      </w:r>
+        <w:t xml:space="preserve">: </w:t>
+      </w:r>
+      <w:proofErr w:type="spellStart"/>
+      <w:r>
+        <w:t>calculateMinAndMax</w:t>
+      </w:r>
+      <w:proofErr w:type="spellEnd"/>
     </w:p>
     <w:p>
       <w:pPr>
@@ -1121,7 +1730,21 @@
           <w:lang w:val="en-AT"/>
         </w:rPr>
         <w:br/>
-        <w:t>void testArrayFromExercise()</w:t>
+        <w:t xml:space="preserve">void </w:t>
+      </w:r>
+      <w:proofErr w:type="spellStart"/>
+      <w:r>
+        <w:rPr>
+          <w:lang w:val="en-AT"/>
+        </w:rPr>
+        <w:t>testArrayFromExercise</w:t>
+      </w:r>
+      <w:proofErr w:type="spellEnd"/>
+      <w:r>
+        <w:rPr>
+          <w:lang w:val="en-AT"/>
+        </w:rPr>
+        <w:t>()</w:t>
       </w:r>
       <w:r>
         <w:rPr>
@@ -1135,75 +1758,188 @@
           <w:lang w:val="en-AT"/>
         </w:rPr>
         <w:br/>
-        <w:t xml:space="preserve">    excercise = new ArrayStatisticsExercise(new int[]{15, 8, 23, 4, 42, 11, 19});</w:t>
-      </w:r>
-      <w:r>
-        <w:rPr>
-          <w:lang w:val="en-AT"/>
-        </w:rPr>
-        <w:br/>
-      </w:r>
-      <w:r>
-        <w:rPr>
-          <w:lang w:val="en-AT"/>
-        </w:rPr>
-        <w:br/>
-        <w:t xml:space="preserve">    excercise.runExcercise();</w:t>
-      </w:r>
-      <w:r>
-        <w:rPr>
-          <w:lang w:val="en-AT"/>
-        </w:rPr>
-        <w:br/>
-        <w:t xml:space="preserve">    excercise.displayOutput();</w:t>
-      </w:r>
-      <w:r>
-        <w:rPr>
-          <w:lang w:val="en-AT"/>
-        </w:rPr>
-        <w:br/>
-      </w:r>
-      <w:r>
-        <w:rPr>
-          <w:lang w:val="en-AT"/>
-        </w:rPr>
-        <w:br/>
-        <w:t xml:space="preserve">    double expectedMean = 17.43;</w:t>
-      </w:r>
-      <w:r>
-        <w:rPr>
-          <w:lang w:val="en-AT"/>
-        </w:rPr>
-        <w:br/>
-        <w:t xml:space="preserve">    double expectedMedian = 15.0;</w:t>
-      </w:r>
-      <w:r>
-        <w:rPr>
-          <w:lang w:val="en-AT"/>
-        </w:rPr>
-        <w:br/>
-        <w:t xml:space="preserve">    int expectedMin = 4;</w:t>
-      </w:r>
-      <w:r>
-        <w:rPr>
-          <w:lang w:val="en-AT"/>
-        </w:rPr>
-        <w:br/>
-        <w:t xml:space="preserve">    int expectedMax = 42;</w:t>
-      </w:r>
-      <w:r>
-        <w:rPr>
-          <w:lang w:val="en-AT"/>
-        </w:rPr>
-        <w:br/>
-      </w:r>
-      <w:r>
-        <w:rPr>
-          <w:lang w:val="en-AT"/>
-        </w:rPr>
-        <w:br/>
         <w:t xml:space="preserve">    </w:t>
       </w:r>
+      <w:proofErr w:type="spellStart"/>
+      <w:r>
+        <w:rPr>
+          <w:lang w:val="en-AT"/>
+        </w:rPr>
+        <w:t>excercise</w:t>
+      </w:r>
+      <w:proofErr w:type="spellEnd"/>
+      <w:r>
+        <w:rPr>
+          <w:lang w:val="en-AT"/>
+        </w:rPr>
+        <w:t xml:space="preserve"> = new </w:t>
+      </w:r>
+      <w:proofErr w:type="spellStart"/>
+      <w:r>
+        <w:rPr>
+          <w:lang w:val="en-AT"/>
+        </w:rPr>
+        <w:t>ArrayStatisticsExercise</w:t>
+      </w:r>
+      <w:proofErr w:type="spellEnd"/>
+      <w:r>
+        <w:rPr>
+          <w:lang w:val="en-AT"/>
+        </w:rPr>
+        <w:t>(new int[]{15, 8, 23, 4, 42, 11, 19});</w:t>
+      </w:r>
+      <w:r>
+        <w:rPr>
+          <w:lang w:val="en-AT"/>
+        </w:rPr>
+        <w:br/>
+      </w:r>
+      <w:r>
+        <w:rPr>
+          <w:lang w:val="en-AT"/>
+        </w:rPr>
+        <w:br/>
+        <w:t xml:space="preserve">    </w:t>
+      </w:r>
+      <w:proofErr w:type="spellStart"/>
+      <w:r>
+        <w:rPr>
+          <w:lang w:val="en-AT"/>
+        </w:rPr>
+        <w:t>excercise.runExcercise</w:t>
+      </w:r>
+      <w:proofErr w:type="spellEnd"/>
+      <w:r>
+        <w:rPr>
+          <w:lang w:val="en-AT"/>
+        </w:rPr>
+        <w:t>();</w:t>
+      </w:r>
+      <w:r>
+        <w:rPr>
+          <w:lang w:val="en-AT"/>
+        </w:rPr>
+        <w:br/>
+        <w:t xml:space="preserve">    </w:t>
+      </w:r>
+      <w:proofErr w:type="spellStart"/>
+      <w:r>
+        <w:rPr>
+          <w:lang w:val="en-AT"/>
+        </w:rPr>
+        <w:t>excercise.displayOutput</w:t>
+      </w:r>
+      <w:proofErr w:type="spellEnd"/>
+      <w:r>
+        <w:rPr>
+          <w:lang w:val="en-AT"/>
+        </w:rPr>
+        <w:t>();</w:t>
+      </w:r>
+      <w:r>
+        <w:rPr>
+          <w:lang w:val="en-AT"/>
+        </w:rPr>
+        <w:br/>
+      </w:r>
+      <w:r>
+        <w:rPr>
+          <w:lang w:val="en-AT"/>
+        </w:rPr>
+        <w:br/>
+        <w:t xml:space="preserve">    double </w:t>
+      </w:r>
+      <w:proofErr w:type="spellStart"/>
+      <w:r>
+        <w:rPr>
+          <w:lang w:val="en-AT"/>
+        </w:rPr>
+        <w:t>expectedMean</w:t>
+      </w:r>
+      <w:proofErr w:type="spellEnd"/>
+      <w:r>
+        <w:rPr>
+          <w:lang w:val="en-AT"/>
+        </w:rPr>
+        <w:t xml:space="preserve"> = 17.43;</w:t>
+      </w:r>
+      <w:r>
+        <w:rPr>
+          <w:lang w:val="en-AT"/>
+        </w:rPr>
+        <w:br/>
+        <w:t xml:space="preserve">    double </w:t>
+      </w:r>
+      <w:proofErr w:type="spellStart"/>
+      <w:r>
+        <w:rPr>
+          <w:lang w:val="en-AT"/>
+        </w:rPr>
+        <w:t>expectedMedian</w:t>
+      </w:r>
+      <w:proofErr w:type="spellEnd"/>
+      <w:r>
+        <w:rPr>
+          <w:lang w:val="en-AT"/>
+        </w:rPr>
+        <w:t xml:space="preserve"> = 15.0;</w:t>
+      </w:r>
+      <w:r>
+        <w:rPr>
+          <w:lang w:val="en-AT"/>
+        </w:rPr>
+        <w:br/>
+        <w:t xml:space="preserve">    int </w:t>
+      </w:r>
+      <w:proofErr w:type="spellStart"/>
+      <w:r>
+        <w:rPr>
+          <w:lang w:val="en-AT"/>
+        </w:rPr>
+        <w:t>expectedMin</w:t>
+      </w:r>
+      <w:proofErr w:type="spellEnd"/>
+      <w:r>
+        <w:rPr>
+          <w:lang w:val="en-AT"/>
+        </w:rPr>
+        <w:t xml:space="preserve"> = 4;</w:t>
+      </w:r>
+      <w:r>
+        <w:rPr>
+          <w:lang w:val="en-AT"/>
+        </w:rPr>
+        <w:br/>
+        <w:t xml:space="preserve">    int </w:t>
+      </w:r>
+      <w:proofErr w:type="spellStart"/>
+      <w:r>
+        <w:rPr>
+          <w:lang w:val="en-AT"/>
+        </w:rPr>
+        <w:t>expectedMax</w:t>
+      </w:r>
+      <w:proofErr w:type="spellEnd"/>
+      <w:r>
+        <w:rPr>
+          <w:lang w:val="en-AT"/>
+        </w:rPr>
+        <w:t xml:space="preserve"> = 42;</w:t>
+      </w:r>
+      <w:r>
+        <w:rPr>
+          <w:lang w:val="en-AT"/>
+        </w:rPr>
+        <w:br/>
+      </w:r>
+      <w:r>
+        <w:rPr>
+          <w:lang w:val="en-AT"/>
+        </w:rPr>
+        <w:br/>
+        <w:t xml:space="preserve">    </w:t>
+      </w:r>
+      <w:proofErr w:type="spellStart"/>
       <w:r>
         <w:rPr>
           <w:i/>
@@ -1212,11 +1948,40 @@
         </w:rPr>
         <w:t>assertEquals</w:t>
       </w:r>
-      <w:r>
-        <w:rPr>
-          <w:lang w:val="en-AT"/>
-        </w:rPr>
-        <w:t>(expectedMean, excercise.getMean(), 0.01);</w:t>
+      <w:proofErr w:type="spellEnd"/>
+      <w:r>
+        <w:rPr>
+          <w:lang w:val="en-AT"/>
+        </w:rPr>
+        <w:t>(</w:t>
+      </w:r>
+      <w:proofErr w:type="spellStart"/>
+      <w:r>
+        <w:rPr>
+          <w:lang w:val="en-AT"/>
+        </w:rPr>
+        <w:t>expectedMean</w:t>
+      </w:r>
+      <w:proofErr w:type="spellEnd"/>
+      <w:r>
+        <w:rPr>
+          <w:lang w:val="en-AT"/>
+        </w:rPr>
+        <w:t xml:space="preserve">, </w:t>
+      </w:r>
+      <w:proofErr w:type="spellStart"/>
+      <w:r>
+        <w:rPr>
+          <w:lang w:val="en-AT"/>
+        </w:rPr>
+        <w:t>excercise.getMean</w:t>
+      </w:r>
+      <w:proofErr w:type="spellEnd"/>
+      <w:r>
+        <w:rPr>
+          <w:lang w:val="en-AT"/>
+        </w:rPr>
+        <w:t>(), 0.01);</w:t>
       </w:r>
       <w:r>
         <w:rPr>
@@ -1225,6 +1990,7 @@
         <w:br/>
         <w:t xml:space="preserve">    </w:t>
       </w:r>
+      <w:proofErr w:type="spellStart"/>
       <w:r>
         <w:rPr>
           <w:i/>
@@ -1233,11 +1999,40 @@
         </w:rPr>
         <w:t>assertEquals</w:t>
       </w:r>
-      <w:r>
-        <w:rPr>
-          <w:lang w:val="en-AT"/>
-        </w:rPr>
-        <w:t>(expectedMedian, excercise.getMedian(), 0.001);</w:t>
+      <w:proofErr w:type="spellEnd"/>
+      <w:r>
+        <w:rPr>
+          <w:lang w:val="en-AT"/>
+        </w:rPr>
+        <w:t>(</w:t>
+      </w:r>
+      <w:proofErr w:type="spellStart"/>
+      <w:r>
+        <w:rPr>
+          <w:lang w:val="en-AT"/>
+        </w:rPr>
+        <w:t>expectedMedian</w:t>
+      </w:r>
+      <w:proofErr w:type="spellEnd"/>
+      <w:r>
+        <w:rPr>
+          <w:lang w:val="en-AT"/>
+        </w:rPr>
+        <w:t xml:space="preserve">, </w:t>
+      </w:r>
+      <w:proofErr w:type="spellStart"/>
+      <w:r>
+        <w:rPr>
+          <w:lang w:val="en-AT"/>
+        </w:rPr>
+        <w:t>excercise.getMedian</w:t>
+      </w:r>
+      <w:proofErr w:type="spellEnd"/>
+      <w:r>
+        <w:rPr>
+          <w:lang w:val="en-AT"/>
+        </w:rPr>
+        <w:t>(), 0.001);</w:t>
       </w:r>
       <w:r>
         <w:rPr>
@@ -1246,6 +2041,7 @@
         <w:br/>
         <w:t xml:space="preserve">    </w:t>
       </w:r>
+      <w:proofErr w:type="spellStart"/>
       <w:r>
         <w:rPr>
           <w:i/>
@@ -1254,11 +2050,40 @@
         </w:rPr>
         <w:t>assertEquals</w:t>
       </w:r>
-      <w:r>
-        <w:rPr>
-          <w:lang w:val="en-AT"/>
-        </w:rPr>
-        <w:t>(expectedMin, excercise.getMinimum());</w:t>
+      <w:proofErr w:type="spellEnd"/>
+      <w:r>
+        <w:rPr>
+          <w:lang w:val="en-AT"/>
+        </w:rPr>
+        <w:t>(</w:t>
+      </w:r>
+      <w:proofErr w:type="spellStart"/>
+      <w:r>
+        <w:rPr>
+          <w:lang w:val="en-AT"/>
+        </w:rPr>
+        <w:t>expectedMin</w:t>
+      </w:r>
+      <w:proofErr w:type="spellEnd"/>
+      <w:r>
+        <w:rPr>
+          <w:lang w:val="en-AT"/>
+        </w:rPr>
+        <w:t xml:space="preserve">, </w:t>
+      </w:r>
+      <w:proofErr w:type="spellStart"/>
+      <w:r>
+        <w:rPr>
+          <w:lang w:val="en-AT"/>
+        </w:rPr>
+        <w:t>excercise.getMinimum</w:t>
+      </w:r>
+      <w:proofErr w:type="spellEnd"/>
+      <w:r>
+        <w:rPr>
+          <w:lang w:val="en-AT"/>
+        </w:rPr>
+        <w:t>());</w:t>
       </w:r>
       <w:r>
         <w:rPr>
@@ -1267,6 +2092,7 @@
         <w:br/>
         <w:t xml:space="preserve">    </w:t>
       </w:r>
+      <w:proofErr w:type="spellStart"/>
       <w:r>
         <w:rPr>
           <w:i/>
@@ -1275,11 +2101,40 @@
         </w:rPr>
         <w:t>assertEquals</w:t>
       </w:r>
-      <w:r>
-        <w:rPr>
-          <w:lang w:val="en-AT"/>
-        </w:rPr>
-        <w:t>(expectedMax, excercise.getMaximum());</w:t>
+      <w:proofErr w:type="spellEnd"/>
+      <w:r>
+        <w:rPr>
+          <w:lang w:val="en-AT"/>
+        </w:rPr>
+        <w:t>(</w:t>
+      </w:r>
+      <w:proofErr w:type="spellStart"/>
+      <w:r>
+        <w:rPr>
+          <w:lang w:val="en-AT"/>
+        </w:rPr>
+        <w:t>expectedMax</w:t>
+      </w:r>
+      <w:proofErr w:type="spellEnd"/>
+      <w:r>
+        <w:rPr>
+          <w:lang w:val="en-AT"/>
+        </w:rPr>
+        <w:t xml:space="preserve">, </w:t>
+      </w:r>
+      <w:proofErr w:type="spellStart"/>
+      <w:r>
+        <w:rPr>
+          <w:lang w:val="en-AT"/>
+        </w:rPr>
+        <w:t>excercise.getMaximum</w:t>
+      </w:r>
+      <w:proofErr w:type="spellEnd"/>
+      <w:r>
+        <w:rPr>
+          <w:lang w:val="en-AT"/>
+        </w:rPr>
+        <w:t>());</w:t>
       </w:r>
       <w:r>
         <w:rPr>
@@ -1323,48 +2178,104 @@
         <w:pStyle w:val="Pseoudocode"/>
       </w:pPr>
       <w:r>
-        <w:t>=== Array Statistics ===</w:t>
+        <w:t xml:space="preserve">=== </w:t>
+      </w:r>
+      <w:proofErr w:type="spellStart"/>
+      <w:r>
+        <w:t>Array</w:t>
+      </w:r>
+      <w:proofErr w:type="spellEnd"/>
+      <w:r>
+        <w:t xml:space="preserve"> </w:t>
+      </w:r>
+      <w:proofErr w:type="spellStart"/>
+      <w:r>
+        <w:t>Statistics</w:t>
+      </w:r>
+      <w:proofErr w:type="spellEnd"/>
+      <w:r>
+        <w:t xml:space="preserve"> ===</w:t>
       </w:r>
     </w:p>
     <w:p>
       <w:pPr>
         <w:pStyle w:val="Pseoudocode"/>
       </w:pPr>
-      <w:r>
-        <w:t>Arrays: [15, 8, 23, 4, 42, 11, 19]</w:t>
+      <w:proofErr w:type="spellStart"/>
+      <w:proofErr w:type="gramStart"/>
+      <w:r>
+        <w:t>Arrays</w:t>
+      </w:r>
+      <w:proofErr w:type="spellEnd"/>
+      <w:r>
+        <w:t>:</w:t>
+      </w:r>
+      <w:proofErr w:type="gramEnd"/>
+      <w:r>
+        <w:t xml:space="preserve"> [15, 8, 23, 4, 42, 11, 19]</w:t>
       </w:r>
     </w:p>
     <w:p>
       <w:pPr>
         <w:pStyle w:val="Pseoudocode"/>
       </w:pPr>
-      <w:r>
-        <w:t>Mean: 17.43</w:t>
+      <w:proofErr w:type="spellStart"/>
+      <w:proofErr w:type="gramStart"/>
+      <w:r>
+        <w:t>Mean</w:t>
+      </w:r>
+      <w:proofErr w:type="spellEnd"/>
+      <w:r>
+        <w:t>:</w:t>
+      </w:r>
+      <w:proofErr w:type="gramEnd"/>
+      <w:r>
+        <w:t xml:space="preserve"> 17.43</w:t>
       </w:r>
     </w:p>
     <w:p>
       <w:pPr>
         <w:pStyle w:val="Pseoudocode"/>
       </w:pPr>
+      <w:proofErr w:type="spellStart"/>
+      <w:proofErr w:type="gramStart"/>
       <w:r>
         <w:lastRenderedPageBreak/>
-        <w:t>Median: 15.00</w:t>
+        <w:t>Median</w:t>
+      </w:r>
+      <w:proofErr w:type="spellEnd"/>
+      <w:r>
+        <w:t>:</w:t>
+      </w:r>
+      <w:proofErr w:type="gramEnd"/>
+      <w:r>
+        <w:t xml:space="preserve"> 15.00</w:t>
       </w:r>
     </w:p>
     <w:p>
       <w:pPr>
         <w:pStyle w:val="Pseoudocode"/>
       </w:pPr>
-      <w:r>
-        <w:t>Minimum: 4</w:t>
+      <w:proofErr w:type="gramStart"/>
+      <w:r>
+        <w:t>Minimum:</w:t>
+      </w:r>
+      <w:proofErr w:type="gramEnd"/>
+      <w:r>
+        <w:t xml:space="preserve"> 4</w:t>
       </w:r>
     </w:p>
     <w:p>
       <w:pPr>
         <w:pStyle w:val="Pseoudocode"/>
       </w:pPr>
-      <w:r>
-        <w:t>Maximum: 42</w:t>
+      <w:proofErr w:type="gramStart"/>
+      <w:r>
+        <w:t>Maximum:</w:t>
+      </w:r>
+      <w:proofErr w:type="gramEnd"/>
+      <w:r>
+        <w:t xml:space="preserve"> 42</w:t>
       </w:r>
     </w:p>
     <w:p>
@@ -1524,6 +2435,9 @@
         </mc:AlternateContent>
       </w:r>
       <w:r>
+        <w:rPr>
+          <w:noProof/>
+        </w:rPr>
         <w:drawing>
           <wp:anchor distT="0" distB="0" distL="114300" distR="114300" simplePos="0" relativeHeight="251662336" behindDoc="0" locked="0" layoutInCell="1" allowOverlap="1" wp14:anchorId="797499EE" wp14:editId="313DA407">
             <wp:simplePos x="0" y="0"/>
@@ -1707,7 +2621,21 @@
         <w:rPr>
           <w:lang w:val="en-AT"/>
         </w:rPr>
-        <w:t>private int[] reverseArray(int[] array)</w:t>
+        <w:t xml:space="preserve">private int[] </w:t>
+      </w:r>
+      <w:proofErr w:type="spellStart"/>
+      <w:r>
+        <w:rPr>
+          <w:lang w:val="en-AT"/>
+        </w:rPr>
+        <w:t>reverseArray</w:t>
+      </w:r>
+      <w:proofErr w:type="spellEnd"/>
+      <w:r>
+        <w:rPr>
+          <w:lang w:val="en-AT"/>
+        </w:rPr>
+        <w:t>(int[] array)</w:t>
       </w:r>
       <w:r>
         <w:rPr>
@@ -1721,7 +2649,28 @@
           <w:lang w:val="en-AT"/>
         </w:rPr>
         <w:br/>
-        <w:t xml:space="preserve">    int[] arrayCopy = Arrays.</w:t>
+        <w:t xml:space="preserve">    int[] </w:t>
+      </w:r>
+      <w:proofErr w:type="spellStart"/>
+      <w:r>
+        <w:rPr>
+          <w:lang w:val="en-AT"/>
+        </w:rPr>
+        <w:t>arrayCopy</w:t>
+      </w:r>
+      <w:proofErr w:type="spellEnd"/>
+      <w:r>
+        <w:rPr>
+          <w:lang w:val="en-AT"/>
+        </w:rPr>
+        <w:t xml:space="preserve"> = </w:t>
+      </w:r>
+      <w:proofErr w:type="spellStart"/>
+      <w:r>
+        <w:rPr>
+          <w:lang w:val="en-AT"/>
+        </w:rPr>
+        <w:t>Arrays.</w:t>
       </w:r>
       <w:r>
         <w:rPr>
@@ -1731,11 +2680,26 @@
         </w:rPr>
         <w:t>copyOf</w:t>
       </w:r>
-      <w:r>
-        <w:rPr>
-          <w:lang w:val="en-AT"/>
-        </w:rPr>
-        <w:t>(array, array.length);</w:t>
+      <w:proofErr w:type="spellEnd"/>
+      <w:r>
+        <w:rPr>
+          <w:lang w:val="en-AT"/>
+        </w:rPr>
+        <w:t xml:space="preserve">(array, </w:t>
+      </w:r>
+      <w:proofErr w:type="spellStart"/>
+      <w:r>
+        <w:rPr>
+          <w:lang w:val="en-AT"/>
+        </w:rPr>
+        <w:t>array.length</w:t>
+      </w:r>
+      <w:proofErr w:type="spellEnd"/>
+      <w:r>
+        <w:rPr>
+          <w:lang w:val="en-AT"/>
+        </w:rPr>
+        <w:t>);</w:t>
       </w:r>
       <w:r>
         <w:rPr>
@@ -1761,7 +2725,63 @@
           <w:lang w:val="en-AT"/>
         </w:rPr>
         <w:br/>
-        <w:t xml:space="preserve">    for (int i = 0; i &lt; arrayCopy.length / 2; i++)</w:t>
+        <w:t xml:space="preserve">    for (int </w:t>
+      </w:r>
+      <w:proofErr w:type="spellStart"/>
+      <w:r>
+        <w:rPr>
+          <w:lang w:val="en-AT"/>
+        </w:rPr>
+        <w:t>i</w:t>
+      </w:r>
+      <w:proofErr w:type="spellEnd"/>
+      <w:r>
+        <w:rPr>
+          <w:lang w:val="en-AT"/>
+        </w:rPr>
+        <w:t xml:space="preserve"> = 0; </w:t>
+      </w:r>
+      <w:proofErr w:type="spellStart"/>
+      <w:r>
+        <w:rPr>
+          <w:lang w:val="en-AT"/>
+        </w:rPr>
+        <w:t>i</w:t>
+      </w:r>
+      <w:proofErr w:type="spellEnd"/>
+      <w:r>
+        <w:rPr>
+          <w:lang w:val="en-AT"/>
+        </w:rPr>
+        <w:t xml:space="preserve"> &lt; </w:t>
+      </w:r>
+      <w:proofErr w:type="spellStart"/>
+      <w:r>
+        <w:rPr>
+          <w:lang w:val="en-AT"/>
+        </w:rPr>
+        <w:t>arrayCopy.length</w:t>
+      </w:r>
+      <w:proofErr w:type="spellEnd"/>
+      <w:r>
+        <w:rPr>
+          <w:lang w:val="en-AT"/>
+        </w:rPr>
+        <w:t xml:space="preserve"> / 2; </w:t>
+      </w:r>
+      <w:proofErr w:type="spellStart"/>
+      <w:r>
+        <w:rPr>
+          <w:lang w:val="en-AT"/>
+        </w:rPr>
+        <w:t>i</w:t>
+      </w:r>
+      <w:proofErr w:type="spellEnd"/>
+      <w:r>
+        <w:rPr>
+          <w:lang w:val="en-AT"/>
+        </w:rPr>
+        <w:t>++)</w:t>
       </w:r>
       <w:r>
         <w:rPr>
@@ -1775,21 +2795,161 @@
           <w:lang w:val="en-AT"/>
         </w:rPr>
         <w:br/>
-        <w:t xml:space="preserve">        temp = arrayCopy[i];</w:t>
-      </w:r>
-      <w:r>
-        <w:rPr>
-          <w:lang w:val="en-AT"/>
-        </w:rPr>
-        <w:br/>
-        <w:t xml:space="preserve">        arrayCopy[i] = arrayCopy[arrayCopy.length - 1 - i];</w:t>
-      </w:r>
-      <w:r>
-        <w:rPr>
-          <w:lang w:val="en-AT"/>
-        </w:rPr>
-        <w:br/>
-        <w:t xml:space="preserve">        arrayCopy[arrayCopy.length - 1 - i] = temp;</w:t>
+        <w:t xml:space="preserve">        temp = </w:t>
+      </w:r>
+      <w:proofErr w:type="spellStart"/>
+      <w:r>
+        <w:rPr>
+          <w:lang w:val="en-AT"/>
+        </w:rPr>
+        <w:t>arrayCopy</w:t>
+      </w:r>
+      <w:proofErr w:type="spellEnd"/>
+      <w:r>
+        <w:rPr>
+          <w:lang w:val="en-AT"/>
+        </w:rPr>
+        <w:t>[</w:t>
+      </w:r>
+      <w:proofErr w:type="spellStart"/>
+      <w:r>
+        <w:rPr>
+          <w:lang w:val="en-AT"/>
+        </w:rPr>
+        <w:t>i</w:t>
+      </w:r>
+      <w:proofErr w:type="spellEnd"/>
+      <w:r>
+        <w:rPr>
+          <w:lang w:val="en-AT"/>
+        </w:rPr>
+        <w:t>];</w:t>
+      </w:r>
+      <w:r>
+        <w:rPr>
+          <w:lang w:val="en-AT"/>
+        </w:rPr>
+        <w:br/>
+        <w:t xml:space="preserve">        </w:t>
+      </w:r>
+      <w:proofErr w:type="spellStart"/>
+      <w:r>
+        <w:rPr>
+          <w:lang w:val="en-AT"/>
+        </w:rPr>
+        <w:t>arrayCopy</w:t>
+      </w:r>
+      <w:proofErr w:type="spellEnd"/>
+      <w:r>
+        <w:rPr>
+          <w:lang w:val="en-AT"/>
+        </w:rPr>
+        <w:t>[</w:t>
+      </w:r>
+      <w:proofErr w:type="spellStart"/>
+      <w:r>
+        <w:rPr>
+          <w:lang w:val="en-AT"/>
+        </w:rPr>
+        <w:t>i</w:t>
+      </w:r>
+      <w:proofErr w:type="spellEnd"/>
+      <w:r>
+        <w:rPr>
+          <w:lang w:val="en-AT"/>
+        </w:rPr>
+        <w:t xml:space="preserve">] = </w:t>
+      </w:r>
+      <w:proofErr w:type="spellStart"/>
+      <w:r>
+        <w:rPr>
+          <w:lang w:val="en-AT"/>
+        </w:rPr>
+        <w:t>arrayCopy</w:t>
+      </w:r>
+      <w:proofErr w:type="spellEnd"/>
+      <w:r>
+        <w:rPr>
+          <w:lang w:val="en-AT"/>
+        </w:rPr>
+        <w:t>[</w:t>
+      </w:r>
+      <w:proofErr w:type="spellStart"/>
+      <w:r>
+        <w:rPr>
+          <w:lang w:val="en-AT"/>
+        </w:rPr>
+        <w:t>arrayCopy.length</w:t>
+      </w:r>
+      <w:proofErr w:type="spellEnd"/>
+      <w:r>
+        <w:rPr>
+          <w:lang w:val="en-AT"/>
+        </w:rPr>
+        <w:t xml:space="preserve"> - 1 - </w:t>
+      </w:r>
+      <w:proofErr w:type="spellStart"/>
+      <w:r>
+        <w:rPr>
+          <w:lang w:val="en-AT"/>
+        </w:rPr>
+        <w:t>i</w:t>
+      </w:r>
+      <w:proofErr w:type="spellEnd"/>
+      <w:r>
+        <w:rPr>
+          <w:lang w:val="en-AT"/>
+        </w:rPr>
+        <w:t>];</w:t>
+      </w:r>
+      <w:r>
+        <w:rPr>
+          <w:lang w:val="en-AT"/>
+        </w:rPr>
+        <w:br/>
+        <w:t xml:space="preserve">        </w:t>
+      </w:r>
+      <w:proofErr w:type="spellStart"/>
+      <w:r>
+        <w:rPr>
+          <w:lang w:val="en-AT"/>
+        </w:rPr>
+        <w:t>arrayCopy</w:t>
+      </w:r>
+      <w:proofErr w:type="spellEnd"/>
+      <w:r>
+        <w:rPr>
+          <w:lang w:val="en-AT"/>
+        </w:rPr>
+        <w:t>[</w:t>
+      </w:r>
+      <w:proofErr w:type="spellStart"/>
+      <w:r>
+        <w:rPr>
+          <w:lang w:val="en-AT"/>
+        </w:rPr>
+        <w:t>arrayCopy.length</w:t>
+      </w:r>
+      <w:proofErr w:type="spellEnd"/>
+      <w:r>
+        <w:rPr>
+          <w:lang w:val="en-AT"/>
+        </w:rPr>
+        <w:t xml:space="preserve"> - 1 - </w:t>
+      </w:r>
+      <w:proofErr w:type="spellStart"/>
+      <w:r>
+        <w:rPr>
+          <w:lang w:val="en-AT"/>
+        </w:rPr>
+        <w:t>i</w:t>
+      </w:r>
+      <w:proofErr w:type="spellEnd"/>
+      <w:r>
+        <w:rPr>
+          <w:lang w:val="en-AT"/>
+        </w:rPr>
+        <w:t>] = temp;</w:t>
       </w:r>
       <w:r>
         <w:rPr>
@@ -1815,7 +2975,21 @@
           <w:lang w:val="en-AT"/>
         </w:rPr>
         <w:lastRenderedPageBreak/>
-        <w:t xml:space="preserve">    return arrayCopy;</w:t>
+        <w:t xml:space="preserve">    return </w:t>
+      </w:r>
+      <w:proofErr w:type="spellStart"/>
+      <w:r>
+        <w:rPr>
+          <w:lang w:val="en-AT"/>
+        </w:rPr>
+        <w:t>arrayCopy</w:t>
+      </w:r>
+      <w:proofErr w:type="spellEnd"/>
+      <w:r>
+        <w:rPr>
+          <w:lang w:val="en-AT"/>
+        </w:rPr>
+        <w:t>;</w:t>
       </w:r>
       <w:r>
         <w:rPr>
@@ -1856,8 +3030,13 @@
       </w:r>
       <w:bookmarkEnd w:id="3"/>
       <w:r>
-        <w:t>: reverseArray</w:t>
-      </w:r>
+        <w:t xml:space="preserve">: </w:t>
+      </w:r>
+      <w:proofErr w:type="spellStart"/>
+      <w:r>
+        <w:t>reverseArray</w:t>
+      </w:r>
+      <w:proofErr w:type="spellEnd"/>
     </w:p>
     <w:p>
       <w:pPr>
@@ -1885,7 +3064,21 @@
           <w:lang w:val="en-AT"/>
         </w:rPr>
         <w:br/>
-        <w:t>void testArrayReversalOdd()</w:t>
+        <w:t xml:space="preserve">void </w:t>
+      </w:r>
+      <w:proofErr w:type="spellStart"/>
+      <w:r>
+        <w:rPr>
+          <w:lang w:val="en-AT"/>
+        </w:rPr>
+        <w:t>testArrayReversalOdd</w:t>
+      </w:r>
+      <w:proofErr w:type="spellEnd"/>
+      <w:r>
+        <w:rPr>
+          <w:lang w:val="en-AT"/>
+        </w:rPr>
+        <w:t>()</w:t>
       </w:r>
       <w:r>
         <w:rPr>
@@ -1899,72 +3092,254 @@
           <w:lang w:val="en-AT"/>
         </w:rPr>
         <w:br/>
-        <w:t xml:space="preserve">    int[] inputArray = {10, 20, 30, 40, 50};</w:t>
-      </w:r>
-      <w:r>
-        <w:rPr>
-          <w:lang w:val="en-AT"/>
-        </w:rPr>
-        <w:br/>
-      </w:r>
-      <w:r>
-        <w:rPr>
-          <w:lang w:val="en-AT"/>
-        </w:rPr>
-        <w:br/>
-        <w:t xml:space="preserve">    ArrayReversalExercise excercise = new ArrayReversalExercise(inputArray);</w:t>
-      </w:r>
-      <w:r>
-        <w:rPr>
-          <w:lang w:val="en-AT"/>
-        </w:rPr>
-        <w:br/>
-      </w:r>
-      <w:r>
-        <w:rPr>
-          <w:lang w:val="en-AT"/>
-        </w:rPr>
-        <w:br/>
-        <w:t xml:space="preserve">    excercise.runExcercise();</w:t>
-      </w:r>
-      <w:r>
-        <w:rPr>
-          <w:lang w:val="en-AT"/>
-        </w:rPr>
-        <w:br/>
-      </w:r>
-      <w:r>
-        <w:rPr>
-          <w:lang w:val="en-AT"/>
-        </w:rPr>
-        <w:br/>
-        <w:t xml:space="preserve">    int[] reversedArray = excercise.getReversedArray();</w:t>
-      </w:r>
-      <w:r>
-        <w:rPr>
-          <w:lang w:val="en-AT"/>
-        </w:rPr>
-        <w:br/>
-      </w:r>
-      <w:r>
-        <w:rPr>
-          <w:lang w:val="en-AT"/>
-        </w:rPr>
-        <w:br/>
-        <w:t xml:space="preserve">    int[] expectedArray = {50, 40, 30, 20, 10};</w:t>
-      </w:r>
-      <w:r>
-        <w:rPr>
-          <w:lang w:val="en-AT"/>
-        </w:rPr>
-        <w:br/>
-      </w:r>
-      <w:r>
-        <w:rPr>
-          <w:lang w:val="en-AT"/>
-        </w:rPr>
-        <w:br/>
-        <w:t xml:space="preserve">    for (int i = 0; i &lt; expectedArray.length; i++)</w:t>
+        <w:t xml:space="preserve">    int[] </w:t>
+      </w:r>
+      <w:proofErr w:type="spellStart"/>
+      <w:r>
+        <w:rPr>
+          <w:lang w:val="en-AT"/>
+        </w:rPr>
+        <w:t>inputArray</w:t>
+      </w:r>
+      <w:proofErr w:type="spellEnd"/>
+      <w:r>
+        <w:rPr>
+          <w:lang w:val="en-AT"/>
+        </w:rPr>
+        <w:t xml:space="preserve"> = {10, 20, 30, 40, 50};</w:t>
+      </w:r>
+      <w:r>
+        <w:rPr>
+          <w:lang w:val="en-AT"/>
+        </w:rPr>
+        <w:br/>
+      </w:r>
+      <w:r>
+        <w:rPr>
+          <w:lang w:val="en-AT"/>
+        </w:rPr>
+        <w:br/>
+        <w:t xml:space="preserve">    </w:t>
+      </w:r>
+      <w:proofErr w:type="spellStart"/>
+      <w:r>
+        <w:rPr>
+          <w:lang w:val="en-AT"/>
+        </w:rPr>
+        <w:t>ArrayReversalExercise</w:t>
+      </w:r>
+      <w:proofErr w:type="spellEnd"/>
+      <w:r>
+        <w:rPr>
+          <w:lang w:val="en-AT"/>
+        </w:rPr>
+        <w:t xml:space="preserve"> </w:t>
+      </w:r>
+      <w:proofErr w:type="spellStart"/>
+      <w:r>
+        <w:rPr>
+          <w:lang w:val="en-AT"/>
+        </w:rPr>
+        <w:t>excercise</w:t>
+      </w:r>
+      <w:proofErr w:type="spellEnd"/>
+      <w:r>
+        <w:rPr>
+          <w:lang w:val="en-AT"/>
+        </w:rPr>
+        <w:t xml:space="preserve"> = new </w:t>
+      </w:r>
+      <w:proofErr w:type="spellStart"/>
+      <w:r>
+        <w:rPr>
+          <w:lang w:val="en-AT"/>
+        </w:rPr>
+        <w:t>ArrayReversalExercise</w:t>
+      </w:r>
+      <w:proofErr w:type="spellEnd"/>
+      <w:r>
+        <w:rPr>
+          <w:lang w:val="en-AT"/>
+        </w:rPr>
+        <w:t>(</w:t>
+      </w:r>
+      <w:proofErr w:type="spellStart"/>
+      <w:r>
+        <w:rPr>
+          <w:lang w:val="en-AT"/>
+        </w:rPr>
+        <w:t>inputArray</w:t>
+      </w:r>
+      <w:proofErr w:type="spellEnd"/>
+      <w:r>
+        <w:rPr>
+          <w:lang w:val="en-AT"/>
+        </w:rPr>
+        <w:t>);</w:t>
+      </w:r>
+      <w:r>
+        <w:rPr>
+          <w:lang w:val="en-AT"/>
+        </w:rPr>
+        <w:br/>
+      </w:r>
+      <w:r>
+        <w:rPr>
+          <w:lang w:val="en-AT"/>
+        </w:rPr>
+        <w:br/>
+        <w:t xml:space="preserve">    </w:t>
+      </w:r>
+      <w:proofErr w:type="spellStart"/>
+      <w:r>
+        <w:rPr>
+          <w:lang w:val="en-AT"/>
+        </w:rPr>
+        <w:t>excercise.runExcercise</w:t>
+      </w:r>
+      <w:proofErr w:type="spellEnd"/>
+      <w:r>
+        <w:rPr>
+          <w:lang w:val="en-AT"/>
+        </w:rPr>
+        <w:t>();</w:t>
+      </w:r>
+      <w:r>
+        <w:rPr>
+          <w:lang w:val="en-AT"/>
+        </w:rPr>
+        <w:br/>
+      </w:r>
+      <w:r>
+        <w:rPr>
+          <w:lang w:val="en-AT"/>
+        </w:rPr>
+        <w:br/>
+        <w:t xml:space="preserve">    int[] </w:t>
+      </w:r>
+      <w:proofErr w:type="spellStart"/>
+      <w:r>
+        <w:rPr>
+          <w:lang w:val="en-AT"/>
+        </w:rPr>
+        <w:t>reversedArray</w:t>
+      </w:r>
+      <w:proofErr w:type="spellEnd"/>
+      <w:r>
+        <w:rPr>
+          <w:lang w:val="en-AT"/>
+        </w:rPr>
+        <w:t xml:space="preserve"> = </w:t>
+      </w:r>
+      <w:proofErr w:type="spellStart"/>
+      <w:r>
+        <w:rPr>
+          <w:lang w:val="en-AT"/>
+        </w:rPr>
+        <w:t>excercise.getReversedArray</w:t>
+      </w:r>
+      <w:proofErr w:type="spellEnd"/>
+      <w:r>
+        <w:rPr>
+          <w:lang w:val="en-AT"/>
+        </w:rPr>
+        <w:t>();</w:t>
+      </w:r>
+      <w:r>
+        <w:rPr>
+          <w:lang w:val="en-AT"/>
+        </w:rPr>
+        <w:br/>
+      </w:r>
+      <w:r>
+        <w:rPr>
+          <w:lang w:val="en-AT"/>
+        </w:rPr>
+        <w:br/>
+        <w:t xml:space="preserve">    int[] </w:t>
+      </w:r>
+      <w:proofErr w:type="spellStart"/>
+      <w:r>
+        <w:rPr>
+          <w:lang w:val="en-AT"/>
+        </w:rPr>
+        <w:t>expectedArray</w:t>
+      </w:r>
+      <w:proofErr w:type="spellEnd"/>
+      <w:r>
+        <w:rPr>
+          <w:lang w:val="en-AT"/>
+        </w:rPr>
+        <w:t xml:space="preserve"> = {50, 40, 30, 20, 10};</w:t>
+      </w:r>
+      <w:r>
+        <w:rPr>
+          <w:lang w:val="en-AT"/>
+        </w:rPr>
+        <w:br/>
+      </w:r>
+      <w:r>
+        <w:rPr>
+          <w:lang w:val="en-AT"/>
+        </w:rPr>
+        <w:br/>
+        <w:t xml:space="preserve">    for (int </w:t>
+      </w:r>
+      <w:proofErr w:type="spellStart"/>
+      <w:r>
+        <w:rPr>
+          <w:lang w:val="en-AT"/>
+        </w:rPr>
+        <w:t>i</w:t>
+      </w:r>
+      <w:proofErr w:type="spellEnd"/>
+      <w:r>
+        <w:rPr>
+          <w:lang w:val="en-AT"/>
+        </w:rPr>
+        <w:t xml:space="preserve"> = 0; </w:t>
+      </w:r>
+      <w:proofErr w:type="spellStart"/>
+      <w:r>
+        <w:rPr>
+          <w:lang w:val="en-AT"/>
+        </w:rPr>
+        <w:t>i</w:t>
+      </w:r>
+      <w:proofErr w:type="spellEnd"/>
+      <w:r>
+        <w:rPr>
+          <w:lang w:val="en-AT"/>
+        </w:rPr>
+        <w:t xml:space="preserve"> &lt; </w:t>
+      </w:r>
+      <w:proofErr w:type="spellStart"/>
+      <w:r>
+        <w:rPr>
+          <w:lang w:val="en-AT"/>
+        </w:rPr>
+        <w:t>expectedArray.length</w:t>
+      </w:r>
+      <w:proofErr w:type="spellEnd"/>
+      <w:r>
+        <w:rPr>
+          <w:lang w:val="en-AT"/>
+        </w:rPr>
+        <w:t xml:space="preserve">; </w:t>
+      </w:r>
+      <w:proofErr w:type="spellStart"/>
+      <w:r>
+        <w:rPr>
+          <w:lang w:val="en-AT"/>
+        </w:rPr>
+        <w:t>i</w:t>
+      </w:r>
+      <w:proofErr w:type="spellEnd"/>
+      <w:r>
+        <w:rPr>
+          <w:lang w:val="en-AT"/>
+        </w:rPr>
+        <w:t>++)</w:t>
       </w:r>
       <w:r>
         <w:rPr>
@@ -1978,7 +3353,63 @@
           <w:lang w:val="en-AT"/>
         </w:rPr>
         <w:br/>
-        <w:t xml:space="preserve">        assert(reversedArray[i] == expectedArray[i]);</w:t>
+        <w:t xml:space="preserve">        assert(</w:t>
+      </w:r>
+      <w:proofErr w:type="spellStart"/>
+      <w:r>
+        <w:rPr>
+          <w:lang w:val="en-AT"/>
+        </w:rPr>
+        <w:t>reversedArray</w:t>
+      </w:r>
+      <w:proofErr w:type="spellEnd"/>
+      <w:r>
+        <w:rPr>
+          <w:lang w:val="en-AT"/>
+        </w:rPr>
+        <w:t>[</w:t>
+      </w:r>
+      <w:proofErr w:type="spellStart"/>
+      <w:r>
+        <w:rPr>
+          <w:lang w:val="en-AT"/>
+        </w:rPr>
+        <w:t>i</w:t>
+      </w:r>
+      <w:proofErr w:type="spellEnd"/>
+      <w:r>
+        <w:rPr>
+          <w:lang w:val="en-AT"/>
+        </w:rPr>
+        <w:t xml:space="preserve">] == </w:t>
+      </w:r>
+      <w:proofErr w:type="spellStart"/>
+      <w:r>
+        <w:rPr>
+          <w:lang w:val="en-AT"/>
+        </w:rPr>
+        <w:t>expectedArray</w:t>
+      </w:r>
+      <w:proofErr w:type="spellEnd"/>
+      <w:r>
+        <w:rPr>
+          <w:lang w:val="en-AT"/>
+        </w:rPr>
+        <w:t>[</w:t>
+      </w:r>
+      <w:proofErr w:type="spellStart"/>
+      <w:r>
+        <w:rPr>
+          <w:lang w:val="en-AT"/>
+        </w:rPr>
+        <w:t>i</w:t>
+      </w:r>
+      <w:proofErr w:type="spellEnd"/>
+      <w:r>
+        <w:rPr>
+          <w:lang w:val="en-AT"/>
+        </w:rPr>
+        <w:t>]);</w:t>
       </w:r>
       <w:r>
         <w:rPr>
@@ -2029,7 +3460,15 @@
         <w:pStyle w:val="Pseoudocode"/>
       </w:pPr>
       <w:r>
-        <w:t>=== Array Reversal ===</w:t>
+        <w:t xml:space="preserve">=== </w:t>
+      </w:r>
+      <w:proofErr w:type="spellStart"/>
+      <w:r>
+        <w:t>Array</w:t>
+      </w:r>
+      <w:proofErr w:type="spellEnd"/>
+      <w:r>
+        <w:t xml:space="preserve"> Reversal ===</w:t>
       </w:r>
     </w:p>
     <w:p>
@@ -2037,15 +3476,46 @@
         <w:pStyle w:val="Pseoudocode"/>
       </w:pPr>
       <w:r>
-        <w:t>Original Array: [10, 20, 30, 40, 50]</w:t>
+        <w:t xml:space="preserve">Original </w:t>
+      </w:r>
+      <w:proofErr w:type="spellStart"/>
+      <w:proofErr w:type="gramStart"/>
+      <w:r>
+        <w:t>Array</w:t>
+      </w:r>
+      <w:proofErr w:type="spellEnd"/>
+      <w:r>
+        <w:t>:</w:t>
+      </w:r>
+      <w:proofErr w:type="gramEnd"/>
+      <w:r>
+        <w:t xml:space="preserve"> [10, 20, 30, 40, 50]</w:t>
       </w:r>
     </w:p>
     <w:p>
       <w:pPr>
         <w:pStyle w:val="Pseoudocode"/>
       </w:pPr>
-      <w:r>
-        <w:t>Reversed Array: [50, 40, 30, 20, 10]</w:t>
+      <w:proofErr w:type="spellStart"/>
+      <w:r>
+        <w:t>Reversed</w:t>
+      </w:r>
+      <w:proofErr w:type="spellEnd"/>
+      <w:r>
+        <w:t xml:space="preserve"> </w:t>
+      </w:r>
+      <w:proofErr w:type="spellStart"/>
+      <w:proofErr w:type="gramStart"/>
+      <w:r>
+        <w:t>Array</w:t>
+      </w:r>
+      <w:proofErr w:type="spellEnd"/>
+      <w:r>
+        <w:t>:</w:t>
+      </w:r>
+      <w:proofErr w:type="gramEnd"/>
+      <w:r>
+        <w:t xml:space="preserve"> [50, 40, 30, 20, 10]</w:t>
       </w:r>
     </w:p>
     <w:p>
@@ -2205,6 +3675,9 @@
         </mc:AlternateContent>
       </w:r>
       <w:r>
+        <w:rPr>
+          <w:noProof/>
+        </w:rPr>
         <w:drawing>
           <wp:anchor distT="0" distB="0" distL="114300" distR="114300" simplePos="0" relativeHeight="251665408" behindDoc="0" locked="0" layoutInCell="1" allowOverlap="1" wp14:anchorId="32442BD6" wp14:editId="5F238951">
             <wp:simplePos x="0" y="0"/>
@@ -2257,6 +3730,195 @@
       </w:r>
     </w:p>
     <w:p/>
+    <w:p>
+      <w:pPr>
+        <w:pStyle w:val="Heading1"/>
+      </w:pPr>
+      <w:r>
+        <w:lastRenderedPageBreak/>
+        <w:t>Exercise 3 – Fuzzy Search</w:t>
+      </w:r>
+    </w:p>
+    <w:p>
+      <w:pPr>
+        <w:pStyle w:val="Heading2"/>
+      </w:pPr>
+      <w:r>
+        <w:t>Solution Idea</w:t>
+      </w:r>
+    </w:p>
+    <w:p>
+      <w:r>
+        <w:t xml:space="preserve">Loop through the array and save the difference of the current index with the target value, if during another iteration the difference is smaller, save that index as the closest match instead. </w:t>
+      </w:r>
+      <w:r>
+        <w:t xml:space="preserve">If the index value is the same as the </w:t>
+      </w:r>
+      <w:r>
+        <w:t>target,</w:t>
+      </w:r>
+      <w:r>
+        <w:t xml:space="preserve"> simply return that. </w:t>
+      </w:r>
+    </w:p>
+    <w:p>
+      <w:pPr>
+        <w:pStyle w:val="Heading2"/>
+      </w:pPr>
+      <w:r>
+        <w:t>Code</w:t>
+      </w:r>
+    </w:p>
+    <w:p>
+      <w:pPr>
+        <w:pStyle w:val="Pseoudocode"/>
+        <w:rPr>
+          <w:lang w:val="en-AT"/>
+        </w:rPr>
+      </w:pPr>
+      <w:r>
+        <w:rPr>
+          <w:lang w:val="en-AT"/>
+        </w:rPr>
+        <w:t xml:space="preserve">public record </w:t>
+      </w:r>
+      <w:proofErr w:type="spellStart"/>
+      <w:proofErr w:type="gramStart"/>
+      <w:r>
+        <w:rPr>
+          <w:lang w:val="en-AT"/>
+        </w:rPr>
+        <w:t>FuzzySearchResult</w:t>
+      </w:r>
+      <w:proofErr w:type="spellEnd"/>
+      <w:r>
+        <w:rPr>
+          <w:lang w:val="en-AT"/>
+        </w:rPr>
+        <w:t>(</w:t>
+      </w:r>
+      <w:proofErr w:type="spellStart"/>
+      <w:proofErr w:type="gramEnd"/>
+      <w:r>
+        <w:rPr>
+          <w:lang w:val="en-AT"/>
+        </w:rPr>
+        <w:t>boolean</w:t>
+      </w:r>
+      <w:proofErr w:type="spellEnd"/>
+      <w:r>
+        <w:rPr>
+          <w:lang w:val="en-AT"/>
+        </w:rPr>
+        <w:t xml:space="preserve"> </w:t>
+      </w:r>
+      <w:proofErr w:type="spellStart"/>
+      <w:r>
+        <w:rPr>
+          <w:lang w:val="en-AT"/>
+        </w:rPr>
+        <w:t>foundExactMatch</w:t>
+      </w:r>
+      <w:proofErr w:type="spellEnd"/>
+      <w:r>
+        <w:rPr>
+          <w:lang w:val="en-AT"/>
+        </w:rPr>
+        <w:t xml:space="preserve">, int </w:t>
+      </w:r>
+      <w:proofErr w:type="spellStart"/>
+      <w:r>
+        <w:rPr>
+          <w:lang w:val="en-AT"/>
+        </w:rPr>
+        <w:t>bestMatchIndex</w:t>
+      </w:r>
+      <w:proofErr w:type="spellEnd"/>
+      <w:r>
+        <w:rPr>
+          <w:lang w:val="en-AT"/>
+        </w:rPr>
+        <w:t xml:space="preserve">, int </w:t>
+      </w:r>
+      <w:proofErr w:type="spellStart"/>
+      <w:r>
+        <w:rPr>
+          <w:lang w:val="en-AT"/>
+        </w:rPr>
+        <w:t>bestMatchValue</w:t>
+      </w:r>
+      <w:proofErr w:type="spellEnd"/>
+      <w:r>
+        <w:rPr>
+          <w:lang w:val="en-AT"/>
+        </w:rPr>
+        <w:t>)</w:t>
+      </w:r>
+      <w:r>
+        <w:rPr>
+          <w:lang w:val="en-AT"/>
+        </w:rPr>
+        <w:t xml:space="preserve"> </w:t>
+      </w:r>
+      <w:proofErr w:type="gramStart"/>
+      <w:r>
+        <w:rPr>
+          <w:lang w:val="en-AT"/>
+        </w:rPr>
+        <w:t>{</w:t>
+      </w:r>
+      <w:r>
+        <w:rPr>
+          <w:lang w:val="en-AT"/>
+        </w:rPr>
+        <w:t xml:space="preserve"> </w:t>
+      </w:r>
+      <w:r>
+        <w:rPr>
+          <w:lang w:val="en-AT"/>
+        </w:rPr>
+        <w:t>}</w:t>
+      </w:r>
+      <w:proofErr w:type="gramEnd"/>
+    </w:p>
+    <w:p>
+      <w:pPr>
+        <w:pStyle w:val="Caption"/>
+      </w:pPr>
+      <w:r>
+        <w:t xml:space="preserve">Figure </w:t>
+      </w:r>
+      <w:r>
+        <w:fldChar w:fldCharType="begin"/>
+      </w:r>
+      <w:r>
+        <w:instrText xml:space="preserve"> SEQ Figure \* ARABIC </w:instrText>
+      </w:r>
+      <w:r>
+        <w:fldChar w:fldCharType="separate"/>
+      </w:r>
+      <w:r>
+        <w:rPr>
+          <w:noProof/>
+        </w:rPr>
+        <w:t>11</w:t>
+      </w:r>
+      <w:r>
+        <w:fldChar w:fldCharType="end"/>
+      </w:r>
+      <w:r>
+        <w:t>: Fuzzy search result record</w:t>
+      </w:r>
+    </w:p>
+    <w:p/>
+    <w:p>
+      <w:pPr>
+        <w:pStyle w:val="Heading2"/>
+      </w:pPr>
+      <w:r>
+        <w:t>Test</w:t>
+      </w:r>
+    </w:p>
     <w:sectPr>
       <w:headerReference w:type="default" r:id="rId10"/>
       <w:footerReference w:type="default" r:id="rId11"/>

</xml_diff>

<commit_message>
Add line breaks between exercise outputs in Main.java
Inserted IO.println() calls between the outputs of different exercises in Main.java to improve readability of the console output.
</commit_message>
<xml_diff>
--- a/Modules/Semester_1/Modern Code/Aufgaben/04_Arrays_and_Algorithms/Protocol.docx
+++ b/Modules/Semester_1/Modern Code/Aufgaben/04_Arrays_and_Algorithms/Protocol.docx
@@ -277,13 +277,8 @@
                                 <w:r>
                                   <w:tab/>
                                 </w:r>
-                                <w:proofErr w:type="gramStart"/>
                                 <w:r>
-                                  <w:t>XX:XX</w:t>
-                                </w:r>
-                                <w:proofErr w:type="gramEnd"/>
-                                <w:r>
-                                  <w:t>:XX</w:t>
+                                  <w:t>XX:XX:XX</w:t>
                                 </w:r>
                               </w:p>
                             </w:txbxContent>
@@ -385,13 +380,8 @@
                           <w:r>
                             <w:tab/>
                           </w:r>
-                          <w:proofErr w:type="gramStart"/>
                           <w:r>
-                            <w:t>XX:XX</w:t>
-                          </w:r>
-                          <w:proofErr w:type="gramEnd"/>
-                          <w:r>
-                            <w:t>:XX</w:t>
+                            <w:t>XX:XX:XX</w:t>
                           </w:r>
                         </w:p>
                       </w:txbxContent>
@@ -689,15 +679,7 @@
     </w:p>
     <w:p>
       <w:r>
-        <w:t xml:space="preserve">Calculating the </w:t>
-      </w:r>
-      <w:proofErr w:type="gramStart"/>
-      <w:r>
-        <w:t>mean</w:t>
-      </w:r>
-      <w:proofErr w:type="gramEnd"/>
-      <w:r>
-        <w:t xml:space="preserve"> only requires calculating the sum and then dividing by the length of the array. Before dividing, either the sum or the length should be </w:t>
+        <w:t xml:space="preserve">Calculating the mean only requires calculating the sum and then dividing by the length of the array. Before dividing, either the sum or the length should be </w:t>
       </w:r>
       <w:r>
         <w:t>cast</w:t>
@@ -771,16 +753,211 @@
       <w:pPr>
         <w:pStyle w:val="Pseoudocode"/>
       </w:pPr>
-      <w:proofErr w:type="gramStart"/>
-      <w:r>
-        <w:t>public</w:t>
-      </w:r>
-      <w:proofErr w:type="gramEnd"/>
+      <w:r>
+        <w:t xml:space="preserve">public </w:t>
+      </w:r>
+      <w:proofErr w:type="spellStart"/>
+      <w:r>
+        <w:t>void</w:t>
+      </w:r>
+      <w:proofErr w:type="spellEnd"/>
       <w:r>
         <w:t xml:space="preserve"> </w:t>
       </w:r>
       <w:proofErr w:type="spellStart"/>
       <w:r>
+        <w:t>calculateMean</w:t>
+      </w:r>
+      <w:proofErr w:type="spellEnd"/>
+      <w:r>
+        <w:t>()</w:t>
+      </w:r>
+      <w:r>
+        <w:br/>
+        <w:t>{</w:t>
+      </w:r>
+      <w:r>
+        <w:br/>
+        <w:t xml:space="preserve">    </w:t>
+      </w:r>
+      <w:proofErr w:type="spellStart"/>
+      <w:r>
+        <w:t>int</w:t>
+      </w:r>
+      <w:proofErr w:type="spellEnd"/>
+      <w:r>
+        <w:t xml:space="preserve"> </w:t>
+      </w:r>
+      <w:proofErr w:type="spellStart"/>
+      <w:r>
+        <w:t>sum</w:t>
+      </w:r>
+      <w:proofErr w:type="spellEnd"/>
+      <w:r>
+        <w:t xml:space="preserve"> = 0;</w:t>
+      </w:r>
+      <w:r>
+        <w:br/>
+      </w:r>
+      <w:r>
+        <w:br/>
+        <w:t xml:space="preserve">    for (</w:t>
+      </w:r>
+      <w:proofErr w:type="spellStart"/>
+      <w:r>
+        <w:t>int</w:t>
+      </w:r>
+      <w:proofErr w:type="spellEnd"/>
+      <w:r>
+        <w:t xml:space="preserve"> </w:t>
+      </w:r>
+      <w:proofErr w:type="spellStart"/>
+      <w:r>
+        <w:t>num</w:t>
+      </w:r>
+      <w:proofErr w:type="spellEnd"/>
+      <w:r>
+        <w:t xml:space="preserve"> : </w:t>
+      </w:r>
+      <w:proofErr w:type="spellStart"/>
+      <w:r>
+        <w:t>getInputArray</w:t>
+      </w:r>
+      <w:proofErr w:type="spellEnd"/>
+      <w:r>
+        <w:t>())</w:t>
+      </w:r>
+      <w:r>
+        <w:br/>
+        <w:t xml:space="preserve">    {</w:t>
+      </w:r>
+      <w:r>
+        <w:br/>
+        <w:t xml:space="preserve">        </w:t>
+      </w:r>
+      <w:proofErr w:type="spellStart"/>
+      <w:r>
+        <w:t>sum</w:t>
+      </w:r>
+      <w:proofErr w:type="spellEnd"/>
+      <w:r>
+        <w:t xml:space="preserve"> += </w:t>
+      </w:r>
+      <w:proofErr w:type="spellStart"/>
+      <w:r>
+        <w:t>num</w:t>
+      </w:r>
+      <w:proofErr w:type="spellEnd"/>
+      <w:r>
+        <w:t>;</w:t>
+      </w:r>
+      <w:r>
+        <w:br/>
+      </w:r>
+      <w:r>
+        <w:lastRenderedPageBreak/>
+        <w:t xml:space="preserve">    }</w:t>
+      </w:r>
+      <w:r>
+        <w:br/>
+      </w:r>
+      <w:r>
+        <w:br/>
+        <w:t xml:space="preserve">    </w:t>
+      </w:r>
+      <w:proofErr w:type="spellStart"/>
+      <w:r>
+        <w:t>setMean</w:t>
+      </w:r>
+      <w:proofErr w:type="spellEnd"/>
+      <w:r>
+        <w:t xml:space="preserve">((double) </w:t>
+      </w:r>
+      <w:proofErr w:type="spellStart"/>
+      <w:r>
+        <w:t>sum</w:t>
+      </w:r>
+      <w:proofErr w:type="spellEnd"/>
+      <w:r>
+        <w:t xml:space="preserve"> / </w:t>
+      </w:r>
+      <w:proofErr w:type="spellStart"/>
+      <w:r>
+        <w:t>getInputArray</w:t>
+      </w:r>
+      <w:proofErr w:type="spellEnd"/>
+      <w:r>
+        <w:t>().</w:t>
+      </w:r>
+      <w:proofErr w:type="spellStart"/>
+      <w:r>
+        <w:t>length</w:t>
+      </w:r>
+      <w:proofErr w:type="spellEnd"/>
+      <w:r>
+        <w:t>);</w:t>
+      </w:r>
+      <w:r>
+        <w:br/>
+        <w:t>}</w:t>
+      </w:r>
+    </w:p>
+    <w:p>
+      <w:pPr>
+        <w:pStyle w:val="Caption"/>
+        <w:rPr>
+          <w:lang w:val="en-AT"/>
+        </w:rPr>
+      </w:pPr>
+      <w:bookmarkStart w:id="2" w:name="_Ref215077198"/>
+      <w:r>
+        <w:t xml:space="preserve">Figure </w:t>
+      </w:r>
+      <w:r>
+        <w:fldChar w:fldCharType="begin"/>
+      </w:r>
+      <w:r>
+        <w:instrText xml:space="preserve"> SEQ Figure \* ARABIC </w:instrText>
+      </w:r>
+      <w:r>
+        <w:fldChar w:fldCharType="separate"/>
+      </w:r>
+      <w:r>
+        <w:rPr>
+          <w:noProof/>
+        </w:rPr>
+        <w:t>1</w:t>
+      </w:r>
+      <w:r>
+        <w:fldChar w:fldCharType="end"/>
+      </w:r>
+      <w:bookmarkEnd w:id="2"/>
+      <w:r>
+        <w:t xml:space="preserve">: </w:t>
+      </w:r>
+      <w:proofErr w:type="spellStart"/>
+      <w:r>
+        <w:t>calculateMean</w:t>
+      </w:r>
+      <w:proofErr w:type="spellEnd"/>
+    </w:p>
+    <w:p>
+      <w:pPr>
+        <w:pStyle w:val="Heading3"/>
+      </w:pPr>
+      <w:r>
+        <w:t>Median</w:t>
+      </w:r>
+    </w:p>
+    <w:p>
+      <w:pPr>
+        <w:pStyle w:val="Pseoudocode"/>
+      </w:pPr>
+      <w:r>
+        <w:t xml:space="preserve">public </w:t>
+      </w:r>
+      <w:proofErr w:type="spellStart"/>
+      <w:r>
         <w:t>void</w:t>
       </w:r>
       <w:proofErr w:type="spellEnd"/>
@@ -788,17 +965,12 @@
         <w:t xml:space="preserve"> </w:t>
       </w:r>
       <w:proofErr w:type="spellStart"/>
-      <w:proofErr w:type="gramStart"/>
-      <w:r>
-        <w:t>calculateMean</w:t>
-      </w:r>
-      <w:proofErr w:type="spellEnd"/>
-      <w:r>
-        <w:t>(</w:t>
-      </w:r>
-      <w:proofErr w:type="gramEnd"/>
-      <w:r>
-        <w:t>)</w:t>
+      <w:r>
+        <w:t>calculateMedian</w:t>
+      </w:r>
+      <w:proofErr w:type="spellEnd"/>
+      <w:r>
+        <w:t>()</w:t>
       </w:r>
       <w:r>
         <w:br/>
@@ -814,249 +986,7 @@
       </w:r>
       <w:proofErr w:type="spellEnd"/>
       <w:r>
-        <w:t xml:space="preserve"> </w:t>
-      </w:r>
-      <w:proofErr w:type="spellStart"/>
-      <w:r>
-        <w:t>sum</w:t>
-      </w:r>
-      <w:proofErr w:type="spellEnd"/>
-      <w:r>
-        <w:t xml:space="preserve"> = </w:t>
-      </w:r>
-      <w:proofErr w:type="gramStart"/>
-      <w:r>
-        <w:t>0;</w:t>
-      </w:r>
-      <w:proofErr w:type="gramEnd"/>
-      <w:r>
-        <w:br/>
-      </w:r>
-      <w:r>
-        <w:br/>
-        <w:t xml:space="preserve">    for (</w:t>
-      </w:r>
-      <w:proofErr w:type="spellStart"/>
-      <w:r>
-        <w:t>int</w:t>
-      </w:r>
-      <w:proofErr w:type="spellEnd"/>
-      <w:r>
-        <w:t xml:space="preserve"> </w:t>
-      </w:r>
-      <w:proofErr w:type="spellStart"/>
-      <w:r>
-        <w:t>num</w:t>
-      </w:r>
-      <w:proofErr w:type="spellEnd"/>
-      <w:r>
-        <w:t xml:space="preserve"> : </w:t>
-      </w:r>
-      <w:proofErr w:type="spellStart"/>
-      <w:proofErr w:type="gramStart"/>
-      <w:r>
-        <w:t>getInputArray</w:t>
-      </w:r>
-      <w:proofErr w:type="spellEnd"/>
-      <w:r>
-        <w:t>(</w:t>
-      </w:r>
-      <w:proofErr w:type="gramEnd"/>
-      <w:r>
-        <w:t>))</w:t>
-      </w:r>
-      <w:r>
-        <w:br/>
-        <w:t xml:space="preserve"> </w:t>
-      </w:r>
-      <w:proofErr w:type="gramStart"/>
-      <w:r>
-        <w:t xml:space="preserve">   {</w:t>
-      </w:r>
-      <w:proofErr w:type="gramEnd"/>
-      <w:r>
-        <w:br/>
-        <w:t xml:space="preserve">        </w:t>
-      </w:r>
-      <w:proofErr w:type="spellStart"/>
-      <w:r>
-        <w:t>sum</w:t>
-      </w:r>
-      <w:proofErr w:type="spellEnd"/>
-      <w:r>
-        <w:t xml:space="preserve"> += </w:t>
-      </w:r>
-      <w:proofErr w:type="spellStart"/>
-      <w:proofErr w:type="gramStart"/>
-      <w:r>
-        <w:t>num</w:t>
-      </w:r>
-      <w:proofErr w:type="spellEnd"/>
-      <w:r>
-        <w:t>;</w:t>
-      </w:r>
-      <w:proofErr w:type="gramEnd"/>
-      <w:r>
-        <w:br/>
-      </w:r>
-      <w:r>
-        <w:lastRenderedPageBreak/>
-        <w:t xml:space="preserve">  </w:t>
-      </w:r>
-      <w:proofErr w:type="gramStart"/>
-      <w:r>
-        <w:t xml:space="preserve">  }</w:t>
-      </w:r>
-      <w:proofErr w:type="gramEnd"/>
-      <w:r>
-        <w:br/>
-      </w:r>
-      <w:r>
-        <w:br/>
-        <w:t xml:space="preserve">    </w:t>
-      </w:r>
-      <w:proofErr w:type="spellStart"/>
-      <w:r>
-        <w:t>setMean</w:t>
-      </w:r>
-      <w:proofErr w:type="spellEnd"/>
-      <w:r>
-        <w:t xml:space="preserve">((double) </w:t>
-      </w:r>
-      <w:proofErr w:type="spellStart"/>
-      <w:r>
-        <w:t>sum</w:t>
-      </w:r>
-      <w:proofErr w:type="spellEnd"/>
-      <w:r>
-        <w:t xml:space="preserve"> / </w:t>
-      </w:r>
-      <w:proofErr w:type="spellStart"/>
-      <w:r>
-        <w:t>getInputArray</w:t>
-      </w:r>
-      <w:proofErr w:type="spellEnd"/>
-      <w:r>
-        <w:t>(</w:t>
-      </w:r>
-      <w:proofErr w:type="gramStart"/>
-      <w:r>
-        <w:t>).</w:t>
-      </w:r>
-      <w:proofErr w:type="spellStart"/>
-      <w:r>
-        <w:t>length</w:t>
-      </w:r>
-      <w:proofErr w:type="spellEnd"/>
-      <w:r>
-        <w:t>);</w:t>
-      </w:r>
-      <w:proofErr w:type="gramEnd"/>
-      <w:r>
-        <w:br/>
-        <w:t>}</w:t>
-      </w:r>
-    </w:p>
-    <w:p>
-      <w:pPr>
-        <w:pStyle w:val="Caption"/>
-        <w:rPr>
-          <w:lang w:val="en-AT"/>
-        </w:rPr>
-      </w:pPr>
-      <w:bookmarkStart w:id="2" w:name="_Ref215077198"/>
-      <w:r>
-        <w:t xml:space="preserve">Figure </w:t>
-      </w:r>
-      <w:r>
-        <w:fldChar w:fldCharType="begin"/>
-      </w:r>
-      <w:r>
-        <w:instrText xml:space="preserve"> SEQ Figure \* ARABIC </w:instrText>
-      </w:r>
-      <w:r>
-        <w:fldChar w:fldCharType="separate"/>
-      </w:r>
-      <w:r>
-        <w:rPr>
-          <w:noProof/>
-        </w:rPr>
-        <w:t>1</w:t>
-      </w:r>
-      <w:r>
-        <w:fldChar w:fldCharType="end"/>
-      </w:r>
-      <w:bookmarkEnd w:id="2"/>
-      <w:r>
-        <w:t xml:space="preserve">: </w:t>
-      </w:r>
-      <w:proofErr w:type="spellStart"/>
-      <w:r>
-        <w:t>calculateMean</w:t>
-      </w:r>
-      <w:proofErr w:type="spellEnd"/>
-    </w:p>
-    <w:p>
-      <w:pPr>
-        <w:pStyle w:val="Heading3"/>
-      </w:pPr>
-      <w:r>
-        <w:t>Median</w:t>
-      </w:r>
-    </w:p>
-    <w:p>
-      <w:pPr>
-        <w:pStyle w:val="Pseoudocode"/>
-      </w:pPr>
-      <w:proofErr w:type="gramStart"/>
-      <w:r>
-        <w:t>public</w:t>
-      </w:r>
-      <w:proofErr w:type="gramEnd"/>
-      <w:r>
-        <w:t xml:space="preserve"> </w:t>
-      </w:r>
-      <w:proofErr w:type="spellStart"/>
-      <w:r>
-        <w:t>void</w:t>
-      </w:r>
-      <w:proofErr w:type="spellEnd"/>
-      <w:r>
-        <w:t xml:space="preserve"> </w:t>
-      </w:r>
-      <w:proofErr w:type="spellStart"/>
-      <w:proofErr w:type="gramStart"/>
-      <w:r>
-        <w:t>calculateMedian</w:t>
-      </w:r>
-      <w:proofErr w:type="spellEnd"/>
-      <w:r>
-        <w:t>(</w:t>
-      </w:r>
-      <w:proofErr w:type="gramEnd"/>
-      <w:r>
-        <w:t>)</w:t>
-      </w:r>
-      <w:r>
-        <w:br/>
-        <w:t>{</w:t>
-      </w:r>
-      <w:r>
-        <w:br/>
-        <w:t xml:space="preserve">    </w:t>
-      </w:r>
-      <w:proofErr w:type="spellStart"/>
-      <w:proofErr w:type="gramStart"/>
-      <w:r>
-        <w:t>int</w:t>
-      </w:r>
-      <w:proofErr w:type="spellEnd"/>
-      <w:r>
-        <w:t>[</w:t>
-      </w:r>
-      <w:proofErr w:type="gramEnd"/>
-      <w:r>
-        <w:t xml:space="preserve">] </w:t>
+        <w:t xml:space="preserve">[] </w:t>
       </w:r>
       <w:proofErr w:type="spellStart"/>
       <w:r>
@@ -1082,17 +1012,12 @@
         <w:t>(</w:t>
       </w:r>
       <w:proofErr w:type="spellStart"/>
-      <w:proofErr w:type="gramStart"/>
       <w:r>
         <w:t>getInputArray</w:t>
       </w:r>
       <w:proofErr w:type="spellEnd"/>
       <w:r>
-        <w:t>(</w:t>
-      </w:r>
-      <w:proofErr w:type="gramEnd"/>
-      <w:r>
-        <w:t xml:space="preserve">), </w:t>
+        <w:t xml:space="preserve">(), </w:t>
       </w:r>
       <w:proofErr w:type="spellStart"/>
       <w:r>
@@ -1100,11 +1025,7 @@
       </w:r>
       <w:proofErr w:type="spellEnd"/>
       <w:r>
-        <w:t>(</w:t>
-      </w:r>
-      <w:proofErr w:type="gramStart"/>
-      <w:r>
-        <w:t>).</w:t>
+        <w:t>().</w:t>
       </w:r>
       <w:proofErr w:type="spellStart"/>
       <w:r>
@@ -1114,7 +1035,6 @@
       <w:r>
         <w:t>);</w:t>
       </w:r>
-      <w:proofErr w:type="gramEnd"/>
       <w:r>
         <w:br/>
         <w:t xml:space="preserve">    </w:t>
@@ -1139,11 +1059,9 @@
         <w:t>sortedArray</w:t>
       </w:r>
       <w:proofErr w:type="spellEnd"/>
-      <w:proofErr w:type="gramStart"/>
       <w:r>
         <w:t>);</w:t>
       </w:r>
-      <w:proofErr w:type="gramEnd"/>
       <w:r>
         <w:br/>
       </w:r>
@@ -1161,41 +1079,245 @@
       </w:r>
       <w:r>
         <w:br/>
+        <w:t xml:space="preserve">    {</w:t>
+      </w:r>
+      <w:r>
+        <w:br/>
+        <w:t xml:space="preserve">        </w:t>
+      </w:r>
+      <w:proofErr w:type="spellStart"/>
+      <w:r>
+        <w:t>int</w:t>
+      </w:r>
+      <w:proofErr w:type="spellEnd"/>
+      <w:r>
+        <w:t xml:space="preserve"> mid1 = </w:t>
+      </w:r>
+      <w:proofErr w:type="spellStart"/>
+      <w:r>
+        <w:t>sortedArray.length</w:t>
+      </w:r>
+      <w:proofErr w:type="spellEnd"/>
+      <w:r>
+        <w:t xml:space="preserve"> / 2;</w:t>
+      </w:r>
+      <w:r>
+        <w:br/>
+        <w:t xml:space="preserve">        </w:t>
+      </w:r>
+      <w:proofErr w:type="spellStart"/>
+      <w:r>
+        <w:t>int</w:t>
+      </w:r>
+      <w:proofErr w:type="spellEnd"/>
+      <w:r>
+        <w:t xml:space="preserve"> mid2 = mid1 - 1;</w:t>
+      </w:r>
+      <w:r>
+        <w:br/>
+        <w:t xml:space="preserve">        </w:t>
+      </w:r>
+      <w:proofErr w:type="spellStart"/>
+      <w:r>
+        <w:t>setMedian</w:t>
+      </w:r>
+      <w:proofErr w:type="spellEnd"/>
+      <w:r>
+        <w:t>((</w:t>
+      </w:r>
+      <w:proofErr w:type="spellStart"/>
+      <w:r>
+        <w:t>sortedArray</w:t>
+      </w:r>
+      <w:proofErr w:type="spellEnd"/>
+      <w:r>
+        <w:t xml:space="preserve">[mid1] + </w:t>
+      </w:r>
+      <w:proofErr w:type="spellStart"/>
+      <w:r>
+        <w:t>sortedArray</w:t>
+      </w:r>
+      <w:proofErr w:type="spellEnd"/>
+      <w:r>
+        <w:t>[mid2]) / 2.0);</w:t>
+      </w:r>
+      <w:r>
+        <w:br/>
+        <w:t xml:space="preserve">    }</w:t>
+      </w:r>
+      <w:r>
+        <w:br/>
+        <w:t xml:space="preserve">    </w:t>
+      </w:r>
+      <w:proofErr w:type="spellStart"/>
+      <w:r>
+        <w:t>else</w:t>
+      </w:r>
+      <w:proofErr w:type="spellEnd"/>
+      <w:r>
+        <w:br/>
+        <w:t xml:space="preserve">    {</w:t>
+      </w:r>
+      <w:r>
+        <w:br/>
+        <w:t xml:space="preserve">        </w:t>
+      </w:r>
+      <w:proofErr w:type="spellStart"/>
+      <w:r>
+        <w:t>int</w:t>
+      </w:r>
+      <w:proofErr w:type="spellEnd"/>
+      <w:r>
         <w:t xml:space="preserve"> </w:t>
       </w:r>
-      <w:proofErr w:type="gramStart"/>
-      <w:r>
-        <w:t xml:space="preserve">   {</w:t>
-      </w:r>
-      <w:proofErr w:type="gramEnd"/>
+      <w:proofErr w:type="spellStart"/>
+      <w:r>
+        <w:t>mid</w:t>
+      </w:r>
+      <w:proofErr w:type="spellEnd"/>
+      <w:r>
+        <w:t xml:space="preserve"> = </w:t>
+      </w:r>
+      <w:proofErr w:type="spellStart"/>
+      <w:r>
+        <w:t>sortedArray.length</w:t>
+      </w:r>
+      <w:proofErr w:type="spellEnd"/>
+      <w:r>
+        <w:t xml:space="preserve"> / 2;</w:t>
+      </w:r>
       <w:r>
         <w:br/>
         <w:t xml:space="preserve">        </w:t>
       </w:r>
       <w:proofErr w:type="spellStart"/>
       <w:r>
+        <w:t>setMedian</w:t>
+      </w:r>
+      <w:proofErr w:type="spellEnd"/>
+      <w:r>
+        <w:t>(</w:t>
+      </w:r>
+      <w:proofErr w:type="spellStart"/>
+      <w:r>
+        <w:t>sortedArray</w:t>
+      </w:r>
+      <w:proofErr w:type="spellEnd"/>
+      <w:r>
+        <w:t>[</w:t>
+      </w:r>
+      <w:proofErr w:type="spellStart"/>
+      <w:r>
+        <w:t>mid</w:t>
+      </w:r>
+      <w:proofErr w:type="spellEnd"/>
+      <w:r>
+        <w:t>]);</w:t>
+      </w:r>
+      <w:r>
+        <w:br/>
+        <w:t xml:space="preserve">    }</w:t>
+      </w:r>
+      <w:r>
+        <w:br/>
+        <w:t>}</w:t>
+      </w:r>
+    </w:p>
+    <w:p>
+      <w:pPr>
+        <w:pStyle w:val="Caption"/>
+        <w:rPr>
+          <w:lang w:val="en-AT"/>
+        </w:rPr>
+      </w:pPr>
+      <w:r>
+        <w:t xml:space="preserve">Figure </w:t>
+      </w:r>
+      <w:r>
+        <w:fldChar w:fldCharType="begin"/>
+      </w:r>
+      <w:r>
+        <w:instrText xml:space="preserve"> SEQ Figure \* ARABIC </w:instrText>
+      </w:r>
+      <w:r>
+        <w:fldChar w:fldCharType="separate"/>
+      </w:r>
+      <w:r>
+        <w:rPr>
+          <w:noProof/>
+        </w:rPr>
+        <w:t>2</w:t>
+      </w:r>
+      <w:r>
+        <w:fldChar w:fldCharType="end"/>
+      </w:r>
+      <w:r>
+        <w:t xml:space="preserve">: </w:t>
+      </w:r>
+      <w:proofErr w:type="spellStart"/>
+      <w:r>
+        <w:t>calculateMedian</w:t>
+      </w:r>
+      <w:proofErr w:type="spellEnd"/>
+    </w:p>
+    <w:p>
+      <w:pPr>
+        <w:pStyle w:val="Heading3"/>
+      </w:pPr>
+      <w:r>
+        <w:t>Minimum and Maximum</w:t>
+      </w:r>
+    </w:p>
+    <w:p>
+      <w:pPr>
+        <w:pStyle w:val="Pseoudocode"/>
+      </w:pPr>
+      <w:r>
+        <w:t xml:space="preserve">public </w:t>
+      </w:r>
+      <w:proofErr w:type="spellStart"/>
+      <w:r>
+        <w:t>void</w:t>
+      </w:r>
+      <w:proofErr w:type="spellEnd"/>
+      <w:r>
+        <w:t xml:space="preserve"> </w:t>
+      </w:r>
+      <w:proofErr w:type="spellStart"/>
+      <w:r>
+        <w:t>calculateMinAndMax</w:t>
+      </w:r>
+      <w:proofErr w:type="spellEnd"/>
+      <w:r>
+        <w:t>()</w:t>
+      </w:r>
+      <w:r>
+        <w:br/>
+        <w:t>{</w:t>
+      </w:r>
+      <w:r>
+        <w:br/>
+        <w:t xml:space="preserve">    </w:t>
+      </w:r>
+      <w:proofErr w:type="spellStart"/>
+      <w:r>
         <w:t>int</w:t>
       </w:r>
       <w:proofErr w:type="spellEnd"/>
       <w:r>
-        <w:t xml:space="preserve"> mid1 = </w:t>
-      </w:r>
-      <w:proofErr w:type="spellStart"/>
-      <w:r>
-        <w:t>sortedArray.length</w:t>
-      </w:r>
-      <w:proofErr w:type="spellEnd"/>
-      <w:r>
-        <w:t xml:space="preserve"> / </w:t>
-      </w:r>
-      <w:proofErr w:type="gramStart"/>
-      <w:r>
-        <w:t>2;</w:t>
-      </w:r>
-      <w:proofErr w:type="gramEnd"/>
-      <w:r>
-        <w:br/>
-        <w:t xml:space="preserve">        </w:t>
+        <w:t xml:space="preserve"> min = </w:t>
+      </w:r>
+      <w:proofErr w:type="spellStart"/>
+      <w:r>
+        <w:t>getInputArray</w:t>
+      </w:r>
+      <w:proofErr w:type="spellEnd"/>
+      <w:r>
+        <w:t>()[0];</w:t>
+      </w:r>
+      <w:r>
+        <w:br/>
+        <w:t xml:space="preserve">    </w:t>
       </w:r>
       <w:proofErr w:type="spellStart"/>
       <w:r>
@@ -1203,309 +1325,54 @@
       </w:r>
       <w:proofErr w:type="spellEnd"/>
       <w:r>
-        <w:t xml:space="preserve"> mid2 = mid1 - </w:t>
-      </w:r>
-      <w:proofErr w:type="gramStart"/>
-      <w:r>
-        <w:t>1;</w:t>
-      </w:r>
-      <w:proofErr w:type="gramEnd"/>
-      <w:r>
-        <w:br/>
-        <w:t xml:space="preserve">        </w:t>
-      </w:r>
-      <w:proofErr w:type="spellStart"/>
-      <w:r>
-        <w:t>setMedian</w:t>
-      </w:r>
-      <w:proofErr w:type="spellEnd"/>
-      <w:r>
-        <w:t>((</w:t>
-      </w:r>
-      <w:proofErr w:type="spellStart"/>
-      <w:r>
-        <w:t>sortedArray</w:t>
-      </w:r>
-      <w:proofErr w:type="spellEnd"/>
-      <w:r>
-        <w:t xml:space="preserve">[mid1] + </w:t>
-      </w:r>
-      <w:proofErr w:type="spellStart"/>
-      <w:r>
-        <w:t>sortedArray</w:t>
-      </w:r>
-      <w:proofErr w:type="spellEnd"/>
-      <w:r>
-        <w:t>[mid2]) / 2.0</w:t>
-      </w:r>
-      <w:proofErr w:type="gramStart"/>
-      <w:r>
-        <w:t>);</w:t>
-      </w:r>
-      <w:proofErr w:type="gramEnd"/>
-      <w:r>
-        <w:br/>
-        <w:t xml:space="preserve">  </w:t>
-      </w:r>
-      <w:proofErr w:type="gramStart"/>
-      <w:r>
-        <w:t xml:space="preserve">  }</w:t>
-      </w:r>
-      <w:proofErr w:type="gramEnd"/>
-      <w:r>
-        <w:br/>
-        <w:t xml:space="preserve">    </w:t>
-      </w:r>
-      <w:proofErr w:type="spellStart"/>
-      <w:r>
-        <w:t>else</w:t>
-      </w:r>
-      <w:proofErr w:type="spellEnd"/>
-      <w:r>
-        <w:br/>
+        <w:t xml:space="preserve"> max = </w:t>
+      </w:r>
+      <w:proofErr w:type="spellStart"/>
+      <w:r>
+        <w:t>getInputArray</w:t>
+      </w:r>
+      <w:proofErr w:type="spellEnd"/>
+      <w:r>
+        <w:t>()[0];</w:t>
+      </w:r>
+      <w:r>
+        <w:br/>
+      </w:r>
+      <w:r>
+        <w:br/>
+        <w:t xml:space="preserve">    for (</w:t>
+      </w:r>
+      <w:proofErr w:type="spellStart"/>
+      <w:r>
+        <w:t>int</w:t>
+      </w:r>
+      <w:proofErr w:type="spellEnd"/>
+      <w:r>
         <w:t xml:space="preserve"> </w:t>
       </w:r>
-      <w:proofErr w:type="gramStart"/>
-      <w:r>
-        <w:t xml:space="preserve">   {</w:t>
-      </w:r>
-      <w:proofErr w:type="gramEnd"/>
-      <w:r>
-        <w:br/>
-        <w:t xml:space="preserve">        </w:t>
-      </w:r>
-      <w:proofErr w:type="spellStart"/>
-      <w:r>
-        <w:t>int</w:t>
-      </w:r>
-      <w:proofErr w:type="spellEnd"/>
-      <w:r>
-        <w:t xml:space="preserve"> </w:t>
-      </w:r>
-      <w:proofErr w:type="spellStart"/>
-      <w:r>
-        <w:t>mid</w:t>
-      </w:r>
-      <w:proofErr w:type="spellEnd"/>
-      <w:r>
-        <w:t xml:space="preserve"> = </w:t>
-      </w:r>
-      <w:proofErr w:type="spellStart"/>
-      <w:r>
-        <w:t>sortedArray.length</w:t>
-      </w:r>
-      <w:proofErr w:type="spellEnd"/>
-      <w:r>
-        <w:t xml:space="preserve"> / </w:t>
-      </w:r>
-      <w:proofErr w:type="gramStart"/>
-      <w:r>
-        <w:t>2;</w:t>
-      </w:r>
-      <w:proofErr w:type="gramEnd"/>
-      <w:r>
-        <w:br/>
-        <w:t xml:space="preserve">        </w:t>
-      </w:r>
-      <w:proofErr w:type="spellStart"/>
-      <w:r>
-        <w:t>setMedian</w:t>
-      </w:r>
-      <w:proofErr w:type="spellEnd"/>
-      <w:r>
-        <w:t>(</w:t>
-      </w:r>
-      <w:proofErr w:type="spellStart"/>
-      <w:r>
-        <w:t>sortedArray</w:t>
-      </w:r>
-      <w:proofErr w:type="spellEnd"/>
-      <w:r>
-        <w:t>[</w:t>
-      </w:r>
-      <w:proofErr w:type="spellStart"/>
-      <w:r>
-        <w:t>mid</w:t>
-      </w:r>
-      <w:proofErr w:type="spellEnd"/>
-      <w:r>
-        <w:t>]</w:t>
-      </w:r>
-      <w:proofErr w:type="gramStart"/>
-      <w:r>
-        <w:t>);</w:t>
-      </w:r>
-      <w:proofErr w:type="gramEnd"/>
-      <w:r>
-        <w:br/>
-        <w:t xml:space="preserve">  </w:t>
-      </w:r>
-      <w:proofErr w:type="gramStart"/>
-      <w:r>
-        <w:t xml:space="preserve">  }</w:t>
-      </w:r>
-      <w:proofErr w:type="gramEnd"/>
-      <w:r>
-        <w:br/>
-        <w:t>}</w:t>
-      </w:r>
-    </w:p>
-    <w:p>
-      <w:pPr>
-        <w:pStyle w:val="Caption"/>
-        <w:rPr>
-          <w:lang w:val="en-AT"/>
-        </w:rPr>
-      </w:pPr>
-      <w:r>
-        <w:t xml:space="preserve">Figure </w:t>
-      </w:r>
-      <w:r>
-        <w:fldChar w:fldCharType="begin"/>
-      </w:r>
-      <w:r>
-        <w:instrText xml:space="preserve"> SEQ Figure \* ARABIC </w:instrText>
-      </w:r>
-      <w:r>
-        <w:fldChar w:fldCharType="separate"/>
-      </w:r>
-      <w:r>
-        <w:rPr>
-          <w:noProof/>
-        </w:rPr>
-        <w:t>2</w:t>
-      </w:r>
-      <w:r>
-        <w:fldChar w:fldCharType="end"/>
-      </w:r>
-      <w:r>
-        <w:t xml:space="preserve">: </w:t>
-      </w:r>
-      <w:proofErr w:type="spellStart"/>
-      <w:r>
-        <w:t>calculateMedian</w:t>
-      </w:r>
-      <w:proofErr w:type="spellEnd"/>
-    </w:p>
-    <w:p>
-      <w:pPr>
-        <w:pStyle w:val="Heading3"/>
-      </w:pPr>
-      <w:r>
-        <w:t>Minimum and Maximum</w:t>
-      </w:r>
-    </w:p>
-    <w:p>
-      <w:pPr>
-        <w:pStyle w:val="Pseoudocode"/>
-      </w:pPr>
-      <w:proofErr w:type="gramStart"/>
-      <w:r>
-        <w:t>public</w:t>
-      </w:r>
-      <w:proofErr w:type="gramEnd"/>
-      <w:r>
-        <w:t xml:space="preserve"> </w:t>
-      </w:r>
-      <w:proofErr w:type="spellStart"/>
-      <w:r>
-        <w:t>void</w:t>
-      </w:r>
-      <w:proofErr w:type="spellEnd"/>
-      <w:r>
-        <w:t xml:space="preserve"> </w:t>
-      </w:r>
-      <w:proofErr w:type="spellStart"/>
-      <w:proofErr w:type="gramStart"/>
-      <w:r>
-        <w:t>calculateMinAndMax</w:t>
-      </w:r>
-      <w:proofErr w:type="spellEnd"/>
-      <w:r>
-        <w:t>(</w:t>
-      </w:r>
-      <w:proofErr w:type="gramEnd"/>
-      <w:r>
-        <w:t>)</w:t>
-      </w:r>
-      <w:r>
-        <w:br/>
-        <w:t>{</w:t>
-      </w:r>
-      <w:r>
-        <w:br/>
-        <w:t xml:space="preserve">    </w:t>
-      </w:r>
-      <w:proofErr w:type="spellStart"/>
-      <w:r>
-        <w:t>int</w:t>
-      </w:r>
-      <w:proofErr w:type="spellEnd"/>
-      <w:r>
-        <w:t xml:space="preserve"> min = </w:t>
-      </w:r>
-      <w:proofErr w:type="spellStart"/>
-      <w:proofErr w:type="gramStart"/>
+      <w:proofErr w:type="spellStart"/>
+      <w:r>
+        <w:t>num</w:t>
+      </w:r>
+      <w:proofErr w:type="spellEnd"/>
+      <w:r>
+        <w:t xml:space="preserve"> : </w:t>
+      </w:r>
+      <w:proofErr w:type="spellStart"/>
       <w:r>
         <w:t>getInputArray</w:t>
       </w:r>
       <w:proofErr w:type="spellEnd"/>
       <w:r>
-        <w:t>()[</w:t>
-      </w:r>
-      <w:proofErr w:type="gramEnd"/>
-      <w:r>
-        <w:t>0</w:t>
-      </w:r>
-      <w:proofErr w:type="gramStart"/>
-      <w:r>
-        <w:t>];</w:t>
-      </w:r>
-      <w:proofErr w:type="gramEnd"/>
-      <w:r>
-        <w:br/>
-        <w:t xml:space="preserve">    </w:t>
-      </w:r>
-      <w:proofErr w:type="spellStart"/>
-      <w:r>
-        <w:t>int</w:t>
-      </w:r>
-      <w:proofErr w:type="spellEnd"/>
-      <w:r>
-        <w:t xml:space="preserve"> max = </w:t>
-      </w:r>
-      <w:proofErr w:type="spellStart"/>
-      <w:proofErr w:type="gramStart"/>
-      <w:r>
-        <w:t>getInputArray</w:t>
-      </w:r>
-      <w:proofErr w:type="spellEnd"/>
-      <w:r>
-        <w:t>()[</w:t>
-      </w:r>
-      <w:proofErr w:type="gramEnd"/>
-      <w:r>
-        <w:t>0</w:t>
-      </w:r>
-      <w:proofErr w:type="gramStart"/>
-      <w:r>
-        <w:t>];</w:t>
-      </w:r>
-      <w:proofErr w:type="gramEnd"/>
-      <w:r>
-        <w:br/>
-      </w:r>
-      <w:r>
-        <w:br/>
-        <w:t xml:space="preserve">    for (</w:t>
-      </w:r>
-      <w:proofErr w:type="spellStart"/>
-      <w:r>
-        <w:t>int</w:t>
-      </w:r>
-      <w:proofErr w:type="spellEnd"/>
-      <w:r>
-        <w:t xml:space="preserve"> </w:t>
+        <w:t>())</w:t>
+      </w:r>
+      <w:r>
+        <w:br/>
+        <w:t xml:space="preserve">    {</w:t>
+      </w:r>
+      <w:r>
+        <w:br/>
+        <w:t xml:space="preserve">        if (</w:t>
       </w:r>
       <w:proofErr w:type="spellStart"/>
       <w:r>
@@ -1513,51 +1380,12 @@
       </w:r>
       <w:proofErr w:type="spellEnd"/>
       <w:r>
-        <w:t xml:space="preserve"> : </w:t>
-      </w:r>
-      <w:proofErr w:type="spellStart"/>
-      <w:proofErr w:type="gramStart"/>
-      <w:r>
-        <w:t>getInputArray</w:t>
-      </w:r>
-      <w:proofErr w:type="spellEnd"/>
-      <w:r>
-        <w:t>(</w:t>
-      </w:r>
-      <w:proofErr w:type="gramEnd"/>
-      <w:r>
-        <w:t>))</w:t>
-      </w:r>
-      <w:r>
-        <w:br/>
-        <w:t xml:space="preserve"> </w:t>
-      </w:r>
-      <w:proofErr w:type="gramStart"/>
-      <w:r>
-        <w:t xml:space="preserve">   {</w:t>
-      </w:r>
-      <w:proofErr w:type="gramEnd"/>
-      <w:r>
-        <w:br/>
-        <w:t xml:space="preserve">        if (</w:t>
-      </w:r>
-      <w:proofErr w:type="spellStart"/>
-      <w:r>
-        <w:t>num</w:t>
-      </w:r>
-      <w:proofErr w:type="spellEnd"/>
-      <w:r>
         <w:t xml:space="preserve"> &lt; min)</w:t>
       </w:r>
       <w:r>
         <w:br/>
-        <w:t xml:space="preserve">     </w:t>
-      </w:r>
-      <w:proofErr w:type="gramStart"/>
-      <w:r>
-        <w:t xml:space="preserve">   {</w:t>
-      </w:r>
-      <w:proofErr w:type="gramEnd"/>
+        <w:t xml:space="preserve">        {</w:t>
+      </w:r>
       <w:r>
         <w:br/>
       </w:r>
@@ -1566,7 +1394,6 @@
         <w:t xml:space="preserve">            min = </w:t>
       </w:r>
       <w:proofErr w:type="spellStart"/>
-      <w:proofErr w:type="gramStart"/>
       <w:r>
         <w:t>num</w:t>
       </w:r>
@@ -1574,16 +1401,10 @@
       <w:r>
         <w:t>;</w:t>
       </w:r>
-      <w:proofErr w:type="gramEnd"/>
-      <w:r>
-        <w:br/>
-        <w:t xml:space="preserve">      </w:t>
-      </w:r>
-      <w:proofErr w:type="gramStart"/>
-      <w:r>
-        <w:t xml:space="preserve">  }</w:t>
-      </w:r>
-      <w:proofErr w:type="gramEnd"/>
+      <w:r>
+        <w:br/>
+        <w:t xml:space="preserve">        }</w:t>
+      </w:r>
       <w:r>
         <w:br/>
         <w:t xml:space="preserve">        if (</w:t>
@@ -1598,19 +1419,13 @@
       </w:r>
       <w:r>
         <w:br/>
-        <w:t xml:space="preserve">     </w:t>
-      </w:r>
-      <w:proofErr w:type="gramStart"/>
-      <w:r>
-        <w:t xml:space="preserve">   {</w:t>
-      </w:r>
-      <w:proofErr w:type="gramEnd"/>
+        <w:t xml:space="preserve">        {</w:t>
+      </w:r>
       <w:r>
         <w:br/>
         <w:t xml:space="preserve">            max = </w:t>
       </w:r>
       <w:proofErr w:type="spellStart"/>
-      <w:proofErr w:type="gramStart"/>
       <w:r>
         <w:t>num</w:t>
       </w:r>
@@ -1618,46 +1433,25 @@
       <w:r>
         <w:t>;</w:t>
       </w:r>
-      <w:proofErr w:type="gramEnd"/>
-      <w:r>
-        <w:br/>
-        <w:t xml:space="preserve">      </w:t>
-      </w:r>
-      <w:proofErr w:type="gramStart"/>
-      <w:r>
-        <w:t xml:space="preserve">  }</w:t>
-      </w:r>
-      <w:proofErr w:type="gramEnd"/>
-      <w:r>
-        <w:br/>
-        <w:t xml:space="preserve">  </w:t>
-      </w:r>
-      <w:proofErr w:type="gramStart"/>
-      <w:r>
-        <w:t xml:space="preserve">  }</w:t>
-      </w:r>
-      <w:proofErr w:type="gramEnd"/>
-      <w:r>
-        <w:br/>
-      </w:r>
-      <w:r>
-        <w:br/>
-        <w:t xml:space="preserve">    minimum = </w:t>
-      </w:r>
-      <w:proofErr w:type="gramStart"/>
-      <w:r>
-        <w:t>min;</w:t>
-      </w:r>
-      <w:proofErr w:type="gramEnd"/>
-      <w:r>
-        <w:br/>
-        <w:t xml:space="preserve">    maximum = </w:t>
-      </w:r>
-      <w:proofErr w:type="gramStart"/>
-      <w:r>
-        <w:t>max;</w:t>
-      </w:r>
-      <w:proofErr w:type="gramEnd"/>
+      <w:r>
+        <w:br/>
+        <w:t xml:space="preserve">        }</w:t>
+      </w:r>
+      <w:r>
+        <w:br/>
+        <w:t xml:space="preserve">    }</w:t>
+      </w:r>
+      <w:r>
+        <w:br/>
+      </w:r>
+      <w:r>
+        <w:br/>
+        <w:t xml:space="preserve">    minimum = min;</w:t>
+      </w:r>
+      <w:r>
+        <w:br/>
+        <w:t xml:space="preserve">    maximum = max;</w:t>
+      </w:r>
       <w:r>
         <w:br/>
         <w:t>}</w:t>
@@ -2202,17 +1996,12 @@
         <w:pStyle w:val="Pseoudocode"/>
       </w:pPr>
       <w:proofErr w:type="spellStart"/>
-      <w:proofErr w:type="gramStart"/>
       <w:r>
         <w:t>Arrays</w:t>
       </w:r>
       <w:proofErr w:type="spellEnd"/>
       <w:r>
-        <w:t>:</w:t>
-      </w:r>
-      <w:proofErr w:type="gramEnd"/>
-      <w:r>
-        <w:t xml:space="preserve"> [15, 8, 23, 4, 42, 11, 19]</w:t>
+        <w:t>: [15, 8, 23, 4, 42, 11, 19]</w:t>
       </w:r>
     </w:p>
     <w:p>
@@ -2220,17 +2009,12 @@
         <w:pStyle w:val="Pseoudocode"/>
       </w:pPr>
       <w:proofErr w:type="spellStart"/>
-      <w:proofErr w:type="gramStart"/>
       <w:r>
         <w:t>Mean</w:t>
       </w:r>
       <w:proofErr w:type="spellEnd"/>
       <w:r>
-        <w:t>:</w:t>
-      </w:r>
-      <w:proofErr w:type="gramEnd"/>
-      <w:r>
-        <w:t xml:space="preserve"> 17.43</w:t>
+        <w:t>: 17.43</w:t>
       </w:r>
     </w:p>
     <w:p>
@@ -2238,44 +2022,29 @@
         <w:pStyle w:val="Pseoudocode"/>
       </w:pPr>
       <w:proofErr w:type="spellStart"/>
-      <w:proofErr w:type="gramStart"/>
       <w:r>
         <w:lastRenderedPageBreak/>
         <w:t>Median</w:t>
       </w:r>
       <w:proofErr w:type="spellEnd"/>
       <w:r>
-        <w:t>:</w:t>
-      </w:r>
-      <w:proofErr w:type="gramEnd"/>
-      <w:r>
-        <w:t xml:space="preserve"> 15.00</w:t>
+        <w:t>: 15.00</w:t>
       </w:r>
     </w:p>
     <w:p>
       <w:pPr>
         <w:pStyle w:val="Pseoudocode"/>
       </w:pPr>
-      <w:proofErr w:type="gramStart"/>
-      <w:r>
-        <w:t>Minimum:</w:t>
-      </w:r>
-      <w:proofErr w:type="gramEnd"/>
-      <w:r>
-        <w:t xml:space="preserve"> 4</w:t>
+      <w:r>
+        <w:t>Minimum: 4</w:t>
       </w:r>
     </w:p>
     <w:p>
       <w:pPr>
         <w:pStyle w:val="Pseoudocode"/>
       </w:pPr>
-      <w:proofErr w:type="gramStart"/>
-      <w:r>
-        <w:t>Maximum:</w:t>
-      </w:r>
-      <w:proofErr w:type="gramEnd"/>
-      <w:r>
-        <w:t xml:space="preserve"> 42</w:t>
+      <w:r>
+        <w:t>Maximum: 42</w:t>
       </w:r>
     </w:p>
     <w:p>
@@ -3479,17 +3248,12 @@
         <w:t xml:space="preserve">Original </w:t>
       </w:r>
       <w:proofErr w:type="spellStart"/>
-      <w:proofErr w:type="gramStart"/>
       <w:r>
         <w:t>Array</w:t>
       </w:r>
       <w:proofErr w:type="spellEnd"/>
       <w:r>
-        <w:t>:</w:t>
-      </w:r>
-      <w:proofErr w:type="gramEnd"/>
-      <w:r>
-        <w:t xml:space="preserve"> [10, 20, 30, 40, 50]</w:t>
+        <w:t>: [10, 20, 30, 40, 50]</w:t>
       </w:r>
     </w:p>
     <w:p>
@@ -3505,17 +3269,12 @@
         <w:t xml:space="preserve"> </w:t>
       </w:r>
       <w:proofErr w:type="spellStart"/>
-      <w:proofErr w:type="gramStart"/>
       <w:r>
         <w:t>Array</w:t>
       </w:r>
       <w:proofErr w:type="spellEnd"/>
       <w:r>
-        <w:t>:</w:t>
-      </w:r>
-      <w:proofErr w:type="gramEnd"/>
-      <w:r>
-        <w:t xml:space="preserve"> [50, 40, 30, 20, 10]</w:t>
+        <w:t>: [50, 40, 30, 20, 10]</w:t>
       </w:r>
     </w:p>
     <w:p>
@@ -3783,7 +3542,6 @@
         <w:t xml:space="preserve">public record </w:t>
       </w:r>
       <w:proofErr w:type="spellStart"/>
-      <w:proofErr w:type="gramStart"/>
       <w:r>
         <w:rPr>
           <w:lang w:val="en-AT"/>
@@ -3798,7 +3556,6 @@
         <w:t>(</w:t>
       </w:r>
       <w:proofErr w:type="spellStart"/>
-      <w:proofErr w:type="gramEnd"/>
       <w:r>
         <w:rPr>
           <w:lang w:val="en-AT"/>
@@ -3860,7 +3617,6 @@
         </w:rPr>
         <w:t xml:space="preserve"> </w:t>
       </w:r>
-      <w:proofErr w:type="gramStart"/>
       <w:r>
         <w:rPr>
           <w:lang w:val="en-AT"/>
@@ -3879,7 +3635,6 @@
         </w:rPr>
         <w:t>}</w:t>
       </w:r>
-      <w:proofErr w:type="gramEnd"/>
     </w:p>
     <w:p>
       <w:pPr>
@@ -3913,16 +3668,867 @@
     <w:p/>
     <w:p>
       <w:pPr>
+        <w:pStyle w:val="Pseoudocode"/>
+      </w:pPr>
+      <w:r>
+        <w:t xml:space="preserve">private </w:t>
+      </w:r>
+      <w:proofErr w:type="spellStart"/>
+      <w:r>
+        <w:t>FuzzySearchResult</w:t>
+      </w:r>
+      <w:proofErr w:type="spellEnd"/>
+      <w:r>
+        <w:t xml:space="preserve"> </w:t>
+      </w:r>
+      <w:proofErr w:type="spellStart"/>
+      <w:r>
+        <w:t>fuzzySearch</w:t>
+      </w:r>
+      <w:proofErr w:type="spellEnd"/>
+      <w:r>
+        <w:t>(int target, int[] array)</w:t>
+      </w:r>
+      <w:r>
+        <w:br/>
+        <w:t>{</w:t>
+      </w:r>
+      <w:r>
+        <w:br/>
+        <w:t xml:space="preserve">    int difference = </w:t>
+      </w:r>
+      <w:proofErr w:type="spellStart"/>
+      <w:r>
+        <w:t>Integer.</w:t>
+      </w:r>
+      <w:r>
+        <w:rPr>
+          <w:i/>
+          <w:iCs/>
+        </w:rPr>
+        <w:t>MAX_VALUE</w:t>
+      </w:r>
+      <w:proofErr w:type="spellEnd"/>
+      <w:r>
+        <w:t>;</w:t>
+      </w:r>
+      <w:r>
+        <w:br/>
+        <w:t xml:space="preserve">    int </w:t>
+      </w:r>
+      <w:proofErr w:type="spellStart"/>
+      <w:r>
+        <w:t>closestIndex</w:t>
+      </w:r>
+      <w:proofErr w:type="spellEnd"/>
+      <w:r>
+        <w:t xml:space="preserve"> = -1;</w:t>
+      </w:r>
+      <w:r>
+        <w:br/>
+      </w:r>
+      <w:r>
+        <w:br/>
+        <w:t xml:space="preserve">    for (int </w:t>
+      </w:r>
+      <w:proofErr w:type="spellStart"/>
+      <w:r>
+        <w:t>i</w:t>
+      </w:r>
+      <w:proofErr w:type="spellEnd"/>
+      <w:r>
+        <w:t xml:space="preserve"> = 0; </w:t>
+      </w:r>
+      <w:proofErr w:type="spellStart"/>
+      <w:r>
+        <w:t>i</w:t>
+      </w:r>
+      <w:proofErr w:type="spellEnd"/>
+      <w:r>
+        <w:t xml:space="preserve"> &lt; </w:t>
+      </w:r>
+      <w:proofErr w:type="spellStart"/>
+      <w:r>
+        <w:t>array.length</w:t>
+      </w:r>
+      <w:proofErr w:type="spellEnd"/>
+      <w:r>
+        <w:t xml:space="preserve">; </w:t>
+      </w:r>
+      <w:proofErr w:type="spellStart"/>
+      <w:r>
+        <w:t>i</w:t>
+      </w:r>
+      <w:proofErr w:type="spellEnd"/>
+      <w:r>
+        <w:t>++)</w:t>
+      </w:r>
+      <w:r>
+        <w:br/>
+        <w:t xml:space="preserve">    {</w:t>
+      </w:r>
+      <w:r>
+        <w:br/>
+        <w:t xml:space="preserve">       if (array[</w:t>
+      </w:r>
+      <w:proofErr w:type="spellStart"/>
+      <w:r>
+        <w:t>i</w:t>
+      </w:r>
+      <w:proofErr w:type="spellEnd"/>
+      <w:r>
+        <w:t>] == target)</w:t>
+      </w:r>
+      <w:r>
+        <w:br/>
+        <w:t xml:space="preserve">       {</w:t>
+      </w:r>
+      <w:r>
+        <w:br/>
+        <w:t xml:space="preserve">           return new </w:t>
+      </w:r>
+      <w:proofErr w:type="spellStart"/>
+      <w:r>
+        <w:t>FuzzySearchResult</w:t>
+      </w:r>
+      <w:proofErr w:type="spellEnd"/>
+      <w:r>
+        <w:t xml:space="preserve">(true, </w:t>
+      </w:r>
+      <w:proofErr w:type="spellStart"/>
+      <w:r>
+        <w:t>i</w:t>
+      </w:r>
+      <w:proofErr w:type="spellEnd"/>
+      <w:r>
+        <w:t>, array[</w:t>
+      </w:r>
+      <w:proofErr w:type="spellStart"/>
+      <w:r>
+        <w:t>i</w:t>
+      </w:r>
+      <w:proofErr w:type="spellEnd"/>
+      <w:r>
+        <w:t>]);</w:t>
+      </w:r>
+      <w:r>
+        <w:br/>
+        <w:t xml:space="preserve">       }</w:t>
+      </w:r>
+      <w:r>
+        <w:br/>
+      </w:r>
+      <w:r>
+        <w:br/>
+        <w:t xml:space="preserve">       int </w:t>
+      </w:r>
+      <w:proofErr w:type="spellStart"/>
+      <w:r>
+        <w:t>currentDifference</w:t>
+      </w:r>
+      <w:proofErr w:type="spellEnd"/>
+      <w:r>
+        <w:t xml:space="preserve"> = </w:t>
+      </w:r>
+      <w:proofErr w:type="spellStart"/>
+      <w:r>
+        <w:t>Math.</w:t>
+      </w:r>
+      <w:r>
+        <w:rPr>
+          <w:i/>
+          <w:iCs/>
+        </w:rPr>
+        <w:t>abs</w:t>
+      </w:r>
+      <w:proofErr w:type="spellEnd"/>
+      <w:r>
+        <w:t>(array[</w:t>
+      </w:r>
+      <w:proofErr w:type="spellStart"/>
+      <w:r>
+        <w:t>i</w:t>
+      </w:r>
+      <w:proofErr w:type="spellEnd"/>
+      <w:r>
+        <w:t>] - target);</w:t>
+      </w:r>
+      <w:r>
+        <w:br/>
+      </w:r>
+      <w:r>
+        <w:br/>
+        <w:t xml:space="preserve">       if (</w:t>
+      </w:r>
+      <w:proofErr w:type="spellStart"/>
+      <w:r>
+        <w:t>currentDifference</w:t>
+      </w:r>
+      <w:proofErr w:type="spellEnd"/>
+      <w:r>
+        <w:t xml:space="preserve"> &lt; difference)</w:t>
+      </w:r>
+      <w:r>
+        <w:br/>
+        <w:t xml:space="preserve">       {</w:t>
+      </w:r>
+      <w:r>
+        <w:br/>
+        <w:t xml:space="preserve">           difference = </w:t>
+      </w:r>
+      <w:proofErr w:type="spellStart"/>
+      <w:r>
+        <w:t>currentDifference</w:t>
+      </w:r>
+      <w:proofErr w:type="spellEnd"/>
+      <w:r>
+        <w:t>;</w:t>
+      </w:r>
+      <w:r>
+        <w:br/>
+        <w:t xml:space="preserve">           </w:t>
+      </w:r>
+      <w:proofErr w:type="spellStart"/>
+      <w:r>
+        <w:t>closestIndex</w:t>
+      </w:r>
+      <w:proofErr w:type="spellEnd"/>
+      <w:r>
+        <w:t xml:space="preserve"> = </w:t>
+      </w:r>
+      <w:proofErr w:type="spellStart"/>
+      <w:r>
+        <w:t>i</w:t>
+      </w:r>
+      <w:proofErr w:type="spellEnd"/>
+      <w:r>
+        <w:t>;</w:t>
+      </w:r>
+      <w:r>
+        <w:br/>
+        <w:t xml:space="preserve">       }</w:t>
+      </w:r>
+      <w:r>
+        <w:br/>
+        <w:t xml:space="preserve">    }</w:t>
+      </w:r>
+      <w:r>
+        <w:br/>
+      </w:r>
+      <w:r>
+        <w:br/>
+        <w:t xml:space="preserve">    return new </w:t>
+      </w:r>
+      <w:proofErr w:type="spellStart"/>
+      <w:r>
+        <w:t>FuzzySearchResult</w:t>
+      </w:r>
+      <w:proofErr w:type="spellEnd"/>
+      <w:r>
+        <w:t xml:space="preserve">(false, </w:t>
+      </w:r>
+      <w:proofErr w:type="spellStart"/>
+      <w:r>
+        <w:t>closestIndex</w:t>
+      </w:r>
+      <w:proofErr w:type="spellEnd"/>
+      <w:r>
+        <w:t xml:space="preserve">, </w:t>
+      </w:r>
+      <w:r>
+        <w:lastRenderedPageBreak/>
+        <w:t>array[</w:t>
+      </w:r>
+      <w:proofErr w:type="spellStart"/>
+      <w:r>
+        <w:t>closestIndex</w:t>
+      </w:r>
+      <w:proofErr w:type="spellEnd"/>
+      <w:r>
+        <w:t>]);</w:t>
+      </w:r>
+      <w:r>
+        <w:br/>
+        <w:t>}</w:t>
+      </w:r>
+    </w:p>
+    <w:p>
+      <w:pPr>
+        <w:pStyle w:val="Caption"/>
+      </w:pPr>
+      <w:r>
+        <w:t xml:space="preserve">Figure </w:t>
+      </w:r>
+      <w:r>
+        <w:fldChar w:fldCharType="begin"/>
+      </w:r>
+      <w:r>
+        <w:instrText xml:space="preserve"> SEQ Figure \* ARABIC </w:instrText>
+      </w:r>
+      <w:r>
+        <w:fldChar w:fldCharType="separate"/>
+      </w:r>
+      <w:r>
+        <w:rPr>
+          <w:noProof/>
+        </w:rPr>
+        <w:t>12</w:t>
+      </w:r>
+      <w:r>
+        <w:fldChar w:fldCharType="end"/>
+      </w:r>
+      <w:r>
+        <w:t>: Fuzzy Seach</w:t>
+      </w:r>
+    </w:p>
+    <w:p>
+      <w:pPr>
         <w:pStyle w:val="Heading2"/>
       </w:pPr>
       <w:r>
         <w:t>Test</w:t>
       </w:r>
     </w:p>
+    <w:p>
+      <w:pPr>
+        <w:pStyle w:val="Pseoudocode"/>
+      </w:pPr>
+      <w:r>
+        <w:t>@Test</w:t>
+      </w:r>
+      <w:r>
+        <w:br/>
+        <w:t xml:space="preserve">void </w:t>
+      </w:r>
+      <w:proofErr w:type="spellStart"/>
+      <w:r>
+        <w:t>testFuzzySearchNoMatchExists</w:t>
+      </w:r>
+      <w:proofErr w:type="spellEnd"/>
+      <w:r>
+        <w:t>()</w:t>
+      </w:r>
+      <w:r>
+        <w:br/>
+        <w:t>{</w:t>
+      </w:r>
+      <w:r>
+        <w:br/>
+        <w:t xml:space="preserve">    int[] </w:t>
+      </w:r>
+      <w:proofErr w:type="spellStart"/>
+      <w:r>
+        <w:t>testArray</w:t>
+      </w:r>
+      <w:proofErr w:type="spellEnd"/>
+      <w:r>
+        <w:t xml:space="preserve"> = {15, 8, 23, 4, 42, 11, 19};</w:t>
+      </w:r>
+      <w:r>
+        <w:br/>
+        <w:t xml:space="preserve">    int </w:t>
+      </w:r>
+      <w:proofErr w:type="spellStart"/>
+      <w:r>
+        <w:t>targetValue</w:t>
+      </w:r>
+      <w:proofErr w:type="spellEnd"/>
+      <w:r>
+        <w:t xml:space="preserve"> = 20;</w:t>
+      </w:r>
+      <w:r>
+        <w:br/>
+        <w:t xml:space="preserve">    int </w:t>
+      </w:r>
+      <w:proofErr w:type="spellStart"/>
+      <w:r>
+        <w:t>expectedClosestValue</w:t>
+      </w:r>
+      <w:proofErr w:type="spellEnd"/>
+      <w:r>
+        <w:t xml:space="preserve"> = 19;</w:t>
+      </w:r>
+      <w:r>
+        <w:br/>
+        <w:t xml:space="preserve">    int </w:t>
+      </w:r>
+      <w:proofErr w:type="spellStart"/>
+      <w:r>
+        <w:t>expectedClosestIndex</w:t>
+      </w:r>
+      <w:proofErr w:type="spellEnd"/>
+      <w:r>
+        <w:t xml:space="preserve"> = 6;</w:t>
+      </w:r>
+      <w:r>
+        <w:br/>
+      </w:r>
+      <w:r>
+        <w:br/>
+        <w:t xml:space="preserve">    </w:t>
+      </w:r>
+      <w:proofErr w:type="spellStart"/>
+      <w:r>
+        <w:t>FuzzySearchExercise</w:t>
+      </w:r>
+      <w:proofErr w:type="spellEnd"/>
+      <w:r>
+        <w:t xml:space="preserve"> </w:t>
+      </w:r>
+      <w:proofErr w:type="spellStart"/>
+      <w:r>
+        <w:t>fuzzySearchExercise</w:t>
+      </w:r>
+      <w:proofErr w:type="spellEnd"/>
+      <w:r>
+        <w:t xml:space="preserve"> = new </w:t>
+      </w:r>
+      <w:proofErr w:type="spellStart"/>
+      <w:r>
+        <w:t>FuzzySearchExercise</w:t>
+      </w:r>
+      <w:proofErr w:type="spellEnd"/>
+      <w:r>
+        <w:t>(</w:t>
+      </w:r>
+      <w:proofErr w:type="spellStart"/>
+      <w:r>
+        <w:t>testArray</w:t>
+      </w:r>
+      <w:proofErr w:type="spellEnd"/>
+      <w:r>
+        <w:t xml:space="preserve">, </w:t>
+      </w:r>
+      <w:proofErr w:type="spellStart"/>
+      <w:r>
+        <w:t>targetValue</w:t>
+      </w:r>
+      <w:proofErr w:type="spellEnd"/>
+      <w:r>
+        <w:t>);</w:t>
+      </w:r>
+      <w:r>
+        <w:br/>
+        <w:t xml:space="preserve">    </w:t>
+      </w:r>
+      <w:proofErr w:type="spellStart"/>
+      <w:r>
+        <w:t>fuzzySearchExercise.runExcercise</w:t>
+      </w:r>
+      <w:proofErr w:type="spellEnd"/>
+      <w:r>
+        <w:t>();</w:t>
+      </w:r>
+      <w:r>
+        <w:br/>
+        <w:t xml:space="preserve">    </w:t>
+      </w:r>
+      <w:proofErr w:type="spellStart"/>
+      <w:r>
+        <w:t>fuzzySearchExercise.displayOutput</w:t>
+      </w:r>
+      <w:proofErr w:type="spellEnd"/>
+      <w:r>
+        <w:t>();</w:t>
+      </w:r>
+      <w:r>
+        <w:br/>
+      </w:r>
+      <w:r>
+        <w:br/>
+        <w:t xml:space="preserve">    </w:t>
+      </w:r>
+      <w:proofErr w:type="spellStart"/>
+      <w:r>
+        <w:rPr>
+          <w:i/>
+          <w:iCs/>
+        </w:rPr>
+        <w:t>assertEquals</w:t>
+      </w:r>
+      <w:proofErr w:type="spellEnd"/>
+      <w:r>
+        <w:t>(</w:t>
+      </w:r>
+      <w:proofErr w:type="spellStart"/>
+      <w:r>
+        <w:t>expectedClosestValue</w:t>
+      </w:r>
+      <w:proofErr w:type="spellEnd"/>
+      <w:r>
+        <w:t xml:space="preserve">, </w:t>
+      </w:r>
+      <w:proofErr w:type="spellStart"/>
+      <w:r>
+        <w:t>fuzzySearchExercise.getFuzzySearchResult</w:t>
+      </w:r>
+      <w:proofErr w:type="spellEnd"/>
+      <w:r>
+        <w:t>().</w:t>
+      </w:r>
+      <w:proofErr w:type="spellStart"/>
+      <w:r>
+        <w:t>bestMatchValue</w:t>
+      </w:r>
+      <w:proofErr w:type="spellEnd"/>
+      <w:r>
+        <w:t>());</w:t>
+      </w:r>
+      <w:r>
+        <w:br/>
+        <w:t xml:space="preserve">    </w:t>
+      </w:r>
+      <w:r>
+        <w:rPr>
+          <w:i/>
+          <w:iCs/>
+        </w:rPr>
+        <w:t>assertFalse</w:t>
+      </w:r>
+      <w:r>
+        <w:t>(fuzzySearchExercise.getFuzzySearchResult().foundExactMatch());</w:t>
+      </w:r>
+      <w:r>
+        <w:br/>
+        <w:t xml:space="preserve">    </w:t>
+      </w:r>
+      <w:proofErr w:type="spellStart"/>
+      <w:r>
+        <w:rPr>
+          <w:i/>
+          <w:iCs/>
+        </w:rPr>
+        <w:t>assertEquals</w:t>
+      </w:r>
+      <w:proofErr w:type="spellEnd"/>
+      <w:r>
+        <w:t>(</w:t>
+      </w:r>
+      <w:proofErr w:type="spellStart"/>
+      <w:r>
+        <w:t>expectedClosestIndex</w:t>
+      </w:r>
+      <w:proofErr w:type="spellEnd"/>
+      <w:r>
+        <w:t xml:space="preserve">, </w:t>
+      </w:r>
+      <w:proofErr w:type="spellStart"/>
+      <w:r>
+        <w:t>fuzzySearchExercise.getFuzzySearchResult</w:t>
+      </w:r>
+      <w:proofErr w:type="spellEnd"/>
+      <w:r>
+        <w:t>().</w:t>
+      </w:r>
+      <w:proofErr w:type="spellStart"/>
+      <w:r>
+        <w:t>bestMatchIndex</w:t>
+      </w:r>
+      <w:proofErr w:type="spellEnd"/>
+      <w:r>
+        <w:t>());</w:t>
+      </w:r>
+      <w:r>
+        <w:br/>
+        <w:t>}</w:t>
+      </w:r>
+    </w:p>
+    <w:p>
+      <w:pPr>
+        <w:pStyle w:val="Caption"/>
+      </w:pPr>
+      <w:r>
+        <w:t xml:space="preserve">Figure </w:t>
+      </w:r>
+      <w:r>
+        <w:fldChar w:fldCharType="begin"/>
+      </w:r>
+      <w:r>
+        <w:instrText xml:space="preserve"> SEQ Figure \* ARABIC </w:instrText>
+      </w:r>
+      <w:r>
+        <w:fldChar w:fldCharType="separate"/>
+      </w:r>
+      <w:r>
+        <w:rPr>
+          <w:noProof/>
+        </w:rPr>
+        <w:t>13</w:t>
+      </w:r>
+      <w:r>
+        <w:fldChar w:fldCharType="end"/>
+      </w:r>
+      <w:r>
+        <w:t>: Fuzzy Search Test</w:t>
+      </w:r>
+    </w:p>
+    <w:p>
+      <w:pPr>
+        <w:pStyle w:val="Pseoudocode"/>
+      </w:pPr>
+      <w:r>
+        <w:t>=== Fuzzy Search ===</w:t>
+      </w:r>
+    </w:p>
+    <w:p>
+      <w:pPr>
+        <w:pStyle w:val="Pseoudocode"/>
+      </w:pPr>
+      <w:r>
+        <w:t>Array: [15, 8, 23, 4, 42, 11, 19]</w:t>
+      </w:r>
+    </w:p>
+    <w:p>
+      <w:pPr>
+        <w:pStyle w:val="Pseoudocode"/>
+      </w:pPr>
+      <w:r>
+        <w:t>Searching for: 20</w:t>
+      </w:r>
+    </w:p>
+    <w:p>
+      <w:pPr>
+        <w:pStyle w:val="Pseoudocode"/>
+      </w:pPr>
+      <w:r>
+        <w:t>Exact match not found.</w:t>
+      </w:r>
+    </w:p>
+    <w:p>
+      <w:pPr>
+        <w:pStyle w:val="Pseoudocode"/>
+      </w:pPr>
+      <w:r>
+        <w:t>Closest value: 19 at index 6</w:t>
+      </w:r>
+    </w:p>
+    <w:p>
+      <w:pPr>
+        <w:pStyle w:val="Pseoudocode"/>
+      </w:pPr>
+      <w:proofErr w:type="spellStart"/>
+      <w:r>
+        <w:t>Difference</w:t>
+      </w:r>
+      <w:proofErr w:type="spellEnd"/>
+      <w:r>
+        <w:t>: 1</w:t>
+      </w:r>
+    </w:p>
+    <w:p>
+      <w:pPr>
+        <w:pStyle w:val="Caption"/>
+      </w:pPr>
+      <w:r>
+        <w:t xml:space="preserve">Figure </w:t>
+      </w:r>
+      <w:r>
+        <w:fldChar w:fldCharType="begin"/>
+      </w:r>
+      <w:r>
+        <w:instrText xml:space="preserve"> SEQ Figure \* ARABIC </w:instrText>
+      </w:r>
+      <w:r>
+        <w:fldChar w:fldCharType="separate"/>
+      </w:r>
+      <w:r>
+        <w:rPr>
+          <w:noProof/>
+        </w:rPr>
+        <w:t>14</w:t>
+      </w:r>
+      <w:r>
+        <w:fldChar w:fldCharType="end"/>
+      </w:r>
+      <w:r>
+        <w:t>: Fuzzy Search Result</w:t>
+      </w:r>
+    </w:p>
+    <w:p/>
+    <w:p>
+      <w:r>
+        <w:rPr>
+          <w:noProof/>
+        </w:rPr>
+        <w:lastRenderedPageBreak/>
+        <mc:AlternateContent>
+          <mc:Choice Requires="wps">
+            <w:drawing>
+              <wp:anchor distT="0" distB="0" distL="114300" distR="114300" simplePos="0" relativeHeight="251670528" behindDoc="0" locked="0" layoutInCell="1" allowOverlap="1" wp14:anchorId="0B60F1C7" wp14:editId="6EF5EFAD">
+                <wp:simplePos x="0" y="0"/>
+                <wp:positionH relativeFrom="column">
+                  <wp:posOffset>967105</wp:posOffset>
+                </wp:positionH>
+                <wp:positionV relativeFrom="paragraph">
+                  <wp:posOffset>857250</wp:posOffset>
+                </wp:positionV>
+                <wp:extent cx="3248025" cy="635"/>
+                <wp:effectExtent l="0" t="0" r="0" b="0"/>
+                <wp:wrapTopAndBottom/>
+                <wp:docPr id="494912395" name="Text Box 1"/>
+                <wp:cNvGraphicFramePr/>
+                <a:graphic xmlns:a="http://schemas.openxmlformats.org/drawingml/2006/main">
+                  <a:graphicData uri="http://schemas.microsoft.com/office/word/2010/wordprocessingShape">
+                    <wps:wsp>
+                      <wps:cNvSpPr txBox="1"/>
+                      <wps:spPr>
+                        <a:xfrm>
+                          <a:off x="0" y="0"/>
+                          <a:ext cx="3248025" cy="635"/>
+                        </a:xfrm>
+                        <a:prstGeom prst="rect">
+                          <a:avLst/>
+                        </a:prstGeom>
+                        <a:solidFill>
+                          <a:prstClr val="white"/>
+                        </a:solidFill>
+                        <a:ln>
+                          <a:noFill/>
+                        </a:ln>
+                      </wps:spPr>
+                      <wps:txbx>
+                        <w:txbxContent>
+                          <w:p>
+                            <w:pPr>
+                              <w:pStyle w:val="Caption"/>
+                            </w:pPr>
+                            <w:r>
+                              <w:t xml:space="preserve">Figure </w:t>
+                            </w:r>
+                            <w:r>
+                              <w:fldChar w:fldCharType="begin"/>
+                            </w:r>
+                            <w:r>
+                              <w:instrText xml:space="preserve"> SEQ Figure \* ARABIC </w:instrText>
+                            </w:r>
+                            <w:r>
+                              <w:fldChar w:fldCharType="separate"/>
+                            </w:r>
+                            <w:r>
+                              <w:rPr>
+                                <w:noProof/>
+                              </w:rPr>
+                              <w:t>15</w:t>
+                            </w:r>
+                            <w:r>
+                              <w:fldChar w:fldCharType="end"/>
+                            </w:r>
+                            <w:r>
+                              <w:t>: Successful unit tests</w:t>
+                            </w:r>
+                          </w:p>
+                        </w:txbxContent>
+                      </wps:txbx>
+                      <wps:bodyPr rot="0" spcFirstLastPara="0" vertOverflow="overflow" horzOverflow="overflow" vert="horz" wrap="square" lIns="0" tIns="0" rIns="0" bIns="0" numCol="1" spcCol="0" rtlCol="0" fromWordArt="0" anchor="t" anchorCtr="0" forceAA="0" compatLnSpc="1">
+                        <a:prstTxWarp prst="textNoShape">
+                          <a:avLst/>
+                        </a:prstTxWarp>
+                        <a:spAutoFit/>
+                      </wps:bodyPr>
+                    </wps:wsp>
+                  </a:graphicData>
+                </a:graphic>
+              </wp:anchor>
+            </w:drawing>
+          </mc:Choice>
+          <mc:Fallback>
+            <w:pict>
+              <v:shape w14:anchorId="0B60F1C7" id="_x0000_s1030" type="#_x0000_t202" style="position:absolute;left:0;text-align:left;margin-left:76.15pt;margin-top:67.5pt;width:255.75pt;height:.05pt;z-index:251670528;visibility:visible;mso-wrap-style:square;mso-wrap-distance-left:9pt;mso-wrap-distance-top:0;mso-wrap-distance-right:9pt;mso-wrap-distance-bottom:0;mso-position-horizontal:absolute;mso-position-horizontal-relative:text;mso-position-vertical:absolute;mso-position-vertical-relative:text;v-text-anchor:top" o:gfxdata="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" stroked="f">
+                <v:textbox style="mso-fit-shape-to-text:t" inset="0,0,0,0">
+                  <w:txbxContent>
+                    <w:p>
+                      <w:pPr>
+                        <w:pStyle w:val="Caption"/>
+                      </w:pPr>
+                      <w:r>
+                        <w:t xml:space="preserve">Figure </w:t>
+                      </w:r>
+                      <w:r>
+                        <w:fldChar w:fldCharType="begin"/>
+                      </w:r>
+                      <w:r>
+                        <w:instrText xml:space="preserve"> SEQ Figure \* ARABIC </w:instrText>
+                      </w:r>
+                      <w:r>
+                        <w:fldChar w:fldCharType="separate"/>
+                      </w:r>
+                      <w:r>
+                        <w:rPr>
+                          <w:noProof/>
+                        </w:rPr>
+                        <w:t>15</w:t>
+                      </w:r>
+                      <w:r>
+                        <w:fldChar w:fldCharType="end"/>
+                      </w:r>
+                      <w:r>
+                        <w:t>: Successful unit tests</w:t>
+                      </w:r>
+                    </w:p>
+                  </w:txbxContent>
+                </v:textbox>
+                <w10:wrap type="topAndBottom"/>
+              </v:shape>
+            </w:pict>
+          </mc:Fallback>
+        </mc:AlternateContent>
+      </w:r>
+      <w:r>
+        <w:drawing>
+          <wp:anchor distT="0" distB="0" distL="114300" distR="114300" simplePos="0" relativeHeight="251668480" behindDoc="0" locked="0" layoutInCell="1" allowOverlap="1" wp14:anchorId="4D49B56E" wp14:editId="71F67B79">
+            <wp:simplePos x="0" y="0"/>
+            <wp:positionH relativeFrom="margin">
+              <wp:align>center</wp:align>
+            </wp:positionH>
+            <wp:positionV relativeFrom="paragraph">
+              <wp:posOffset>360</wp:posOffset>
+            </wp:positionV>
+            <wp:extent cx="3248478" cy="800212"/>
+            <wp:effectExtent l="0" t="0" r="0" b="0"/>
+            <wp:wrapTopAndBottom/>
+            <wp:docPr id="1147603240" name="Picture 1" descr="A screenshot of a computer&#10;&#10;AI-generated content may be incorrect."/>
+            <wp:cNvGraphicFramePr>
+              <a:graphicFrameLocks xmlns:a="http://schemas.openxmlformats.org/drawingml/2006/main" noChangeAspect="1"/>
+            </wp:cNvGraphicFramePr>
+            <a:graphic xmlns:a="http://schemas.openxmlformats.org/drawingml/2006/main">
+              <a:graphicData uri="http://schemas.openxmlformats.org/drawingml/2006/picture">
+                <pic:pic xmlns:pic="http://schemas.openxmlformats.org/drawingml/2006/picture">
+                  <pic:nvPicPr>
+                    <pic:cNvPr id="1147603240" name="Picture 1" descr="A screenshot of a computer&#10;&#10;AI-generated content may be incorrect."/>
+                    <pic:cNvPicPr/>
+                  </pic:nvPicPr>
+                  <pic:blipFill>
+                    <a:blip r:embed="rId10">
+                      <a:extLst>
+                        <a:ext uri="{28A0092B-C50C-407E-A947-70E740481C1C}">
+                          <a14:useLocalDpi xmlns:a14="http://schemas.microsoft.com/office/drawing/2010/main" val="0"/>
+                        </a:ext>
+                      </a:extLst>
+                    </a:blip>
+                    <a:stretch>
+                      <a:fillRect/>
+                    </a:stretch>
+                  </pic:blipFill>
+                  <pic:spPr>
+                    <a:xfrm>
+                      <a:off x="0" y="0"/>
+                      <a:ext cx="3248478" cy="800212"/>
+                    </a:xfrm>
+                    <a:prstGeom prst="rect">
+                      <a:avLst/>
+                    </a:prstGeom>
+                  </pic:spPr>
+                </pic:pic>
+              </a:graphicData>
+            </a:graphic>
+          </wp:anchor>
+        </w:drawing>
+      </w:r>
+    </w:p>
     <w:sectPr>
-      <w:headerReference w:type="default" r:id="rId10"/>
-      <w:footerReference w:type="default" r:id="rId11"/>
-      <w:headerReference w:type="first" r:id="rId12"/>
+      <w:headerReference w:type="default" r:id="rId11"/>
+      <w:footerReference w:type="default" r:id="rId12"/>
+      <w:headerReference w:type="first" r:id="rId13"/>
       <w:pgSz w:w="11906" w:h="16838"/>
       <w:pgMar w:top="1872" w:right="1872" w:bottom="1872" w:left="1872" w:header="706" w:footer="706" w:gutter="0"/>
       <w:pgNumType w:start="0"/>

</xml_diff>

<commit_message>
Fix typo in class name and add unit test
Renamed UniqueValueAndFrequencyCountingExcercise to UniqueValueAndFrequencyCountingExercise for consistency. Updated all references and constructors accordingly. Added a JUnit test to verify frequency counting logic.
</commit_message>
<xml_diff>
--- a/Modules/Semester_1/Modern Code/Aufgaben/04_Arrays_and_Algorithms/Protocol.docx
+++ b/Modules/Semester_1/Modern Code/Aufgaben/04_Arrays_and_Algorithms/Protocol.docx
@@ -3420,7 +3420,23 @@
         <w:pStyle w:val="Pseoudocode"/>
       </w:pPr>
       <w:r>
-        <w:t>public void calculateMean()</w:t>
+        <w:t xml:space="preserve">public </w:t>
+      </w:r>
+      <w:proofErr w:type="spellStart"/>
+      <w:r>
+        <w:t>void</w:t>
+      </w:r>
+      <w:proofErr w:type="spellEnd"/>
+      <w:r>
+        <w:t xml:space="preserve"> </w:t>
+      </w:r>
+      <w:proofErr w:type="spellStart"/>
+      <w:r>
+        <w:t>calculateMean</w:t>
+      </w:r>
+      <w:proofErr w:type="spellEnd"/>
+      <w:r>
+        <w:t>()</w:t>
       </w:r>
       <w:r>
         <w:br/>
@@ -3428,14 +3444,54 @@
       </w:r>
       <w:r>
         <w:br/>
-        <w:t xml:space="preserve">    int sum = 0;</w:t>
-      </w:r>
-      <w:r>
-        <w:br/>
-      </w:r>
-      <w:r>
-        <w:br/>
-        <w:t xml:space="preserve">    for (int num : getInputArray())</w:t>
+        <w:t xml:space="preserve">    </w:t>
+      </w:r>
+      <w:proofErr w:type="spellStart"/>
+      <w:r>
+        <w:t>int</w:t>
+      </w:r>
+      <w:proofErr w:type="spellEnd"/>
+      <w:r>
+        <w:t xml:space="preserve"> </w:t>
+      </w:r>
+      <w:proofErr w:type="spellStart"/>
+      <w:r>
+        <w:t>sum</w:t>
+      </w:r>
+      <w:proofErr w:type="spellEnd"/>
+      <w:r>
+        <w:t xml:space="preserve"> = 0;</w:t>
+      </w:r>
+      <w:r>
+        <w:br/>
+      </w:r>
+      <w:r>
+        <w:br/>
+        <w:t xml:space="preserve">    for (</w:t>
+      </w:r>
+      <w:proofErr w:type="spellStart"/>
+      <w:r>
+        <w:t>int</w:t>
+      </w:r>
+      <w:proofErr w:type="spellEnd"/>
+      <w:r>
+        <w:t xml:space="preserve"> </w:t>
+      </w:r>
+      <w:proofErr w:type="spellStart"/>
+      <w:r>
+        <w:t>num</w:t>
+      </w:r>
+      <w:proofErr w:type="spellEnd"/>
+      <w:r>
+        <w:t xml:space="preserve"> : </w:t>
+      </w:r>
+      <w:proofErr w:type="spellStart"/>
+      <w:r>
+        <w:t>getInputArray</w:t>
+      </w:r>
+      <w:proofErr w:type="spellEnd"/>
+      <w:r>
+        <w:t>())</w:t>
       </w:r>
       <w:r>
         <w:br/>
@@ -3443,7 +3499,23 @@
       </w:r>
       <w:r>
         <w:br/>
-        <w:t xml:space="preserve">        sum += num;</w:t>
+        <w:t xml:space="preserve">        </w:t>
+      </w:r>
+      <w:proofErr w:type="spellStart"/>
+      <w:r>
+        <w:t>sum</w:t>
+      </w:r>
+      <w:proofErr w:type="spellEnd"/>
+      <w:r>
+        <w:t xml:space="preserve"> += </w:t>
+      </w:r>
+      <w:proofErr w:type="spellStart"/>
+      <w:r>
+        <w:t>num</w:t>
+      </w:r>
+      <w:proofErr w:type="spellEnd"/>
+      <w:r>
+        <w:t>;</w:t>
       </w:r>
       <w:r>
         <w:br/>
@@ -3457,7 +3529,39 @@
       </w:r>
       <w:r>
         <w:br/>
-        <w:t xml:space="preserve">    setMean((double) sum / getInputArray().length);</w:t>
+        <w:t xml:space="preserve">    </w:t>
+      </w:r>
+      <w:proofErr w:type="spellStart"/>
+      <w:r>
+        <w:t>setMean</w:t>
+      </w:r>
+      <w:proofErr w:type="spellEnd"/>
+      <w:r>
+        <w:t xml:space="preserve">((double) </w:t>
+      </w:r>
+      <w:proofErr w:type="spellStart"/>
+      <w:r>
+        <w:t>sum</w:t>
+      </w:r>
+      <w:proofErr w:type="spellEnd"/>
+      <w:r>
+        <w:t xml:space="preserve"> / </w:t>
+      </w:r>
+      <w:proofErr w:type="spellStart"/>
+      <w:r>
+        <w:t>getInputArray</w:t>
+      </w:r>
+      <w:proofErr w:type="spellEnd"/>
+      <w:r>
+        <w:t>().</w:t>
+      </w:r>
+      <w:proofErr w:type="spellStart"/>
+      <w:r>
+        <w:t>length</w:t>
+      </w:r>
+      <w:proofErr w:type="spellEnd"/>
+      <w:r>
+        <w:t>);</w:t>
       </w:r>
       <w:r>
         <w:br/>
@@ -3496,9 +3600,14 @@
       </w:r>
       <w:bookmarkEnd w:id="9"/>
       <w:r>
-        <w:t>: calculateMean</w:t>
+        <w:t xml:space="preserve">: </w:t>
+      </w:r>
+      <w:proofErr w:type="spellStart"/>
+      <w:r>
+        <w:t>calculateMean</w:t>
       </w:r>
       <w:bookmarkEnd w:id="10"/>
+      <w:proofErr w:type="spellEnd"/>
     </w:p>
     <w:p>
       <w:pPr>
@@ -3515,7 +3624,23 @@
         <w:pStyle w:val="Pseoudocode"/>
       </w:pPr>
       <w:r>
-        <w:t>public void calculateMedian()</w:t>
+        <w:t xml:space="preserve">public </w:t>
+      </w:r>
+      <w:proofErr w:type="spellStart"/>
+      <w:r>
+        <w:t>void</w:t>
+      </w:r>
+      <w:proofErr w:type="spellEnd"/>
+      <w:r>
+        <w:t xml:space="preserve"> </w:t>
+      </w:r>
+      <w:proofErr w:type="spellStart"/>
+      <w:r>
+        <w:t>calculateMedian</w:t>
+      </w:r>
+      <w:proofErr w:type="spellEnd"/>
+      <w:r>
+        <w:t>()</w:t>
       </w:r>
       <w:r>
         <w:br/>
@@ -3523,7 +3648,27 @@
       </w:r>
       <w:r>
         <w:br/>
-        <w:t xml:space="preserve">    int[] sortedArray = Arrays.</w:t>
+        <w:t xml:space="preserve">    </w:t>
+      </w:r>
+      <w:proofErr w:type="spellStart"/>
+      <w:r>
+        <w:t>int</w:t>
+      </w:r>
+      <w:proofErr w:type="spellEnd"/>
+      <w:r>
+        <w:t xml:space="preserve">[] </w:t>
+      </w:r>
+      <w:proofErr w:type="spellStart"/>
+      <w:r>
+        <w:t>sortedArray</w:t>
+      </w:r>
+      <w:proofErr w:type="spellEnd"/>
+      <w:r>
+        <w:t xml:space="preserve"> = </w:t>
+      </w:r>
+      <w:proofErr w:type="spellStart"/>
+      <w:r>
+        <w:t>Arrays.</w:t>
       </w:r>
       <w:r>
         <w:rPr>
@@ -3532,12 +3677,41 @@
         </w:rPr>
         <w:t>copyOf</w:t>
       </w:r>
-      <w:r>
-        <w:t>(getInputArray(), getInputArray().length);</w:t>
-      </w:r>
-      <w:r>
-        <w:br/>
-        <w:t xml:space="preserve">    Arrays.</w:t>
+      <w:proofErr w:type="spellEnd"/>
+      <w:r>
+        <w:t>(</w:t>
+      </w:r>
+      <w:proofErr w:type="spellStart"/>
+      <w:r>
+        <w:t>getInputArray</w:t>
+      </w:r>
+      <w:proofErr w:type="spellEnd"/>
+      <w:r>
+        <w:t xml:space="preserve">(), </w:t>
+      </w:r>
+      <w:proofErr w:type="spellStart"/>
+      <w:r>
+        <w:t>getInputArray</w:t>
+      </w:r>
+      <w:proofErr w:type="spellEnd"/>
+      <w:r>
+        <w:t>().</w:t>
+      </w:r>
+      <w:proofErr w:type="spellStart"/>
+      <w:r>
+        <w:t>length</w:t>
+      </w:r>
+      <w:proofErr w:type="spellEnd"/>
+      <w:r>
+        <w:t>);</w:t>
+      </w:r>
+      <w:r>
+        <w:br/>
+        <w:t xml:space="preserve">    </w:t>
+      </w:r>
+      <w:proofErr w:type="spellStart"/>
+      <w:r>
+        <w:t>Arrays.</w:t>
       </w:r>
       <w:r>
         <w:rPr>
@@ -3546,15 +3720,32 @@
         </w:rPr>
         <w:t>sort</w:t>
       </w:r>
-      <w:r>
-        <w:t>(sortedArray);</w:t>
-      </w:r>
-      <w:r>
-        <w:br/>
-      </w:r>
-      <w:r>
-        <w:br/>
-        <w:t xml:space="preserve">    if (sortedArray.length % 2 == 0)</w:t>
+      <w:proofErr w:type="spellEnd"/>
+      <w:r>
+        <w:t>(</w:t>
+      </w:r>
+      <w:proofErr w:type="spellStart"/>
+      <w:r>
+        <w:t>sortedArray</w:t>
+      </w:r>
+      <w:proofErr w:type="spellEnd"/>
+      <w:r>
+        <w:t>);</w:t>
+      </w:r>
+      <w:r>
+        <w:br/>
+      </w:r>
+      <w:r>
+        <w:br/>
+        <w:t xml:space="preserve">    if (</w:t>
+      </w:r>
+      <w:proofErr w:type="spellStart"/>
+      <w:r>
+        <w:t>sortedArray.length</w:t>
+      </w:r>
+      <w:proofErr w:type="spellEnd"/>
+      <w:r>
+        <w:t xml:space="preserve"> % 2 == 0)</w:t>
       </w:r>
       <w:r>
         <w:br/>
@@ -3562,15 +3753,63 @@
       </w:r>
       <w:r>
         <w:br/>
-        <w:t xml:space="preserve">        int mid1 = sortedArray.length / 2;</w:t>
-      </w:r>
-      <w:r>
-        <w:br/>
-        <w:t xml:space="preserve">        int mid2 = mid1 - 1;</w:t>
-      </w:r>
-      <w:r>
-        <w:br/>
-        <w:t xml:space="preserve">        setMedian((sortedArray[mid1] + sortedArray[mid2]) / 2.0);</w:t>
+        <w:t xml:space="preserve">        </w:t>
+      </w:r>
+      <w:proofErr w:type="spellStart"/>
+      <w:r>
+        <w:t>int</w:t>
+      </w:r>
+      <w:proofErr w:type="spellEnd"/>
+      <w:r>
+        <w:t xml:space="preserve"> mid1 = </w:t>
+      </w:r>
+      <w:proofErr w:type="spellStart"/>
+      <w:r>
+        <w:t>sortedArray.length</w:t>
+      </w:r>
+      <w:proofErr w:type="spellEnd"/>
+      <w:r>
+        <w:t xml:space="preserve"> / 2;</w:t>
+      </w:r>
+      <w:r>
+        <w:br/>
+        <w:t xml:space="preserve">        </w:t>
+      </w:r>
+      <w:proofErr w:type="spellStart"/>
+      <w:r>
+        <w:t>int</w:t>
+      </w:r>
+      <w:proofErr w:type="spellEnd"/>
+      <w:r>
+        <w:t xml:space="preserve"> mid2 = mid1 - 1;</w:t>
+      </w:r>
+      <w:r>
+        <w:br/>
+        <w:t xml:space="preserve">        </w:t>
+      </w:r>
+      <w:proofErr w:type="spellStart"/>
+      <w:r>
+        <w:t>setMedian</w:t>
+      </w:r>
+      <w:proofErr w:type="spellEnd"/>
+      <w:r>
+        <w:t>((</w:t>
+      </w:r>
+      <w:proofErr w:type="spellStart"/>
+      <w:r>
+        <w:t>sortedArray</w:t>
+      </w:r>
+      <w:proofErr w:type="spellEnd"/>
+      <w:r>
+        <w:t xml:space="preserve">[mid1] + </w:t>
+      </w:r>
+      <w:proofErr w:type="spellStart"/>
+      <w:r>
+        <w:t>sortedArray</w:t>
+      </w:r>
+      <w:proofErr w:type="spellEnd"/>
+      <w:r>
+        <w:t>[mid2]) / 2.0);</w:t>
       </w:r>
       <w:r>
         <w:br/>
@@ -3578,19 +3817,72 @@
       </w:r>
       <w:r>
         <w:br/>
-        <w:t xml:space="preserve">    else</w:t>
-      </w:r>
+        <w:t xml:space="preserve">    </w:t>
+      </w:r>
+      <w:proofErr w:type="spellStart"/>
+      <w:r>
+        <w:t>else</w:t>
+      </w:r>
+      <w:proofErr w:type="spellEnd"/>
       <w:r>
         <w:br/>
         <w:t xml:space="preserve">    {</w:t>
       </w:r>
       <w:r>
         <w:br/>
-        <w:t xml:space="preserve">        int mid = sortedArray.length / 2;</w:t>
-      </w:r>
-      <w:r>
-        <w:br/>
-        <w:t xml:space="preserve">        setMedian(sortedArray[mid]);</w:t>
+        <w:t xml:space="preserve">        </w:t>
+      </w:r>
+      <w:proofErr w:type="spellStart"/>
+      <w:r>
+        <w:t>int</w:t>
+      </w:r>
+      <w:proofErr w:type="spellEnd"/>
+      <w:r>
+        <w:t xml:space="preserve"> </w:t>
+      </w:r>
+      <w:proofErr w:type="spellStart"/>
+      <w:r>
+        <w:t>mid</w:t>
+      </w:r>
+      <w:proofErr w:type="spellEnd"/>
+      <w:r>
+        <w:t xml:space="preserve"> = </w:t>
+      </w:r>
+      <w:proofErr w:type="spellStart"/>
+      <w:r>
+        <w:t>sortedArray.length</w:t>
+      </w:r>
+      <w:proofErr w:type="spellEnd"/>
+      <w:r>
+        <w:t xml:space="preserve"> / 2;</w:t>
+      </w:r>
+      <w:r>
+        <w:br/>
+        <w:t xml:space="preserve">        </w:t>
+      </w:r>
+      <w:proofErr w:type="spellStart"/>
+      <w:r>
+        <w:t>setMedian</w:t>
+      </w:r>
+      <w:proofErr w:type="spellEnd"/>
+      <w:r>
+        <w:t>(</w:t>
+      </w:r>
+      <w:proofErr w:type="spellStart"/>
+      <w:r>
+        <w:t>sortedArray</w:t>
+      </w:r>
+      <w:proofErr w:type="spellEnd"/>
+      <w:r>
+        <w:t>[</w:t>
+      </w:r>
+      <w:proofErr w:type="spellStart"/>
+      <w:r>
+        <w:t>mid</w:t>
+      </w:r>
+      <w:proofErr w:type="spellEnd"/>
+      <w:r>
+        <w:t>]);</w:t>
       </w:r>
       <w:r>
         <w:br/>
@@ -3631,9 +3923,14 @@
         <w:fldChar w:fldCharType="end"/>
       </w:r>
       <w:r>
-        <w:t>: calculateMedian</w:t>
+        <w:t xml:space="preserve">: </w:t>
+      </w:r>
+      <w:proofErr w:type="spellStart"/>
+      <w:r>
+        <w:t>calculateMedian</w:t>
       </w:r>
       <w:bookmarkEnd w:id="12"/>
+      <w:proofErr w:type="spellEnd"/>
     </w:p>
     <w:p>
       <w:pPr>
@@ -3650,7 +3947,23 @@
         <w:pStyle w:val="Pseoudocode"/>
       </w:pPr>
       <w:r>
-        <w:t>public void calculateMinAndMax()</w:t>
+        <w:t xml:space="preserve">public </w:t>
+      </w:r>
+      <w:proofErr w:type="spellStart"/>
+      <w:r>
+        <w:t>void</w:t>
+      </w:r>
+      <w:proofErr w:type="spellEnd"/>
+      <w:r>
+        <w:t xml:space="preserve"> </w:t>
+      </w:r>
+      <w:proofErr w:type="spellStart"/>
+      <w:r>
+        <w:t>calculateMinAndMax</w:t>
+      </w:r>
+      <w:proofErr w:type="spellEnd"/>
+      <w:r>
+        <w:t>()</w:t>
       </w:r>
       <w:r>
         <w:br/>
@@ -3658,18 +3971,74 @@
       </w:r>
       <w:r>
         <w:br/>
-        <w:t xml:space="preserve">    int min = getInputArray()[0];</w:t>
-      </w:r>
-      <w:r>
-        <w:br/>
-        <w:t xml:space="preserve">    int max = getInputArray()[0];</w:t>
-      </w:r>
-      <w:r>
-        <w:br/>
-      </w:r>
-      <w:r>
-        <w:br/>
-        <w:t xml:space="preserve">    for (int num : getInputArray())</w:t>
+        <w:t xml:space="preserve">    </w:t>
+      </w:r>
+      <w:proofErr w:type="spellStart"/>
+      <w:r>
+        <w:t>int</w:t>
+      </w:r>
+      <w:proofErr w:type="spellEnd"/>
+      <w:r>
+        <w:t xml:space="preserve"> min = </w:t>
+      </w:r>
+      <w:proofErr w:type="spellStart"/>
+      <w:r>
+        <w:t>getInputArray</w:t>
+      </w:r>
+      <w:proofErr w:type="spellEnd"/>
+      <w:r>
+        <w:t>()[0];</w:t>
+      </w:r>
+      <w:r>
+        <w:br/>
+        <w:t xml:space="preserve">    </w:t>
+      </w:r>
+      <w:proofErr w:type="spellStart"/>
+      <w:r>
+        <w:t>int</w:t>
+      </w:r>
+      <w:proofErr w:type="spellEnd"/>
+      <w:r>
+        <w:t xml:space="preserve"> max = </w:t>
+      </w:r>
+      <w:proofErr w:type="spellStart"/>
+      <w:r>
+        <w:t>getInputArray</w:t>
+      </w:r>
+      <w:proofErr w:type="spellEnd"/>
+      <w:r>
+        <w:t>()[0];</w:t>
+      </w:r>
+      <w:r>
+        <w:br/>
+      </w:r>
+      <w:r>
+        <w:br/>
+        <w:t xml:space="preserve">    for (</w:t>
+      </w:r>
+      <w:proofErr w:type="spellStart"/>
+      <w:r>
+        <w:t>int</w:t>
+      </w:r>
+      <w:proofErr w:type="spellEnd"/>
+      <w:r>
+        <w:t xml:space="preserve"> </w:t>
+      </w:r>
+      <w:proofErr w:type="spellStart"/>
+      <w:r>
+        <w:t>num</w:t>
+      </w:r>
+      <w:proofErr w:type="spellEnd"/>
+      <w:r>
+        <w:t xml:space="preserve"> : </w:t>
+      </w:r>
+      <w:proofErr w:type="spellStart"/>
+      <w:r>
+        <w:t>getInputArray</w:t>
+      </w:r>
+      <w:proofErr w:type="spellEnd"/>
+      <w:r>
+        <w:t>())</w:t>
       </w:r>
       <w:r>
         <w:br/>
@@ -3677,7 +4046,15 @@
       </w:r>
       <w:r>
         <w:br/>
-        <w:t xml:space="preserve">        if (num &lt; min)</w:t>
+        <w:t xml:space="preserve">        if (</w:t>
+      </w:r>
+      <w:proofErr w:type="spellStart"/>
+      <w:r>
+        <w:t>num</w:t>
+      </w:r>
+      <w:proofErr w:type="spellEnd"/>
+      <w:r>
+        <w:t xml:space="preserve"> &lt; min)</w:t>
       </w:r>
       <w:r>
         <w:br/>
@@ -3688,7 +4065,15 @@
       </w:r>
       <w:r>
         <w:lastRenderedPageBreak/>
-        <w:t xml:space="preserve">            min = num;</w:t>
+        <w:t xml:space="preserve">            min = </w:t>
+      </w:r>
+      <w:proofErr w:type="spellStart"/>
+      <w:r>
+        <w:t>num</w:t>
+      </w:r>
+      <w:proofErr w:type="spellEnd"/>
+      <w:r>
+        <w:t>;</w:t>
       </w:r>
       <w:r>
         <w:br/>
@@ -3696,7 +4081,15 @@
       </w:r>
       <w:r>
         <w:br/>
-        <w:t xml:space="preserve">        if (num &gt; max)</w:t>
+        <w:t xml:space="preserve">        if (</w:t>
+      </w:r>
+      <w:proofErr w:type="spellStart"/>
+      <w:r>
+        <w:t>num</w:t>
+      </w:r>
+      <w:proofErr w:type="spellEnd"/>
+      <w:r>
+        <w:t xml:space="preserve"> &gt; max)</w:t>
       </w:r>
       <w:r>
         <w:br/>
@@ -3704,7 +4097,15 @@
       </w:r>
       <w:r>
         <w:br/>
-        <w:t xml:space="preserve">            max = num;</w:t>
+        <w:t xml:space="preserve">            max = </w:t>
+      </w:r>
+      <w:proofErr w:type="spellStart"/>
+      <w:r>
+        <w:t>num</w:t>
+      </w:r>
+      <w:proofErr w:type="spellEnd"/>
+      <w:r>
+        <w:t>;</w:t>
       </w:r>
       <w:r>
         <w:br/>
@@ -3757,9 +4158,14 @@
         <w:fldChar w:fldCharType="end"/>
       </w:r>
       <w:r>
-        <w:t>: calculateMinAndMax</w:t>
+        <w:t xml:space="preserve">: </w:t>
+      </w:r>
+      <w:proofErr w:type="spellStart"/>
+      <w:r>
+        <w:t>calculateMinAndMax</w:t>
       </w:r>
       <w:bookmarkEnd w:id="14"/>
+      <w:proofErr w:type="spellEnd"/>
     </w:p>
     <w:p>
       <w:pPr>
@@ -3796,7 +4202,21 @@
           <w:lang w:val="en-AT"/>
         </w:rPr>
         <w:br/>
-        <w:t>void testArrayFromExercise()</w:t>
+        <w:t xml:space="preserve">void </w:t>
+      </w:r>
+      <w:proofErr w:type="spellStart"/>
+      <w:r>
+        <w:rPr>
+          <w:lang w:val="en-AT"/>
+        </w:rPr>
+        <w:t>testArrayFromExercise</w:t>
+      </w:r>
+      <w:proofErr w:type="spellEnd"/>
+      <w:r>
+        <w:rPr>
+          <w:lang w:val="en-AT"/>
+        </w:rPr>
+        <w:t>()</w:t>
       </w:r>
       <w:r>
         <w:rPr>
@@ -3810,75 +4230,188 @@
           <w:lang w:val="en-AT"/>
         </w:rPr>
         <w:br/>
-        <w:t xml:space="preserve">    excercise = new ArrayStatisticsExercise(new int[]{15, 8, 23, 4, 42, 11, 19});</w:t>
-      </w:r>
-      <w:r>
-        <w:rPr>
-          <w:lang w:val="en-AT"/>
-        </w:rPr>
-        <w:br/>
-      </w:r>
-      <w:r>
-        <w:rPr>
-          <w:lang w:val="en-AT"/>
-        </w:rPr>
-        <w:br/>
-        <w:t xml:space="preserve">    excercise.runExcercise();</w:t>
-      </w:r>
-      <w:r>
-        <w:rPr>
-          <w:lang w:val="en-AT"/>
-        </w:rPr>
-        <w:br/>
-        <w:t xml:space="preserve">    excercise.displayOutput();</w:t>
-      </w:r>
-      <w:r>
-        <w:rPr>
-          <w:lang w:val="en-AT"/>
-        </w:rPr>
-        <w:br/>
-      </w:r>
-      <w:r>
-        <w:rPr>
-          <w:lang w:val="en-AT"/>
-        </w:rPr>
-        <w:br/>
-        <w:t xml:space="preserve">    double expectedMean = 17.43;</w:t>
-      </w:r>
-      <w:r>
-        <w:rPr>
-          <w:lang w:val="en-AT"/>
-        </w:rPr>
-        <w:br/>
-        <w:t xml:space="preserve">    double expectedMedian = 15.0;</w:t>
-      </w:r>
-      <w:r>
-        <w:rPr>
-          <w:lang w:val="en-AT"/>
-        </w:rPr>
-        <w:br/>
-        <w:t xml:space="preserve">    int expectedMin = 4;</w:t>
-      </w:r>
-      <w:r>
-        <w:rPr>
-          <w:lang w:val="en-AT"/>
-        </w:rPr>
-        <w:br/>
-        <w:t xml:space="preserve">    int expectedMax = 42;</w:t>
-      </w:r>
-      <w:r>
-        <w:rPr>
-          <w:lang w:val="en-AT"/>
-        </w:rPr>
-        <w:br/>
-      </w:r>
-      <w:r>
-        <w:rPr>
-          <w:lang w:val="en-AT"/>
-        </w:rPr>
-        <w:br/>
         <w:t xml:space="preserve">    </w:t>
       </w:r>
+      <w:proofErr w:type="spellStart"/>
+      <w:r>
+        <w:rPr>
+          <w:lang w:val="en-AT"/>
+        </w:rPr>
+        <w:t>excercise</w:t>
+      </w:r>
+      <w:proofErr w:type="spellEnd"/>
+      <w:r>
+        <w:rPr>
+          <w:lang w:val="en-AT"/>
+        </w:rPr>
+        <w:t xml:space="preserve"> = new </w:t>
+      </w:r>
+      <w:proofErr w:type="spellStart"/>
+      <w:r>
+        <w:rPr>
+          <w:lang w:val="en-AT"/>
+        </w:rPr>
+        <w:t>ArrayStatisticsExercise</w:t>
+      </w:r>
+      <w:proofErr w:type="spellEnd"/>
+      <w:r>
+        <w:rPr>
+          <w:lang w:val="en-AT"/>
+        </w:rPr>
+        <w:t>(new int[]{15, 8, 23, 4, 42, 11, 19});</w:t>
+      </w:r>
+      <w:r>
+        <w:rPr>
+          <w:lang w:val="en-AT"/>
+        </w:rPr>
+        <w:br/>
+      </w:r>
+      <w:r>
+        <w:rPr>
+          <w:lang w:val="en-AT"/>
+        </w:rPr>
+        <w:br/>
+        <w:t xml:space="preserve">    </w:t>
+      </w:r>
+      <w:proofErr w:type="spellStart"/>
+      <w:r>
+        <w:rPr>
+          <w:lang w:val="en-AT"/>
+        </w:rPr>
+        <w:t>excercise.runExcercise</w:t>
+      </w:r>
+      <w:proofErr w:type="spellEnd"/>
+      <w:r>
+        <w:rPr>
+          <w:lang w:val="en-AT"/>
+        </w:rPr>
+        <w:t>();</w:t>
+      </w:r>
+      <w:r>
+        <w:rPr>
+          <w:lang w:val="en-AT"/>
+        </w:rPr>
+        <w:br/>
+        <w:t xml:space="preserve">    </w:t>
+      </w:r>
+      <w:proofErr w:type="spellStart"/>
+      <w:r>
+        <w:rPr>
+          <w:lang w:val="en-AT"/>
+        </w:rPr>
+        <w:t>excercise.displayOutput</w:t>
+      </w:r>
+      <w:proofErr w:type="spellEnd"/>
+      <w:r>
+        <w:rPr>
+          <w:lang w:val="en-AT"/>
+        </w:rPr>
+        <w:t>();</w:t>
+      </w:r>
+      <w:r>
+        <w:rPr>
+          <w:lang w:val="en-AT"/>
+        </w:rPr>
+        <w:br/>
+      </w:r>
+      <w:r>
+        <w:rPr>
+          <w:lang w:val="en-AT"/>
+        </w:rPr>
+        <w:br/>
+        <w:t xml:space="preserve">    double </w:t>
+      </w:r>
+      <w:proofErr w:type="spellStart"/>
+      <w:r>
+        <w:rPr>
+          <w:lang w:val="en-AT"/>
+        </w:rPr>
+        <w:t>expectedMean</w:t>
+      </w:r>
+      <w:proofErr w:type="spellEnd"/>
+      <w:r>
+        <w:rPr>
+          <w:lang w:val="en-AT"/>
+        </w:rPr>
+        <w:t xml:space="preserve"> = 17.43;</w:t>
+      </w:r>
+      <w:r>
+        <w:rPr>
+          <w:lang w:val="en-AT"/>
+        </w:rPr>
+        <w:br/>
+        <w:t xml:space="preserve">    double </w:t>
+      </w:r>
+      <w:proofErr w:type="spellStart"/>
+      <w:r>
+        <w:rPr>
+          <w:lang w:val="en-AT"/>
+        </w:rPr>
+        <w:t>expectedMedian</w:t>
+      </w:r>
+      <w:proofErr w:type="spellEnd"/>
+      <w:r>
+        <w:rPr>
+          <w:lang w:val="en-AT"/>
+        </w:rPr>
+        <w:t xml:space="preserve"> = 15.0;</w:t>
+      </w:r>
+      <w:r>
+        <w:rPr>
+          <w:lang w:val="en-AT"/>
+        </w:rPr>
+        <w:br/>
+        <w:t xml:space="preserve">    int </w:t>
+      </w:r>
+      <w:proofErr w:type="spellStart"/>
+      <w:r>
+        <w:rPr>
+          <w:lang w:val="en-AT"/>
+        </w:rPr>
+        <w:t>expectedMin</w:t>
+      </w:r>
+      <w:proofErr w:type="spellEnd"/>
+      <w:r>
+        <w:rPr>
+          <w:lang w:val="en-AT"/>
+        </w:rPr>
+        <w:t xml:space="preserve"> = 4;</w:t>
+      </w:r>
+      <w:r>
+        <w:rPr>
+          <w:lang w:val="en-AT"/>
+        </w:rPr>
+        <w:br/>
+        <w:t xml:space="preserve">    int </w:t>
+      </w:r>
+      <w:proofErr w:type="spellStart"/>
+      <w:r>
+        <w:rPr>
+          <w:lang w:val="en-AT"/>
+        </w:rPr>
+        <w:t>expectedMax</w:t>
+      </w:r>
+      <w:proofErr w:type="spellEnd"/>
+      <w:r>
+        <w:rPr>
+          <w:lang w:val="en-AT"/>
+        </w:rPr>
+        <w:t xml:space="preserve"> = 42;</w:t>
+      </w:r>
+      <w:r>
+        <w:rPr>
+          <w:lang w:val="en-AT"/>
+        </w:rPr>
+        <w:br/>
+      </w:r>
+      <w:r>
+        <w:rPr>
+          <w:lang w:val="en-AT"/>
+        </w:rPr>
+        <w:br/>
+        <w:t xml:space="preserve">    </w:t>
+      </w:r>
+      <w:proofErr w:type="spellStart"/>
       <w:r>
         <w:rPr>
           <w:i/>
@@ -3887,11 +4420,40 @@
         </w:rPr>
         <w:t>assertEquals</w:t>
       </w:r>
-      <w:r>
-        <w:rPr>
-          <w:lang w:val="en-AT"/>
-        </w:rPr>
-        <w:t>(expectedMean, excercise.getMean(), 0.01);</w:t>
+      <w:proofErr w:type="spellEnd"/>
+      <w:r>
+        <w:rPr>
+          <w:lang w:val="en-AT"/>
+        </w:rPr>
+        <w:t>(</w:t>
+      </w:r>
+      <w:proofErr w:type="spellStart"/>
+      <w:r>
+        <w:rPr>
+          <w:lang w:val="en-AT"/>
+        </w:rPr>
+        <w:t>expectedMean</w:t>
+      </w:r>
+      <w:proofErr w:type="spellEnd"/>
+      <w:r>
+        <w:rPr>
+          <w:lang w:val="en-AT"/>
+        </w:rPr>
+        <w:t xml:space="preserve">, </w:t>
+      </w:r>
+      <w:proofErr w:type="spellStart"/>
+      <w:r>
+        <w:rPr>
+          <w:lang w:val="en-AT"/>
+        </w:rPr>
+        <w:t>excercise.getMean</w:t>
+      </w:r>
+      <w:proofErr w:type="spellEnd"/>
+      <w:r>
+        <w:rPr>
+          <w:lang w:val="en-AT"/>
+        </w:rPr>
+        <w:t>(), 0.01);</w:t>
       </w:r>
       <w:r>
         <w:rPr>
@@ -3900,6 +4462,7 @@
         <w:br/>
         <w:t xml:space="preserve">    </w:t>
       </w:r>
+      <w:proofErr w:type="spellStart"/>
       <w:r>
         <w:rPr>
           <w:i/>
@@ -3908,11 +4471,40 @@
         </w:rPr>
         <w:t>assertEquals</w:t>
       </w:r>
-      <w:r>
-        <w:rPr>
-          <w:lang w:val="en-AT"/>
-        </w:rPr>
-        <w:t>(expectedMedian, excercise.getMedian(), 0.001);</w:t>
+      <w:proofErr w:type="spellEnd"/>
+      <w:r>
+        <w:rPr>
+          <w:lang w:val="en-AT"/>
+        </w:rPr>
+        <w:t>(</w:t>
+      </w:r>
+      <w:proofErr w:type="spellStart"/>
+      <w:r>
+        <w:rPr>
+          <w:lang w:val="en-AT"/>
+        </w:rPr>
+        <w:t>expectedMedian</w:t>
+      </w:r>
+      <w:proofErr w:type="spellEnd"/>
+      <w:r>
+        <w:rPr>
+          <w:lang w:val="en-AT"/>
+        </w:rPr>
+        <w:t xml:space="preserve">, </w:t>
+      </w:r>
+      <w:proofErr w:type="spellStart"/>
+      <w:r>
+        <w:rPr>
+          <w:lang w:val="en-AT"/>
+        </w:rPr>
+        <w:t>excercise.getMedian</w:t>
+      </w:r>
+      <w:proofErr w:type="spellEnd"/>
+      <w:r>
+        <w:rPr>
+          <w:lang w:val="en-AT"/>
+        </w:rPr>
+        <w:t>(), 0.001);</w:t>
       </w:r>
       <w:r>
         <w:rPr>
@@ -3921,6 +4513,7 @@
         <w:br/>
         <w:t xml:space="preserve">    </w:t>
       </w:r>
+      <w:proofErr w:type="spellStart"/>
       <w:r>
         <w:rPr>
           <w:i/>
@@ -3929,11 +4522,40 @@
         </w:rPr>
         <w:t>assertEquals</w:t>
       </w:r>
-      <w:r>
-        <w:rPr>
-          <w:lang w:val="en-AT"/>
-        </w:rPr>
-        <w:t>(expectedMin, excercise.getMinimum());</w:t>
+      <w:proofErr w:type="spellEnd"/>
+      <w:r>
+        <w:rPr>
+          <w:lang w:val="en-AT"/>
+        </w:rPr>
+        <w:t>(</w:t>
+      </w:r>
+      <w:proofErr w:type="spellStart"/>
+      <w:r>
+        <w:rPr>
+          <w:lang w:val="en-AT"/>
+        </w:rPr>
+        <w:t>expectedMin</w:t>
+      </w:r>
+      <w:proofErr w:type="spellEnd"/>
+      <w:r>
+        <w:rPr>
+          <w:lang w:val="en-AT"/>
+        </w:rPr>
+        <w:t xml:space="preserve">, </w:t>
+      </w:r>
+      <w:proofErr w:type="spellStart"/>
+      <w:r>
+        <w:rPr>
+          <w:lang w:val="en-AT"/>
+        </w:rPr>
+        <w:t>excercise.getMinimum</w:t>
+      </w:r>
+      <w:proofErr w:type="spellEnd"/>
+      <w:r>
+        <w:rPr>
+          <w:lang w:val="en-AT"/>
+        </w:rPr>
+        <w:t>());</w:t>
       </w:r>
       <w:r>
         <w:rPr>
@@ -3942,6 +4564,7 @@
         <w:br/>
         <w:t xml:space="preserve">    </w:t>
       </w:r>
+      <w:proofErr w:type="spellStart"/>
       <w:r>
         <w:rPr>
           <w:i/>
@@ -3950,11 +4573,40 @@
         </w:rPr>
         <w:t>assertEquals</w:t>
       </w:r>
-      <w:r>
-        <w:rPr>
-          <w:lang w:val="en-AT"/>
-        </w:rPr>
-        <w:t>(expectedMax, excercise.getMaximum());</w:t>
+      <w:proofErr w:type="spellEnd"/>
+      <w:r>
+        <w:rPr>
+          <w:lang w:val="en-AT"/>
+        </w:rPr>
+        <w:t>(</w:t>
+      </w:r>
+      <w:proofErr w:type="spellStart"/>
+      <w:r>
+        <w:rPr>
+          <w:lang w:val="en-AT"/>
+        </w:rPr>
+        <w:t>expectedMax</w:t>
+      </w:r>
+      <w:proofErr w:type="spellEnd"/>
+      <w:r>
+        <w:rPr>
+          <w:lang w:val="en-AT"/>
+        </w:rPr>
+        <w:t xml:space="preserve">, </w:t>
+      </w:r>
+      <w:proofErr w:type="spellStart"/>
+      <w:r>
+        <w:rPr>
+          <w:lang w:val="en-AT"/>
+        </w:rPr>
+        <w:t>excercise.getMaximum</w:t>
+      </w:r>
+      <w:proofErr w:type="spellEnd"/>
+      <w:r>
+        <w:rPr>
+          <w:lang w:val="en-AT"/>
+        </w:rPr>
+        <w:t>());</w:t>
       </w:r>
       <w:r>
         <w:rPr>
@@ -4000,32 +4652,63 @@
         <w:pStyle w:val="Pseoudocode"/>
       </w:pPr>
       <w:r>
-        <w:t>=== Array Statistics ===</w:t>
+        <w:t xml:space="preserve">=== </w:t>
+      </w:r>
+      <w:proofErr w:type="spellStart"/>
+      <w:r>
+        <w:t>Array</w:t>
+      </w:r>
+      <w:proofErr w:type="spellEnd"/>
+      <w:r>
+        <w:t xml:space="preserve"> </w:t>
+      </w:r>
+      <w:proofErr w:type="spellStart"/>
+      <w:r>
+        <w:t>Statistics</w:t>
+      </w:r>
+      <w:proofErr w:type="spellEnd"/>
+      <w:r>
+        <w:t xml:space="preserve"> ===</w:t>
       </w:r>
     </w:p>
     <w:p>
       <w:pPr>
         <w:pStyle w:val="Pseoudocode"/>
       </w:pPr>
-      <w:r>
-        <w:t>Arrays: [15, 8, 23, 4, 42, 11, 19]</w:t>
+      <w:proofErr w:type="spellStart"/>
+      <w:r>
+        <w:t>Arrays</w:t>
+      </w:r>
+      <w:proofErr w:type="spellEnd"/>
+      <w:r>
+        <w:t>: [15, 8, 23, 4, 42, 11, 19]</w:t>
       </w:r>
     </w:p>
     <w:p>
       <w:pPr>
         <w:pStyle w:val="Pseoudocode"/>
       </w:pPr>
-      <w:r>
-        <w:t>Mean: 17.43</w:t>
+      <w:proofErr w:type="spellStart"/>
+      <w:r>
+        <w:t>Mean</w:t>
+      </w:r>
+      <w:proofErr w:type="spellEnd"/>
+      <w:r>
+        <w:t>: 17.43</w:t>
       </w:r>
     </w:p>
     <w:p>
       <w:pPr>
         <w:pStyle w:val="Pseoudocode"/>
       </w:pPr>
+      <w:proofErr w:type="spellStart"/>
       <w:r>
         <w:lastRenderedPageBreak/>
-        <w:t>Median: 15.00</w:t>
+        <w:t>Median</w:t>
+      </w:r>
+      <w:proofErr w:type="spellEnd"/>
+      <w:r>
+        <w:t>: 15.00</w:t>
       </w:r>
     </w:p>
     <w:p>
@@ -4399,7 +5082,21 @@
         <w:rPr>
           <w:lang w:val="en-AT"/>
         </w:rPr>
-        <w:t>private int[] reverseArray(int[] array)</w:t>
+        <w:t xml:space="preserve">private int[] </w:t>
+      </w:r>
+      <w:proofErr w:type="spellStart"/>
+      <w:r>
+        <w:rPr>
+          <w:lang w:val="en-AT"/>
+        </w:rPr>
+        <w:t>reverseArray</w:t>
+      </w:r>
+      <w:proofErr w:type="spellEnd"/>
+      <w:r>
+        <w:rPr>
+          <w:lang w:val="en-AT"/>
+        </w:rPr>
+        <w:t>(int[] array)</w:t>
       </w:r>
       <w:r>
         <w:rPr>
@@ -4413,7 +5110,28 @@
           <w:lang w:val="en-AT"/>
         </w:rPr>
         <w:br/>
-        <w:t xml:space="preserve">    int[] arrayCopy = Arrays.</w:t>
+        <w:t xml:space="preserve">    int[] </w:t>
+      </w:r>
+      <w:proofErr w:type="spellStart"/>
+      <w:r>
+        <w:rPr>
+          <w:lang w:val="en-AT"/>
+        </w:rPr>
+        <w:t>arrayCopy</w:t>
+      </w:r>
+      <w:proofErr w:type="spellEnd"/>
+      <w:r>
+        <w:rPr>
+          <w:lang w:val="en-AT"/>
+        </w:rPr>
+        <w:t xml:space="preserve"> = </w:t>
+      </w:r>
+      <w:proofErr w:type="spellStart"/>
+      <w:r>
+        <w:rPr>
+          <w:lang w:val="en-AT"/>
+        </w:rPr>
+        <w:t>Arrays.</w:t>
       </w:r>
       <w:r>
         <w:rPr>
@@ -4423,11 +5141,26 @@
         </w:rPr>
         <w:t>copyOf</w:t>
       </w:r>
-      <w:r>
-        <w:rPr>
-          <w:lang w:val="en-AT"/>
-        </w:rPr>
-        <w:t>(array, array.length);</w:t>
+      <w:proofErr w:type="spellEnd"/>
+      <w:r>
+        <w:rPr>
+          <w:lang w:val="en-AT"/>
+        </w:rPr>
+        <w:t xml:space="preserve">(array, </w:t>
+      </w:r>
+      <w:proofErr w:type="spellStart"/>
+      <w:r>
+        <w:rPr>
+          <w:lang w:val="en-AT"/>
+        </w:rPr>
+        <w:t>array.length</w:t>
+      </w:r>
+      <w:proofErr w:type="spellEnd"/>
+      <w:r>
+        <w:rPr>
+          <w:lang w:val="en-AT"/>
+        </w:rPr>
+        <w:t>);</w:t>
       </w:r>
       <w:r>
         <w:rPr>
@@ -4453,7 +5186,63 @@
           <w:lang w:val="en-AT"/>
         </w:rPr>
         <w:br/>
-        <w:t xml:space="preserve">    for (int i = 0; i &lt; arrayCopy.length / 2; i++)</w:t>
+        <w:t xml:space="preserve">    for (int </w:t>
+      </w:r>
+      <w:proofErr w:type="spellStart"/>
+      <w:r>
+        <w:rPr>
+          <w:lang w:val="en-AT"/>
+        </w:rPr>
+        <w:t>i</w:t>
+      </w:r>
+      <w:proofErr w:type="spellEnd"/>
+      <w:r>
+        <w:rPr>
+          <w:lang w:val="en-AT"/>
+        </w:rPr>
+        <w:t xml:space="preserve"> = 0; </w:t>
+      </w:r>
+      <w:proofErr w:type="spellStart"/>
+      <w:r>
+        <w:rPr>
+          <w:lang w:val="en-AT"/>
+        </w:rPr>
+        <w:t>i</w:t>
+      </w:r>
+      <w:proofErr w:type="spellEnd"/>
+      <w:r>
+        <w:rPr>
+          <w:lang w:val="en-AT"/>
+        </w:rPr>
+        <w:t xml:space="preserve"> &lt; </w:t>
+      </w:r>
+      <w:proofErr w:type="spellStart"/>
+      <w:r>
+        <w:rPr>
+          <w:lang w:val="en-AT"/>
+        </w:rPr>
+        <w:t>arrayCopy.length</w:t>
+      </w:r>
+      <w:proofErr w:type="spellEnd"/>
+      <w:r>
+        <w:rPr>
+          <w:lang w:val="en-AT"/>
+        </w:rPr>
+        <w:t xml:space="preserve"> / 2; </w:t>
+      </w:r>
+      <w:proofErr w:type="spellStart"/>
+      <w:r>
+        <w:rPr>
+          <w:lang w:val="en-AT"/>
+        </w:rPr>
+        <w:t>i</w:t>
+      </w:r>
+      <w:proofErr w:type="spellEnd"/>
+      <w:r>
+        <w:rPr>
+          <w:lang w:val="en-AT"/>
+        </w:rPr>
+        <w:t>++)</w:t>
       </w:r>
       <w:r>
         <w:rPr>
@@ -4467,21 +5256,161 @@
           <w:lang w:val="en-AT"/>
         </w:rPr>
         <w:br/>
-        <w:t xml:space="preserve">        temp = arrayCopy[i];</w:t>
-      </w:r>
-      <w:r>
-        <w:rPr>
-          <w:lang w:val="en-AT"/>
-        </w:rPr>
-        <w:br/>
-        <w:t xml:space="preserve">        arrayCopy[i] = arrayCopy[arrayCopy.length - 1 - i];</w:t>
-      </w:r>
-      <w:r>
-        <w:rPr>
-          <w:lang w:val="en-AT"/>
-        </w:rPr>
-        <w:br/>
-        <w:t xml:space="preserve">        arrayCopy[arrayCopy.length - 1 - i] = temp;</w:t>
+        <w:t xml:space="preserve">        temp = </w:t>
+      </w:r>
+      <w:proofErr w:type="spellStart"/>
+      <w:r>
+        <w:rPr>
+          <w:lang w:val="en-AT"/>
+        </w:rPr>
+        <w:t>arrayCopy</w:t>
+      </w:r>
+      <w:proofErr w:type="spellEnd"/>
+      <w:r>
+        <w:rPr>
+          <w:lang w:val="en-AT"/>
+        </w:rPr>
+        <w:t>[</w:t>
+      </w:r>
+      <w:proofErr w:type="spellStart"/>
+      <w:r>
+        <w:rPr>
+          <w:lang w:val="en-AT"/>
+        </w:rPr>
+        <w:t>i</w:t>
+      </w:r>
+      <w:proofErr w:type="spellEnd"/>
+      <w:r>
+        <w:rPr>
+          <w:lang w:val="en-AT"/>
+        </w:rPr>
+        <w:t>];</w:t>
+      </w:r>
+      <w:r>
+        <w:rPr>
+          <w:lang w:val="en-AT"/>
+        </w:rPr>
+        <w:br/>
+        <w:t xml:space="preserve">        </w:t>
+      </w:r>
+      <w:proofErr w:type="spellStart"/>
+      <w:r>
+        <w:rPr>
+          <w:lang w:val="en-AT"/>
+        </w:rPr>
+        <w:t>arrayCopy</w:t>
+      </w:r>
+      <w:proofErr w:type="spellEnd"/>
+      <w:r>
+        <w:rPr>
+          <w:lang w:val="en-AT"/>
+        </w:rPr>
+        <w:t>[</w:t>
+      </w:r>
+      <w:proofErr w:type="spellStart"/>
+      <w:r>
+        <w:rPr>
+          <w:lang w:val="en-AT"/>
+        </w:rPr>
+        <w:t>i</w:t>
+      </w:r>
+      <w:proofErr w:type="spellEnd"/>
+      <w:r>
+        <w:rPr>
+          <w:lang w:val="en-AT"/>
+        </w:rPr>
+        <w:t xml:space="preserve">] = </w:t>
+      </w:r>
+      <w:proofErr w:type="spellStart"/>
+      <w:r>
+        <w:rPr>
+          <w:lang w:val="en-AT"/>
+        </w:rPr>
+        <w:t>arrayCopy</w:t>
+      </w:r>
+      <w:proofErr w:type="spellEnd"/>
+      <w:r>
+        <w:rPr>
+          <w:lang w:val="en-AT"/>
+        </w:rPr>
+        <w:t>[</w:t>
+      </w:r>
+      <w:proofErr w:type="spellStart"/>
+      <w:r>
+        <w:rPr>
+          <w:lang w:val="en-AT"/>
+        </w:rPr>
+        <w:t>arrayCopy.length</w:t>
+      </w:r>
+      <w:proofErr w:type="spellEnd"/>
+      <w:r>
+        <w:rPr>
+          <w:lang w:val="en-AT"/>
+        </w:rPr>
+        <w:t xml:space="preserve"> - 1 - </w:t>
+      </w:r>
+      <w:proofErr w:type="spellStart"/>
+      <w:r>
+        <w:rPr>
+          <w:lang w:val="en-AT"/>
+        </w:rPr>
+        <w:t>i</w:t>
+      </w:r>
+      <w:proofErr w:type="spellEnd"/>
+      <w:r>
+        <w:rPr>
+          <w:lang w:val="en-AT"/>
+        </w:rPr>
+        <w:t>];</w:t>
+      </w:r>
+      <w:r>
+        <w:rPr>
+          <w:lang w:val="en-AT"/>
+        </w:rPr>
+        <w:br/>
+        <w:t xml:space="preserve">        </w:t>
+      </w:r>
+      <w:proofErr w:type="spellStart"/>
+      <w:r>
+        <w:rPr>
+          <w:lang w:val="en-AT"/>
+        </w:rPr>
+        <w:t>arrayCopy</w:t>
+      </w:r>
+      <w:proofErr w:type="spellEnd"/>
+      <w:r>
+        <w:rPr>
+          <w:lang w:val="en-AT"/>
+        </w:rPr>
+        <w:t>[</w:t>
+      </w:r>
+      <w:proofErr w:type="spellStart"/>
+      <w:r>
+        <w:rPr>
+          <w:lang w:val="en-AT"/>
+        </w:rPr>
+        <w:t>arrayCopy.length</w:t>
+      </w:r>
+      <w:proofErr w:type="spellEnd"/>
+      <w:r>
+        <w:rPr>
+          <w:lang w:val="en-AT"/>
+        </w:rPr>
+        <w:t xml:space="preserve"> - 1 - </w:t>
+      </w:r>
+      <w:proofErr w:type="spellStart"/>
+      <w:r>
+        <w:rPr>
+          <w:lang w:val="en-AT"/>
+        </w:rPr>
+        <w:t>i</w:t>
+      </w:r>
+      <w:proofErr w:type="spellEnd"/>
+      <w:r>
+        <w:rPr>
+          <w:lang w:val="en-AT"/>
+        </w:rPr>
+        <w:t>] = temp;</w:t>
       </w:r>
       <w:r>
         <w:rPr>
@@ -4507,7 +5436,21 @@
           <w:lang w:val="en-AT"/>
         </w:rPr>
         <w:lastRenderedPageBreak/>
-        <w:t xml:space="preserve">    return arrayCopy;</w:t>
+        <w:t xml:space="preserve">    return </w:t>
+      </w:r>
+      <w:proofErr w:type="spellStart"/>
+      <w:r>
+        <w:rPr>
+          <w:lang w:val="en-AT"/>
+        </w:rPr>
+        <w:t>arrayCopy</w:t>
+      </w:r>
+      <w:proofErr w:type="spellEnd"/>
+      <w:r>
+        <w:rPr>
+          <w:lang w:val="en-AT"/>
+        </w:rPr>
+        <w:t>;</w:t>
       </w:r>
       <w:r>
         <w:rPr>
@@ -4549,9 +5492,14 @@
       </w:r>
       <w:bookmarkEnd w:id="23"/>
       <w:r>
-        <w:t>: reverseArray</w:t>
+        <w:t xml:space="preserve">: </w:t>
+      </w:r>
+      <w:proofErr w:type="spellStart"/>
+      <w:r>
+        <w:t>reverseArray</w:t>
       </w:r>
       <w:bookmarkEnd w:id="24"/>
+      <w:proofErr w:type="spellEnd"/>
     </w:p>
     <w:p>
       <w:pPr>
@@ -4581,7 +5529,21 @@
           <w:lang w:val="en-AT"/>
         </w:rPr>
         <w:br/>
-        <w:t>void testArrayReversalOdd()</w:t>
+        <w:t xml:space="preserve">void </w:t>
+      </w:r>
+      <w:proofErr w:type="spellStart"/>
+      <w:r>
+        <w:rPr>
+          <w:lang w:val="en-AT"/>
+        </w:rPr>
+        <w:t>testArrayReversalOdd</w:t>
+      </w:r>
+      <w:proofErr w:type="spellEnd"/>
+      <w:r>
+        <w:rPr>
+          <w:lang w:val="en-AT"/>
+        </w:rPr>
+        <w:t>()</w:t>
       </w:r>
       <w:r>
         <w:rPr>
@@ -4595,72 +5557,254 @@
           <w:lang w:val="en-AT"/>
         </w:rPr>
         <w:br/>
-        <w:t xml:space="preserve">    int[] inputArray = {10, 20, 30, 40, 50};</w:t>
-      </w:r>
-      <w:r>
-        <w:rPr>
-          <w:lang w:val="en-AT"/>
-        </w:rPr>
-        <w:br/>
-      </w:r>
-      <w:r>
-        <w:rPr>
-          <w:lang w:val="en-AT"/>
-        </w:rPr>
-        <w:br/>
-        <w:t xml:space="preserve">    ArrayReversalExercise excercise = new ArrayReversalExercise(inputArray);</w:t>
-      </w:r>
-      <w:r>
-        <w:rPr>
-          <w:lang w:val="en-AT"/>
-        </w:rPr>
-        <w:br/>
-      </w:r>
-      <w:r>
-        <w:rPr>
-          <w:lang w:val="en-AT"/>
-        </w:rPr>
-        <w:br/>
-        <w:t xml:space="preserve">    excercise.runExcercise();</w:t>
-      </w:r>
-      <w:r>
-        <w:rPr>
-          <w:lang w:val="en-AT"/>
-        </w:rPr>
-        <w:br/>
-      </w:r>
-      <w:r>
-        <w:rPr>
-          <w:lang w:val="en-AT"/>
-        </w:rPr>
-        <w:br/>
-        <w:t xml:space="preserve">    int[] reversedArray = excercise.getReversedArray();</w:t>
-      </w:r>
-      <w:r>
-        <w:rPr>
-          <w:lang w:val="en-AT"/>
-        </w:rPr>
-        <w:br/>
-      </w:r>
-      <w:r>
-        <w:rPr>
-          <w:lang w:val="en-AT"/>
-        </w:rPr>
-        <w:br/>
-        <w:t xml:space="preserve">    int[] expectedArray = {50, 40, 30, 20, 10};</w:t>
-      </w:r>
-      <w:r>
-        <w:rPr>
-          <w:lang w:val="en-AT"/>
-        </w:rPr>
-        <w:br/>
-      </w:r>
-      <w:r>
-        <w:rPr>
-          <w:lang w:val="en-AT"/>
-        </w:rPr>
-        <w:br/>
-        <w:t xml:space="preserve">    for (int i = 0; i &lt; expectedArray.length; i++)</w:t>
+        <w:t xml:space="preserve">    int[] </w:t>
+      </w:r>
+      <w:proofErr w:type="spellStart"/>
+      <w:r>
+        <w:rPr>
+          <w:lang w:val="en-AT"/>
+        </w:rPr>
+        <w:t>inputArray</w:t>
+      </w:r>
+      <w:proofErr w:type="spellEnd"/>
+      <w:r>
+        <w:rPr>
+          <w:lang w:val="en-AT"/>
+        </w:rPr>
+        <w:t xml:space="preserve"> = {10, 20, 30, 40, 50};</w:t>
+      </w:r>
+      <w:r>
+        <w:rPr>
+          <w:lang w:val="en-AT"/>
+        </w:rPr>
+        <w:br/>
+      </w:r>
+      <w:r>
+        <w:rPr>
+          <w:lang w:val="en-AT"/>
+        </w:rPr>
+        <w:br/>
+        <w:t xml:space="preserve">    </w:t>
+      </w:r>
+      <w:proofErr w:type="spellStart"/>
+      <w:r>
+        <w:rPr>
+          <w:lang w:val="en-AT"/>
+        </w:rPr>
+        <w:t>ArrayReversalExercise</w:t>
+      </w:r>
+      <w:proofErr w:type="spellEnd"/>
+      <w:r>
+        <w:rPr>
+          <w:lang w:val="en-AT"/>
+        </w:rPr>
+        <w:t xml:space="preserve"> </w:t>
+      </w:r>
+      <w:proofErr w:type="spellStart"/>
+      <w:r>
+        <w:rPr>
+          <w:lang w:val="en-AT"/>
+        </w:rPr>
+        <w:t>excercise</w:t>
+      </w:r>
+      <w:proofErr w:type="spellEnd"/>
+      <w:r>
+        <w:rPr>
+          <w:lang w:val="en-AT"/>
+        </w:rPr>
+        <w:t xml:space="preserve"> = new </w:t>
+      </w:r>
+      <w:proofErr w:type="spellStart"/>
+      <w:r>
+        <w:rPr>
+          <w:lang w:val="en-AT"/>
+        </w:rPr>
+        <w:t>ArrayReversalExercise</w:t>
+      </w:r>
+      <w:proofErr w:type="spellEnd"/>
+      <w:r>
+        <w:rPr>
+          <w:lang w:val="en-AT"/>
+        </w:rPr>
+        <w:t>(</w:t>
+      </w:r>
+      <w:proofErr w:type="spellStart"/>
+      <w:r>
+        <w:rPr>
+          <w:lang w:val="en-AT"/>
+        </w:rPr>
+        <w:t>inputArray</w:t>
+      </w:r>
+      <w:proofErr w:type="spellEnd"/>
+      <w:r>
+        <w:rPr>
+          <w:lang w:val="en-AT"/>
+        </w:rPr>
+        <w:t>);</w:t>
+      </w:r>
+      <w:r>
+        <w:rPr>
+          <w:lang w:val="en-AT"/>
+        </w:rPr>
+        <w:br/>
+      </w:r>
+      <w:r>
+        <w:rPr>
+          <w:lang w:val="en-AT"/>
+        </w:rPr>
+        <w:br/>
+        <w:t xml:space="preserve">    </w:t>
+      </w:r>
+      <w:proofErr w:type="spellStart"/>
+      <w:r>
+        <w:rPr>
+          <w:lang w:val="en-AT"/>
+        </w:rPr>
+        <w:t>excercise.runExcercise</w:t>
+      </w:r>
+      <w:proofErr w:type="spellEnd"/>
+      <w:r>
+        <w:rPr>
+          <w:lang w:val="en-AT"/>
+        </w:rPr>
+        <w:t>();</w:t>
+      </w:r>
+      <w:r>
+        <w:rPr>
+          <w:lang w:val="en-AT"/>
+        </w:rPr>
+        <w:br/>
+      </w:r>
+      <w:r>
+        <w:rPr>
+          <w:lang w:val="en-AT"/>
+        </w:rPr>
+        <w:br/>
+        <w:t xml:space="preserve">    int[] </w:t>
+      </w:r>
+      <w:proofErr w:type="spellStart"/>
+      <w:r>
+        <w:rPr>
+          <w:lang w:val="en-AT"/>
+        </w:rPr>
+        <w:t>reversedArray</w:t>
+      </w:r>
+      <w:proofErr w:type="spellEnd"/>
+      <w:r>
+        <w:rPr>
+          <w:lang w:val="en-AT"/>
+        </w:rPr>
+        <w:t xml:space="preserve"> = </w:t>
+      </w:r>
+      <w:proofErr w:type="spellStart"/>
+      <w:r>
+        <w:rPr>
+          <w:lang w:val="en-AT"/>
+        </w:rPr>
+        <w:t>excercise.getReversedArray</w:t>
+      </w:r>
+      <w:proofErr w:type="spellEnd"/>
+      <w:r>
+        <w:rPr>
+          <w:lang w:val="en-AT"/>
+        </w:rPr>
+        <w:t>();</w:t>
+      </w:r>
+      <w:r>
+        <w:rPr>
+          <w:lang w:val="en-AT"/>
+        </w:rPr>
+        <w:br/>
+      </w:r>
+      <w:r>
+        <w:rPr>
+          <w:lang w:val="en-AT"/>
+        </w:rPr>
+        <w:br/>
+        <w:t xml:space="preserve">    int[] </w:t>
+      </w:r>
+      <w:proofErr w:type="spellStart"/>
+      <w:r>
+        <w:rPr>
+          <w:lang w:val="en-AT"/>
+        </w:rPr>
+        <w:t>expectedArray</w:t>
+      </w:r>
+      <w:proofErr w:type="spellEnd"/>
+      <w:r>
+        <w:rPr>
+          <w:lang w:val="en-AT"/>
+        </w:rPr>
+        <w:t xml:space="preserve"> = {50, 40, 30, 20, 10};</w:t>
+      </w:r>
+      <w:r>
+        <w:rPr>
+          <w:lang w:val="en-AT"/>
+        </w:rPr>
+        <w:br/>
+      </w:r>
+      <w:r>
+        <w:rPr>
+          <w:lang w:val="en-AT"/>
+        </w:rPr>
+        <w:br/>
+        <w:t xml:space="preserve">    for (int </w:t>
+      </w:r>
+      <w:proofErr w:type="spellStart"/>
+      <w:r>
+        <w:rPr>
+          <w:lang w:val="en-AT"/>
+        </w:rPr>
+        <w:t>i</w:t>
+      </w:r>
+      <w:proofErr w:type="spellEnd"/>
+      <w:r>
+        <w:rPr>
+          <w:lang w:val="en-AT"/>
+        </w:rPr>
+        <w:t xml:space="preserve"> = 0; </w:t>
+      </w:r>
+      <w:proofErr w:type="spellStart"/>
+      <w:r>
+        <w:rPr>
+          <w:lang w:val="en-AT"/>
+        </w:rPr>
+        <w:t>i</w:t>
+      </w:r>
+      <w:proofErr w:type="spellEnd"/>
+      <w:r>
+        <w:rPr>
+          <w:lang w:val="en-AT"/>
+        </w:rPr>
+        <w:t xml:space="preserve"> &lt; </w:t>
+      </w:r>
+      <w:proofErr w:type="spellStart"/>
+      <w:r>
+        <w:rPr>
+          <w:lang w:val="en-AT"/>
+        </w:rPr>
+        <w:t>expectedArray.length</w:t>
+      </w:r>
+      <w:proofErr w:type="spellEnd"/>
+      <w:r>
+        <w:rPr>
+          <w:lang w:val="en-AT"/>
+        </w:rPr>
+        <w:t xml:space="preserve">; </w:t>
+      </w:r>
+      <w:proofErr w:type="spellStart"/>
+      <w:r>
+        <w:rPr>
+          <w:lang w:val="en-AT"/>
+        </w:rPr>
+        <w:t>i</w:t>
+      </w:r>
+      <w:proofErr w:type="spellEnd"/>
+      <w:r>
+        <w:rPr>
+          <w:lang w:val="en-AT"/>
+        </w:rPr>
+        <w:t>++)</w:t>
       </w:r>
       <w:r>
         <w:rPr>
@@ -4674,7 +5818,63 @@
           <w:lang w:val="en-AT"/>
         </w:rPr>
         <w:br/>
-        <w:t xml:space="preserve">        assert(reversedArray[i] == expectedArray[i]);</w:t>
+        <w:t xml:space="preserve">        assert(</w:t>
+      </w:r>
+      <w:proofErr w:type="spellStart"/>
+      <w:r>
+        <w:rPr>
+          <w:lang w:val="en-AT"/>
+        </w:rPr>
+        <w:t>reversedArray</w:t>
+      </w:r>
+      <w:proofErr w:type="spellEnd"/>
+      <w:r>
+        <w:rPr>
+          <w:lang w:val="en-AT"/>
+        </w:rPr>
+        <w:t>[</w:t>
+      </w:r>
+      <w:proofErr w:type="spellStart"/>
+      <w:r>
+        <w:rPr>
+          <w:lang w:val="en-AT"/>
+        </w:rPr>
+        <w:t>i</w:t>
+      </w:r>
+      <w:proofErr w:type="spellEnd"/>
+      <w:r>
+        <w:rPr>
+          <w:lang w:val="en-AT"/>
+        </w:rPr>
+        <w:t xml:space="preserve">] == </w:t>
+      </w:r>
+      <w:proofErr w:type="spellStart"/>
+      <w:r>
+        <w:rPr>
+          <w:lang w:val="en-AT"/>
+        </w:rPr>
+        <w:t>expectedArray</w:t>
+      </w:r>
+      <w:proofErr w:type="spellEnd"/>
+      <w:r>
+        <w:rPr>
+          <w:lang w:val="en-AT"/>
+        </w:rPr>
+        <w:t>[</w:t>
+      </w:r>
+      <w:proofErr w:type="spellStart"/>
+      <w:r>
+        <w:rPr>
+          <w:lang w:val="en-AT"/>
+        </w:rPr>
+        <w:t>i</w:t>
+      </w:r>
+      <w:proofErr w:type="spellEnd"/>
+      <w:r>
+        <w:rPr>
+          <w:lang w:val="en-AT"/>
+        </w:rPr>
+        <w:t>]);</w:t>
       </w:r>
       <w:r>
         <w:rPr>
@@ -4727,7 +5927,15 @@
         <w:pStyle w:val="Pseoudocode"/>
       </w:pPr>
       <w:r>
-        <w:t>=== Array Reversal ===</w:t>
+        <w:t xml:space="preserve">=== </w:t>
+      </w:r>
+      <w:proofErr w:type="spellStart"/>
+      <w:r>
+        <w:t>Array</w:t>
+      </w:r>
+      <w:proofErr w:type="spellEnd"/>
+      <w:r>
+        <w:t xml:space="preserve"> Reversal ===</w:t>
       </w:r>
     </w:p>
     <w:p>
@@ -4735,15 +5943,36 @@
         <w:pStyle w:val="Pseoudocode"/>
       </w:pPr>
       <w:r>
-        <w:t>Original Array: [10, 20, 30, 40, 50]</w:t>
+        <w:t xml:space="preserve">Original </w:t>
+      </w:r>
+      <w:proofErr w:type="spellStart"/>
+      <w:r>
+        <w:t>Array</w:t>
+      </w:r>
+      <w:proofErr w:type="spellEnd"/>
+      <w:r>
+        <w:t>: [10, 20, 30, 40, 50]</w:t>
       </w:r>
     </w:p>
     <w:p>
       <w:pPr>
         <w:pStyle w:val="Pseoudocode"/>
       </w:pPr>
-      <w:r>
-        <w:t>Reversed Array: [50, 40, 30, 20, 10]</w:t>
+      <w:proofErr w:type="spellStart"/>
+      <w:r>
+        <w:t>Reversed</w:t>
+      </w:r>
+      <w:proofErr w:type="spellEnd"/>
+      <w:r>
+        <w:t xml:space="preserve"> </w:t>
+      </w:r>
+      <w:proofErr w:type="spellStart"/>
+      <w:r>
+        <w:t>Array</w:t>
+      </w:r>
+      <w:proofErr w:type="spellEnd"/>
+      <w:r>
+        <w:t>: [50, 40, 30, 20, 10]</w:t>
       </w:r>
     </w:p>
     <w:p>
@@ -5020,14 +6249,84 @@
         <w:rPr>
           <w:lang w:val="en-AT"/>
         </w:rPr>
-        <w:t>public record FuzzySearchResult(boolean foundExactMatch, int bestMatchIndex, int bestMatchValue)</w:t>
-      </w:r>
+        <w:t xml:space="preserve">public record </w:t>
+      </w:r>
+      <w:proofErr w:type="spellStart"/>
+      <w:r>
+        <w:rPr>
+          <w:lang w:val="en-AT"/>
+        </w:rPr>
+        <w:t>FuzzySearchResult</w:t>
+      </w:r>
+      <w:proofErr w:type="spellEnd"/>
+      <w:r>
+        <w:rPr>
+          <w:lang w:val="en-AT"/>
+        </w:rPr>
+        <w:t>(</w:t>
+      </w:r>
+      <w:proofErr w:type="spellStart"/>
+      <w:r>
+        <w:rPr>
+          <w:lang w:val="en-AT"/>
+        </w:rPr>
+        <w:t>boolean</w:t>
+      </w:r>
+      <w:proofErr w:type="spellEnd"/>
       <w:r>
         <w:rPr>
           <w:lang w:val="en-AT"/>
         </w:rPr>
         <w:t xml:space="preserve"> </w:t>
       </w:r>
+      <w:proofErr w:type="spellStart"/>
+      <w:r>
+        <w:rPr>
+          <w:lang w:val="en-AT"/>
+        </w:rPr>
+        <w:t>foundExactMatch</w:t>
+      </w:r>
+      <w:proofErr w:type="spellEnd"/>
+      <w:r>
+        <w:rPr>
+          <w:lang w:val="en-AT"/>
+        </w:rPr>
+        <w:t xml:space="preserve">, int </w:t>
+      </w:r>
+      <w:proofErr w:type="spellStart"/>
+      <w:r>
+        <w:rPr>
+          <w:lang w:val="en-AT"/>
+        </w:rPr>
+        <w:t>bestMatchIndex</w:t>
+      </w:r>
+      <w:proofErr w:type="spellEnd"/>
+      <w:r>
+        <w:rPr>
+          <w:lang w:val="en-AT"/>
+        </w:rPr>
+        <w:t xml:space="preserve">, int </w:t>
+      </w:r>
+      <w:proofErr w:type="spellStart"/>
+      <w:r>
+        <w:rPr>
+          <w:lang w:val="en-AT"/>
+        </w:rPr>
+        <w:t>bestMatchValue</w:t>
+      </w:r>
+      <w:proofErr w:type="spellEnd"/>
+      <w:r>
+        <w:rPr>
+          <w:lang w:val="en-AT"/>
+        </w:rPr>
+        <w:t>)</w:t>
+      </w:r>
+      <w:r>
+        <w:rPr>
+          <w:lang w:val="en-AT"/>
+        </w:rPr>
+        <w:t xml:space="preserve"> </w:t>
+      </w:r>
       <w:r>
         <w:rPr>
           <w:lang w:val="en-AT"/>
@@ -5084,7 +6383,23 @@
         <w:pStyle w:val="Pseoudocode"/>
       </w:pPr>
       <w:r>
-        <w:t>private FuzzySearchResult fuzzySearch(int target, int[] array)</w:t>
+        <w:t xml:space="preserve">private </w:t>
+      </w:r>
+      <w:proofErr w:type="spellStart"/>
+      <w:r>
+        <w:t>FuzzySearchResult</w:t>
+      </w:r>
+      <w:proofErr w:type="spellEnd"/>
+      <w:r>
+        <w:t xml:space="preserve"> </w:t>
+      </w:r>
+      <w:proofErr w:type="spellStart"/>
+      <w:r>
+        <w:t>fuzzySearch</w:t>
+      </w:r>
+      <w:proofErr w:type="spellEnd"/>
+      <w:r>
+        <w:t>(int target, int[] array)</w:t>
       </w:r>
       <w:r>
         <w:br/>
@@ -5092,7 +6407,11 @@
       </w:r>
       <w:r>
         <w:br/>
-        <w:t xml:space="preserve">    int difference = Integer.</w:t>
+        <w:t xml:space="preserve">    int difference = </w:t>
+      </w:r>
+      <w:proofErr w:type="spellStart"/>
+      <w:r>
+        <w:t>Integer.</w:t>
       </w:r>
       <w:r>
         <w:rPr>
@@ -5101,19 +6420,60 @@
         </w:rPr>
         <w:t>MAX_VALUE</w:t>
       </w:r>
+      <w:proofErr w:type="spellEnd"/>
       <w:r>
         <w:t>;</w:t>
       </w:r>
       <w:r>
         <w:br/>
-        <w:t xml:space="preserve">    int closestIndex = -1;</w:t>
-      </w:r>
-      <w:r>
-        <w:br/>
-      </w:r>
-      <w:r>
-        <w:br/>
-        <w:t xml:space="preserve">    for (int i = 0; i &lt; array.length; i++)</w:t>
+        <w:t xml:space="preserve">    int </w:t>
+      </w:r>
+      <w:proofErr w:type="spellStart"/>
+      <w:r>
+        <w:t>closestIndex</w:t>
+      </w:r>
+      <w:proofErr w:type="spellEnd"/>
+      <w:r>
+        <w:t xml:space="preserve"> = -1;</w:t>
+      </w:r>
+      <w:r>
+        <w:br/>
+      </w:r>
+      <w:r>
+        <w:br/>
+        <w:t xml:space="preserve">    for (int </w:t>
+      </w:r>
+      <w:proofErr w:type="spellStart"/>
+      <w:r>
+        <w:t>i</w:t>
+      </w:r>
+      <w:proofErr w:type="spellEnd"/>
+      <w:r>
+        <w:t xml:space="preserve"> = 0; </w:t>
+      </w:r>
+      <w:proofErr w:type="spellStart"/>
+      <w:r>
+        <w:t>i</w:t>
+      </w:r>
+      <w:proofErr w:type="spellEnd"/>
+      <w:r>
+        <w:t xml:space="preserve"> &lt; </w:t>
+      </w:r>
+      <w:proofErr w:type="spellStart"/>
+      <w:r>
+        <w:t>array.length</w:t>
+      </w:r>
+      <w:proofErr w:type="spellEnd"/>
+      <w:r>
+        <w:t xml:space="preserve">; </w:t>
+      </w:r>
+      <w:proofErr w:type="spellStart"/>
+      <w:r>
+        <w:t>i</w:t>
+      </w:r>
+      <w:proofErr w:type="spellEnd"/>
+      <w:r>
+        <w:t>++)</w:t>
       </w:r>
       <w:r>
         <w:br/>
@@ -5121,7 +6481,15 @@
       </w:r>
       <w:r>
         <w:br/>
-        <w:t xml:space="preserve">       if (array[i] == target)</w:t>
+        <w:t xml:space="preserve">       if (array[</w:t>
+      </w:r>
+      <w:proofErr w:type="spellStart"/>
+      <w:r>
+        <w:t>i</w:t>
+      </w:r>
+      <w:proofErr w:type="spellEnd"/>
+      <w:r>
+        <w:t>] == target)</w:t>
       </w:r>
       <w:r>
         <w:br/>
@@ -5129,7 +6497,31 @@
       </w:r>
       <w:r>
         <w:br/>
-        <w:t xml:space="preserve">           return new FuzzySearchResult(true, i, array[i]);</w:t>
+        <w:t xml:space="preserve">           return new </w:t>
+      </w:r>
+      <w:proofErr w:type="spellStart"/>
+      <w:r>
+        <w:t>FuzzySearchResult</w:t>
+      </w:r>
+      <w:proofErr w:type="spellEnd"/>
+      <w:r>
+        <w:t xml:space="preserve">(true, </w:t>
+      </w:r>
+      <w:proofErr w:type="spellStart"/>
+      <w:r>
+        <w:t>i</w:t>
+      </w:r>
+      <w:proofErr w:type="spellEnd"/>
+      <w:r>
+        <w:t>, array[</w:t>
+      </w:r>
+      <w:proofErr w:type="spellStart"/>
+      <w:r>
+        <w:t>i</w:t>
+      </w:r>
+      <w:proofErr w:type="spellEnd"/>
+      <w:r>
+        <w:t>]);</w:t>
       </w:r>
       <w:r>
         <w:br/>
@@ -5140,7 +6532,19 @@
       </w:r>
       <w:r>
         <w:br/>
-        <w:t xml:space="preserve">       int currentDifference = Math.</w:t>
+        <w:t xml:space="preserve">       int </w:t>
+      </w:r>
+      <w:proofErr w:type="spellStart"/>
+      <w:r>
+        <w:t>currentDifference</w:t>
+      </w:r>
+      <w:proofErr w:type="spellEnd"/>
+      <w:r>
+        <w:t xml:space="preserve"> = </w:t>
+      </w:r>
+      <w:proofErr w:type="spellStart"/>
+      <w:r>
+        <w:t>Math.</w:t>
       </w:r>
       <w:r>
         <w:rPr>
@@ -5149,15 +6553,32 @@
         </w:rPr>
         <w:t>abs</w:t>
       </w:r>
-      <w:r>
-        <w:t>(array[i] - target);</w:t>
-      </w:r>
-      <w:r>
-        <w:br/>
-      </w:r>
-      <w:r>
-        <w:br/>
-        <w:t xml:space="preserve">       if (currentDifference &lt; difference)</w:t>
+      <w:proofErr w:type="spellEnd"/>
+      <w:r>
+        <w:t>(array[</w:t>
+      </w:r>
+      <w:proofErr w:type="spellStart"/>
+      <w:r>
+        <w:t>i</w:t>
+      </w:r>
+      <w:proofErr w:type="spellEnd"/>
+      <w:r>
+        <w:t>] - target);</w:t>
+      </w:r>
+      <w:r>
+        <w:br/>
+      </w:r>
+      <w:r>
+        <w:br/>
+        <w:t xml:space="preserve">       if (</w:t>
+      </w:r>
+      <w:proofErr w:type="spellStart"/>
+      <w:r>
+        <w:t>currentDifference</w:t>
+      </w:r>
+      <w:proofErr w:type="spellEnd"/>
+      <w:r>
+        <w:t xml:space="preserve"> &lt; difference)</w:t>
       </w:r>
       <w:r>
         <w:br/>
@@ -5165,11 +6586,35 @@
       </w:r>
       <w:r>
         <w:br/>
-        <w:t xml:space="preserve">           difference = currentDifference;</w:t>
-      </w:r>
-      <w:r>
-        <w:br/>
-        <w:t xml:space="preserve">           closestIndex = i;</w:t>
+        <w:t xml:space="preserve">           difference = </w:t>
+      </w:r>
+      <w:proofErr w:type="spellStart"/>
+      <w:r>
+        <w:t>currentDifference</w:t>
+      </w:r>
+      <w:proofErr w:type="spellEnd"/>
+      <w:r>
+        <w:t>;</w:t>
+      </w:r>
+      <w:r>
+        <w:br/>
+        <w:t xml:space="preserve">           </w:t>
+      </w:r>
+      <w:proofErr w:type="spellStart"/>
+      <w:r>
+        <w:t>closestIndex</w:t>
+      </w:r>
+      <w:proofErr w:type="spellEnd"/>
+      <w:r>
+        <w:t xml:space="preserve"> = </w:t>
+      </w:r>
+      <w:proofErr w:type="spellStart"/>
+      <w:r>
+        <w:t>i</w:t>
+      </w:r>
+      <w:proofErr w:type="spellEnd"/>
+      <w:r>
+        <w:t>;</w:t>
       </w:r>
       <w:r>
         <w:br/>
@@ -5184,11 +6629,35 @@
       </w:r>
       <w:r>
         <w:br/>
-        <w:t xml:space="preserve">    return new FuzzySearchResult(false, closestIndex, </w:t>
+        <w:t xml:space="preserve">    return new </w:t>
+      </w:r>
+      <w:proofErr w:type="spellStart"/>
+      <w:r>
+        <w:t>FuzzySearchResult</w:t>
+      </w:r>
+      <w:proofErr w:type="spellEnd"/>
+      <w:r>
+        <w:t xml:space="preserve">(false, </w:t>
+      </w:r>
+      <w:proofErr w:type="spellStart"/>
+      <w:r>
+        <w:t>closestIndex</w:t>
+      </w:r>
+      <w:proofErr w:type="spellEnd"/>
+      <w:r>
+        <w:t xml:space="preserve">, </w:t>
       </w:r>
       <w:r>
         <w:lastRenderedPageBreak/>
-        <w:t>array[closestIndex]);</w:t>
+        <w:t>array[</w:t>
+      </w:r>
+      <w:proofErr w:type="spellStart"/>
+      <w:r>
+        <w:t>closestIndex</w:t>
+      </w:r>
+      <w:proofErr w:type="spellEnd"/>
+      <w:r>
+        <w:t>]);</w:t>
       </w:r>
       <w:r>
         <w:br/>
@@ -5245,7 +6714,15 @@
       </w:r>
       <w:r>
         <w:br/>
-        <w:t>void testFuzzySearchNoMatchExists()</w:t>
+        <w:t xml:space="preserve">void </w:t>
+      </w:r>
+      <w:proofErr w:type="spellStart"/>
+      <w:r>
+        <w:t>testFuzzySearchNoMatchExists</w:t>
+      </w:r>
+      <w:proofErr w:type="spellEnd"/>
+      <w:r>
+        <w:t>()</w:t>
       </w:r>
       <w:r>
         <w:br/>
@@ -5253,34 +6730,51 @@
       </w:r>
       <w:r>
         <w:br/>
-        <w:t xml:space="preserve">    int[] testArray = {15, 8, 23, 4, 42, 11, 19};</w:t>
-      </w:r>
-      <w:r>
-        <w:br/>
-        <w:t xml:space="preserve">    int targetValue = 20;</w:t>
-      </w:r>
-      <w:r>
-        <w:br/>
-        <w:t xml:space="preserve">    int expectedClosestValue = 19;</w:t>
-      </w:r>
-      <w:r>
-        <w:br/>
-        <w:t xml:space="preserve">    int expectedClosestIndex = 6;</w:t>
-      </w:r>
-      <w:r>
-        <w:br/>
-      </w:r>
-      <w:r>
-        <w:br/>
-        <w:t xml:space="preserve">    FuzzySearchExercise fuzzySearchExercise = new FuzzySearchExercise(testArray, targetValue);</w:t>
-      </w:r>
-      <w:r>
-        <w:br/>
-        <w:t xml:space="preserve">    fuzzySearchExercise.runExcercise();</w:t>
-      </w:r>
-      <w:r>
-        <w:br/>
-        <w:t xml:space="preserve">    fuzzySearchExercise.displayOutput();</w:t>
+        <w:t xml:space="preserve">    int[] </w:t>
+      </w:r>
+      <w:proofErr w:type="spellStart"/>
+      <w:r>
+        <w:t>testArray</w:t>
+      </w:r>
+      <w:proofErr w:type="spellEnd"/>
+      <w:r>
+        <w:t xml:space="preserve"> = {15, 8, 23, 4, 42, 11, 19};</w:t>
+      </w:r>
+      <w:r>
+        <w:br/>
+        <w:t xml:space="preserve">    int </w:t>
+      </w:r>
+      <w:proofErr w:type="spellStart"/>
+      <w:r>
+        <w:t>targetValue</w:t>
+      </w:r>
+      <w:proofErr w:type="spellEnd"/>
+      <w:r>
+        <w:t xml:space="preserve"> = 20;</w:t>
+      </w:r>
+      <w:r>
+        <w:br/>
+        <w:t xml:space="preserve">    int </w:t>
+      </w:r>
+      <w:proofErr w:type="spellStart"/>
+      <w:r>
+        <w:t>expectedClosestValue</w:t>
+      </w:r>
+      <w:proofErr w:type="spellEnd"/>
+      <w:r>
+        <w:t xml:space="preserve"> = 19;</w:t>
+      </w:r>
+      <w:r>
+        <w:br/>
+        <w:t xml:space="preserve">    int </w:t>
+      </w:r>
+      <w:proofErr w:type="spellStart"/>
+      <w:r>
+        <w:t>expectedClosestIndex</w:t>
+      </w:r>
+      <w:proofErr w:type="spellEnd"/>
+      <w:r>
+        <w:t xml:space="preserve"> = 6;</w:t>
       </w:r>
       <w:r>
         <w:br/>
@@ -5289,6 +6783,78 @@
         <w:br/>
         <w:t xml:space="preserve">    </w:t>
       </w:r>
+      <w:proofErr w:type="spellStart"/>
+      <w:r>
+        <w:t>FuzzySearchExercise</w:t>
+      </w:r>
+      <w:proofErr w:type="spellEnd"/>
+      <w:r>
+        <w:t xml:space="preserve"> </w:t>
+      </w:r>
+      <w:proofErr w:type="spellStart"/>
+      <w:r>
+        <w:t>fuzzySearchExercise</w:t>
+      </w:r>
+      <w:proofErr w:type="spellEnd"/>
+      <w:r>
+        <w:t xml:space="preserve"> = new </w:t>
+      </w:r>
+      <w:proofErr w:type="spellStart"/>
+      <w:r>
+        <w:t>FuzzySearchExercise</w:t>
+      </w:r>
+      <w:proofErr w:type="spellEnd"/>
+      <w:r>
+        <w:t>(</w:t>
+      </w:r>
+      <w:proofErr w:type="spellStart"/>
+      <w:r>
+        <w:t>testArray</w:t>
+      </w:r>
+      <w:proofErr w:type="spellEnd"/>
+      <w:r>
+        <w:t xml:space="preserve">, </w:t>
+      </w:r>
+      <w:proofErr w:type="spellStart"/>
+      <w:r>
+        <w:t>targetValue</w:t>
+      </w:r>
+      <w:proofErr w:type="spellEnd"/>
+      <w:r>
+        <w:t>);</w:t>
+      </w:r>
+      <w:r>
+        <w:br/>
+        <w:t xml:space="preserve">    </w:t>
+      </w:r>
+      <w:proofErr w:type="spellStart"/>
+      <w:r>
+        <w:t>fuzzySearchExercise.runExcercise</w:t>
+      </w:r>
+      <w:proofErr w:type="spellEnd"/>
+      <w:r>
+        <w:t>();</w:t>
+      </w:r>
+      <w:r>
+        <w:br/>
+        <w:t xml:space="preserve">    </w:t>
+      </w:r>
+      <w:proofErr w:type="spellStart"/>
+      <w:r>
+        <w:t>fuzzySearchExercise.displayOutput</w:t>
+      </w:r>
+      <w:proofErr w:type="spellEnd"/>
+      <w:r>
+        <w:t>();</w:t>
+      </w:r>
+      <w:r>
+        <w:br/>
+      </w:r>
+      <w:r>
+        <w:br/>
+        <w:t xml:space="preserve">    </w:t>
+      </w:r>
+      <w:proofErr w:type="spellStart"/>
       <w:r>
         <w:rPr>
           <w:i/>
@@ -5296,8 +6862,33 @@
         </w:rPr>
         <w:t>assertEquals</w:t>
       </w:r>
-      <w:r>
-        <w:t>(expectedClosestValue, fuzzySearchExercise.getFuzzySearchResult().bestMatchValue());</w:t>
+      <w:proofErr w:type="spellEnd"/>
+      <w:r>
+        <w:t>(</w:t>
+      </w:r>
+      <w:proofErr w:type="spellStart"/>
+      <w:r>
+        <w:t>expectedClosestValue</w:t>
+      </w:r>
+      <w:proofErr w:type="spellEnd"/>
+      <w:r>
+        <w:t xml:space="preserve">, </w:t>
+      </w:r>
+      <w:proofErr w:type="spellStart"/>
+      <w:r>
+        <w:t>fuzzySearchExercise.getFuzzySearchResult</w:t>
+      </w:r>
+      <w:proofErr w:type="spellEnd"/>
+      <w:r>
+        <w:t>().</w:t>
+      </w:r>
+      <w:proofErr w:type="spellStart"/>
+      <w:r>
+        <w:t>bestMatchValue</w:t>
+      </w:r>
+      <w:proofErr w:type="spellEnd"/>
+      <w:r>
+        <w:t>());</w:t>
       </w:r>
       <w:r>
         <w:br/>
@@ -5317,6 +6908,7 @@
         <w:br/>
         <w:t xml:space="preserve">    </w:t>
       </w:r>
+      <w:proofErr w:type="spellStart"/>
       <w:r>
         <w:rPr>
           <w:i/>
@@ -5324,8 +6916,33 @@
         </w:rPr>
         <w:t>assertEquals</w:t>
       </w:r>
-      <w:r>
-        <w:t>(expectedClosestIndex, fuzzySearchExercise.getFuzzySearchResult().bestMatchIndex());</w:t>
+      <w:proofErr w:type="spellEnd"/>
+      <w:r>
+        <w:t>(</w:t>
+      </w:r>
+      <w:proofErr w:type="spellStart"/>
+      <w:r>
+        <w:t>expectedClosestIndex</w:t>
+      </w:r>
+      <w:proofErr w:type="spellEnd"/>
+      <w:r>
+        <w:t xml:space="preserve">, </w:t>
+      </w:r>
+      <w:proofErr w:type="spellStart"/>
+      <w:r>
+        <w:t>fuzzySearchExercise.getFuzzySearchResult</w:t>
+      </w:r>
+      <w:proofErr w:type="spellEnd"/>
+      <w:r>
+        <w:t>().</w:t>
+      </w:r>
+      <w:proofErr w:type="spellStart"/>
+      <w:r>
+        <w:t>bestMatchIndex</w:t>
+      </w:r>
+      <w:proofErr w:type="spellEnd"/>
+      <w:r>
+        <w:t>());</w:t>
       </w:r>
       <w:r>
         <w:br/>
@@ -5407,8 +7024,13 @@
       <w:pPr>
         <w:pStyle w:val="Pseoudocode"/>
       </w:pPr>
-      <w:r>
-        <w:t>Difference: 1</w:t>
+      <w:proofErr w:type="spellStart"/>
+      <w:r>
+        <w:t>Difference</w:t>
+      </w:r>
+      <w:proofErr w:type="spellEnd"/>
+      <w:r>
+        <w:t>: 1</w:t>
       </w:r>
     </w:p>
     <w:p>
@@ -5647,7 +7269,15 @@
     </w:p>
     <w:p>
       <w:r>
-        <w:t>One way to do this is to create a new array with the combined length of both arrays, loop through the first array and copy the values, save the index, then do the same with the second array. I just used System.arraycopy() instead.</w:t>
+        <w:t xml:space="preserve">One way to do this is to create a new array with the combined length of both arrays, loop through the first array and copy the values, save the index, then do the same with the second array. I just used </w:t>
+      </w:r>
+      <w:proofErr w:type="spellStart"/>
+      <w:r>
+        <w:t>System.arraycopy</w:t>
+      </w:r>
+      <w:proofErr w:type="spellEnd"/>
+      <w:r>
+        <w:t>() instead.</w:t>
       </w:r>
     </w:p>
     <w:p>
@@ -5665,7 +7295,15 @@
         <w:pStyle w:val="Pseoudocode"/>
       </w:pPr>
       <w:r>
-        <w:t>private int[] mergeArrays(int[] array1, int[] array2)</w:t>
+        <w:t xml:space="preserve">private int[] </w:t>
+      </w:r>
+      <w:proofErr w:type="spellStart"/>
+      <w:r>
+        <w:t>mergeArrays</w:t>
+      </w:r>
+      <w:proofErr w:type="spellEnd"/>
+      <w:r>
+        <w:t>(int[] array1, int[] array2)</w:t>
       </w:r>
       <w:r>
         <w:br/>
@@ -5681,14 +7319,26 @@
       </w:r>
       <w:r>
         <w:br/>
-        <w:t xml:space="preserve">    int[] mergedArray = new int[length1 + length2];</w:t>
-      </w:r>
-      <w:r>
-        <w:br/>
-      </w:r>
-      <w:r>
-        <w:br/>
-        <w:t xml:space="preserve">    System.</w:t>
+        <w:t xml:space="preserve">    int[] </w:t>
+      </w:r>
+      <w:proofErr w:type="spellStart"/>
+      <w:r>
+        <w:t>mergedArray</w:t>
+      </w:r>
+      <w:proofErr w:type="spellEnd"/>
+      <w:r>
+        <w:t xml:space="preserve"> = new int[length1 + length2];</w:t>
+      </w:r>
+      <w:r>
+        <w:br/>
+      </w:r>
+      <w:r>
+        <w:br/>
+        <w:t xml:space="preserve">    </w:t>
+      </w:r>
+      <w:proofErr w:type="spellStart"/>
+      <w:r>
+        <w:t>System.</w:t>
       </w:r>
       <w:r>
         <w:rPr>
@@ -5697,12 +7347,25 @@
         </w:rPr>
         <w:t>arraycopy</w:t>
       </w:r>
-      <w:r>
-        <w:t>(array1, 0, mergedArray, 0, length1);</w:t>
-      </w:r>
-      <w:r>
-        <w:br/>
-        <w:t xml:space="preserve">    System.</w:t>
+      <w:proofErr w:type="spellEnd"/>
+      <w:r>
+        <w:t xml:space="preserve">(array1, 0, </w:t>
+      </w:r>
+      <w:proofErr w:type="spellStart"/>
+      <w:r>
+        <w:t>mergedArray</w:t>
+      </w:r>
+      <w:proofErr w:type="spellEnd"/>
+      <w:r>
+        <w:t>, 0, length1);</w:t>
+      </w:r>
+      <w:r>
+        <w:br/>
+        <w:t xml:space="preserve">    </w:t>
+      </w:r>
+      <w:proofErr w:type="spellStart"/>
+      <w:r>
+        <w:t>System.</w:t>
       </w:r>
       <w:r>
         <w:rPr>
@@ -5711,15 +7374,32 @@
         </w:rPr>
         <w:t>arraycopy</w:t>
       </w:r>
-      <w:r>
-        <w:t>(array2, 0, mergedArray, length1, length2);</w:t>
-      </w:r>
-      <w:r>
-        <w:br/>
-      </w:r>
-      <w:r>
-        <w:br/>
-        <w:t xml:space="preserve">    return mergedArray;</w:t>
+      <w:proofErr w:type="spellEnd"/>
+      <w:r>
+        <w:t xml:space="preserve">(array2, 0, </w:t>
+      </w:r>
+      <w:proofErr w:type="spellStart"/>
+      <w:r>
+        <w:t>mergedArray</w:t>
+      </w:r>
+      <w:proofErr w:type="spellEnd"/>
+      <w:r>
+        <w:t>, length1, length2);</w:t>
+      </w:r>
+      <w:r>
+        <w:br/>
+      </w:r>
+      <w:r>
+        <w:br/>
+        <w:t xml:space="preserve">    return </w:t>
+      </w:r>
+      <w:proofErr w:type="spellStart"/>
+      <w:r>
+        <w:t>mergedArray</w:t>
+      </w:r>
+      <w:proofErr w:type="spellEnd"/>
+      <w:r>
+        <w:t>;</w:t>
       </w:r>
       <w:r>
         <w:br/>
@@ -5756,9 +7436,14 @@
         <w:fldChar w:fldCharType="end"/>
       </w:r>
       <w:r>
-        <w:t>: mergeArrays</w:t>
+        <w:t xml:space="preserve">: </w:t>
+      </w:r>
+      <w:proofErr w:type="spellStart"/>
+      <w:r>
+        <w:t>mergeArrays</w:t>
       </w:r>
       <w:bookmarkEnd w:id="43"/>
+      <w:proofErr w:type="spellEnd"/>
     </w:p>
     <w:p>
       <w:pPr>
@@ -5779,7 +7464,15 @@
       </w:r>
       <w:r>
         <w:br/>
-        <w:t>void testArrayMergingSmallArrays()</w:t>
+        <w:t xml:space="preserve">void </w:t>
+      </w:r>
+      <w:proofErr w:type="spellStart"/>
+      <w:r>
+        <w:t>testArrayMergingSmallArrays</w:t>
+      </w:r>
+      <w:proofErr w:type="spellEnd"/>
+      <w:r>
+        <w:t>()</w:t>
       </w:r>
       <w:r>
         <w:br/>
@@ -5795,37 +7488,102 @@
       </w:r>
       <w:r>
         <w:br/>
-        <w:t xml:space="preserve">    int[] expectedMergedArray = {10, 20, 30, 40, 50, 60, 70};</w:t>
-      </w:r>
-      <w:r>
-        <w:br/>
-      </w:r>
-      <w:r>
-        <w:br/>
-        <w:t xml:space="preserve">    ArrayMergingExercise excercise = new ArrayMergingExercise(array1, array2);</w:t>
+        <w:t xml:space="preserve">    int[] </w:t>
+      </w:r>
+      <w:proofErr w:type="spellStart"/>
+      <w:r>
+        <w:t>expectedMergedArray</w:t>
+      </w:r>
+      <w:proofErr w:type="spellEnd"/>
+      <w:r>
+        <w:t xml:space="preserve"> = {10, 20, 30, 40, 50, 60, 70};</w:t>
+      </w:r>
+      <w:r>
+        <w:br/>
+      </w:r>
+      <w:r>
+        <w:br/>
+        <w:t xml:space="preserve">    </w:t>
+      </w:r>
+      <w:proofErr w:type="spellStart"/>
+      <w:r>
+        <w:t>ArrayMergingExercise</w:t>
+      </w:r>
+      <w:proofErr w:type="spellEnd"/>
+      <w:r>
+        <w:t xml:space="preserve"> </w:t>
+      </w:r>
+      <w:proofErr w:type="spellStart"/>
+      <w:r>
+        <w:t>excercise</w:t>
+      </w:r>
+      <w:proofErr w:type="spellEnd"/>
+      <w:r>
+        <w:t xml:space="preserve"> = new </w:t>
+      </w:r>
+      <w:proofErr w:type="spellStart"/>
+      <w:r>
+        <w:t>ArrayMergingExercise</w:t>
+      </w:r>
+      <w:proofErr w:type="spellEnd"/>
+      <w:r>
+        <w:t>(array1, array2);</w:t>
       </w:r>
       <w:r>
         <w:br/>
       </w:r>
       <w:r>
         <w:lastRenderedPageBreak/>
-        <w:t xml:space="preserve">    excercise.runExercise();</w:t>
-      </w:r>
-      <w:r>
-        <w:br/>
-        <w:t xml:space="preserve">    excercise.displayOutput();</w:t>
-      </w:r>
-      <w:r>
-        <w:br/>
-        <w:t xml:space="preserve">    int[] mergedArray = excercise.getMergedArray();</w:t>
-      </w:r>
-      <w:r>
-        <w:br/>
-      </w:r>
-      <w:r>
-        <w:br/>
         <w:t xml:space="preserve">    </w:t>
       </w:r>
+      <w:proofErr w:type="spellStart"/>
+      <w:r>
+        <w:t>excercise.runExercise</w:t>
+      </w:r>
+      <w:proofErr w:type="spellEnd"/>
+      <w:r>
+        <w:t>();</w:t>
+      </w:r>
+      <w:r>
+        <w:br/>
+        <w:t xml:space="preserve">    </w:t>
+      </w:r>
+      <w:proofErr w:type="spellStart"/>
+      <w:r>
+        <w:t>excercise.displayOutput</w:t>
+      </w:r>
+      <w:proofErr w:type="spellEnd"/>
+      <w:r>
+        <w:t>();</w:t>
+      </w:r>
+      <w:r>
+        <w:br/>
+        <w:t xml:space="preserve">    int[] </w:t>
+      </w:r>
+      <w:proofErr w:type="spellStart"/>
+      <w:r>
+        <w:t>mergedArray</w:t>
+      </w:r>
+      <w:proofErr w:type="spellEnd"/>
+      <w:r>
+        <w:t xml:space="preserve"> = </w:t>
+      </w:r>
+      <w:proofErr w:type="spellStart"/>
+      <w:r>
+        <w:t>excercise.getMergedArray</w:t>
+      </w:r>
+      <w:proofErr w:type="spellEnd"/>
+      <w:r>
+        <w:t>();</w:t>
+      </w:r>
+      <w:r>
+        <w:br/>
+      </w:r>
+      <w:r>
+        <w:br/>
+        <w:t xml:space="preserve">    </w:t>
+      </w:r>
+      <w:proofErr w:type="spellStart"/>
       <w:r>
         <w:rPr>
           <w:i/>
@@ -5833,8 +7591,25 @@
         </w:rPr>
         <w:t>assertArrayEquals</w:t>
       </w:r>
-      <w:r>
-        <w:t>(expectedMergedArray, mergedArray);</w:t>
+      <w:proofErr w:type="spellEnd"/>
+      <w:r>
+        <w:t>(</w:t>
+      </w:r>
+      <w:proofErr w:type="spellStart"/>
+      <w:r>
+        <w:t>expectedMergedArray</w:t>
+      </w:r>
+      <w:proofErr w:type="spellEnd"/>
+      <w:r>
+        <w:t xml:space="preserve">, </w:t>
+      </w:r>
+      <w:proofErr w:type="spellStart"/>
+      <w:r>
+        <w:t>mergedArray</w:t>
+      </w:r>
+      <w:proofErr w:type="spellEnd"/>
+      <w:r>
+        <w:t>);</w:t>
       </w:r>
       <w:r>
         <w:br/>
@@ -5875,31 +7650,78 @@
         <w:pStyle w:val="Pseoudocode"/>
       </w:pPr>
       <w:r>
-        <w:t>=== Merging Two Arrays ===</w:t>
+        <w:t xml:space="preserve">=== </w:t>
+      </w:r>
+      <w:proofErr w:type="spellStart"/>
+      <w:r>
+        <w:t>Merging</w:t>
+      </w:r>
+      <w:proofErr w:type="spellEnd"/>
+      <w:r>
+        <w:t xml:space="preserve"> </w:t>
+      </w:r>
+      <w:proofErr w:type="spellStart"/>
+      <w:r>
+        <w:t>Two</w:t>
+      </w:r>
+      <w:proofErr w:type="spellEnd"/>
+      <w:r>
+        <w:t xml:space="preserve"> </w:t>
+      </w:r>
+      <w:proofErr w:type="spellStart"/>
+      <w:r>
+        <w:t>Arrays</w:t>
+      </w:r>
+      <w:proofErr w:type="spellEnd"/>
+      <w:r>
+        <w:t xml:space="preserve"> ===</w:t>
       </w:r>
     </w:p>
     <w:p>
       <w:pPr>
         <w:pStyle w:val="Pseoudocode"/>
       </w:pPr>
-      <w:r>
-        <w:t>Array 1: [10, 20, 30]</w:t>
+      <w:proofErr w:type="spellStart"/>
+      <w:r>
+        <w:t>Array</w:t>
+      </w:r>
+      <w:proofErr w:type="spellEnd"/>
+      <w:r>
+        <w:t xml:space="preserve"> 1: [10, 20, 30]</w:t>
       </w:r>
     </w:p>
     <w:p>
       <w:pPr>
         <w:pStyle w:val="Pseoudocode"/>
       </w:pPr>
-      <w:r>
-        <w:t>Array 2: [40, 50, 60, 70]</w:t>
+      <w:proofErr w:type="spellStart"/>
+      <w:r>
+        <w:t>Array</w:t>
+      </w:r>
+      <w:proofErr w:type="spellEnd"/>
+      <w:r>
+        <w:t xml:space="preserve"> 2: [40, 50, 60, 70]</w:t>
       </w:r>
     </w:p>
     <w:p>
       <w:pPr>
         <w:pStyle w:val="Pseoudocode"/>
       </w:pPr>
-      <w:r>
-        <w:t>Merged array: [10, 20, 30, 40, 50, 60, 70]</w:t>
+      <w:proofErr w:type="spellStart"/>
+      <w:r>
+        <w:t>Merged</w:t>
+      </w:r>
+      <w:proofErr w:type="spellEnd"/>
+      <w:r>
+        <w:t xml:space="preserve"> </w:t>
+      </w:r>
+      <w:proofErr w:type="spellStart"/>
+      <w:r>
+        <w:t>array</w:t>
+      </w:r>
+      <w:proofErr w:type="spellEnd"/>
+      <w:r>
+        <w:t>: [10, 20, 30, 40, 50, 60, 70]</w:t>
       </w:r>
     </w:p>
     <w:p>
@@ -6110,11 +7932,716 @@
         </w:drawing>
       </w:r>
     </w:p>
+    <w:p>
+      <w:pPr>
+        <w:pStyle w:val="Heading1"/>
+      </w:pPr>
+      <w:r>
+        <w:t>Exercise 5 – Unique Value and Frequency Counting</w:t>
+      </w:r>
+    </w:p>
+    <w:p>
+      <w:pPr>
+        <w:pStyle w:val="Heading2"/>
+      </w:pPr>
+      <w:r>
+        <w:t>Solution Idea</w:t>
+      </w:r>
+    </w:p>
+    <w:p>
+      <w:r>
+        <w:t xml:space="preserve">A hash map is perfect for this exercise, since we need to save a key – value pair! </w:t>
+      </w:r>
+      <w:r>
+        <w:t xml:space="preserve">The HashMap class in java has a neat method called merge that I used for this exercise. </w:t>
+      </w:r>
+      <w:r>
+        <w:t xml:space="preserve">It just adds the value to the map, if it already exists it automatically updates the value! </w:t>
+      </w:r>
+    </w:p>
+    <w:p>
+      <w:pPr>
+        <w:pStyle w:val="Heading2"/>
+      </w:pPr>
+      <w:r>
+        <w:t>Code</w:t>
+      </w:r>
+    </w:p>
+    <w:p>
+      <w:pPr>
+        <w:pStyle w:val="Pseoudocode"/>
+      </w:pPr>
+      <w:r>
+        <w:t>private HashMap&lt;</w:t>
+      </w:r>
+      <w:proofErr w:type="spellStart"/>
+      <w:r>
+        <w:t>Integer,Integer</w:t>
+      </w:r>
+      <w:proofErr w:type="spellEnd"/>
+      <w:r>
+        <w:t xml:space="preserve">&gt; </w:t>
+      </w:r>
+      <w:proofErr w:type="spellStart"/>
+      <w:r>
+        <w:t>countFrequencies</w:t>
+      </w:r>
+      <w:proofErr w:type="spellEnd"/>
+      <w:r>
+        <w:t>(int[] array)</w:t>
+      </w:r>
+      <w:r>
+        <w:br/>
+        <w:t>{</w:t>
+      </w:r>
+      <w:r>
+        <w:br/>
+      </w:r>
+      <w:r>
+        <w:lastRenderedPageBreak/>
+        <w:t xml:space="preserve">    HashMap&lt;</w:t>
+      </w:r>
+      <w:proofErr w:type="spellStart"/>
+      <w:r>
+        <w:t>Integer,Integer</w:t>
+      </w:r>
+      <w:proofErr w:type="spellEnd"/>
+      <w:r>
+        <w:t xml:space="preserve">&gt; </w:t>
+      </w:r>
+      <w:proofErr w:type="spellStart"/>
+      <w:r>
+        <w:t>frequencyHashMap</w:t>
+      </w:r>
+      <w:proofErr w:type="spellEnd"/>
+      <w:r>
+        <w:t xml:space="preserve"> = new HashMap&lt;&gt;();</w:t>
+      </w:r>
+      <w:r>
+        <w:br/>
+      </w:r>
+      <w:r>
+        <w:br/>
+        <w:t xml:space="preserve">    for (int value : array)</w:t>
+      </w:r>
+      <w:r>
+        <w:br/>
+        <w:t xml:space="preserve">    {</w:t>
+      </w:r>
+      <w:r>
+        <w:br/>
+        <w:t xml:space="preserve">        </w:t>
+      </w:r>
+      <w:proofErr w:type="spellStart"/>
+      <w:r>
+        <w:t>frequencyHashMap.merge</w:t>
+      </w:r>
+      <w:proofErr w:type="spellEnd"/>
+      <w:r>
+        <w:t>(value, 1, Integer::</w:t>
+      </w:r>
+      <w:r>
+        <w:rPr>
+          <w:i/>
+          <w:iCs/>
+        </w:rPr>
+        <w:t>sum</w:t>
+      </w:r>
+      <w:r>
+        <w:t>);</w:t>
+      </w:r>
+      <w:r>
+        <w:br/>
+        <w:t xml:space="preserve">    }</w:t>
+      </w:r>
+      <w:r>
+        <w:br/>
+        <w:t xml:space="preserve">    return </w:t>
+      </w:r>
+      <w:proofErr w:type="spellStart"/>
+      <w:r>
+        <w:t>frequencyHashMap</w:t>
+      </w:r>
+      <w:proofErr w:type="spellEnd"/>
+      <w:r>
+        <w:t>;</w:t>
+      </w:r>
+      <w:r>
+        <w:br/>
+        <w:t>}</w:t>
+      </w:r>
+    </w:p>
+    <w:p>
+      <w:pPr>
+        <w:pStyle w:val="Caption"/>
+        <w:rPr>
+          <w:lang w:val="en-AT"/>
+        </w:rPr>
+      </w:pPr>
+      <w:r>
+        <w:t xml:space="preserve">Figure </w:t>
+      </w:r>
+      <w:r>
+        <w:fldChar w:fldCharType="begin"/>
+      </w:r>
+      <w:r>
+        <w:instrText xml:space="preserve"> SEQ Figure \* ARABIC </w:instrText>
+      </w:r>
+      <w:r>
+        <w:fldChar w:fldCharType="separate"/>
+      </w:r>
+      <w:r>
+        <w:rPr>
+          <w:noProof/>
+        </w:rPr>
+        <w:t>20</w:t>
+      </w:r>
+      <w:r>
+        <w:fldChar w:fldCharType="end"/>
+      </w:r>
+      <w:r>
+        <w:t xml:space="preserve">: </w:t>
+      </w:r>
+      <w:proofErr w:type="spellStart"/>
+      <w:r>
+        <w:t>countFrequencies</w:t>
+      </w:r>
+      <w:proofErr w:type="spellEnd"/>
+    </w:p>
+    <w:p>
+      <w:pPr>
+        <w:pStyle w:val="Heading2"/>
+      </w:pPr>
+      <w:r>
+        <w:t>Test</w:t>
+      </w:r>
+    </w:p>
+    <w:p>
+      <w:pPr>
+        <w:pStyle w:val="Pseoudocode"/>
+      </w:pPr>
+      <w:r>
+        <w:t>@Test</w:t>
+      </w:r>
+      <w:r>
+        <w:br/>
+        <w:t xml:space="preserve">void </w:t>
+      </w:r>
+      <w:proofErr w:type="spellStart"/>
+      <w:r>
+        <w:t>testUniqueValueAndFrequencyCounting</w:t>
+      </w:r>
+      <w:proofErr w:type="spellEnd"/>
+      <w:r>
+        <w:t>()</w:t>
+      </w:r>
+      <w:r>
+        <w:br/>
+        <w:t>{</w:t>
+      </w:r>
+      <w:r>
+        <w:br/>
+        <w:t xml:space="preserve">    int[] </w:t>
+      </w:r>
+      <w:proofErr w:type="spellStart"/>
+      <w:r>
+        <w:t>testArray</w:t>
+      </w:r>
+      <w:proofErr w:type="spellEnd"/>
+      <w:r>
+        <w:t xml:space="preserve"> = {5, 2, 8, 2, 5, 5, 1, 8};</w:t>
+      </w:r>
+      <w:r>
+        <w:br/>
+      </w:r>
+      <w:r>
+        <w:br/>
+        <w:t xml:space="preserve">    HashMap&lt;Integer, Integer&gt; </w:t>
+      </w:r>
+      <w:proofErr w:type="spellStart"/>
+      <w:r>
+        <w:t>expectedFrequency</w:t>
+      </w:r>
+      <w:proofErr w:type="spellEnd"/>
+      <w:r>
+        <w:t xml:space="preserve"> = new HashMap&lt;&gt;();</w:t>
+      </w:r>
+      <w:r>
+        <w:br/>
+      </w:r>
+      <w:r>
+        <w:br/>
+        <w:t xml:space="preserve">    </w:t>
+      </w:r>
+      <w:proofErr w:type="spellStart"/>
+      <w:r>
+        <w:t>expectedFrequency.put</w:t>
+      </w:r>
+      <w:proofErr w:type="spellEnd"/>
+      <w:r>
+        <w:t>(5, 3);</w:t>
+      </w:r>
+      <w:r>
+        <w:br/>
+        <w:t xml:space="preserve">    </w:t>
+      </w:r>
+      <w:proofErr w:type="spellStart"/>
+      <w:r>
+        <w:t>expectedFrequency.put</w:t>
+      </w:r>
+      <w:proofErr w:type="spellEnd"/>
+      <w:r>
+        <w:t>(2, 2);</w:t>
+      </w:r>
+      <w:r>
+        <w:br/>
+        <w:t xml:space="preserve">    </w:t>
+      </w:r>
+      <w:proofErr w:type="spellStart"/>
+      <w:r>
+        <w:t>expectedFrequency.put</w:t>
+      </w:r>
+      <w:proofErr w:type="spellEnd"/>
+      <w:r>
+        <w:t>(8, 2);</w:t>
+      </w:r>
+      <w:r>
+        <w:br/>
+        <w:t xml:space="preserve">    </w:t>
+      </w:r>
+      <w:proofErr w:type="spellStart"/>
+      <w:r>
+        <w:t>expectedFrequency.put</w:t>
+      </w:r>
+      <w:proofErr w:type="spellEnd"/>
+      <w:r>
+        <w:t>(1, 1);</w:t>
+      </w:r>
+      <w:r>
+        <w:br/>
+      </w:r>
+      <w:r>
+        <w:br/>
+        <w:t xml:space="preserve">    </w:t>
+      </w:r>
+      <w:proofErr w:type="spellStart"/>
+      <w:r>
+        <w:t>UniqueValueAndFrequencyCountingExercise</w:t>
+      </w:r>
+      <w:proofErr w:type="spellEnd"/>
+      <w:r>
+        <w:t xml:space="preserve"> exercise = new </w:t>
+      </w:r>
+      <w:proofErr w:type="spellStart"/>
+      <w:r>
+        <w:t>UniqueValueAndFrequencyCountingExercise</w:t>
+      </w:r>
+      <w:proofErr w:type="spellEnd"/>
+      <w:r>
+        <w:t>(</w:t>
+      </w:r>
+      <w:proofErr w:type="spellStart"/>
+      <w:r>
+        <w:t>testArray</w:t>
+      </w:r>
+      <w:proofErr w:type="spellEnd"/>
+      <w:r>
+        <w:t>);</w:t>
+      </w:r>
+      <w:r>
+        <w:br/>
+        <w:t xml:space="preserve">    </w:t>
+      </w:r>
+      <w:proofErr w:type="spellStart"/>
+      <w:r>
+        <w:t>exercise.runExercise</w:t>
+      </w:r>
+      <w:proofErr w:type="spellEnd"/>
+      <w:r>
+        <w:t>();</w:t>
+      </w:r>
+      <w:r>
+        <w:br/>
+        <w:t xml:space="preserve">    </w:t>
+      </w:r>
+      <w:proofErr w:type="spellStart"/>
+      <w:r>
+        <w:t>exercise.displayOutput</w:t>
+      </w:r>
+      <w:proofErr w:type="spellEnd"/>
+      <w:r>
+        <w:t>();</w:t>
+      </w:r>
+      <w:r>
+        <w:br/>
+      </w:r>
+      <w:r>
+        <w:br/>
+        <w:t xml:space="preserve">    HashMap&lt;Integer, Integer&gt; </w:t>
+      </w:r>
+      <w:proofErr w:type="spellStart"/>
+      <w:r>
+        <w:t>actualFrequency</w:t>
+      </w:r>
+      <w:proofErr w:type="spellEnd"/>
+      <w:r>
+        <w:t xml:space="preserve"> = </w:t>
+      </w:r>
+      <w:proofErr w:type="spellStart"/>
+      <w:r>
+        <w:t>exercise.getUniqueValuesFrequency</w:t>
+      </w:r>
+      <w:proofErr w:type="spellEnd"/>
+      <w:r>
+        <w:t>();</w:t>
+      </w:r>
+      <w:r>
+        <w:br/>
+      </w:r>
+      <w:r>
+        <w:br/>
+        <w:t xml:space="preserve">    </w:t>
+      </w:r>
+      <w:proofErr w:type="spellStart"/>
+      <w:r>
+        <w:rPr>
+          <w:i/>
+          <w:iCs/>
+        </w:rPr>
+        <w:t>assertEquals</w:t>
+      </w:r>
+      <w:proofErr w:type="spellEnd"/>
+      <w:r>
+        <w:t>(</w:t>
+      </w:r>
+      <w:proofErr w:type="spellStart"/>
+      <w:r>
+        <w:t>expectedFrequency</w:t>
+      </w:r>
+      <w:proofErr w:type="spellEnd"/>
+      <w:r>
+        <w:t xml:space="preserve">, </w:t>
+      </w:r>
+      <w:proofErr w:type="spellStart"/>
+      <w:r>
+        <w:t>actualFrequency</w:t>
+      </w:r>
+      <w:proofErr w:type="spellEnd"/>
+      <w:r>
+        <w:t>);</w:t>
+      </w:r>
+      <w:r>
+        <w:br/>
+        <w:t>}</w:t>
+      </w:r>
+    </w:p>
+    <w:p>
+      <w:pPr>
+        <w:pStyle w:val="Caption"/>
+      </w:pPr>
+      <w:r>
+        <w:t xml:space="preserve">Figure </w:t>
+      </w:r>
+      <w:r>
+        <w:fldChar w:fldCharType="begin"/>
+      </w:r>
+      <w:r>
+        <w:instrText xml:space="preserve"> SEQ Figure \* ARABIC </w:instrText>
+      </w:r>
+      <w:r>
+        <w:fldChar w:fldCharType="separate"/>
+      </w:r>
+      <w:r>
+        <w:rPr>
+          <w:noProof/>
+        </w:rPr>
+        <w:t>21</w:t>
+      </w:r>
+      <w:r>
+        <w:fldChar w:fldCharType="end"/>
+      </w:r>
+      <w:r>
+        <w:t>: frequency test</w:t>
+      </w:r>
+    </w:p>
+    <w:p>
+      <w:pPr>
+        <w:pStyle w:val="Pseoudocode"/>
+      </w:pPr>
+      <w:r>
+        <w:t>=== Unique Values and Frequency ===</w:t>
+      </w:r>
+    </w:p>
+    <w:p>
+      <w:pPr>
+        <w:pStyle w:val="Pseoudocode"/>
+      </w:pPr>
+      <w:r>
+        <w:t>Original array: [5, 2, 8, 2, 5, 5, 1, 8]</w:t>
+      </w:r>
+    </w:p>
+    <w:p>
+      <w:pPr>
+        <w:pStyle w:val="Pseoudocode"/>
+      </w:pPr>
+      <w:r>
+        <w:t>Unique values and frequencies:</w:t>
+      </w:r>
+    </w:p>
+    <w:p>
+      <w:pPr>
+        <w:pStyle w:val="Pseoudocode"/>
+      </w:pPr>
+      <w:r>
+        <w:lastRenderedPageBreak/>
+        <w:t>1 appears 1 time</w:t>
+      </w:r>
+    </w:p>
+    <w:p>
+      <w:pPr>
+        <w:pStyle w:val="Pseoudocode"/>
+      </w:pPr>
+      <w:r>
+        <w:t>2 appears 2 times</w:t>
+      </w:r>
+    </w:p>
+    <w:p>
+      <w:pPr>
+        <w:pStyle w:val="Pseoudocode"/>
+      </w:pPr>
+      <w:r>
+        <w:t>5 appears 3 times</w:t>
+      </w:r>
+    </w:p>
+    <w:p>
+      <w:pPr>
+        <w:pStyle w:val="Pseoudocode"/>
+      </w:pPr>
+      <w:r>
+        <w:t xml:space="preserve">8 </w:t>
+      </w:r>
+      <w:proofErr w:type="spellStart"/>
+      <w:r>
+        <w:t>appears</w:t>
+      </w:r>
+      <w:proofErr w:type="spellEnd"/>
+      <w:r>
+        <w:t xml:space="preserve"> 2 times</w:t>
+      </w:r>
+    </w:p>
+    <w:p>
+      <w:pPr>
+        <w:pStyle w:val="Caption"/>
+      </w:pPr>
+      <w:r>
+        <w:t xml:space="preserve">Figure </w:t>
+      </w:r>
+      <w:r>
+        <w:fldChar w:fldCharType="begin"/>
+      </w:r>
+      <w:r>
+        <w:instrText xml:space="preserve"> SEQ Figure \* ARABIC </w:instrText>
+      </w:r>
+      <w:r>
+        <w:fldChar w:fldCharType="separate"/>
+      </w:r>
+      <w:r>
+        <w:rPr>
+          <w:noProof/>
+        </w:rPr>
+        <w:t>22</w:t>
+      </w:r>
+      <w:r>
+        <w:fldChar w:fldCharType="end"/>
+      </w:r>
+      <w:r>
+        <w:t>: Frequency Output</w:t>
+      </w:r>
+    </w:p>
+    <w:p>
+      <w:r>
+        <w:rPr>
+          <w:noProof/>
+        </w:rPr>
+        <mc:AlternateContent>
+          <mc:Choice Requires="wps">
+            <w:drawing>
+              <wp:anchor distT="0" distB="0" distL="114300" distR="114300" simplePos="0" relativeHeight="251676672" behindDoc="0" locked="0" layoutInCell="1" allowOverlap="1" wp14:anchorId="023F92F6" wp14:editId="557E62B9">
+                <wp:simplePos x="0" y="0"/>
+                <wp:positionH relativeFrom="column">
+                  <wp:posOffset>705485</wp:posOffset>
+                </wp:positionH>
+                <wp:positionV relativeFrom="paragraph">
+                  <wp:posOffset>859155</wp:posOffset>
+                </wp:positionV>
+                <wp:extent cx="3771900" cy="635"/>
+                <wp:effectExtent l="0" t="0" r="0" b="0"/>
+                <wp:wrapTopAndBottom/>
+                <wp:docPr id="1698652845" name="Text Box 1"/>
+                <wp:cNvGraphicFramePr/>
+                <a:graphic xmlns:a="http://schemas.openxmlformats.org/drawingml/2006/main">
+                  <a:graphicData uri="http://schemas.microsoft.com/office/word/2010/wordprocessingShape">
+                    <wps:wsp>
+                      <wps:cNvSpPr txBox="1"/>
+                      <wps:spPr>
+                        <a:xfrm>
+                          <a:off x="0" y="0"/>
+                          <a:ext cx="3771900" cy="635"/>
+                        </a:xfrm>
+                        <a:prstGeom prst="rect">
+                          <a:avLst/>
+                        </a:prstGeom>
+                        <a:solidFill>
+                          <a:prstClr val="white"/>
+                        </a:solidFill>
+                        <a:ln>
+                          <a:noFill/>
+                        </a:ln>
+                      </wps:spPr>
+                      <wps:txbx>
+                        <w:txbxContent>
+                          <w:p>
+                            <w:pPr>
+                              <w:pStyle w:val="Caption"/>
+                            </w:pPr>
+                            <w:r>
+                              <w:t xml:space="preserve">Figure </w:t>
+                            </w:r>
+                            <w:r>
+                              <w:fldChar w:fldCharType="begin"/>
+                            </w:r>
+                            <w:r>
+                              <w:instrText xml:space="preserve"> SEQ Figure \* ARABIC </w:instrText>
+                            </w:r>
+                            <w:r>
+                              <w:fldChar w:fldCharType="separate"/>
+                            </w:r>
+                            <w:r>
+                              <w:rPr>
+                                <w:noProof/>
+                              </w:rPr>
+                              <w:t>23</w:t>
+                            </w:r>
+                            <w:r>
+                              <w:fldChar w:fldCharType="end"/>
+                            </w:r>
+                            <w:r>
+                              <w:t>: Frequency Unit test</w:t>
+                            </w:r>
+                          </w:p>
+                        </w:txbxContent>
+                      </wps:txbx>
+                      <wps:bodyPr rot="0" spcFirstLastPara="0" vertOverflow="overflow" horzOverflow="overflow" vert="horz" wrap="square" lIns="0" tIns="0" rIns="0" bIns="0" numCol="1" spcCol="0" rtlCol="0" fromWordArt="0" anchor="t" anchorCtr="0" forceAA="0" compatLnSpc="1">
+                        <a:prstTxWarp prst="textNoShape">
+                          <a:avLst/>
+                        </a:prstTxWarp>
+                        <a:spAutoFit/>
+                      </wps:bodyPr>
+                    </wps:wsp>
+                  </a:graphicData>
+                </a:graphic>
+              </wp:anchor>
+            </w:drawing>
+          </mc:Choice>
+          <mc:Fallback>
+            <w:pict>
+              <v:shape w14:anchorId="023F92F6" id="_x0000_s1032" type="#_x0000_t202" style="position:absolute;left:0;text-align:left;margin-left:55.55pt;margin-top:67.65pt;width:297pt;height:.05pt;z-index:251676672;visibility:visible;mso-wrap-style:square;mso-wrap-distance-left:9pt;mso-wrap-distance-top:0;mso-wrap-distance-right:9pt;mso-wrap-distance-bottom:0;mso-position-horizontal:absolute;mso-position-horizontal-relative:text;mso-position-vertical:absolute;mso-position-vertical-relative:text;v-text-anchor:top" o:gfxdata="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" stroked="f">
+                <v:textbox style="mso-fit-shape-to-text:t" inset="0,0,0,0">
+                  <w:txbxContent>
+                    <w:p>
+                      <w:pPr>
+                        <w:pStyle w:val="Caption"/>
+                      </w:pPr>
+                      <w:r>
+                        <w:t xml:space="preserve">Figure </w:t>
+                      </w:r>
+                      <w:r>
+                        <w:fldChar w:fldCharType="begin"/>
+                      </w:r>
+                      <w:r>
+                        <w:instrText xml:space="preserve"> SEQ Figure \* ARABIC </w:instrText>
+                      </w:r>
+                      <w:r>
+                        <w:fldChar w:fldCharType="separate"/>
+                      </w:r>
+                      <w:r>
+                        <w:rPr>
+                          <w:noProof/>
+                        </w:rPr>
+                        <w:t>23</w:t>
+                      </w:r>
+                      <w:r>
+                        <w:fldChar w:fldCharType="end"/>
+                      </w:r>
+                      <w:r>
+                        <w:t>: Frequency Unit test</w:t>
+                      </w:r>
+                    </w:p>
+                  </w:txbxContent>
+                </v:textbox>
+                <w10:wrap type="topAndBottom"/>
+              </v:shape>
+            </w:pict>
+          </mc:Fallback>
+        </mc:AlternateContent>
+      </w:r>
+      <w:r>
+        <w:drawing>
+          <wp:anchor distT="0" distB="0" distL="114300" distR="114300" simplePos="0" relativeHeight="251674624" behindDoc="0" locked="0" layoutInCell="1" allowOverlap="1" wp14:anchorId="15DD939E" wp14:editId="0F7E59FF">
+            <wp:simplePos x="0" y="0"/>
+            <wp:positionH relativeFrom="margin">
+              <wp:align>center</wp:align>
+            </wp:positionH>
+            <wp:positionV relativeFrom="paragraph">
+              <wp:posOffset>297180</wp:posOffset>
+            </wp:positionV>
+            <wp:extent cx="3772426" cy="504895"/>
+            <wp:effectExtent l="0" t="0" r="0" b="9525"/>
+            <wp:wrapTopAndBottom/>
+            <wp:docPr id="399081832" name="Picture 1" descr="A black and white text&#10;&#10;AI-generated content may be incorrect."/>
+            <wp:cNvGraphicFramePr>
+              <a:graphicFrameLocks xmlns:a="http://schemas.openxmlformats.org/drawingml/2006/main" noChangeAspect="1"/>
+            </wp:cNvGraphicFramePr>
+            <a:graphic xmlns:a="http://schemas.openxmlformats.org/drawingml/2006/main">
+              <a:graphicData uri="http://schemas.openxmlformats.org/drawingml/2006/picture">
+                <pic:pic xmlns:pic="http://schemas.openxmlformats.org/drawingml/2006/picture">
+                  <pic:nvPicPr>
+                    <pic:cNvPr id="399081832" name="Picture 1" descr="A black and white text&#10;&#10;AI-generated content may be incorrect."/>
+                    <pic:cNvPicPr/>
+                  </pic:nvPicPr>
+                  <pic:blipFill>
+                    <a:blip r:embed="rId12">
+                      <a:extLst>
+                        <a:ext uri="{28A0092B-C50C-407E-A947-70E740481C1C}">
+                          <a14:useLocalDpi xmlns:a14="http://schemas.microsoft.com/office/drawing/2010/main" val="0"/>
+                        </a:ext>
+                      </a:extLst>
+                    </a:blip>
+                    <a:stretch>
+                      <a:fillRect/>
+                    </a:stretch>
+                  </pic:blipFill>
+                  <pic:spPr>
+                    <a:xfrm>
+                      <a:off x="0" y="0"/>
+                      <a:ext cx="3772426" cy="504895"/>
+                    </a:xfrm>
+                    <a:prstGeom prst="rect">
+                      <a:avLst/>
+                    </a:prstGeom>
+                  </pic:spPr>
+                </pic:pic>
+              </a:graphicData>
+            </a:graphic>
+          </wp:anchor>
+        </w:drawing>
+      </w:r>
+    </w:p>
     <w:p/>
     <w:sectPr>
-      <w:headerReference w:type="default" r:id="rId12"/>
-      <w:footerReference w:type="default" r:id="rId13"/>
-      <w:headerReference w:type="first" r:id="rId14"/>
+      <w:headerReference w:type="default" r:id="rId13"/>
+      <w:footerReference w:type="default" r:id="rId14"/>
+      <w:headerReference w:type="first" r:id="rId15"/>
       <w:pgSz w:w="11906" w:h="16838"/>
       <w:pgMar w:top="1872" w:right="1872" w:bottom="1872" w:left="1872" w:header="706" w:footer="706" w:gutter="0"/>
       <w:pgNumType w:start="0"/>

</xml_diff>

<commit_message>
Add tests for ArraySplittingExercise
Introduced ArraySplittingExerciseTest with unit tests covering arrays with mixed, only even, and only odd numbers. Updated .gitignore to exclude a new temporary file. Protocol.docx was also updated.
</commit_message>
<xml_diff>
--- a/Modules/Semester_1/Modern Code/Aufgaben/04_Arrays_and_Algorithms/Protocol.docx
+++ b/Modules/Semester_1/Modern Code/Aufgaben/04_Arrays_and_Algorithms/Protocol.docx
@@ -8637,11 +8637,915 @@
         </w:drawing>
       </w:r>
     </w:p>
-    <w:p/>
+    <w:p>
+      <w:pPr>
+        <w:pStyle w:val="Heading1"/>
+      </w:pPr>
+      <w:r>
+        <w:t>Exercise 6 – Array Splitting</w:t>
+      </w:r>
+    </w:p>
+    <w:p>
+      <w:pPr>
+        <w:pStyle w:val="Heading2"/>
+      </w:pPr>
+      <w:r>
+        <w:t>Solution Idea</w:t>
+      </w:r>
+    </w:p>
+    <w:p>
+      <w:r>
+        <w:t>An array only solution to this would be to first loop through the array and determine how many odd and even numbers there are, create the arrays and then then loop again and add the even and odd numbers to their arrays.</w:t>
+      </w:r>
+      <w:r>
+        <w:t xml:space="preserve"> I used lists instead, because it’s cleaner. </w:t>
+      </w:r>
+    </w:p>
+    <w:p>
+      <w:pPr>
+        <w:pStyle w:val="Heading2"/>
+      </w:pPr>
+      <w:r>
+        <w:t>Code</w:t>
+      </w:r>
+    </w:p>
+    <w:p>
+      <w:pPr>
+        <w:pStyle w:val="Pseoudocode"/>
+      </w:pPr>
+      <w:r>
+        <w:t xml:space="preserve">private </w:t>
+      </w:r>
+      <w:proofErr w:type="spellStart"/>
+      <w:r>
+        <w:t>ArraySplittingResult</w:t>
+      </w:r>
+      <w:proofErr w:type="spellEnd"/>
+      <w:r>
+        <w:t xml:space="preserve"> </w:t>
+      </w:r>
+      <w:proofErr w:type="spellStart"/>
+      <w:r>
+        <w:t>splitArray</w:t>
+      </w:r>
+      <w:proofErr w:type="spellEnd"/>
+      <w:r>
+        <w:t>(int[] array)</w:t>
+      </w:r>
+      <w:r>
+        <w:br/>
+        <w:t>{</w:t>
+      </w:r>
+      <w:r>
+        <w:br/>
+        <w:t xml:space="preserve">    List&lt;Integer&gt; e</w:t>
+      </w:r>
+      <w:proofErr w:type="spellStart"/>
+      <w:r>
+        <w:t>venList</w:t>
+      </w:r>
+      <w:proofErr w:type="spellEnd"/>
+      <w:r>
+        <w:t xml:space="preserve"> = new </w:t>
+      </w:r>
+      <w:proofErr w:type="spellStart"/>
+      <w:r>
+        <w:t>ArrayList</w:t>
+      </w:r>
+      <w:proofErr w:type="spellEnd"/>
+      <w:r>
+        <w:t>&lt;Integer&gt;();</w:t>
+      </w:r>
+      <w:r>
+        <w:br/>
+        <w:t xml:space="preserve">    List&lt;Integer&gt; </w:t>
+      </w:r>
+      <w:proofErr w:type="spellStart"/>
+      <w:r>
+        <w:t>oddList</w:t>
+      </w:r>
+      <w:proofErr w:type="spellEnd"/>
+      <w:r>
+        <w:t xml:space="preserve"> = new </w:t>
+      </w:r>
+      <w:proofErr w:type="spellStart"/>
+      <w:r>
+        <w:t>ArrayList</w:t>
+      </w:r>
+      <w:proofErr w:type="spellEnd"/>
+      <w:r>
+        <w:t>&lt;Integer&gt;();</w:t>
+      </w:r>
+      <w:r>
+        <w:br/>
+      </w:r>
+      <w:r>
+        <w:br/>
+        <w:t xml:space="preserve">    for (int </w:t>
+      </w:r>
+      <w:proofErr w:type="spellStart"/>
+      <w:r>
+        <w:t>num</w:t>
+      </w:r>
+      <w:proofErr w:type="spellEnd"/>
+      <w:r>
+        <w:t xml:space="preserve"> : array)</w:t>
+      </w:r>
+      <w:r>
+        <w:br/>
+        <w:t xml:space="preserve">    {</w:t>
+      </w:r>
+      <w:r>
+        <w:br/>
+        <w:t xml:space="preserve">        if (</w:t>
+      </w:r>
+      <w:proofErr w:type="spellStart"/>
+      <w:r>
+        <w:t>num</w:t>
+      </w:r>
+      <w:proofErr w:type="spellEnd"/>
+      <w:r>
+        <w:t xml:space="preserve"> % 2 == 0)</w:t>
+      </w:r>
+      <w:r>
+        <w:br/>
+        <w:t xml:space="preserve">        {</w:t>
+      </w:r>
+      <w:r>
+        <w:br/>
+        <w:t xml:space="preserve">            </w:t>
+      </w:r>
+      <w:proofErr w:type="spellStart"/>
+      <w:r>
+        <w:t>evenList.add</w:t>
+      </w:r>
+      <w:proofErr w:type="spellEnd"/>
+      <w:r>
+        <w:t>(</w:t>
+      </w:r>
+      <w:proofErr w:type="spellStart"/>
+      <w:r>
+        <w:t>num</w:t>
+      </w:r>
+      <w:proofErr w:type="spellEnd"/>
+      <w:r>
+        <w:t>);</w:t>
+      </w:r>
+      <w:r>
+        <w:br/>
+        <w:t xml:space="preserve">        }</w:t>
+      </w:r>
+      <w:r>
+        <w:br/>
+        <w:t xml:space="preserve">        else</w:t>
+      </w:r>
+      <w:r>
+        <w:br/>
+        <w:t xml:space="preserve">        {</w:t>
+      </w:r>
+      <w:r>
+        <w:br/>
+        <w:t xml:space="preserve">            </w:t>
+      </w:r>
+      <w:proofErr w:type="spellStart"/>
+      <w:r>
+        <w:t>oddList.add</w:t>
+      </w:r>
+      <w:proofErr w:type="spellEnd"/>
+      <w:r>
+        <w:t>(</w:t>
+      </w:r>
+      <w:proofErr w:type="spellStart"/>
+      <w:r>
+        <w:t>num</w:t>
+      </w:r>
+      <w:proofErr w:type="spellEnd"/>
+      <w:r>
+        <w:t>);</w:t>
+      </w:r>
+      <w:r>
+        <w:br/>
+        <w:t xml:space="preserve">        }</w:t>
+      </w:r>
+      <w:r>
+        <w:br/>
+        <w:t xml:space="preserve">    }</w:t>
+      </w:r>
+      <w:r>
+        <w:br/>
+      </w:r>
+      <w:r>
+        <w:br/>
+      </w:r>
+      <w:r>
+        <w:lastRenderedPageBreak/>
+        <w:t xml:space="preserve">    int[] </w:t>
+      </w:r>
+      <w:proofErr w:type="spellStart"/>
+      <w:r>
+        <w:t>evenArray</w:t>
+      </w:r>
+      <w:proofErr w:type="spellEnd"/>
+      <w:r>
+        <w:t xml:space="preserve"> = </w:t>
+      </w:r>
+      <w:proofErr w:type="spellStart"/>
+      <w:r>
+        <w:t>evenList.stream</w:t>
+      </w:r>
+      <w:proofErr w:type="spellEnd"/>
+      <w:r>
+        <w:t>().</w:t>
+      </w:r>
+      <w:proofErr w:type="spellStart"/>
+      <w:r>
+        <w:t>mapToInt</w:t>
+      </w:r>
+      <w:proofErr w:type="spellEnd"/>
+      <w:r>
+        <w:t>(Integer::</w:t>
+      </w:r>
+      <w:proofErr w:type="spellStart"/>
+      <w:r>
+        <w:t>intValue</w:t>
+      </w:r>
+      <w:proofErr w:type="spellEnd"/>
+      <w:r>
+        <w:t>).</w:t>
+      </w:r>
+      <w:proofErr w:type="spellStart"/>
+      <w:r>
+        <w:t>toArray</w:t>
+      </w:r>
+      <w:proofErr w:type="spellEnd"/>
+      <w:r>
+        <w:t>();</w:t>
+      </w:r>
+      <w:r>
+        <w:br/>
+        <w:t xml:space="preserve">    int[] </w:t>
+      </w:r>
+      <w:proofErr w:type="spellStart"/>
+      <w:r>
+        <w:t>oddArray</w:t>
+      </w:r>
+      <w:proofErr w:type="spellEnd"/>
+      <w:r>
+        <w:t xml:space="preserve"> = </w:t>
+      </w:r>
+      <w:proofErr w:type="spellStart"/>
+      <w:r>
+        <w:t>oddList.stream</w:t>
+      </w:r>
+      <w:proofErr w:type="spellEnd"/>
+      <w:r>
+        <w:t>().</w:t>
+      </w:r>
+      <w:proofErr w:type="spellStart"/>
+      <w:r>
+        <w:t>mapToInt</w:t>
+      </w:r>
+      <w:proofErr w:type="spellEnd"/>
+      <w:r>
+        <w:t>(Integer::</w:t>
+      </w:r>
+      <w:proofErr w:type="spellStart"/>
+      <w:r>
+        <w:t>intValue</w:t>
+      </w:r>
+      <w:proofErr w:type="spellEnd"/>
+      <w:r>
+        <w:t>).</w:t>
+      </w:r>
+      <w:proofErr w:type="spellStart"/>
+      <w:r>
+        <w:t>toArray</w:t>
+      </w:r>
+      <w:proofErr w:type="spellEnd"/>
+      <w:r>
+        <w:t>();</w:t>
+      </w:r>
+      <w:r>
+        <w:br/>
+      </w:r>
+      <w:r>
+        <w:br/>
+        <w:t xml:space="preserve">    return new </w:t>
+      </w:r>
+      <w:proofErr w:type="spellStart"/>
+      <w:r>
+        <w:t>ArraySplittingResult</w:t>
+      </w:r>
+      <w:proofErr w:type="spellEnd"/>
+      <w:r>
+        <w:t>(</w:t>
+      </w:r>
+      <w:proofErr w:type="spellStart"/>
+      <w:r>
+        <w:t>evenArray</w:t>
+      </w:r>
+      <w:proofErr w:type="spellEnd"/>
+      <w:r>
+        <w:t xml:space="preserve">, </w:t>
+      </w:r>
+      <w:proofErr w:type="spellStart"/>
+      <w:r>
+        <w:t>oddArray</w:t>
+      </w:r>
+      <w:proofErr w:type="spellEnd"/>
+      <w:r>
+        <w:t>);</w:t>
+      </w:r>
+      <w:r>
+        <w:br/>
+      </w:r>
+      <w:r>
+        <w:br/>
+        <w:t>}</w:t>
+      </w:r>
+    </w:p>
+    <w:p>
+      <w:pPr>
+        <w:pStyle w:val="Caption"/>
+      </w:pPr>
+      <w:r>
+        <w:t xml:space="preserve">Figure </w:t>
+      </w:r>
+      <w:r>
+        <w:fldChar w:fldCharType="begin"/>
+      </w:r>
+      <w:r>
+        <w:instrText xml:space="preserve"> SEQ Figure \* ARABIC </w:instrText>
+      </w:r>
+      <w:r>
+        <w:fldChar w:fldCharType="separate"/>
+      </w:r>
+      <w:r>
+        <w:rPr>
+          <w:noProof/>
+        </w:rPr>
+        <w:t>24</w:t>
+      </w:r>
+      <w:r>
+        <w:fldChar w:fldCharType="end"/>
+      </w:r>
+      <w:r>
+        <w:t xml:space="preserve">: </w:t>
+      </w:r>
+      <w:proofErr w:type="spellStart"/>
+      <w:r>
+        <w:t>splitArray</w:t>
+      </w:r>
+      <w:proofErr w:type="spellEnd"/>
+    </w:p>
+    <w:p>
+      <w:pPr>
+        <w:rPr>
+          <w:lang w:val="en-AT"/>
+        </w:rPr>
+      </w:pPr>
+    </w:p>
+    <w:p>
+      <w:pPr>
+        <w:pStyle w:val="Heading2"/>
+      </w:pPr>
+      <w:r>
+        <w:t>Test</w:t>
+      </w:r>
+    </w:p>
+    <w:p>
+      <w:pPr>
+        <w:pStyle w:val="Pseoudocode"/>
+      </w:pPr>
+      <w:r>
+        <w:t>@Test</w:t>
+      </w:r>
+      <w:r>
+        <w:br/>
+        <w:t xml:space="preserve">void </w:t>
+      </w:r>
+      <w:proofErr w:type="spellStart"/>
+      <w:r>
+        <w:t>testArraySplittingExercise</w:t>
+      </w:r>
+      <w:proofErr w:type="spellEnd"/>
+      <w:r>
+        <w:t>()</w:t>
+      </w:r>
+      <w:r>
+        <w:br/>
+        <w:t>{</w:t>
+      </w:r>
+      <w:r>
+        <w:br/>
+        <w:t xml:space="preserve">    int[] </w:t>
+      </w:r>
+      <w:proofErr w:type="spellStart"/>
+      <w:r>
+        <w:t>inputArray</w:t>
+      </w:r>
+      <w:proofErr w:type="spellEnd"/>
+      <w:r>
+        <w:t xml:space="preserve"> = {15, 8, 23, 4, 42, 11, 19};</w:t>
+      </w:r>
+      <w:r>
+        <w:br/>
+      </w:r>
+      <w:r>
+        <w:br/>
+        <w:t xml:space="preserve">    int[] </w:t>
+      </w:r>
+      <w:proofErr w:type="spellStart"/>
+      <w:r>
+        <w:t>expectedEvenArray</w:t>
+      </w:r>
+      <w:proofErr w:type="spellEnd"/>
+      <w:r>
+        <w:t xml:space="preserve"> = {8, 4, 42};</w:t>
+      </w:r>
+      <w:r>
+        <w:br/>
+        <w:t xml:space="preserve">    int[] </w:t>
+      </w:r>
+      <w:proofErr w:type="spellStart"/>
+      <w:r>
+        <w:t>expectedOddArray</w:t>
+      </w:r>
+      <w:proofErr w:type="spellEnd"/>
+      <w:r>
+        <w:t xml:space="preserve"> = {15, 23, 11, 19};</w:t>
+      </w:r>
+      <w:r>
+        <w:br/>
+      </w:r>
+      <w:r>
+        <w:br/>
+        <w:t xml:space="preserve">    </w:t>
+      </w:r>
+      <w:proofErr w:type="spellStart"/>
+      <w:r>
+        <w:t>ArraySplittingExercise</w:t>
+      </w:r>
+      <w:proofErr w:type="spellEnd"/>
+      <w:r>
+        <w:t xml:space="preserve"> </w:t>
+      </w:r>
+      <w:proofErr w:type="spellStart"/>
+      <w:r>
+        <w:t>splittingExcercise</w:t>
+      </w:r>
+      <w:proofErr w:type="spellEnd"/>
+      <w:r>
+        <w:t xml:space="preserve"> = new </w:t>
+      </w:r>
+      <w:proofErr w:type="spellStart"/>
+      <w:r>
+        <w:t>ArraySplittingExercise</w:t>
+      </w:r>
+      <w:proofErr w:type="spellEnd"/>
+      <w:r>
+        <w:t>(</w:t>
+      </w:r>
+      <w:proofErr w:type="spellStart"/>
+      <w:r>
+        <w:t>inputArray</w:t>
+      </w:r>
+      <w:proofErr w:type="spellEnd"/>
+      <w:r>
+        <w:t>);</w:t>
+      </w:r>
+      <w:r>
+        <w:br/>
+      </w:r>
+      <w:r>
+        <w:br/>
+        <w:t xml:space="preserve">    </w:t>
+      </w:r>
+      <w:proofErr w:type="spellStart"/>
+      <w:r>
+        <w:t>splittingExcercise.runExercise</w:t>
+      </w:r>
+      <w:proofErr w:type="spellEnd"/>
+      <w:r>
+        <w:t>();</w:t>
+      </w:r>
+      <w:r>
+        <w:br/>
+        <w:t xml:space="preserve">    </w:t>
+      </w:r>
+      <w:proofErr w:type="spellStart"/>
+      <w:r>
+        <w:t>splittingExcercise.displayOutput</w:t>
+      </w:r>
+      <w:proofErr w:type="spellEnd"/>
+      <w:r>
+        <w:t>();</w:t>
+      </w:r>
+      <w:r>
+        <w:br/>
+      </w:r>
+      <w:r>
+        <w:br/>
+        <w:t xml:space="preserve">    int[] </w:t>
+      </w:r>
+      <w:proofErr w:type="spellStart"/>
+      <w:r>
+        <w:t>actualEvenArray</w:t>
+      </w:r>
+      <w:proofErr w:type="spellEnd"/>
+      <w:r>
+        <w:t xml:space="preserve"> = </w:t>
+      </w:r>
+      <w:proofErr w:type="spellStart"/>
+      <w:r>
+        <w:t>splittingExcercise.getArraySplittingResult</w:t>
+      </w:r>
+      <w:proofErr w:type="spellEnd"/>
+      <w:r>
+        <w:t>().</w:t>
+      </w:r>
+      <w:proofErr w:type="spellStart"/>
+      <w:r>
+        <w:t>evenArray</w:t>
+      </w:r>
+      <w:proofErr w:type="spellEnd"/>
+      <w:r>
+        <w:t>();</w:t>
+      </w:r>
+      <w:r>
+        <w:br/>
+        <w:t xml:space="preserve">    int[] </w:t>
+      </w:r>
+      <w:proofErr w:type="spellStart"/>
+      <w:r>
+        <w:t>actualOddArray</w:t>
+      </w:r>
+      <w:proofErr w:type="spellEnd"/>
+      <w:r>
+        <w:t xml:space="preserve"> = </w:t>
+      </w:r>
+      <w:proofErr w:type="spellStart"/>
+      <w:r>
+        <w:t>splittingExcercise.getArraySplittingResult</w:t>
+      </w:r>
+      <w:proofErr w:type="spellEnd"/>
+      <w:r>
+        <w:t>().</w:t>
+      </w:r>
+      <w:proofErr w:type="spellStart"/>
+      <w:r>
+        <w:t>oddArray</w:t>
+      </w:r>
+      <w:proofErr w:type="spellEnd"/>
+      <w:r>
+        <w:t>();</w:t>
+      </w:r>
+      <w:r>
+        <w:br/>
+      </w:r>
+      <w:r>
+        <w:br/>
+        <w:t xml:space="preserve">    </w:t>
+      </w:r>
+      <w:proofErr w:type="spellStart"/>
+      <w:r>
+        <w:rPr>
+          <w:i/>
+          <w:iCs/>
+        </w:rPr>
+        <w:t>assertArrayEquals</w:t>
+      </w:r>
+      <w:proofErr w:type="spellEnd"/>
+      <w:r>
+        <w:t>(</w:t>
+      </w:r>
+      <w:proofErr w:type="spellStart"/>
+      <w:r>
+        <w:t>expectedEvenArray</w:t>
+      </w:r>
+      <w:proofErr w:type="spellEnd"/>
+      <w:r>
+        <w:t xml:space="preserve">, </w:t>
+      </w:r>
+      <w:proofErr w:type="spellStart"/>
+      <w:r>
+        <w:t>actualEvenArray</w:t>
+      </w:r>
+      <w:proofErr w:type="spellEnd"/>
+      <w:r>
+        <w:t>);</w:t>
+      </w:r>
+      <w:r>
+        <w:br/>
+        <w:t xml:space="preserve">    </w:t>
+      </w:r>
+      <w:proofErr w:type="spellStart"/>
+      <w:r>
+        <w:rPr>
+          <w:i/>
+          <w:iCs/>
+        </w:rPr>
+        <w:t>assertArrayEquals</w:t>
+      </w:r>
+      <w:proofErr w:type="spellEnd"/>
+      <w:r>
+        <w:t>(</w:t>
+      </w:r>
+      <w:proofErr w:type="spellStart"/>
+      <w:r>
+        <w:t>expectedOddArray</w:t>
+      </w:r>
+      <w:proofErr w:type="spellEnd"/>
+      <w:r>
+        <w:t xml:space="preserve">, </w:t>
+      </w:r>
+      <w:proofErr w:type="spellStart"/>
+      <w:r>
+        <w:t>actualOddArray</w:t>
+      </w:r>
+      <w:proofErr w:type="spellEnd"/>
+      <w:r>
+        <w:t>);</w:t>
+      </w:r>
+      <w:r>
+        <w:br/>
+        <w:t>}</w:t>
+      </w:r>
+    </w:p>
+    <w:p>
+      <w:pPr>
+        <w:pStyle w:val="Caption"/>
+      </w:pPr>
+      <w:r>
+        <w:t xml:space="preserve">Figure </w:t>
+      </w:r>
+      <w:r>
+        <w:fldChar w:fldCharType="begin"/>
+      </w:r>
+      <w:r>
+        <w:instrText xml:space="preserve"> SEQ Figure \* ARABIC </w:instrText>
+      </w:r>
+      <w:r>
+        <w:fldChar w:fldCharType="separate"/>
+      </w:r>
+      <w:r>
+        <w:rPr>
+          <w:noProof/>
+        </w:rPr>
+        <w:t>25</w:t>
+      </w:r>
+      <w:r>
+        <w:fldChar w:fldCharType="end"/>
+      </w:r>
+      <w:r>
+        <w:t>: Array Splitting test</w:t>
+      </w:r>
+    </w:p>
+    <w:p>
+      <w:pPr>
+        <w:pStyle w:val="Pseoudocode"/>
+      </w:pPr>
+      <w:r>
+        <w:t>Array Splitting Exercise: Even and Odds</w:t>
+      </w:r>
+    </w:p>
+    <w:p>
+      <w:pPr>
+        <w:pStyle w:val="Pseoudocode"/>
+      </w:pPr>
+      <w:r>
+        <w:t>Original array: [15, 8, 23, 4, 42, 11, 19]</w:t>
+      </w:r>
+    </w:p>
+    <w:p>
+      <w:pPr>
+        <w:pStyle w:val="Pseoudocode"/>
+      </w:pPr>
+      <w:r>
+        <w:t>Even numbers: [8, 4, 42]</w:t>
+      </w:r>
+    </w:p>
+    <w:p>
+      <w:pPr>
+        <w:pStyle w:val="Pseoudocode"/>
+      </w:pPr>
+      <w:r>
+        <w:lastRenderedPageBreak/>
+        <w:t>Odd numbers: [15, 23, 11, 19]</w:t>
+      </w:r>
+    </w:p>
+    <w:p>
+      <w:pPr>
+        <w:pStyle w:val="Caption"/>
+      </w:pPr>
+      <w:r>
+        <w:t xml:space="preserve">Figure </w:t>
+      </w:r>
+      <w:r>
+        <w:fldChar w:fldCharType="begin"/>
+      </w:r>
+      <w:r>
+        <w:instrText xml:space="preserve"> SEQ Figure \* ARABIC </w:instrText>
+      </w:r>
+      <w:r>
+        <w:fldChar w:fldCharType="separate"/>
+      </w:r>
+      <w:r>
+        <w:rPr>
+          <w:noProof/>
+        </w:rPr>
+        <w:t>26</w:t>
+      </w:r>
+      <w:r>
+        <w:fldChar w:fldCharType="end"/>
+      </w:r>
+      <w:r>
+        <w:t>: Array Splitting result</w:t>
+      </w:r>
+    </w:p>
+    <w:p>
+      <w:r>
+        <w:rPr>
+          <w:noProof/>
+        </w:rPr>
+        <mc:AlternateContent>
+          <mc:Choice Requires="wps">
+            <w:drawing>
+              <wp:anchor distT="0" distB="0" distL="114300" distR="114300" simplePos="0" relativeHeight="251679744" behindDoc="0" locked="0" layoutInCell="1" allowOverlap="1" wp14:anchorId="2297273A" wp14:editId="66C5CF91">
+                <wp:simplePos x="0" y="0"/>
+                <wp:positionH relativeFrom="column">
+                  <wp:posOffset>791210</wp:posOffset>
+                </wp:positionH>
+                <wp:positionV relativeFrom="paragraph">
+                  <wp:posOffset>1122680</wp:posOffset>
+                </wp:positionV>
+                <wp:extent cx="3600450" cy="635"/>
+                <wp:effectExtent l="0" t="0" r="0" b="0"/>
+                <wp:wrapTopAndBottom/>
+                <wp:docPr id="1156050841" name="Text Box 1"/>
+                <wp:cNvGraphicFramePr/>
+                <a:graphic xmlns:a="http://schemas.openxmlformats.org/drawingml/2006/main">
+                  <a:graphicData uri="http://schemas.microsoft.com/office/word/2010/wordprocessingShape">
+                    <wps:wsp>
+                      <wps:cNvSpPr txBox="1"/>
+                      <wps:spPr>
+                        <a:xfrm>
+                          <a:off x="0" y="0"/>
+                          <a:ext cx="3600450" cy="635"/>
+                        </a:xfrm>
+                        <a:prstGeom prst="rect">
+                          <a:avLst/>
+                        </a:prstGeom>
+                        <a:solidFill>
+                          <a:prstClr val="white"/>
+                        </a:solidFill>
+                        <a:ln>
+                          <a:noFill/>
+                        </a:ln>
+                      </wps:spPr>
+                      <wps:txbx>
+                        <w:txbxContent>
+                          <w:p>
+                            <w:pPr>
+                              <w:pStyle w:val="Caption"/>
+                            </w:pPr>
+                            <w:r>
+                              <w:t xml:space="preserve">Figure </w:t>
+                            </w:r>
+                            <w:r>
+                              <w:fldChar w:fldCharType="begin"/>
+                            </w:r>
+                            <w:r>
+                              <w:instrText xml:space="preserve"> SEQ Figure \* ARABIC </w:instrText>
+                            </w:r>
+                            <w:r>
+                              <w:fldChar w:fldCharType="separate"/>
+                            </w:r>
+                            <w:r>
+                              <w:rPr>
+                                <w:noProof/>
+                              </w:rPr>
+                              <w:t>27</w:t>
+                            </w:r>
+                            <w:r>
+                              <w:fldChar w:fldCharType="end"/>
+                            </w:r>
+                            <w:r>
+                              <w:t>: Array Splitting Unit Tests</w:t>
+                            </w:r>
+                          </w:p>
+                        </w:txbxContent>
+                      </wps:txbx>
+                      <wps:bodyPr rot="0" spcFirstLastPara="0" vertOverflow="overflow" horzOverflow="overflow" vert="horz" wrap="square" lIns="0" tIns="0" rIns="0" bIns="0" numCol="1" spcCol="0" rtlCol="0" fromWordArt="0" anchor="t" anchorCtr="0" forceAA="0" compatLnSpc="1">
+                        <a:prstTxWarp prst="textNoShape">
+                          <a:avLst/>
+                        </a:prstTxWarp>
+                        <a:spAutoFit/>
+                      </wps:bodyPr>
+                    </wps:wsp>
+                  </a:graphicData>
+                </a:graphic>
+              </wp:anchor>
+            </w:drawing>
+          </mc:Choice>
+          <mc:Fallback>
+            <w:pict>
+              <v:shape w14:anchorId="2297273A" id="_x0000_s1033" type="#_x0000_t202" style="position:absolute;left:0;text-align:left;margin-left:62.3pt;margin-top:88.4pt;width:283.5pt;height:.05pt;z-index:251679744;visibility:visible;mso-wrap-style:square;mso-wrap-distance-left:9pt;mso-wrap-distance-top:0;mso-wrap-distance-right:9pt;mso-wrap-distance-bottom:0;mso-position-horizontal:absolute;mso-position-horizontal-relative:text;mso-position-vertical:absolute;mso-position-vertical-relative:text;v-text-anchor:top" o:gfxdata="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" stroked="f">
+                <v:textbox style="mso-fit-shape-to-text:t" inset="0,0,0,0">
+                  <w:txbxContent>
+                    <w:p>
+                      <w:pPr>
+                        <w:pStyle w:val="Caption"/>
+                      </w:pPr>
+                      <w:r>
+                        <w:t xml:space="preserve">Figure </w:t>
+                      </w:r>
+                      <w:r>
+                        <w:fldChar w:fldCharType="begin"/>
+                      </w:r>
+                      <w:r>
+                        <w:instrText xml:space="preserve"> SEQ Figure \* ARABIC </w:instrText>
+                      </w:r>
+                      <w:r>
+                        <w:fldChar w:fldCharType="separate"/>
+                      </w:r>
+                      <w:r>
+                        <w:rPr>
+                          <w:noProof/>
+                        </w:rPr>
+                        <w:t>27</w:t>
+                      </w:r>
+                      <w:r>
+                        <w:fldChar w:fldCharType="end"/>
+                      </w:r>
+                      <w:r>
+                        <w:t>: Array Splitting Unit Tests</w:t>
+                      </w:r>
+                    </w:p>
+                  </w:txbxContent>
+                </v:textbox>
+                <w10:wrap type="topAndBottom"/>
+              </v:shape>
+            </w:pict>
+          </mc:Fallback>
+        </mc:AlternateContent>
+      </w:r>
+      <w:r>
+        <w:drawing>
+          <wp:anchor distT="0" distB="0" distL="114300" distR="114300" simplePos="0" relativeHeight="251677696" behindDoc="0" locked="0" layoutInCell="1" allowOverlap="1" wp14:anchorId="46259F25" wp14:editId="2594D6AD">
+            <wp:simplePos x="0" y="0"/>
+            <wp:positionH relativeFrom="margin">
+              <wp:align>center</wp:align>
+            </wp:positionH>
+            <wp:positionV relativeFrom="paragraph">
+              <wp:posOffset>75371</wp:posOffset>
+            </wp:positionV>
+            <wp:extent cx="3600953" cy="990738"/>
+            <wp:effectExtent l="0" t="0" r="0" b="0"/>
+            <wp:wrapTopAndBottom/>
+            <wp:docPr id="1970893108" name="Picture 1" descr="A screenshot of a computer&#10;&#10;AI-generated content may be incorrect."/>
+            <wp:cNvGraphicFramePr>
+              <a:graphicFrameLocks xmlns:a="http://schemas.openxmlformats.org/drawingml/2006/main" noChangeAspect="1"/>
+            </wp:cNvGraphicFramePr>
+            <a:graphic xmlns:a="http://schemas.openxmlformats.org/drawingml/2006/main">
+              <a:graphicData uri="http://schemas.openxmlformats.org/drawingml/2006/picture">
+                <pic:pic xmlns:pic="http://schemas.openxmlformats.org/drawingml/2006/picture">
+                  <pic:nvPicPr>
+                    <pic:cNvPr id="1970893108" name="Picture 1" descr="A screenshot of a computer&#10;&#10;AI-generated content may be incorrect."/>
+                    <pic:cNvPicPr/>
+                  </pic:nvPicPr>
+                  <pic:blipFill>
+                    <a:blip r:embed="rId13">
+                      <a:extLst>
+                        <a:ext uri="{28A0092B-C50C-407E-A947-70E740481C1C}">
+                          <a14:useLocalDpi xmlns:a14="http://schemas.microsoft.com/office/drawing/2010/main" val="0"/>
+                        </a:ext>
+                      </a:extLst>
+                    </a:blip>
+                    <a:stretch>
+                      <a:fillRect/>
+                    </a:stretch>
+                  </pic:blipFill>
+                  <pic:spPr>
+                    <a:xfrm>
+                      <a:off x="0" y="0"/>
+                      <a:ext cx="3600953" cy="990738"/>
+                    </a:xfrm>
+                    <a:prstGeom prst="rect">
+                      <a:avLst/>
+                    </a:prstGeom>
+                  </pic:spPr>
+                </pic:pic>
+              </a:graphicData>
+            </a:graphic>
+          </wp:anchor>
+        </w:drawing>
+      </w:r>
+    </w:p>
     <w:sectPr>
-      <w:headerReference w:type="default" r:id="rId13"/>
-      <w:footerReference w:type="default" r:id="rId14"/>
-      <w:headerReference w:type="first" r:id="rId15"/>
+      <w:headerReference w:type="default" r:id="rId14"/>
+      <w:footerReference w:type="default" r:id="rId15"/>
+      <w:headerReference w:type="first" r:id="rId16"/>
       <w:pgSz w:w="11906" w:h="16838"/>
       <w:pgMar w:top="1872" w:right="1872" w:bottom="1872" w:left="1872" w:header="706" w:footer="706" w:gutter="0"/>
       <w:pgNumType w:start="0"/>

</xml_diff>

<commit_message>
Add Protocol.pdf and update Protocol.docx
Added a PDF version of the protocol and updated the existing Protocol.docx file. Minor changes were also made to the workspace.xml configuration.
</commit_message>
<xml_diff>
--- a/Modules/Semester_1/Modern Code/Aufgaben/04_Arrays_and_Algorithms/Protocol.docx
+++ b/Modules/Semester_1/Modern Code/Aufgaben/04_Arrays_and_Algorithms/Protocol.docx
@@ -277,13 +277,20 @@
                                 <w:r>
                                   <w:tab/>
                                 </w:r>
-                                <w:proofErr w:type="gramStart"/>
                                 <w:r>
-                                  <w:t>XX:XX</w:t>
+                                  <w:t>04</w:t>
                                 </w:r>
-                                <w:proofErr w:type="gramEnd"/>
                                 <w:r>
-                                  <w:t>:XX</w:t>
+                                  <w:t>:</w:t>
+                                </w:r>
+                                <w:r>
+                                  <w:t>05</w:t>
+                                </w:r>
+                                <w:r>
+                                  <w:t>:</w:t>
+                                </w:r>
+                                <w:r>
+                                  <w:t>44</w:t>
                                 </w:r>
                               </w:p>
                             </w:txbxContent>
@@ -385,13 +392,20 @@
                           <w:r>
                             <w:tab/>
                           </w:r>
-                          <w:proofErr w:type="gramStart"/>
                           <w:r>
-                            <w:t>XX:XX</w:t>
+                            <w:t>04</w:t>
                           </w:r>
-                          <w:proofErr w:type="gramEnd"/>
                           <w:r>
-                            <w:t>:XX</w:t>
+                            <w:t>:</w:t>
+                          </w:r>
+                          <w:r>
+                            <w:t>05</w:t>
+                          </w:r>
+                          <w:r>
+                            <w:t>:</w:t>
+                          </w:r>
+                          <w:r>
+                            <w:t>44</w:t>
                           </w:r>
                         </w:p>
                       </w:txbxContent>
@@ -7957,8 +7971,13 @@
       <w:pPr>
         <w:pStyle w:val="Pseoudocode"/>
       </w:pPr>
-      <w:r>
-        <w:t xml:space="preserve">private </w:t>
+      <w:proofErr w:type="spellStart"/>
+      <w:r>
+        <w:t>private</w:t>
+      </w:r>
+      <w:proofErr w:type="spellEnd"/>
+      <w:r>
+        <w:t xml:space="preserve"> </w:t>
       </w:r>
       <w:proofErr w:type="spellStart"/>
       <w:r>
@@ -7974,7 +7993,31 @@
       </w:r>
       <w:proofErr w:type="spellEnd"/>
       <w:r>
-        <w:t>(int target, int[] array)</w:t>
+        <w:t>(</w:t>
+      </w:r>
+      <w:proofErr w:type="spellStart"/>
+      <w:r>
+        <w:t>int</w:t>
+      </w:r>
+      <w:proofErr w:type="spellEnd"/>
+      <w:r>
+        <w:t xml:space="preserve"> </w:t>
+      </w:r>
+      <w:proofErr w:type="spellStart"/>
+      <w:r>
+        <w:t>target</w:t>
+      </w:r>
+      <w:proofErr w:type="spellEnd"/>
+      <w:r>
+        <w:t xml:space="preserve">, </w:t>
+      </w:r>
+      <w:proofErr w:type="spellStart"/>
+      <w:r>
+        <w:t>int</w:t>
+      </w:r>
+      <w:proofErr w:type="spellEnd"/>
+      <w:r>
+        <w:t>[] array)</w:t>
       </w:r>
       <w:r>
         <w:br/>
@@ -7982,7 +8025,23 @@
       </w:r>
       <w:r>
         <w:br/>
-        <w:t xml:space="preserve">    int difference = </w:t>
+        <w:t xml:space="preserve">    </w:t>
+      </w:r>
+      <w:proofErr w:type="spellStart"/>
+      <w:r>
+        <w:t>int</w:t>
+      </w:r>
+      <w:proofErr w:type="spellEnd"/>
+      <w:r>
+        <w:t xml:space="preserve"> </w:t>
+      </w:r>
+      <w:proofErr w:type="spellStart"/>
+      <w:r>
+        <w:t>difference</w:t>
+      </w:r>
+      <w:proofErr w:type="spellEnd"/>
+      <w:r>
+        <w:t xml:space="preserve"> = </w:t>
       </w:r>
       <w:proofErr w:type="spellStart"/>
       <w:r>
@@ -8001,7 +8060,15 @@
       </w:r>
       <w:r>
         <w:br/>
-        <w:t xml:space="preserve">    int </w:t>
+        <w:t xml:space="preserve">    </w:t>
+      </w:r>
+      <w:proofErr w:type="spellStart"/>
+      <w:r>
+        <w:t>int</w:t>
+      </w:r>
+      <w:proofErr w:type="spellEnd"/>
+      <w:r>
+        <w:t xml:space="preserve"> </w:t>
       </w:r>
       <w:proofErr w:type="spellStart"/>
       <w:r>
@@ -8016,23 +8083,15 @@
       </w:r>
       <w:r>
         <w:br/>
-        <w:t xml:space="preserve">    for (int </w:t>
-      </w:r>
-      <w:proofErr w:type="spellStart"/>
-      <w:r>
-        <w:t>i</w:t>
-      </w:r>
-      <w:proofErr w:type="spellEnd"/>
-      <w:r>
-        <w:t xml:space="preserve"> = 0; </w:t>
-      </w:r>
-      <w:proofErr w:type="spellStart"/>
-      <w:r>
-        <w:t>i</w:t>
-      </w:r>
-      <w:proofErr w:type="spellEnd"/>
-      <w:r>
-        <w:t xml:space="preserve"> &lt; </w:t>
+        <w:t xml:space="preserve">    for (</w:t>
+      </w:r>
+      <w:proofErr w:type="spellStart"/>
+      <w:r>
+        <w:t>int</w:t>
+      </w:r>
+      <w:proofErr w:type="spellEnd"/>
+      <w:r>
+        <w:t xml:space="preserve"> i = 0; i &lt; </w:t>
       </w:r>
       <w:proofErr w:type="spellStart"/>
       <w:r>
@@ -8040,15 +8099,7 @@
       </w:r>
       <w:proofErr w:type="spellEnd"/>
       <w:r>
-        <w:t xml:space="preserve">; </w:t>
-      </w:r>
-      <w:proofErr w:type="spellStart"/>
-      <w:r>
-        <w:t>i</w:t>
-      </w:r>
-      <w:proofErr w:type="spellEnd"/>
-      <w:r>
-        <w:t>++)</w:t>
+        <w:t>; i++)</w:t>
       </w:r>
       <w:r>
         <w:br/>
@@ -8056,15 +8107,23 @@
       </w:r>
       <w:r>
         <w:br/>
-        <w:t xml:space="preserve">       if (array[</w:t>
-      </w:r>
-      <w:proofErr w:type="spellStart"/>
-      <w:r>
-        <w:t>i</w:t>
-      </w:r>
-      <w:proofErr w:type="spellEnd"/>
-      <w:r>
-        <w:t>] == target)</w:t>
+        <w:t xml:space="preserve">       if (</w:t>
+      </w:r>
+      <w:proofErr w:type="spellStart"/>
+      <w:r>
+        <w:t>array</w:t>
+      </w:r>
+      <w:proofErr w:type="spellEnd"/>
+      <w:r>
+        <w:t xml:space="preserve">[i] == </w:t>
+      </w:r>
+      <w:proofErr w:type="spellStart"/>
+      <w:r>
+        <w:t>target</w:t>
+      </w:r>
+      <w:proofErr w:type="spellEnd"/>
+      <w:r>
+        <w:t>)</w:t>
       </w:r>
       <w:r>
         <w:br/>
@@ -8080,23 +8139,23 @@
       </w:r>
       <w:proofErr w:type="spellEnd"/>
       <w:r>
-        <w:t xml:space="preserve">(true, </w:t>
-      </w:r>
-      <w:proofErr w:type="spellStart"/>
-      <w:r>
-        <w:t>i</w:t>
-      </w:r>
-      <w:proofErr w:type="spellEnd"/>
-      <w:r>
-        <w:t>, array[</w:t>
-      </w:r>
-      <w:proofErr w:type="spellStart"/>
-      <w:r>
-        <w:t>i</w:t>
-      </w:r>
-      <w:proofErr w:type="spellEnd"/>
-      <w:r>
-        <w:t>]);</w:t>
+        <w:t>(</w:t>
+      </w:r>
+      <w:proofErr w:type="spellStart"/>
+      <w:r>
+        <w:t>true</w:t>
+      </w:r>
+      <w:proofErr w:type="spellEnd"/>
+      <w:r>
+        <w:t xml:space="preserve">, i, </w:t>
+      </w:r>
+      <w:proofErr w:type="spellStart"/>
+      <w:r>
+        <w:t>array</w:t>
+      </w:r>
+      <w:proofErr w:type="spellEnd"/>
+      <w:r>
+        <w:t>[i]);</w:t>
       </w:r>
       <w:r>
         <w:br/>
@@ -8107,7 +8166,15 @@
       </w:r>
       <w:r>
         <w:br/>
-        <w:t xml:space="preserve">       int </w:t>
+        <w:t xml:space="preserve">       </w:t>
+      </w:r>
+      <w:proofErr w:type="spellStart"/>
+      <w:r>
+        <w:t>int</w:t>
+      </w:r>
+      <w:proofErr w:type="spellEnd"/>
+      <w:r>
+        <w:t xml:space="preserve"> </w:t>
       </w:r>
       <w:proofErr w:type="spellStart"/>
       <w:r>
@@ -8130,15 +8197,15 @@
       </w:r>
       <w:proofErr w:type="spellEnd"/>
       <w:r>
-        <w:t>(array[</w:t>
-      </w:r>
-      <w:proofErr w:type="spellStart"/>
-      <w:r>
-        <w:t>i</w:t>
-      </w:r>
-      <w:proofErr w:type="spellEnd"/>
-      <w:r>
-        <w:t>] - target);</w:t>
+        <w:t>(</w:t>
+      </w:r>
+      <w:proofErr w:type="spellStart"/>
+      <w:r>
+        <w:t>array</w:t>
+      </w:r>
+      <w:proofErr w:type="spellEnd"/>
+      <w:r>
+        <w:t>[i] - target);</w:t>
       </w:r>
       <w:r>
         <w:br/>
@@ -8153,7 +8220,15 @@
       </w:r>
       <w:proofErr w:type="spellEnd"/>
       <w:r>
-        <w:t xml:space="preserve"> &lt; difference)</w:t>
+        <w:t xml:space="preserve"> &lt; </w:t>
+      </w:r>
+      <w:proofErr w:type="spellStart"/>
+      <w:r>
+        <w:t>difference</w:t>
+      </w:r>
+      <w:proofErr w:type="spellEnd"/>
+      <w:r>
+        <w:t>)</w:t>
       </w:r>
       <w:r>
         <w:br/>
@@ -8161,7 +8236,15 @@
       </w:r>
       <w:r>
         <w:br/>
-        <w:t xml:space="preserve">           difference = </w:t>
+        <w:t xml:space="preserve">           </w:t>
+      </w:r>
+      <w:proofErr w:type="spellStart"/>
+      <w:r>
+        <w:t>difference</w:t>
+      </w:r>
+      <w:proofErr w:type="spellEnd"/>
+      <w:r>
+        <w:t xml:space="preserve"> = </w:t>
       </w:r>
       <w:proofErr w:type="spellStart"/>
       <w:r>
@@ -8181,15 +8264,7 @@
       </w:r>
       <w:proofErr w:type="spellEnd"/>
       <w:r>
-        <w:t xml:space="preserve"> = </w:t>
-      </w:r>
-      <w:proofErr w:type="spellStart"/>
-      <w:r>
-        <w:t>i</w:t>
-      </w:r>
-      <w:proofErr w:type="spellEnd"/>
-      <w:r>
-        <w:t>;</w:t>
+        <w:t xml:space="preserve"> = i;</w:t>
       </w:r>
       <w:r>
         <w:br/>
@@ -8222,9 +8297,14 @@
       <w:r>
         <w:t xml:space="preserve">, </w:t>
       </w:r>
+      <w:proofErr w:type="spellStart"/>
       <w:r>
         <w:lastRenderedPageBreak/>
-        <w:t>array[</w:t>
+        <w:t>array</w:t>
+      </w:r>
+      <w:proofErr w:type="spellEnd"/>
+      <w:r>
+        <w:t>[</w:t>
       </w:r>
       <w:proofErr w:type="spellStart"/>
       <w:r>
@@ -8242,15 +8322,24 @@
     <w:p>
       <w:pPr>
         <w:pStyle w:val="Caption"/>
+        <w:rPr>
+          <w:lang w:val="fr-FR"/>
+        </w:rPr>
       </w:pPr>
       <w:bookmarkStart w:id="34" w:name="_Toc215085100"/>
       <w:r>
+        <w:rPr>
+          <w:lang w:val="fr-FR"/>
+        </w:rPr>
         <w:t xml:space="preserve">Figure </w:t>
       </w:r>
       <w:r>
         <w:fldChar w:fldCharType="begin"/>
       </w:r>
       <w:r>
+        <w:rPr>
+          <w:lang w:val="fr-FR"/>
+        </w:rPr>
         <w:instrText xml:space="preserve"> SEQ Figure \* ARABIC </w:instrText>
       </w:r>
       <w:r>
@@ -8259,6 +8348,7 @@
       <w:r>
         <w:rPr>
           <w:noProof/>
+          <w:lang w:val="fr-FR"/>
         </w:rPr>
         <w:t>12</w:t>
       </w:r>
@@ -8266,16 +8356,47 @@
         <w:fldChar w:fldCharType="end"/>
       </w:r>
       <w:r>
-        <w:t>: Fuzzy Seach</w:t>
+        <w:rPr>
+          <w:lang w:val="fr-FR"/>
+        </w:rPr>
+        <w:t xml:space="preserve">: </w:t>
+      </w:r>
+      <w:proofErr w:type="spellStart"/>
+      <w:r>
+        <w:rPr>
+          <w:lang w:val="fr-FR"/>
+        </w:rPr>
+        <w:t>Fuzzy</w:t>
+      </w:r>
+      <w:proofErr w:type="spellEnd"/>
+      <w:r>
+        <w:rPr>
+          <w:lang w:val="fr-FR"/>
+        </w:rPr>
+        <w:t xml:space="preserve"> </w:t>
+      </w:r>
+      <w:proofErr w:type="spellStart"/>
+      <w:r>
+        <w:rPr>
+          <w:lang w:val="fr-FR"/>
+        </w:rPr>
+        <w:t>Seach</w:t>
       </w:r>
       <w:bookmarkEnd w:id="34"/>
+      <w:proofErr w:type="spellEnd"/>
     </w:p>
     <w:p>
       <w:pPr>
         <w:pStyle w:val="Heading2"/>
+        <w:rPr>
+          <w:lang w:val="fr-FR"/>
+        </w:rPr>
       </w:pPr>
       <w:bookmarkStart w:id="35" w:name="_Toc215085135"/>
       <w:r>
+        <w:rPr>
+          <w:lang w:val="fr-FR"/>
+        </w:rPr>
         <w:t>Test</w:t>
       </w:r>
       <w:bookmarkEnd w:id="35"/>
@@ -8289,7 +8410,14 @@
       </w:r>
       <w:r>
         <w:br/>
-        <w:t xml:space="preserve">void </w:t>
+      </w:r>
+      <w:proofErr w:type="spellStart"/>
+      <w:r>
+        <w:t>void</w:t>
+      </w:r>
+      <w:proofErr w:type="spellEnd"/>
+      <w:r>
+        <w:t xml:space="preserve"> </w:t>
       </w:r>
       <w:proofErr w:type="spellStart"/>
       <w:r>
@@ -8305,7 +8433,15 @@
       </w:r>
       <w:r>
         <w:br/>
-        <w:t xml:space="preserve">    int[] </w:t>
+        <w:t xml:space="preserve">    </w:t>
+      </w:r>
+      <w:proofErr w:type="spellStart"/>
+      <w:r>
+        <w:t>int</w:t>
+      </w:r>
+      <w:proofErr w:type="spellEnd"/>
+      <w:r>
+        <w:t xml:space="preserve">[] </w:t>
       </w:r>
       <w:proofErr w:type="spellStart"/>
       <w:r>
@@ -8317,7 +8453,15 @@
       </w:r>
       <w:r>
         <w:br/>
-        <w:t xml:space="preserve">    int </w:t>
+        <w:t xml:space="preserve">    </w:t>
+      </w:r>
+      <w:proofErr w:type="spellStart"/>
+      <w:r>
+        <w:t>int</w:t>
+      </w:r>
+      <w:proofErr w:type="spellEnd"/>
+      <w:r>
+        <w:t xml:space="preserve"> </w:t>
       </w:r>
       <w:proofErr w:type="spellStart"/>
       <w:r>
@@ -8329,7 +8473,15 @@
       </w:r>
       <w:r>
         <w:br/>
-        <w:t xml:space="preserve">    int </w:t>
+        <w:t xml:space="preserve">    </w:t>
+      </w:r>
+      <w:proofErr w:type="spellStart"/>
+      <w:r>
+        <w:t>int</w:t>
+      </w:r>
+      <w:proofErr w:type="spellEnd"/>
+      <w:r>
+        <w:t xml:space="preserve"> </w:t>
       </w:r>
       <w:proofErr w:type="spellStart"/>
       <w:r>
@@ -8341,7 +8493,15 @@
       </w:r>
       <w:r>
         <w:br/>
-        <w:t xml:space="preserve">    int </w:t>
+        <w:t xml:space="preserve">    </w:t>
+      </w:r>
+      <w:proofErr w:type="spellStart"/>
+      <w:r>
+        <w:t>int</w:t>
+      </w:r>
+      <w:proofErr w:type="spellEnd"/>
+      <w:r>
+        <w:t xml:space="preserve"> </w:t>
       </w:r>
       <w:proofErr w:type="spellStart"/>
       <w:r>
@@ -8803,6 +8963,9 @@
         </mc:AlternateContent>
       </w:r>
       <w:r>
+        <w:rPr>
+          <w:noProof/>
+        </w:rPr>
         <w:drawing>
           <wp:anchor distT="0" distB="0" distL="114300" distR="114300" simplePos="0" relativeHeight="251668480" behindDoc="0" locked="0" layoutInCell="1" allowOverlap="1" wp14:anchorId="4D49B56E" wp14:editId="71F67B79">
             <wp:simplePos x="0" y="0"/>
@@ -8895,17 +9058,24 @@
       <w:pPr>
         <w:pStyle w:val="Pseoudocode"/>
       </w:pPr>
+      <w:proofErr w:type="spellStart"/>
       <w:proofErr w:type="gramStart"/>
       <w:r>
         <w:t>private</w:t>
       </w:r>
+      <w:proofErr w:type="spellEnd"/>
       <w:proofErr w:type="gramEnd"/>
       <w:r>
         <w:t xml:space="preserve"> </w:t>
       </w:r>
+      <w:proofErr w:type="spellStart"/>
       <w:proofErr w:type="gramStart"/>
       <w:r>
-        <w:t>int[</w:t>
+        <w:t>int</w:t>
+      </w:r>
+      <w:proofErr w:type="spellEnd"/>
+      <w:r>
+        <w:t>[</w:t>
       </w:r>
       <w:proofErr w:type="gramEnd"/>
       <w:r>
@@ -8919,17 +9089,27 @@
       <w:r>
         <w:t>(</w:t>
       </w:r>
+      <w:proofErr w:type="spellStart"/>
       <w:proofErr w:type="gramStart"/>
       <w:r>
-        <w:t>int[</w:t>
+        <w:t>int</w:t>
+      </w:r>
+      <w:proofErr w:type="spellEnd"/>
+      <w:r>
+        <w:t>[</w:t>
       </w:r>
       <w:proofErr w:type="gramEnd"/>
       <w:r>
         <w:t xml:space="preserve">] array1, </w:t>
       </w:r>
+      <w:proofErr w:type="spellStart"/>
       <w:proofErr w:type="gramStart"/>
       <w:r>
-        <w:t>int[</w:t>
+        <w:t>int</w:t>
+      </w:r>
+      <w:proofErr w:type="spellEnd"/>
+      <w:r>
+        <w:t>[</w:t>
       </w:r>
       <w:proofErr w:type="gramEnd"/>
       <w:r>
@@ -8941,19 +9121,40 @@
       </w:r>
       <w:r>
         <w:br/>
-        <w:t xml:space="preserve">    int length1 = array1.length;</w:t>
-      </w:r>
-      <w:r>
-        <w:br/>
-        <w:t xml:space="preserve">    int length2 = array2.length;</w:t>
-      </w:r>
-      <w:r>
-        <w:br/>
         <w:t xml:space="preserve">    </w:t>
       </w:r>
+      <w:proofErr w:type="spellStart"/>
+      <w:r>
+        <w:t>int</w:t>
+      </w:r>
+      <w:proofErr w:type="spellEnd"/>
+      <w:r>
+        <w:t xml:space="preserve"> length1 = array1.length;</w:t>
+      </w:r>
+      <w:r>
+        <w:br/>
+        <w:t xml:space="preserve">    </w:t>
+      </w:r>
+      <w:proofErr w:type="spellStart"/>
+      <w:r>
+        <w:t>int</w:t>
+      </w:r>
+      <w:proofErr w:type="spellEnd"/>
+      <w:r>
+        <w:t xml:space="preserve"> length2 = array2.length;</w:t>
+      </w:r>
+      <w:r>
+        <w:br/>
+        <w:t xml:space="preserve">    </w:t>
+      </w:r>
+      <w:proofErr w:type="spellStart"/>
       <w:proofErr w:type="gramStart"/>
       <w:r>
-        <w:t>int[</w:t>
+        <w:t>int</w:t>
+      </w:r>
+      <w:proofErr w:type="spellEnd"/>
+      <w:r>
+        <w:t>[</w:t>
       </w:r>
       <w:proofErr w:type="gramEnd"/>
       <w:r>
@@ -8967,9 +9168,14 @@
       <w:r>
         <w:t xml:space="preserve"> = new </w:t>
       </w:r>
+      <w:proofErr w:type="spellStart"/>
       <w:proofErr w:type="gramStart"/>
       <w:r>
-        <w:t>int[</w:t>
+        <w:t>int</w:t>
+      </w:r>
+      <w:proofErr w:type="spellEnd"/>
+      <w:r>
+        <w:t>[</w:t>
       </w:r>
       <w:proofErr w:type="gramEnd"/>
       <w:r>
@@ -9127,7 +9333,14 @@
       </w:r>
       <w:r>
         <w:br/>
-        <w:t xml:space="preserve">void </w:t>
+      </w:r>
+      <w:proofErr w:type="spellStart"/>
+      <w:r>
+        <w:t>void</w:t>
+      </w:r>
+      <w:proofErr w:type="spellEnd"/>
+      <w:r>
+        <w:t xml:space="preserve"> </w:t>
       </w:r>
       <w:proofErr w:type="spellStart"/>
       <w:proofErr w:type="gramStart"/>
@@ -9150,9 +9363,14 @@
         <w:br/>
         <w:t xml:space="preserve">    </w:t>
       </w:r>
+      <w:proofErr w:type="spellStart"/>
       <w:proofErr w:type="gramStart"/>
       <w:r>
-        <w:t>int[</w:t>
+        <w:t>int</w:t>
+      </w:r>
+      <w:proofErr w:type="spellEnd"/>
+      <w:r>
+        <w:t>[</w:t>
       </w:r>
       <w:proofErr w:type="gramEnd"/>
       <w:r>
@@ -9167,9 +9385,14 @@
         <w:br/>
         <w:t xml:space="preserve">    </w:t>
       </w:r>
+      <w:proofErr w:type="spellStart"/>
       <w:proofErr w:type="gramStart"/>
       <w:r>
-        <w:t>int[</w:t>
+        <w:t>int</w:t>
+      </w:r>
+      <w:proofErr w:type="spellEnd"/>
+      <w:r>
+        <w:t>[</w:t>
       </w:r>
       <w:proofErr w:type="gramEnd"/>
       <w:r>
@@ -9184,9 +9407,14 @@
         <w:br/>
         <w:t xml:space="preserve">    </w:t>
       </w:r>
+      <w:proofErr w:type="spellStart"/>
       <w:proofErr w:type="gramStart"/>
       <w:r>
-        <w:t>int[</w:t>
+        <w:t>int</w:t>
+      </w:r>
+      <w:proofErr w:type="spellEnd"/>
+      <w:r>
+        <w:t>[</w:t>
       </w:r>
       <w:proofErr w:type="gramEnd"/>
       <w:r>
@@ -9291,9 +9519,14 @@
         <w:br/>
         <w:t xml:space="preserve">    </w:t>
       </w:r>
+      <w:proofErr w:type="spellStart"/>
       <w:proofErr w:type="gramStart"/>
       <w:r>
-        <w:t>int[</w:t>
+        <w:t>int</w:t>
+      </w:r>
+      <w:proofErr w:type="spellEnd"/>
+      <w:r>
+        <w:t>[</w:t>
       </w:r>
       <w:proofErr w:type="gramEnd"/>
       <w:r>
@@ -9660,6 +9893,9 @@
         </mc:AlternateContent>
       </w:r>
       <w:r>
+        <w:rPr>
+          <w:noProof/>
+        </w:rPr>
         <w:drawing>
           <wp:anchor distT="0" distB="0" distL="114300" distR="114300" simplePos="0" relativeHeight="251671552" behindDoc="0" locked="0" layoutInCell="1" allowOverlap="1" wp14:anchorId="061DB597" wp14:editId="14807C59">
             <wp:simplePos x="0" y="0"/>
@@ -9756,13 +9992,23 @@
       <w:pPr>
         <w:pStyle w:val="Pseoudocode"/>
       </w:pPr>
+      <w:proofErr w:type="spellStart"/>
       <w:proofErr w:type="gramStart"/>
       <w:r>
         <w:t>private</w:t>
       </w:r>
+      <w:proofErr w:type="spellEnd"/>
       <w:proofErr w:type="gramEnd"/>
       <w:r>
-        <w:t xml:space="preserve"> HashMap&lt;</w:t>
+        <w:t xml:space="preserve"> </w:t>
+      </w:r>
+      <w:proofErr w:type="spellStart"/>
+      <w:r>
+        <w:t>HashMap</w:t>
+      </w:r>
+      <w:proofErr w:type="spellEnd"/>
+      <w:r>
+        <w:t>&lt;</w:t>
       </w:r>
       <w:proofErr w:type="spellStart"/>
       <w:proofErr w:type="gramStart"/>
@@ -9782,13 +10028,26 @@
       <w:r>
         <w:t>(</w:t>
       </w:r>
+      <w:proofErr w:type="spellStart"/>
       <w:proofErr w:type="gramStart"/>
       <w:r>
-        <w:t>int[</w:t>
+        <w:t>int</w:t>
+      </w:r>
+      <w:proofErr w:type="spellEnd"/>
+      <w:r>
+        <w:t>[</w:t>
       </w:r>
       <w:proofErr w:type="gramEnd"/>
       <w:r>
-        <w:t>] array)</w:t>
+        <w:t xml:space="preserve">] </w:t>
+      </w:r>
+      <w:proofErr w:type="spellStart"/>
+      <w:r>
+        <w:t>array</w:t>
+      </w:r>
+      <w:proofErr w:type="spellEnd"/>
+      <w:r>
+        <w:t>)</w:t>
       </w:r>
       <w:r>
         <w:br/>
@@ -9799,7 +10058,15 @@
       </w:r>
       <w:r>
         <w:lastRenderedPageBreak/>
-        <w:t xml:space="preserve">    HashMap&lt;</w:t>
+        <w:t xml:space="preserve">    </w:t>
+      </w:r>
+      <w:proofErr w:type="spellStart"/>
+      <w:r>
+        <w:t>HashMap</w:t>
+      </w:r>
+      <w:proofErr w:type="spellEnd"/>
+      <w:r>
+        <w:t>&lt;</w:t>
       </w:r>
       <w:proofErr w:type="spellStart"/>
       <w:proofErr w:type="gramStart"/>
@@ -9817,7 +10084,15 @@
       </w:r>
       <w:proofErr w:type="spellEnd"/>
       <w:r>
-        <w:t xml:space="preserve"> = new HashMap&lt;</w:t>
+        <w:t xml:space="preserve"> = new </w:t>
+      </w:r>
+      <w:proofErr w:type="spellStart"/>
+      <w:r>
+        <w:t>HashMap</w:t>
+      </w:r>
+      <w:proofErr w:type="spellEnd"/>
+      <w:r>
+        <w:t>&lt;</w:t>
       </w:r>
       <w:proofErr w:type="gramStart"/>
       <w:r>
@@ -9829,7 +10104,23 @@
       </w:r>
       <w:r>
         <w:br/>
-        <w:t xml:space="preserve">    for (int value : array)</w:t>
+        <w:t xml:space="preserve">    for (</w:t>
+      </w:r>
+      <w:proofErr w:type="spellStart"/>
+      <w:r>
+        <w:t>int</w:t>
+      </w:r>
+      <w:proofErr w:type="spellEnd"/>
+      <w:r>
+        <w:t xml:space="preserve"> value : </w:t>
+      </w:r>
+      <w:proofErr w:type="spellStart"/>
+      <w:r>
+        <w:t>array</w:t>
+      </w:r>
+      <w:proofErr w:type="spellEnd"/>
+      <w:r>
+        <w:t>)</w:t>
       </w:r>
       <w:r>
         <w:br/>
@@ -9856,6 +10147,7 @@
       <w:r>
         <w:t>Integer::</w:t>
       </w:r>
+      <w:proofErr w:type="spellStart"/>
       <w:proofErr w:type="gramEnd"/>
       <w:r>
         <w:rPr>
@@ -9864,6 +10156,7 @@
         </w:rPr>
         <w:t>sum</w:t>
       </w:r>
+      <w:proofErr w:type="spellEnd"/>
       <w:proofErr w:type="gramStart"/>
       <w:r>
         <w:t>);</w:t>
@@ -9955,7 +10248,14 @@
       </w:r>
       <w:r>
         <w:br/>
-        <w:t xml:space="preserve">void </w:t>
+      </w:r>
+      <w:proofErr w:type="spellStart"/>
+      <w:r>
+        <w:t>void</w:t>
+      </w:r>
+      <w:proofErr w:type="spellEnd"/>
+      <w:r>
+        <w:t xml:space="preserve"> </w:t>
       </w:r>
       <w:proofErr w:type="spellStart"/>
       <w:r>
@@ -9971,7 +10271,15 @@
       </w:r>
       <w:r>
         <w:br/>
-        <w:t xml:space="preserve">    int[] </w:t>
+        <w:t xml:space="preserve">    </w:t>
+      </w:r>
+      <w:proofErr w:type="spellStart"/>
+      <w:r>
+        <w:t>int</w:t>
+      </w:r>
+      <w:proofErr w:type="spellEnd"/>
+      <w:r>
+        <w:t xml:space="preserve">[] </w:t>
       </w:r>
       <w:proofErr w:type="spellStart"/>
       <w:r>
@@ -9986,7 +10294,15 @@
       </w:r>
       <w:r>
         <w:br/>
-        <w:t xml:space="preserve">    HashMap&lt;Integer, Integer&gt; </w:t>
+        <w:t xml:space="preserve">    </w:t>
+      </w:r>
+      <w:proofErr w:type="spellStart"/>
+      <w:r>
+        <w:t>HashMap</w:t>
+      </w:r>
+      <w:proofErr w:type="spellEnd"/>
+      <w:r>
+        <w:t xml:space="preserve">&lt;Integer, Integer&gt; </w:t>
       </w:r>
       <w:proofErr w:type="spellStart"/>
       <w:r>
@@ -9994,7 +10310,15 @@
       </w:r>
       <w:proofErr w:type="spellEnd"/>
       <w:r>
-        <w:t xml:space="preserve"> = new HashMap&lt;&gt;();</w:t>
+        <w:t xml:space="preserve"> = new </w:t>
+      </w:r>
+      <w:proofErr w:type="spellStart"/>
+      <w:r>
+        <w:t>HashMap</w:t>
+      </w:r>
+      <w:proofErr w:type="spellEnd"/>
+      <w:r>
+        <w:t>&lt;&gt;();</w:t>
       </w:r>
       <w:r>
         <w:br/>
@@ -10060,7 +10384,15 @@
       </w:r>
       <w:proofErr w:type="spellEnd"/>
       <w:r>
-        <w:t xml:space="preserve"> exercise = new </w:t>
+        <w:t xml:space="preserve"> </w:t>
+      </w:r>
+      <w:proofErr w:type="spellStart"/>
+      <w:r>
+        <w:t>exercise</w:t>
+      </w:r>
+      <w:proofErr w:type="spellEnd"/>
+      <w:r>
+        <w:t xml:space="preserve"> = new </w:t>
       </w:r>
       <w:proofErr w:type="spellStart"/>
       <w:r>
@@ -10107,7 +10439,15 @@
       </w:r>
       <w:r>
         <w:br/>
-        <w:t xml:space="preserve">    HashMap&lt;Integer, Integer&gt; </w:t>
+        <w:t xml:space="preserve">    </w:t>
+      </w:r>
+      <w:proofErr w:type="spellStart"/>
+      <w:r>
+        <w:t>HashMap</w:t>
+      </w:r>
+      <w:proofErr w:type="spellEnd"/>
+      <w:r>
+        <w:t xml:space="preserve">&lt;Integer, Integer&gt; </w:t>
       </w:r>
       <w:proofErr w:type="spellStart"/>
       <w:r>
@@ -10437,6 +10777,9 @@
         </mc:AlternateContent>
       </w:r>
       <w:r>
+        <w:rPr>
+          <w:noProof/>
+        </w:rPr>
         <w:drawing>
           <wp:anchor distT="0" distB="0" distL="114300" distR="114300" simplePos="0" relativeHeight="251674624" behindDoc="0" locked="0" layoutInCell="1" allowOverlap="1" wp14:anchorId="15DD939E" wp14:editId="0F7E59FF">
             <wp:simplePos x="0" y="0"/>
@@ -10535,8 +10878,13 @@
       <w:pPr>
         <w:pStyle w:val="Pseoudocode"/>
       </w:pPr>
-      <w:r>
-        <w:t xml:space="preserve">private </w:t>
+      <w:proofErr w:type="spellStart"/>
+      <w:r>
+        <w:t>private</w:t>
+      </w:r>
+      <w:proofErr w:type="spellEnd"/>
+      <w:r>
+        <w:t xml:space="preserve"> </w:t>
       </w:r>
       <w:proofErr w:type="spellStart"/>
       <w:r>
@@ -10552,7 +10900,23 @@
       </w:r>
       <w:proofErr w:type="spellEnd"/>
       <w:r>
-        <w:t>(int[] array)</w:t>
+        <w:t>(</w:t>
+      </w:r>
+      <w:proofErr w:type="spellStart"/>
+      <w:r>
+        <w:t>int</w:t>
+      </w:r>
+      <w:proofErr w:type="spellEnd"/>
+      <w:r>
+        <w:t xml:space="preserve">[] </w:t>
+      </w:r>
+      <w:proofErr w:type="spellStart"/>
+      <w:r>
+        <w:t>array</w:t>
+      </w:r>
+      <w:proofErr w:type="spellEnd"/>
+      <w:r>
+        <w:t>)</w:t>
       </w:r>
       <w:r>
         <w:br/>
@@ -10560,11 +10924,11 @@
       </w:r>
       <w:r>
         <w:br/>
-        <w:t xml:space="preserve">    List&lt;Integer&gt; e</w:t>
-      </w:r>
-      <w:proofErr w:type="spellStart"/>
-      <w:r>
-        <w:t>venList</w:t>
+        <w:t xml:space="preserve">    List&lt;Integer&gt; </w:t>
+      </w:r>
+      <w:proofErr w:type="spellStart"/>
+      <w:r>
+        <w:t>evenList</w:t>
       </w:r>
       <w:proofErr w:type="spellEnd"/>
       <w:r>
@@ -10603,7 +10967,15 @@
       </w:r>
       <w:r>
         <w:br/>
-        <w:t xml:space="preserve">    for (int </w:t>
+        <w:t xml:space="preserve">    for (</w:t>
+      </w:r>
+      <w:proofErr w:type="spellStart"/>
+      <w:r>
+        <w:t>int</w:t>
+      </w:r>
+      <w:proofErr w:type="spellEnd"/>
+      <w:r>
+        <w:t xml:space="preserve"> </w:t>
       </w:r>
       <w:proofErr w:type="spellStart"/>
       <w:r>
@@ -10611,7 +10983,15 @@
       </w:r>
       <w:proofErr w:type="spellEnd"/>
       <w:r>
-        <w:t xml:space="preserve"> : array)</w:t>
+        <w:t xml:space="preserve"> : </w:t>
+      </w:r>
+      <w:proofErr w:type="spellStart"/>
+      <w:r>
+        <w:t>array</w:t>
+      </w:r>
+      <w:proofErr w:type="spellEnd"/>
+      <w:r>
+        <w:t>)</w:t>
       </w:r>
       <w:r>
         <w:br/>
@@ -10659,8 +11039,13 @@
       </w:r>
       <w:r>
         <w:br/>
-        <w:t xml:space="preserve">        else</w:t>
-      </w:r>
+        <w:t xml:space="preserve">        </w:t>
+      </w:r>
+      <w:proofErr w:type="spellStart"/>
+      <w:r>
+        <w:t>else</w:t>
+      </w:r>
+      <w:proofErr w:type="spellEnd"/>
       <w:r>
         <w:br/>
         <w:t xml:space="preserve">        {</w:t>
@@ -10701,7 +11086,15 @@
       </w:r>
       <w:r>
         <w:lastRenderedPageBreak/>
-        <w:t xml:space="preserve">    int[] </w:t>
+        <w:t xml:space="preserve">    </w:t>
+      </w:r>
+      <w:proofErr w:type="spellStart"/>
+      <w:r>
+        <w:t>int</w:t>
+      </w:r>
+      <w:proofErr w:type="spellEnd"/>
+      <w:r>
+        <w:t xml:space="preserve">[] </w:t>
       </w:r>
       <w:proofErr w:type="spellStart"/>
       <w:r>
@@ -10745,7 +11138,15 @@
       </w:r>
       <w:r>
         <w:br/>
-        <w:t xml:space="preserve">    int[] </w:t>
+        <w:t xml:space="preserve">    </w:t>
+      </w:r>
+      <w:proofErr w:type="spellStart"/>
+      <w:r>
+        <w:t>int</w:t>
+      </w:r>
+      <w:proofErr w:type="spellEnd"/>
+      <w:r>
+        <w:t xml:space="preserve">[] </w:t>
       </w:r>
       <w:proofErr w:type="spellStart"/>
       <w:r>
@@ -10888,7 +11289,14 @@
       </w:r>
       <w:r>
         <w:br/>
-        <w:t xml:space="preserve">void </w:t>
+      </w:r>
+      <w:proofErr w:type="spellStart"/>
+      <w:r>
+        <w:t>void</w:t>
+      </w:r>
+      <w:proofErr w:type="spellEnd"/>
+      <w:r>
+        <w:t xml:space="preserve"> </w:t>
       </w:r>
       <w:proofErr w:type="spellStart"/>
       <w:r>
@@ -10904,7 +11312,15 @@
       </w:r>
       <w:r>
         <w:br/>
-        <w:t xml:space="preserve">    int[] </w:t>
+        <w:t xml:space="preserve">    </w:t>
+      </w:r>
+      <w:proofErr w:type="spellStart"/>
+      <w:r>
+        <w:t>int</w:t>
+      </w:r>
+      <w:proofErr w:type="spellEnd"/>
+      <w:r>
+        <w:t xml:space="preserve">[] </w:t>
       </w:r>
       <w:proofErr w:type="spellStart"/>
       <w:r>
@@ -10919,7 +11335,15 @@
       </w:r>
       <w:r>
         <w:br/>
-        <w:t xml:space="preserve">    int[] </w:t>
+        <w:t xml:space="preserve">    </w:t>
+      </w:r>
+      <w:proofErr w:type="spellStart"/>
+      <w:r>
+        <w:t>int</w:t>
+      </w:r>
+      <w:proofErr w:type="spellEnd"/>
+      <w:r>
+        <w:t xml:space="preserve">[] </w:t>
       </w:r>
       <w:proofErr w:type="spellStart"/>
       <w:r>
@@ -10931,7 +11355,15 @@
       </w:r>
       <w:r>
         <w:br/>
-        <w:t xml:space="preserve">    int[] </w:t>
+        <w:t xml:space="preserve">    </w:t>
+      </w:r>
+      <w:proofErr w:type="spellStart"/>
+      <w:r>
+        <w:t>int</w:t>
+      </w:r>
+      <w:proofErr w:type="spellEnd"/>
+      <w:r>
+        <w:t xml:space="preserve">[] </w:t>
       </w:r>
       <w:proofErr w:type="spellStart"/>
       <w:r>
@@ -11012,7 +11444,15 @@
       </w:r>
       <w:r>
         <w:br/>
-        <w:t xml:space="preserve">    int[] </w:t>
+        <w:t xml:space="preserve">    </w:t>
+      </w:r>
+      <w:proofErr w:type="spellStart"/>
+      <w:r>
+        <w:t>int</w:t>
+      </w:r>
+      <w:proofErr w:type="spellEnd"/>
+      <w:r>
+        <w:t xml:space="preserve">[] </w:t>
       </w:r>
       <w:proofErr w:type="spellStart"/>
       <w:r>
@@ -11040,7 +11480,15 @@
       </w:r>
       <w:r>
         <w:br/>
-        <w:t xml:space="preserve">    int[] </w:t>
+        <w:t xml:space="preserve">    </w:t>
+      </w:r>
+      <w:proofErr w:type="spellStart"/>
+      <w:r>
+        <w:t>int</w:t>
+      </w:r>
+      <w:proofErr w:type="spellEnd"/>
+      <w:r>
+        <w:t xml:space="preserve">[] </w:t>
       </w:r>
       <w:proofErr w:type="spellStart"/>
       <w:r>
@@ -11397,6 +11845,9 @@
         </mc:AlternateContent>
       </w:r>
       <w:r>
+        <w:rPr>
+          <w:noProof/>
+        </w:rPr>
         <w:drawing>
           <wp:anchor distT="0" distB="0" distL="114300" distR="114300" simplePos="0" relativeHeight="251677696" behindDoc="0" locked="0" layoutInCell="1" allowOverlap="1" wp14:anchorId="46259F25" wp14:editId="2594D6AD">
             <wp:simplePos x="0" y="0"/>
@@ -12918,6 +13369,7 @@
   <w:style w:type="character" w:default="1" w:styleId="DefaultParagraphFont">
     <w:name w:val="Default Paragraph Font"/>
     <w:uiPriority w:val="1"/>
+    <w:semiHidden/>
     <w:unhideWhenUsed/>
   </w:style>
   <w:style w:type="table" w:default="1" w:styleId="TableNormal">

</xml_diff>